<commit_message>
Replace manuscript with hybrid revision
</commit_message>
<xml_diff>
--- a/output/imagined_futures_neurips2026.docx
+++ b/output/imagined_futures_neurips2026.docx
@@ -7,7 +7,13 @@
         <w:pStyle w:val="Title"/>
       </w:pPr>
       <w:r>
-        <w:t xml:space="preserve">Do World Action Models Use Their Predicted Futures?</w:t>
+        <w:t xml:space="preserve">How Do World Action Models Use Their Futures?</w:t>
+      </w:r>
+      <w:r>
+        <w:br/>
+      </w:r>
+      <w:r>
+        <w:t xml:space="preserve">Evidence from Mechanistic Interventions</w:t>
       </w:r>
     </w:p>
     <w:p>
@@ -31,49 +37,57 @@
         <w:pStyle w:val="Abstract"/>
       </w:pPr>
       <w:r>
-        <w:t xml:space="preserve">World action models generate predicted future observations together with robot actions, but it remains unclear whether those futures influence action generation. We introduce future transplantation to test this directly. From the same simulator state, we sample two continuations and recompute one after replacing its future representation with the other’s, while holding the current inputs and sampling noise fixed. We then ask whether the recomputed action and its one-chunk simulator endpoint move toward the behavior paired with the donor future. In Cosmos Policy, at the first policy query in each of ten LIBERO-10 tasks, donor futures increase action projection by</w:t>
-      </w:r>
-      <w:r>
-        <w:t xml:space="preserve"> </w:t>
-      </w:r>
-      <m:oMath>
-        <m:r>
-          <m:t>0.499</m:t>
-        </m:r>
-      </m:oMath>
-      <w:r>
-        <w:t xml:space="preserve"> </w:t>
-      </w:r>
-      <w:r>
-        <w:t xml:space="preserve">and endpoint projection by</w:t>
-      </w:r>
-      <w:r>
-        <w:t xml:space="preserve"> </w:t>
-      </w:r>
-      <m:oMath>
-        <m:r>
-          <m:t>0.552</m:t>
-        </m:r>
-      </m:oMath>
-      <w:r>
-        <w:t xml:space="preserve"> </w:t>
-      </w:r>
-      <w:r>
-        <w:t xml:space="preserve">relative to self-future recomputation. Effects are much smaller at later sampled states. Camera-future replacements also steer actions, whereas future proprioception and isolated object-state changes have near-zero effects. This pattern is consistent with sensitivity to camera-visible robot motion. In Cosmos 3, transplanted futures steer actions and endpoints across four RoboLab states. Replacing future-token keys and values wherever action tokens directly attend to future tokens reduces the action shift by</w:t>
-      </w:r>
-      <w:r>
-        <w:t xml:space="preserve"> </w:t>
-      </w:r>
-      <m:oMath>
-        <m:r>
-          <m:t>0.842</m:t>
-        </m:r>
-      </m:oMath>
-      <w:r>
-        <w:t xml:space="preserve"> </w:t>
-      </w:r>
-      <w:r>
-        <w:t xml:space="preserve">projection units on four calibration states and substantially attenuates it in one held-out state. These results show that generated future content can influence WAM actions. They do not establish that either model compares predicted task outcomes or performs planning.</w:t>
+        <w:t xml:space="preserve">World action models jointly generate possible future observations and robot actions, but joint generation does not show whether a particular future affects the action. We introduce reachable-donor future transplantation. From one restored simulator state, two unmodified policy runs produce alternative futures, actions, and endpoints. We replace the recipient’s future with the donor’s while holding the current observation, instruction, sampling noise, and denoising schedule fixed, then measure movement toward the donor action and its one-chunk simulator endpoint. In Cosmos 3, a frozen population study across 22 states and six RoboLab tasks finds predicted-future action steering of</w:t>
+      </w:r>
+      <w:r>
+        <w:t xml:space="preserve"> </w:t>
+      </w:r>
+      <m:oMath>
+        <m:r>
+          <m:t>0.992</m:t>
+        </m:r>
+      </m:oMath>
+      <w:r>
+        <w:t xml:space="preserve"> </w:t>
+      </w:r>
+      <w:r>
+        <w:t xml:space="preserve">and executed-future endpoint steering of</w:t>
+      </w:r>
+      <w:r>
+        <w:t xml:space="preserve"> </w:t>
+      </w:r>
+      <m:oMath>
+        <m:r>
+          <m:t>1.003</m:t>
+        </m:r>
+      </m:oMath>
+      <w:r>
+        <w:t xml:space="preserve"> </w:t>
+      </w:r>
+      <w:r>
+        <w:t xml:space="preserve">on a normalized recipient-to-donor scale. Replacing donor-run future-token keys and values with self-future counterparts reduces predicted-action steering by</w:t>
+      </w:r>
+      <w:r>
+        <w:t xml:space="preserve"> </w:t>
+      </w:r>
+      <m:oMath>
+        <m:r>
+          <m:t>0.877</m:t>
+        </m:r>
+      </m:oMath>
+      <w:r>
+        <w:t xml:space="preserve">; action and endpoint reductions are positive in all 22 states. Yet isolated robot- and object-pixel interventions each have effects below</w:t>
+      </w:r>
+      <w:r>
+        <w:t xml:space="preserve"> </w:t>
+      </w:r>
+      <m:oMath>
+        <m:r>
+          <m:t>0.011</m:t>
+        </m:r>
+      </m:oMath>
+      <w:r>
+        <w:t xml:space="preserve">. In Cosmos Policy’s direct-policy mode, coherent futures steer actions and endpoints at early states across all ten LIBERO-Long tasks, with visual content carrying most of the effect. The results establish donor-specific future use and an active internal pathway, while leaving candidate-future search and value-based outcome comparison untested.</w:t>
       </w:r>
     </w:p>
     <w:bookmarkStart w:id="13" w:name="sec:introduction"/>
@@ -90,7 +104,7 @@
         <w:pStyle w:val="FirstParagraph"/>
       </w:pPr>
       <w:r>
-        <w:t xml:space="preserve">World action models (WAMs) couple prediction and control: the same model generates possible future observations and the robot action to take next</w:t>
+        <w:t xml:space="preserve">Many world action models (WAMs) generate future observations alongside robot actions</w:t>
       </w:r>
       <w:r>
         <w:t xml:space="preserve"> </w:t>
@@ -99,7 +113,7 @@
         <w:t xml:space="preserve">(Kim et al. 2026; NVIDIA 2026a)</w:t>
       </w:r>
       <w:r>
-        <w:t xml:space="preserve">. This design suggests that a WAM may use its predicted future when producing an action. Joint generation alone, however, does not establish that computation. A future may be an unused output, a generic computational workspace, a visual description of the robot motion paired with the action, or a prediction of task consequences used to choose among actions.</w:t>
+        <w:t xml:space="preserve">. This architecture suggests a simple account: the model predicts what may happen and uses that prediction to act. Joint generation alone does not establish this computation. A generated future could be behaviorally irrelevant, serve as a general workspace, describe the robot motion already paired with the action, or represent task consequences used to choose among actions.</w:t>
       </w:r>
     </w:p>
     <w:p>
@@ -107,7 +121,7 @@
         <w:pStyle w:val="BodyText"/>
       </w:pPr>
       <w:r>
-        <w:t xml:space="preserve">These possibilities imply different accounts of the policy. If predicted robot motion drives the action, the model resembles visual inverse dynamics: it maps a current observation and a displayed future pose to the motion connecting them</w:t>
+        <w:t xml:space="preserve">These alternatives imply different functional roles. A policy that conditions action inference on predicted future observations resembles an inverse-dynamics interface</w:t>
       </w:r>
       <w:r>
         <w:t xml:space="preserve"> </w:t>
@@ -116,7 +130,7 @@
         <w:t xml:space="preserve">(Hu et al. 2025; Du et al. 2023)</w:t>
       </w:r>
       <w:r>
-        <w:t xml:space="preserve">. If predicted object changes drive action selection, the computation is closer to visual planning, where candidate actions or subgoals are evaluated through their predicted outcomes</w:t>
+        <w:t xml:space="preserve">. A system that generates alternatives and compares their predicted outcomes with a cost or learned heuristic more closely resembles explicit visual planning</w:t>
       </w:r>
       <w:r>
         <w:t xml:space="preserve"> </w:t>
@@ -125,7 +139,18 @@
         <w:t xml:space="preserve">(Ebert et al. 2018; Du et al. 2024)</w:t>
       </w:r>
       <w:r>
-        <w:t xml:space="preserve">. We study Cosmos Policy in its direct-policy mode and the diffusion-generator component of Cosmos3-Nano-Policy-DROID. Neither inference procedure evaluated here generates and scores multiple candidate actions before acting.</w:t>
+        <w:t xml:space="preserve">. We study Cosmos Policy’s direct-policy mode and the diffusion-generator component of Cosmos3-Nano-Policy-DROID. The inference procedures evaluated here do not generate and score multiple candidate actions before acting; Cosmos Policy’s separate best-of-</w:t>
+      </w:r>
+      <m:oMath>
+        <m:r>
+          <m:t>N</m:t>
+        </m:r>
+      </m:oMath>
+      <w:r>
+        <w:t xml:space="preserve"> </w:t>
+      </w:r>
+      <w:r>
+        <w:t xml:space="preserve">planning mode is outside our study.</w:t>
       </w:r>
     </w:p>
     <w:p>
@@ -142,7 +167,7 @@
         <w:t xml:space="preserve">(Zhang et al. 2026)</w:t>
       </w:r>
       <w:r>
-        <w:t xml:space="preserve">. It masks cached values at future positions or assigns them to different positions, changing closed-loop trajectories and task success across several WAMs. These interventions establish dependence on future-position activations, but they cannot identify the information being used. An arbitrary corruption may move an action in any direction, even if it destroys no meaningful representation of an alternative behavior.</w:t>
+        <w:t xml:space="preserve">. Masking the future read or editing values stored at future positions changes closed-loop trajectories and task success across several WAMs. This establishes dependence on a structured future interface, but a destructive intervention does not say what a particular coherent alternative future tells the policy to do. A damaged representation can move an action in any direction.</w:t>
       </w:r>
     </w:p>
     <w:p>
@@ -150,20 +175,7 @@
         <w:pStyle w:val="BodyText"/>
       </w:pPr>
       <w:r>
-        <w:t xml:space="preserve">We introduce</w:t>
-      </w:r>
-      <w:r>
-        <w:t xml:space="preserve"> </w:t>
-      </w:r>
-      <w:r>
-        <w:rPr>
-          <w:i/>
-          <w:iCs/>
-        </w:rPr>
-        <w:t xml:space="preserve">reachable-donor future transplantation</w:t>
-      </w:r>
-      <w:r>
-        <w:t xml:space="preserve">. Starting from the same restored simulator state, we sample two continuations from the unmodified policy. We designate one continuation as the recipient and the other as the donor, then recompute the recipient with the donor’s predicted future while keeping its current inputs and random draws fixed. The donor action and endpoint are never given to the model; they are used only as references. We measure whether the recomputed action and its executed endpoint move toward the donor behavior rather than merely away from the recipient (Figure </w:t>
+        <w:t xml:space="preserve">We make the test directional. From the same restored state, two native policy continuations define a recipient and a donor. We insert the donor future into the recipient computation while retaining the recipient’s current inputs and random draws. The donor action is never supplied to the model; it defines an independent direction against which we score the intervened action and its executed simulator endpoint (Figure </w:t>
       </w:r>
       <w:hyperlink w:anchor="fig:overview">
         <w:r>
@@ -174,7 +186,15 @@
         </w:r>
       </w:hyperlink>
       <w:r>
-        <w:t xml:space="preserve">).</w:t>
+        <w:t xml:space="preserve">). If the future only perturbs computation, the result need not align with the donor. If its content steers behavior, both action and endpoint should move toward the continuation paired with that future.</w:t>
+      </w:r>
+    </w:p>
+    <w:p>
+      <w:pPr>
+        <w:pStyle w:val="BodyText"/>
+      </w:pPr>
+      <w:r>
+        <w:t xml:space="preserve">The experiments follow three linked questions. First, do coherent donor futures steer behavior? Second, which parts of the future recreate that effect? Third, which future-to-action interfaces carry it? Cosmos 3 provides the strongest within-model chain: steering generalizes across 22 sampled states, isolated robot or object pixels do not recreate it, and future-token K/V replacement suppresses both action and endpoint steering in every state. Cosmos Policy supplies an earlier-model comparison in which effects are concentrated at early states and are most consistent with camera-visible robot motion. Together, the results support future-dependent action generation without establishing candidate search, outcome comparison, or task-level planning.</w:t>
       </w:r>
     </w:p>
     <w:bookmarkStart w:id="12" w:name="fig:overview"/>
@@ -185,14 +205,14 @@
       <w:r>
         <w:drawing>
           <wp:inline>
-            <wp:extent cx="5257800" cy="1695450"/>
+            <wp:extent cx="5257800" cy="1701800"/>
             <wp:effectExtent b="0" l="0" r="0" t="0"/>
             <wp:docPr descr="" title="" id="10" name="Picture"/>
             <a:graphic>
               <a:graphicData uri="http://schemas.openxmlformats.org/drawingml/2006/picture">
                 <pic:pic>
                   <pic:nvPicPr>
-                    <pic:cNvPr descr="figures/method_overview.png" id="11" name="Picture"/>
+                    <pic:cNvPr descr="figures/method_overview.pdf" id="11" name="Picture"/>
                     <pic:cNvPicPr>
                       <a:picLocks noChangeArrowheads="1" noChangeAspect="1"/>
                     </pic:cNvPicPr>
@@ -206,7 +226,7 @@
                   <pic:spPr bwMode="auto">
                     <a:xfrm>
                       <a:off x="0" y="0"/>
-                      <a:ext cx="5257800" cy="1695450"/>
+                      <a:ext cx="5257800" cy="1701800"/>
                     </a:xfrm>
                     <a:prstGeom prst="rect">
                       <a:avLst/>
@@ -230,26 +250,189 @@
         <w:pStyle w:val="ImageCaption"/>
       </w:pPr>
       <w:r>
-        <w:t xml:space="preserve">Future transplantation. We generate two continuations from one simulator state, recompute the recipient with the donor future, and project the new action and one-chunk endpoint onto the recipient-to-donor direction. In Cosmos 3, we additionally replace future-token keys and values to test their contribution to the action shift.</w:t>
+        <w:t xml:space="preserve">Reachable-donor future transplantation. Two unmodified continuations start from the same simulator state. The recipient is recomputed with the donor future while its other inputs and random draws remain fixed. Signed projections measure movement from recipient behavior (0) toward donor behavior (1); K/V replacement then tests whether future-token activations carry that shift.</w:t>
       </w:r>
     </w:p>
     <w:bookmarkEnd w:id="12"/>
+    <w:bookmarkEnd w:id="13"/>
+    <w:bookmarkStart w:id="16" w:name="sec:related"/>
+    <w:p>
+      <w:pPr>
+        <w:pStyle w:val="Heading1"/>
+      </w:pPr>
+      <w:r>
+        <w:t xml:space="preserve">Related Work</w:t>
+      </w:r>
+    </w:p>
+    <w:bookmarkStart w:id="14" w:name="prediction-and-control."/>
+    <w:p>
+      <w:pPr>
+        <w:pStyle w:val="Heading4"/>
+      </w:pPr>
+      <w:r>
+        <w:t xml:space="preserve">Prediction and control.</w:t>
+      </w:r>
+    </w:p>
+    <w:p>
+      <w:pPr>
+        <w:pStyle w:val="FirstParagraph"/>
+      </w:pPr>
+      <w:r>
+        <w:t xml:space="preserve">Some visual robot policies generate future frames and infer actions from them; others condition action inference on predicted video representations</w:t>
+      </w:r>
+      <w:r>
+        <w:t xml:space="preserve"> </w:t>
+      </w:r>
+      <w:r>
+        <w:t xml:space="preserve">(Du et al. 2023; Hu et al. 2025)</w:t>
+      </w:r>
+      <w:r>
+        <w:t xml:space="preserve">. Joint video–action models instead learn future observations and controls in one model</w:t>
+      </w:r>
+      <w:r>
+        <w:t xml:space="preserve"> </w:t>
+      </w:r>
+      <w:r>
+        <w:t xml:space="preserve">(Guo et al. 2024; Li et al. 2025; Kim et al. 2026; NVIDIA 2026a; Ye et al. 2026)</w:t>
+      </w:r>
+      <w:r>
+        <w:t xml:space="preserve">. Their training objective does not determine whether a particular generated future is used at inference. UVA, for example, can omit video generation at test time</w:t>
+      </w:r>
+      <w:r>
+        <w:t xml:space="preserve"> </w:t>
+      </w:r>
+      <w:r>
+        <w:t xml:space="preserve">(Li et al. 2025)</w:t>
+      </w:r>
+      <w:r>
+        <w:t xml:space="preserve">. Explicit visual planners answer a different question by sampling alternatives, predicting their outcomes, and comparing them with a goal-dependent score</w:t>
+      </w:r>
+      <w:r>
+        <w:t xml:space="preserve"> </w:t>
+      </w:r>
+      <w:r>
+        <w:t xml:space="preserve">(Ebert et al. 2018; Du et al. 2024)</w:t>
+      </w:r>
+      <w:r>
+        <w:t xml:space="preserve">.</w:t>
+      </w:r>
+    </w:p>
     <w:p>
       <w:pPr>
         <w:pStyle w:val="BodyText"/>
       </w:pPr>
       <w:r>
-        <w:t xml:space="preserve">Transplanted futures steer actions and simulator endpoints toward the donor in both models. Cosmos Policy experiments further show much larger effects for camera futures than for future proprioception or isolated object-state changes. In Cosmos 3, replacing future-token keys and values substantially attenuates the action shift. These findings answer three successively narrower questions: whether future content affects action, which changes in that content matter in Cosmos Policy, and which attention activations contribute to the Cosmos 3 effect. Because the content and pathway experiments use different models, they do not form a single end-to-end mechanism. They also do not show that either model evaluates predicted task outcomes.</w:t>
-      </w:r>
-    </w:p>
-    <w:bookmarkEnd w:id="13"/>
-    <w:bookmarkStart w:id="14" w:name="sec:related"/>
+        <w:t xml:space="preserve">Recent WAM studies separate predictive training from the use of predictions during action generation. Fast-WAM removes explicit test-time rollout while retaining competitive performance in its evaluations</w:t>
+      </w:r>
+      <w:r>
+        <w:t xml:space="preserve"> </w:t>
+      </w:r>
+      <w:r>
+        <w:t xml:space="preserve">(Yuan et al. 2026)</w:t>
+      </w:r>
+      <w:r>
+        <w:t xml:space="preserve">; Faster-WAM retains a lower-cost future-conditioning route and reports improved robustness</w:t>
+      </w:r>
+      <w:r>
+        <w:t xml:space="preserve"> </w:t>
+      </w:r>
+      <w:r>
+        <w:t xml:space="preserve">(Zhao et al. 2026)</w:t>
+      </w:r>
+      <w:r>
+        <w:t xml:space="preserve">. AGRA finds that visually plausible foresight need not support reliable action inference in its studied architecture</w:t>
+      </w:r>
+      <w:r>
+        <w:t xml:space="preserve"> </w:t>
+      </w:r>
+      <w:r>
+        <w:t xml:space="preserve">(Qiu et al. 2026)</w:t>
+      </w:r>
+      <w:r>
+        <w:t xml:space="preserve">. RIFT directly establishes dependence on future-position values and their organization</w:t>
+      </w:r>
+      <w:r>
+        <w:t xml:space="preserve"> </w:t>
+      </w:r>
+      <w:r>
+        <w:t xml:space="preserve">(Zhang et al. 2026)</w:t>
+      </w:r>
+      <w:r>
+        <w:t xml:space="preserve">. Our contribution is complementary: we exchange two coherent, policy-generated alternatives and ask whether behavior follows the selected donor.</w:t>
+      </w:r>
+    </w:p>
+    <w:bookmarkEnd w:id="14"/>
+    <w:bookmarkStart w:id="15" w:name="mechanistic-interventions."/>
+    <w:p>
+      <w:pPr>
+        <w:pStyle w:val="Heading4"/>
+      </w:pPr>
+      <w:r>
+        <w:t xml:space="preserve">Mechanistic interventions.</w:t>
+      </w:r>
+    </w:p>
+    <w:p>
+      <w:pPr>
+        <w:pStyle w:val="FirstParagraph"/>
+      </w:pPr>
+      <w:r>
+        <w:t xml:space="preserve">Activation replacement tests whether an internal representation affects an output rather than merely being decodable from it</w:t>
+      </w:r>
+      <w:r>
+        <w:t xml:space="preserve"> </w:t>
+      </w:r>
+      <w:r>
+        <w:t xml:space="preserve">(Vig et al. 2020; Meng et al. 2022)</w:t>
+      </w:r>
+      <w:r>
+        <w:t xml:space="preserve">. Path patching extends this logic to specified computational routes</w:t>
+      </w:r>
+      <w:r>
+        <w:t xml:space="preserve"> </w:t>
+      </w:r>
+      <w:r>
+        <w:t xml:space="preserve">(Goldowsky-Dill et al. 2023)</w:t>
+      </w:r>
+      <w:r>
+        <w:t xml:space="preserve">. Conclusions can depend on the counterfactual pair and metric</w:t>
+      </w:r>
+      <w:r>
+        <w:t xml:space="preserve"> </w:t>
+      </w:r>
+      <w:r>
+        <w:t xml:space="preserve">(Zhang and Nanda 2024)</w:t>
+      </w:r>
+      <w:r>
+        <w:t xml:space="preserve">, while multi-component effects need not add when patched and unpatched routes interact</w:t>
+      </w:r>
+      <w:r>
+        <w:t xml:space="preserve"> </w:t>
+      </w:r>
+      <w:r>
+        <w:t xml:space="preserve">(Vaidyanathan et al. 2026)</w:t>
+      </w:r>
+      <w:r>
+        <w:t xml:space="preserve">. We therefore treat K/V replacement as evidence for an active pathway, not a complete circuit decomposition.</w:t>
+      </w:r>
+    </w:p>
+    <w:bookmarkEnd w:id="15"/>
+    <w:bookmarkEnd w:id="16"/>
+    <w:bookmarkStart w:id="24" w:name="sec:methods"/>
     <w:p>
       <w:pPr>
         <w:pStyle w:val="Heading1"/>
       </w:pPr>
       <w:r>
-        <w:t xml:space="preserve">Related Work</w:t>
+        <w:t xml:space="preserve">Methods</w:t>
+      </w:r>
+    </w:p>
+    <w:bookmarkStart w:id="17" w:name="Xf0705b5aec3ba6ca91c2cc5d339e58d96b08c49"/>
+    <w:p>
+      <w:pPr>
+        <w:pStyle w:val="Heading2"/>
+      </w:pPr>
+      <w:r>
+        <w:t xml:space="preserve">Future transplantation and directional projection</w:t>
       </w:r>
     </w:p>
     <w:p>
@@ -257,140 +440,7 @@
         <w:pStyle w:val="FirstParagraph"/>
       </w:pPr>
       <w:r>
-        <w:t xml:space="preserve">Robot policies use predicted visual futures through several interfaces. Some methods first generate a future video and then infer actions from that video or its representation</w:t>
-      </w:r>
-      <w:r>
-        <w:t xml:space="preserve"> </w:t>
-      </w:r>
-      <w:r>
-        <w:t xml:space="preserve">(Hu et al. 2025; Du et al. 2023)</w:t>
-      </w:r>
-      <w:r>
-        <w:t xml:space="preserve">. Others model video and actions jointly</w:t>
-      </w:r>
-      <w:r>
-        <w:t xml:space="preserve"> </w:t>
-      </w:r>
-      <w:r>
-        <w:t xml:space="preserve">(Guo et al. 2024; Li et al. 2025; Kim et al. 2026; NVIDIA 2026a)</w:t>
-      </w:r>
-      <w:r>
-        <w:t xml:space="preserve">. Joint training does not require that a model generate or use video at inference time; UVA, for example, can omit video generation during inference</w:t>
-      </w:r>
-      <w:r>
-        <w:t xml:space="preserve"> </w:t>
-      </w:r>
-      <w:r>
-        <w:t xml:space="preserve">(Li et al. 2025)</w:t>
-      </w:r>
-      <w:r>
-        <w:t xml:space="preserve">. Explicit visual planners instead generate candidate actions or subgoals, predict their outcomes, and compare those outcomes using a goal or value function</w:t>
-      </w:r>
-      <w:r>
-        <w:t xml:space="preserve"> </w:t>
-      </w:r>
-      <w:r>
-        <w:t xml:space="preserve">(Ebert et al. 2018; Du et al. 2024)</w:t>
-      </w:r>
-      <w:r>
-        <w:t xml:space="preserve">.</w:t>
-      </w:r>
-    </w:p>
-    <w:p>
-      <w:pPr>
-        <w:pStyle w:val="BodyText"/>
-      </w:pPr>
-      <w:r>
-        <w:t xml:space="preserve">Recent WAM studies have begun to separate predictive training from the use of predictions during action generation. Fast-WAM removes explicit future rollout while retaining competitive policy performance</w:t>
-      </w:r>
-      <w:r>
-        <w:t xml:space="preserve"> </w:t>
-      </w:r>
-      <w:r>
-        <w:t xml:space="preserve">(Yuan et al. 2026)</w:t>
-      </w:r>
-      <w:r>
-        <w:t xml:space="preserve">. Faster-WAM keeps a lower-cost connection from future representations to actions and reports improved robustness in its evaluation settings</w:t>
-      </w:r>
-      <w:r>
-        <w:t xml:space="preserve"> </w:t>
-      </w:r>
-      <w:r>
-        <w:t xml:space="preserve">(Zhao et al. 2026)</w:t>
-      </w:r>
-      <w:r>
-        <w:t xml:space="preserve">. AGRA finds that visually plausible predictions do not necessarily support reliable action inference in one architecture</w:t>
-      </w:r>
-      <w:r>
-        <w:t xml:space="preserve"> </w:t>
-      </w:r>
-      <w:r>
-        <w:t xml:space="preserve">(Qiu et al. 2026)</w:t>
-      </w:r>
-      <w:r>
-        <w:t xml:space="preserve">. RIFT directly intervenes on activations at future positions</w:t>
-      </w:r>
-      <w:r>
-        <w:t xml:space="preserve"> </w:t>
-      </w:r>
-      <w:r>
-        <w:t xml:space="preserve">(Zhang et al. 2026)</w:t>
-      </w:r>
-      <w:r>
-        <w:t xml:space="preserve">. We instead replace one naturally generated future with another and test whether the action follows the selected donor.</w:t>
-      </w:r>
-    </w:p>
-    <w:p>
-      <w:pPr>
-        <w:pStyle w:val="BodyText"/>
-      </w:pPr>
-      <w:r>
-        <w:t xml:space="preserve">Future transplantation is an activation-replacement intervention. Such methods distinguish information that is merely decodable from information that affects a model’s output</w:t>
-      </w:r>
-      <w:r>
-        <w:t xml:space="preserve"> </w:t>
-      </w:r>
-      <w:r>
-        <w:t xml:space="preserve">(Pearl 2001; Meng et al. 2022; Goldowsky-Dill et al. 2023; Zhang and Nanda 2024)</w:t>
-      </w:r>
-      <w:r>
-        <w:t xml:space="preserve">. A replacement can affect several computational routes at once, and untouched activations may compensate for it</w:t>
-      </w:r>
-      <w:r>
-        <w:t xml:space="preserve"> </w:t>
-      </w:r>
-      <w:r>
-        <w:t xml:space="preserve">(Vaidyanathan et al. 2026)</w:t>
-      </w:r>
-      <w:r>
-        <w:t xml:space="preserve">. We therefore use the Cosmos 3 intervention only to test whether future-token keys and values contribute to the action shift, not to claim a complete causal decomposition.</w:t>
-      </w:r>
-    </w:p>
-    <w:bookmarkEnd w:id="14"/>
-    <w:bookmarkStart w:id="18" w:name="sec:method"/>
-    <w:p>
-      <w:pPr>
-        <w:pStyle w:val="Heading1"/>
-      </w:pPr>
-      <w:r>
-        <w:t xml:space="preserve">Methods</w:t>
-      </w:r>
-    </w:p>
-    <w:bookmarkStart w:id="15" w:name="Xf0705b5aec3ba6ca91c2cc5d339e58d96b08c49"/>
-    <w:p>
-      <w:pPr>
-        <w:pStyle w:val="Heading2"/>
-      </w:pPr>
-      <w:r>
-        <w:t xml:space="preserve">Future transplantation and directional projection</w:t>
-      </w:r>
-    </w:p>
-    <w:p>
-      <w:pPr>
-        <w:pStyle w:val="FirstParagraph"/>
-      </w:pPr>
-      <w:r>
-        <w:t xml:space="preserve">Let</w:t>
+        <w:t xml:space="preserve">Let saved simulator state</w:t>
       </w:r>
       <w:r>
         <w:t xml:space="preserve"> </w:t>
@@ -404,21 +454,7 @@
         <w:t xml:space="preserve"> </w:t>
       </w:r>
       <w:r>
-        <w:t xml:space="preserve">be a saved simulator state. Two runs of the unmodified policy from</w:t>
-      </w:r>
-      <w:r>
-        <w:t xml:space="preserve"> </w:t>
-      </w:r>
-      <m:oMath>
-        <m:r>
-          <m:t>S</m:t>
-        </m:r>
-      </m:oMath>
-      <w:r>
-        <w:t xml:space="preserve"> </w:t>
-      </w:r>
-      <w:r>
-        <w:t xml:space="preserve">produce branches</w:t>
+        <w:t xml:space="preserve">admit two unmodified branches</w:t>
       </w:r>
       <w:r>
         <w:t xml:space="preserve"> </w:t>
@@ -461,17 +497,12 @@
             </m:r>
           </m:sub>
         </m:sSub>
-      </m:oMath>
-      <w:r>
-        <w:t xml:space="preserve"> </w:t>
-      </w:r>
-      <w:r>
-        <w:t xml:space="preserve">and</w:t>
-      </w:r>
-      <w:r>
-        <w:t xml:space="preserve"> </w:t>
-      </w:r>
-      <m:oMath>
+        <m:r>
+          <m:rPr>
+            <m:sty m:val="p"/>
+          </m:rPr>
+          <m:t>,</m:t>
+        </m:r>
         <m:sSub>
           <m:e>
             <m:r>
@@ -507,17 +538,12 @@
             </m:r>
           </m:sub>
         </m:sSub>
-      </m:oMath>
-      <w:r>
-        <w:t xml:space="preserve"> </w:t>
-      </w:r>
-      <w:r>
-        <w:t xml:space="preserve">and</w:t>
-      </w:r>
-      <w:r>
-        <w:t xml:space="preserve"> </w:t>
-      </w:r>
-      <m:oMath>
+        <m:r>
+          <m:rPr>
+            <m:sty m:val="p"/>
+          </m:rPr>
+          <m:t>,</m:t>
+        </m:r>
         <m:sSub>
           <m:e>
             <m:r>
@@ -556,17 +582,12 @@
             </m:r>
           </m:sub>
         </m:sSub>
-      </m:oMath>
-      <w:r>
-        <w:t xml:space="preserve"> </w:t>
-      </w:r>
-      <w:r>
-        <w:t xml:space="preserve">and</w:t>
-      </w:r>
-      <w:r>
-        <w:t xml:space="preserve"> </w:t>
-      </w:r>
-      <m:oMath>
+        <m:r>
+          <m:rPr>
+            <m:sty m:val="p"/>
+          </m:rPr>
+          <m:t>,</m:t>
+        </m:r>
         <m:sSub>
           <m:e>
             <m:r>
@@ -615,15 +636,7 @@
         <w:t xml:space="preserve"> </w:t>
       </w:r>
       <w:r>
-        <w:t xml:space="preserve">the donor.</w:t>
-      </w:r>
-    </w:p>
-    <w:p>
-      <w:pPr>
-        <w:pStyle w:val="BodyText"/>
-      </w:pPr>
-      <w:r>
-        <w:t xml:space="preserve">To recompute branch</w:t>
+        <w:t xml:space="preserve">the donor. To recompute</w:t>
       </w:r>
       <w:r>
         <w:t xml:space="preserve"> </w:t>
@@ -634,7 +647,7 @@
         </m:r>
       </m:oMath>
       <w:r>
-        <w:t xml:space="preserve">, we restore the same state and observation. We keep the instruction, action-noise realization, future-noise realization, solver, and denoising schedule fixed, but replace</w:t>
+        <w:t xml:space="preserve">, we restore the same state and observation, retain its instruction, action noise, future-noise path, solver, and denoising schedule, and replace only</w:t>
       </w:r>
       <w:r>
         <w:t xml:space="preserve"> </w:t>
@@ -677,32 +690,15 @@
         </m:sSub>
       </m:oMath>
       <w:r>
-        <w:t xml:space="preserve">. We also reverse the roles of</w:t>
-      </w:r>
-      <w:r>
-        <w:t xml:space="preserve"> </w:t>
-      </w:r>
-      <m:oMath>
-        <m:r>
-          <m:t>A</m:t>
-        </m:r>
-      </m:oMath>
-      <w:r>
-        <w:t xml:space="preserve"> </w:t>
-      </w:r>
-      <w:r>
-        <w:t xml:space="preserve">and</w:t>
-      </w:r>
-      <w:r>
-        <w:t xml:space="preserve"> </w:t>
-      </w:r>
-      <m:oMath>
-        <m:r>
-          <m:t>B</m:t>
-        </m:r>
-      </m:oMath>
-      <w:r>
-        <w:t xml:space="preserve">. For either an action chunk or endpoint, let</w:t>
+        <w:t xml:space="preserve">. We also reverse the branch roles.</w:t>
+      </w:r>
+    </w:p>
+    <w:p>
+      <w:pPr>
+        <w:pStyle w:val="BodyText"/>
+      </w:pPr>
+      <w:r>
+        <w:t xml:space="preserve">For an action or endpoint</w:t>
       </w:r>
       <w:r>
         <w:t xml:space="preserve"> </w:t>
@@ -752,31 +748,7 @@
         </m:r>
       </m:oMath>
       <w:r>
-        <w:t xml:space="preserve">. We measure the projection of an intervened output</w:t>
-      </w:r>
-      <w:r>
-        <w:t xml:space="preserve"> </w:t>
-      </w:r>
-      <m:oMath>
-        <m:acc>
-          <m:accPr>
-            <m:chr m:val="̂"/>
-          </m:accPr>
-          <m:e>
-            <m:r>
-              <m:rPr>
-                <m:sty m:val="bi"/>
-              </m:rPr>
-              <m:t>x</m:t>
-            </m:r>
-          </m:e>
-        </m:acc>
-      </m:oMath>
-      <w:r>
-        <w:t xml:space="preserve"> </w:t>
-      </w:r>
-      <w:r>
-        <w:t xml:space="preserve">onto the recipient-to-donor direction:</w:t>
+        <w:t xml:space="preserve">, normalized donor projection is</w:t>
       </w:r>
     </w:p>
     <w:p>
@@ -1038,7 +1010,7 @@
         <w:pStyle w:val="FirstParagraph"/>
       </w:pPr>
       <w:r>
-        <w:t xml:space="preserve">The recipient has projection 0 and the donor has projection 1. We also recompute the recipient with its own future and define</w:t>
+        <w:t xml:space="preserve">The recipient is 0 and the donor is 1; negative values move away from the donor and values above 1 overshoot it. The primary steering contrast subtracts the corresponding self-future recomputation:</w:t>
       </w:r>
     </w:p>
     <w:p>
@@ -1267,17 +1239,26 @@
         <w:pStyle w:val="FirstParagraph"/>
       </w:pPr>
       <w:r>
-        <w:t xml:space="preserve">A positive value means that the donor future moves the output toward the donor behavior. An arbitrary perturbation can change the output substantially while having zero or negative projection.</w:t>
-      </w:r>
-    </w:p>
-    <w:bookmarkEnd w:id="15"/>
-    <w:bookmarkStart w:id="16" w:name="models-states-and-controls"/>
+        <w:t xml:space="preserve">Pairs are selected using native action and endpoint separation, never intervention outcomes. Every endpoint arm is executed after restoring the exact simulator state.</w:t>
+      </w:r>
+    </w:p>
+    <w:bookmarkEnd w:id="17"/>
+    <w:bookmarkStart w:id="20" w:name="models-populations-and-controls"/>
     <w:p>
       <w:pPr>
         <w:pStyle w:val="Heading2"/>
       </w:pPr>
       <w:r>
-        <w:t xml:space="preserve">Models, states, and controls</w:t>
+        <w:t xml:space="preserve">Models, populations, and controls</w:t>
+      </w:r>
+    </w:p>
+    <w:bookmarkStart w:id="18" w:name="cosmos-policy."/>
+    <w:p>
+      <w:pPr>
+        <w:pStyle w:val="Heading4"/>
+      </w:pPr>
+      <w:r>
+        <w:t xml:space="preserve">Cosmos Policy.</w:t>
       </w:r>
     </w:p>
     <w:p>
@@ -1285,7 +1266,7 @@
         <w:pStyle w:val="FirstParagraph"/>
       </w:pPr>
       <w:r>
-        <w:t xml:space="preserve">For Cosmos Policy, we use the</w:t>
+        <w:t xml:space="preserve">We evaluate the public</w:t>
       </w:r>
       <w:r>
         <w:t xml:space="preserve"> </w:t>
@@ -1300,7 +1281,7 @@
         <w:t xml:space="preserve"> </w:t>
       </w:r>
       <w:r>
-        <w:t xml:space="preserve">checkpoint in direct-policy mode on the ten long-horizon LIBERO tasks, which we call LIBERO-10</w:t>
+        <w:t xml:space="preserve">checkpoint in direct-policy mode on LIBERO-Long, also called LIBERO-10</w:t>
       </w:r>
       <w:r>
         <w:t xml:space="preserve"> </w:t>
@@ -1309,15 +1290,25 @@
         <w:t xml:space="preserve">(Kim et al. 2026; Liu et al. 2023)</w:t>
       </w:r>
       <w:r>
-        <w:t xml:space="preserve">. The prespecified evaluation set contains 30 states: one per task at the first policy query, after three action chunks, and after six action chunks. At each state, eight unmodified runs are used to select one pair based only on action and endpoint distance. We evaluate both transplant directions with three future-noise draws each.</w:t>
-      </w:r>
-    </w:p>
-    <w:p>
-      <w:pPr>
-        <w:pStyle w:val="BodyText"/>
-      </w:pPr>
-      <w:r>
-        <w:t xml:space="preserve">For Cosmos 3, we intervene in the 36-layer diffusion-generator component of the 16B</w:t>
+        <w:t xml:space="preserve">. The frozen grid contains 30 states: ten tasks crossed with the first query, a state after three open-loop chunks, and a state after six chunks. Eight native runs determine one reciprocal donor pair per state; three future-noise draws are repeated within direction. Endpoints concatenate goal-relevant simulator coordinates with the official nine-dimensional proprioceptive endpoint.</w:t>
+      </w:r>
+    </w:p>
+    <w:bookmarkEnd w:id="18"/>
+    <w:bookmarkStart w:id="19" w:name="cosmos-3."/>
+    <w:p>
+      <w:pPr>
+        <w:pStyle w:val="Heading4"/>
+      </w:pPr>
+      <w:r>
+        <w:t xml:space="preserve">Cosmos 3.</w:t>
+      </w:r>
+    </w:p>
+    <w:p>
+      <w:pPr>
+        <w:pStyle w:val="FirstParagraph"/>
+      </w:pPr>
+      <w:r>
+        <w:t xml:space="preserve">We evaluate the 16B</w:t>
       </w:r>
       <w:r>
         <w:t xml:space="preserve"> </w:t>
@@ -1332,25 +1323,16 @@
         <w:t xml:space="preserve"> </w:t>
       </w:r>
       <w:r>
-        <w:t xml:space="preserve">checkpoint, where future-video and action coordinates are jointly denoised</w:t>
-      </w:r>
-      <w:r>
-        <w:t xml:space="preserve"> </w:t>
-      </w:r>
-      <w:r>
-        <w:t xml:space="preserve">(NVIDIA 2026a, 2026b)</w:t>
-      </w:r>
-      <w:r>
-        <w:t xml:space="preserve">. We evaluate one state from each of four RoboLab tasks selected without intervention outcomes</w:t>
-      </w:r>
-      <w:r>
-        <w:t xml:space="preserve"> </w:t>
-      </w:r>
-      <w:r>
-        <w:t xml:space="preserve">(Yang et al. 2026)</w:t>
-      </w:r>
-      <w:r>
-        <w:t xml:space="preserve">. These states provide 12 donor continuations. Each donor is tested with its model-predicted future and with a future encoded from the video produced by executing the donor action. A fifth Banana state is reserved for the held-out key–value experiment.</w:t>
+        <w:t xml:space="preserve">checkpoint on six eligible RoboLab tasks</w:t>
+      </w:r>
+      <w:r>
+        <w:t xml:space="preserve"> </w:t>
+      </w:r>
+      <w:r>
+        <w:t xml:space="preserve">(NVIDIA 2026a, 2026b; Yang et al. 2026)</w:t>
+      </w:r>
+      <w:r>
+        <w:t xml:space="preserve">. Its diffusion generator has 36 two-way full-attention layers, four denoising calls, 33 raw video frames mapped to nine VAE latent frames, and 32 absolute joint-position actions. The transplant targets unconditioned future-video coordinates at the final guided-sampler boundary. A frozen screen selected 24 state clusters, capped at four per task, using only native success, action and endpoint separation, and replay validity. Twenty-two completed. Two source branches ended before producing full 33-frame videos and were left missing rather than replaced. Reciprocal directions and predicted versus executed future sources are repeated measurements within state.</w:t>
       </w:r>
     </w:p>
     <w:p>
@@ -1358,7 +1340,26 @@
         <w:pStyle w:val="BodyText"/>
       </w:pPr>
       <w:r>
-        <w:t xml:space="preserve">Controls use the recipient’s own future, Gaussian noise matched to the donor future’s norm and distance from the recipient, and a within-task shuffled future. No-op recomputations verify that the intervention code leaves unmodified runs unchanged. At each patched Cosmos 3 attention operation, we replace only keys and values belonging to future-video tokens; no action coordinate or action-token key or value is patched directly.</w:t>
+        <w:t xml:space="preserve">Controls include exact self-future recomputation, Gaussian targets matched to the donor in norm and recipient distance, a prespecified natural-future control, within-task shuffled futures, and bitwise no-op checks. For Cosmos 3, identity layout capture, sampler wrapping, cache record/replay, and self patches reproduce actions bitwise; sentinels confirm that the transplant does not directly write to action coordinates. Executed-future conditions encode video from reachable donor actions and replay the same environment prefix before intervention.</w:t>
+      </w:r>
+    </w:p>
+    <w:bookmarkEnd w:id="19"/>
+    <w:bookmarkEnd w:id="20"/>
+    <w:bookmarkStart w:id="21" w:name="robot-and-object-interventions"/>
+    <w:p>
+      <w:pPr>
+        <w:pStyle w:val="Heading2"/>
+      </w:pPr>
+      <w:r>
+        <w:t xml:space="preserve">Robot and object interventions</w:t>
+      </w:r>
+    </w:p>
+    <w:p>
+      <w:pPr>
+        <w:pStyle w:val="FirstParagraph"/>
+      </w:pPr>
+      <w:r>
+        <w:t xml:space="preserve">We isolate content in complementary ways. In Cosmos Policy, first-query interventions replace the wrist-camera future, primary-camera future, or future proprioception separately. A second study crosses binary robot and object states in re-rendered videos at 20 held-out states. A decoder checks whether the intended cell remains visible. A natural-pair screen separately searches policy-generated continuations for robot-divergent/object-matched and object-divergent/robot-matched futures; only four states meet its criteria, below the planned minimum of ten.</w:t>
       </w:r>
     </w:p>
     <w:p>
@@ -1366,7 +1367,87 @@
         <w:pStyle w:val="BodyText"/>
       </w:pPr>
       <w:r>
-        <w:t xml:space="preserve">The independent unit is a restored simulator state. Reciprocal directions, donors, noise draws, and process launches are repeated measurements of that state. We average within each state and compute 95% confidence intervals with 10,000 cluster-bootstrap resamples over states</w:t>
+        <w:t xml:space="preserve">For Cosmos 3, a separately frozen factor study selected 12 population states round-robin by native object-position separation. Ten completed across all six tasks. Starting from the recipient video, an object-priority disjoint mask copies donor object pixels, donor robot pixels outside the object mask, both, or neither. This</w:t>
+      </w:r>
+      <w:r>
+        <w:t xml:space="preserve"> </w:t>
+      </w:r>
+      <m:oMath>
+        <m:r>
+          <m:t>2</m:t>
+        </m:r>
+        <m:r>
+          <m:rPr>
+            <m:sty m:val="p"/>
+          </m:rPr>
+          <m:t>×</m:t>
+        </m:r>
+        <m:r>
+          <m:t>2</m:t>
+        </m:r>
+      </m:oMath>
+      <w:r>
+        <w:t xml:space="preserve"> </w:t>
+      </w:r>
+      <w:r>
+        <w:t xml:space="preserve">design tests isolated pixel factors; it does not guarantee an in-distribution video or isolate a latent semantic variable.</w:t>
+      </w:r>
+    </w:p>
+    <w:bookmarkEnd w:id="21"/>
+    <w:bookmarkStart w:id="22" w:name="kv-interventions"/>
+    <w:p>
+      <w:pPr>
+        <w:pStyle w:val="Heading2"/>
+      </w:pPr>
+      <w:r>
+        <w:t xml:space="preserve">K/V interventions</w:t>
+      </w:r>
+    </w:p>
+    <w:p>
+      <w:pPr>
+        <w:pStyle w:val="FirstParagraph"/>
+      </w:pPr>
+      <w:r>
+        <w:t xml:space="preserve">In Cosmos Policy, action queries can attend to future keys. We continuously gate future keys at prespecified block 27, with exact all-key recomputation, equal-count random-key and current-key controls, and a block-0 control. This removal changes attention normalization, so it tests whether a late future-to-action edge is active, not the information carried by a token-count-preserving route.</w:t>
+      </w:r>
+    </w:p>
+    <w:p>
+      <w:pPr>
+        <w:pStyle w:val="BodyText"/>
+      </w:pPr>
+      <w:r>
+        <w:t xml:space="preserve">Cosmos 3 permits the stronger replacement test. We record future-video keys and values from a self-future run, then substitute them for donor-run future-token K/V at the frozen direct interface. Token count, token order, current-video K/V, text K/V, action K/V, observation, instruction, and noise remain fixed. Layer and pathway choices were frozen on excluded calibration tasks before the 22-state population intervention. We report</w:t>
+      </w:r>
+      <w:r>
+        <w:t xml:space="preserve"> </w:t>
+      </w:r>
+      <w:r>
+        <w:rPr>
+          <w:i/>
+          <w:iCs/>
+        </w:rPr>
+        <w:t xml:space="preserve">K/V replacement loss</w:t>
+      </w:r>
+      <w:r>
+        <w:t xml:space="preserve">: the reduction in donor projection after substituting self-future K/V. This is an operational intervention contrast, not a population natural indirect effect.</w:t>
+      </w:r>
+    </w:p>
+    <w:bookmarkEnd w:id="22"/>
+    <w:bookmarkStart w:id="23" w:name="statistical-analysis"/>
+    <w:p>
+      <w:pPr>
+        <w:pStyle w:val="Heading2"/>
+      </w:pPr>
+      <w:r>
+        <w:t xml:space="preserve">Statistical analysis</w:t>
+      </w:r>
+    </w:p>
+    <w:p>
+      <w:pPr>
+        <w:pStyle w:val="FirstParagraph"/>
+      </w:pPr>
+      <w:r>
+        <w:t xml:space="preserve">The independent unit is a restored simulator state. We first average reciprocal directions, donors, noise draws, and process repeats within state, then form 95% percentile intervals from 10,000 bootstrap resamples of states</w:t>
       </w:r>
       <w:r>
         <w:t xml:space="preserve"> </w:t>
@@ -1375,7 +1456,21 @@
         <w:t xml:space="preserve">(Field and Welsh 2007)</w:t>
       </w:r>
       <w:r>
-        <w:t xml:space="preserve">. For Cosmos 3, this is equivalent to resampling the four tasks. The prespecified smallest effect of interest for the confirmatory Cosmos Policy Predict2 experiments is 0.10 projection units</w:t>
+        <w:t xml:space="preserve">. Task-balanced sensitivity analyses average states within task before resampling tasks. We prespecified</w:t>
+      </w:r>
+      <w:r>
+        <w:t xml:space="preserve"> </w:t>
+      </w:r>
+      <m:oMath>
+        <m:r>
+          <m:t>0.10</m:t>
+        </m:r>
+      </m:oMath>
+      <w:r>
+        <w:t xml:space="preserve"> </w:t>
+      </w:r>
+      <w:r>
+        <w:t xml:space="preserve">projection units—10% of the native recipient-to-donor displacement—as the smallest effect of interest for the Cosmos Policy confirmatory family and the Cosmos 3 population and factor families</w:t>
       </w:r>
       <w:r>
         <w:t xml:space="preserve"> </w:t>
@@ -1384,17 +1479,38 @@
         <w:t xml:space="preserve">(Lakens 2017)</w:t>
       </w:r>
       <w:r>
-        <w:t xml:space="preserve">.</w:t>
-      </w:r>
-    </w:p>
-    <w:bookmarkEnd w:id="16"/>
-    <w:bookmarkStart w:id="17" w:name="content-and-pathway-interventions"/>
+        <w:t xml:space="preserve">. Prespecified primary sign-test</w:t>
+      </w:r>
+      <w:r>
+        <w:t xml:space="preserve"> </w:t>
+      </w:r>
+      <m:oMath>
+        <m:r>
+          <m:t>p</m:t>
+        </m:r>
+      </m:oMath>
+      <w:r>
+        <w:t xml:space="preserve">-values use Holm correction.</w:t>
+      </w:r>
+    </w:p>
+    <w:bookmarkEnd w:id="23"/>
+    <w:bookmarkEnd w:id="24"/>
+    <w:bookmarkStart w:id="38" w:name="sec:results"/>
+    <w:p>
+      <w:pPr>
+        <w:pStyle w:val="Heading1"/>
+      </w:pPr>
+      <w:r>
+        <w:t xml:space="preserve">Results</w:t>
+      </w:r>
+    </w:p>
+    <w:bookmarkStart w:id="31" w:name="sec:steering"/>
     <w:p>
       <w:pPr>
         <w:pStyle w:val="Heading2"/>
       </w:pPr>
       <w:r>
-        <w:t xml:space="preserve">Content and pathway interventions</w:t>
+        <w:t xml:space="preserve">Do coherent futures steer behavior?</w:t>
       </w:r>
     </w:p>
     <w:p>
@@ -1402,91 +1518,298 @@
         <w:pStyle w:val="FirstParagraph"/>
       </w:pPr>
       <w:r>
-        <w:t xml:space="preserve">We use three experiments to identify which changes in a Cosmos Policy future are associated with the action shift. First, at the ten first-query states, we replace the wrist-camera future, primary-camera future, or future proprioception separately. Second, at 20 held-out states, we independently re-render binary robot state</w:t>
-      </w:r>
-      <w:r>
-        <w:t xml:space="preserve"> </w:t>
-      </w:r>
-      <m:oMath>
-        <m:r>
-          <m:t>R</m:t>
-        </m:r>
-      </m:oMath>
-      <w:r>
-        <w:t xml:space="preserve"> </w:t>
-      </w:r>
-      <w:r>
-        <w:t xml:space="preserve">and object state</w:t>
-      </w:r>
-      <w:r>
-        <w:t xml:space="preserve"> </w:t>
-      </w:r>
-      <m:oMath>
-        <m:r>
-          <m:t>O</m:t>
-        </m:r>
-      </m:oMath>
-      <w:r>
-        <w:t xml:space="preserve">, producing four</w:t>
-      </w:r>
-      <w:r>
-        <w:t xml:space="preserve"> </w:t>
-      </w:r>
-      <m:oMath>
-        <m:r>
-          <m:t>2</m:t>
-        </m:r>
-        <m:r>
-          <m:rPr>
-            <m:sty m:val="p"/>
-          </m:rPr>
-          <m:t>×</m:t>
-        </m:r>
-        <m:r>
-          <m:t>2</m:t>
-        </m:r>
-      </m:oMath>
-      <w:r>
-        <w:t xml:space="preserve"> </w:t>
-      </w:r>
-      <w:r>
-        <w:t xml:space="preserve">combinations per state. A decoder identifies the intended combination in 74/80 primary-camera videos and 79/80 wrist-camera videos, confirming that the manipulation is visible in both views. The available analysis reports the object-state main effect, but not the robot-state main effect. Third, we search unmodified policy continuations for natural pairs that differ primarily in robot motion or object state. Only four states meet the matching criteria, below the prespecified minimum of ten, so this analysis is exploratory.</w:t>
-      </w:r>
-    </w:p>
-    <w:p>
-      <w:pPr>
-        <w:pStyle w:val="BodyText"/>
-      </w:pPr>
-      <w:r>
-        <w:t xml:space="preserve">For the Cosmos 3 pathway experiment, we record future-token keys and values from a recipient-future run, then replace the corresponding activations during a donor-future run. We test replacement at layer 16, at every direct future-to-action attention read, and at those direct reads plus future-to-current-video reads that can carry future information to the action indirectly. Four states are used to calibrate these schemes. We then freeze the interventions and apply them unchanged to the held-out Banana state. We report the decrease in donor projection caused by each replacement. This is an intervention effect, not a formal mediation estimate.</w:t>
-      </w:r>
-    </w:p>
-    <w:bookmarkEnd w:id="17"/>
-    <w:bookmarkEnd w:id="18"/>
-    <w:bookmarkStart w:id="36" w:name="sec:results"/>
-    <w:p>
-      <w:pPr>
-        <w:pStyle w:val="Heading1"/>
-      </w:pPr>
-      <w:r>
-        <w:t xml:space="preserve">Results</w:t>
-      </w:r>
-    </w:p>
-    <w:bookmarkStart w:id="25" w:name="sec:directionality"/>
-    <w:p>
-      <w:pPr>
-        <w:pStyle w:val="Heading2"/>
-      </w:pPr>
-      <w:r>
-        <w:t xml:space="preserve">Coherent donor futures steer actions toward donor behavior</w:t>
-      </w:r>
-    </w:p>
-    <w:bookmarkStart w:id="19" w:name="cosmos-policy."/>
+        <w:rPr>
+          <w:b/>
+          <w:bCs/>
+        </w:rPr>
+        <w:t xml:space="preserve">Yes: coherent donor futures steer both actions and their one-chunk simulator endpoints.</w:t>
+      </w:r>
+    </w:p>
+    <w:bookmarkStart w:id="25" w:name="cosmos-3.-1"/>
     <w:p>
       <w:pPr>
         <w:pStyle w:val="Heading4"/>
       </w:pPr>
       <w:r>
+        <w:t xml:space="preserve">Cosmos 3.</w:t>
+      </w:r>
+    </w:p>
+    <w:p>
+      <w:pPr>
+        <w:pStyle w:val="FirstParagraph"/>
+      </w:pPr>
+      <w:r>
+        <w:t xml:space="preserve">Across 22 completed states and all six tasks, predicted-future action steering is</w:t>
+      </w:r>
+      <w:r>
+        <w:t xml:space="preserve"> </w:t>
+      </w:r>
+      <m:oMath>
+        <m:r>
+          <m:t>0.992</m:t>
+        </m:r>
+      </m:oMath>
+      <w:r>
+        <w:t xml:space="preserve"> </w:t>
+      </w:r>
+      <w:r>
+        <w:t xml:space="preserve">(95% state-bootstrap CI</w:t>
+      </w:r>
+      <w:r>
+        <w:t xml:space="preserve"> </w:t>
+      </w:r>
+      <m:oMath>
+        <m:r>
+          <m:rPr>
+            <m:sty m:val="p"/>
+          </m:rPr>
+          <m:t>[</m:t>
+        </m:r>
+        <m:r>
+          <m:t>0.972</m:t>
+        </m:r>
+        <m:r>
+          <m:rPr>
+            <m:sty m:val="p"/>
+          </m:rPr>
+          <m:t>,</m:t>
+        </m:r>
+        <m:r>
+          <m:t>1.010</m:t>
+        </m:r>
+        <m:r>
+          <m:rPr>
+            <m:sty m:val="p"/>
+          </m:rPr>
+          <m:t>]</m:t>
+        </m:r>
+      </m:oMath>
+      <w:r>
+        <w:t xml:space="preserve">), positive in 22/22 states. It is</w:t>
+      </w:r>
+      <w:r>
+        <w:t xml:space="preserve"> </w:t>
+      </w:r>
+      <m:oMath>
+        <m:r>
+          <m:t>0.433</m:t>
+        </m:r>
+      </m:oMath>
+      <w:r>
+        <w:t xml:space="preserve"> </w:t>
+      </w:r>
+      <w:r>
+        <w:t xml:space="preserve">(</w:t>
+      </w:r>
+      <m:oMath>
+        <m:r>
+          <m:rPr>
+            <m:sty m:val="p"/>
+          </m:rPr>
+          <m:t>[</m:t>
+        </m:r>
+        <m:r>
+          <m:t>0.332</m:t>
+        </m:r>
+        <m:r>
+          <m:rPr>
+            <m:sty m:val="p"/>
+          </m:rPr>
+          <m:t>,</m:t>
+        </m:r>
+        <m:r>
+          <m:t>0.538</m:t>
+        </m:r>
+        <m:r>
+          <m:rPr>
+            <m:sty m:val="p"/>
+          </m:rPr>
+          <m:t>]</m:t>
+        </m:r>
+      </m:oMath>
+      <w:r>
+        <w:t xml:space="preserve">) above the natural-future control. Futures encoded from executed donor branches yield action steering of</w:t>
+      </w:r>
+      <w:r>
+        <w:t xml:space="preserve"> </w:t>
+      </w:r>
+      <m:oMath>
+        <m:r>
+          <m:t>0.983</m:t>
+        </m:r>
+      </m:oMath>
+      <w:r>
+        <w:t xml:space="preserve"> </w:t>
+      </w:r>
+      <w:r>
+        <w:t xml:space="preserve">(</w:t>
+      </w:r>
+      <m:oMath>
+        <m:r>
+          <m:rPr>
+            <m:sty m:val="p"/>
+          </m:rPr>
+          <m:t>[</m:t>
+        </m:r>
+        <m:r>
+          <m:t>0.890</m:t>
+        </m:r>
+        <m:r>
+          <m:rPr>
+            <m:sty m:val="p"/>
+          </m:rPr>
+          <m:t>,</m:t>
+        </m:r>
+        <m:r>
+          <m:t>1.064</m:t>
+        </m:r>
+        <m:r>
+          <m:rPr>
+            <m:sty m:val="p"/>
+          </m:rPr>
+          <m:t>]</m:t>
+        </m:r>
+      </m:oMath>
+      <w:r>
+        <w:t xml:space="preserve">) and executed-endpoint steering of</w:t>
+      </w:r>
+      <w:r>
+        <w:t xml:space="preserve"> </w:t>
+      </w:r>
+      <m:oMath>
+        <m:r>
+          <m:t>1.003</m:t>
+        </m:r>
+      </m:oMath>
+      <w:r>
+        <w:t xml:space="preserve"> </w:t>
+      </w:r>
+      <w:r>
+        <w:t xml:space="preserve">(</w:t>
+      </w:r>
+      <m:oMath>
+        <m:r>
+          <m:rPr>
+            <m:sty m:val="p"/>
+          </m:rPr>
+          <m:t>[</m:t>
+        </m:r>
+        <m:r>
+          <m:t>0.950</m:t>
+        </m:r>
+        <m:r>
+          <m:rPr>
+            <m:sty m:val="p"/>
+          </m:rPr>
+          <m:t>,</m:t>
+        </m:r>
+        <m:r>
+          <m:t>1.050</m:t>
+        </m:r>
+        <m:r>
+          <m:rPr>
+            <m:sty m:val="p"/>
+          </m:rPr>
+          <m:t>]</m:t>
+        </m:r>
+      </m:oMath>
+      <w:r>
+        <w:t xml:space="preserve">), both positive in 22/22 states. Executed-future action steering exceeds the geometry-matched Gaussian by</w:t>
+      </w:r>
+      <w:r>
+        <w:t xml:space="preserve"> </w:t>
+      </w:r>
+      <m:oMath>
+        <m:r>
+          <m:t>0.941</m:t>
+        </m:r>
+      </m:oMath>
+      <w:r>
+        <w:t xml:space="preserve"> </w:t>
+      </w:r>
+      <w:r>
+        <w:t xml:space="preserve">(</w:t>
+      </w:r>
+      <m:oMath>
+        <m:r>
+          <m:rPr>
+            <m:sty m:val="p"/>
+          </m:rPr>
+          <m:t>[</m:t>
+        </m:r>
+        <m:r>
+          <m:t>0.837</m:t>
+        </m:r>
+        <m:r>
+          <m:rPr>
+            <m:sty m:val="p"/>
+          </m:rPr>
+          <m:t>,</m:t>
+        </m:r>
+        <m:r>
+          <m:t>1.032</m:t>
+        </m:r>
+        <m:r>
+          <m:rPr>
+            <m:sty m:val="p"/>
+          </m:rPr>
+          <m:t>]</m:t>
+        </m:r>
+      </m:oMath>
+      <w:r>
+        <w:t xml:space="preserve">) and the natural control by</w:t>
+      </w:r>
+      <w:r>
+        <w:t xml:space="preserve"> </w:t>
+      </w:r>
+      <m:oMath>
+        <m:r>
+          <m:t>0.391</m:t>
+        </m:r>
+      </m:oMath>
+      <w:r>
+        <w:t xml:space="preserve"> </w:t>
+      </w:r>
+      <w:r>
+        <w:t xml:space="preserve">(</w:t>
+      </w:r>
+      <m:oMath>
+        <m:r>
+          <m:rPr>
+            <m:sty m:val="p"/>
+          </m:rPr>
+          <m:t>[</m:t>
+        </m:r>
+        <m:r>
+          <m:t>0.246</m:t>
+        </m:r>
+        <m:r>
+          <m:rPr>
+            <m:sty m:val="p"/>
+          </m:rPr>
+          <m:t>,</m:t>
+        </m:r>
+        <m:r>
+          <m:t>0.533</m:t>
+        </m:r>
+        <m:r>
+          <m:rPr>
+            <m:sty m:val="p"/>
+          </m:rPr>
+          <m:t>]</m:t>
+        </m:r>
+      </m:oMath>
+      <w:r>
+        <w:t xml:space="preserve">). Task-balanced analyses give the same qualitative conclusions. A separate four-task engineering study identifies the correct donor in 12/12 cases for both future sources.</w:t>
+      </w:r>
+    </w:p>
+    <w:bookmarkEnd w:id="25"/>
+    <w:bookmarkStart w:id="30" w:name="cosmos-policy.-1"/>
+    <w:p>
+      <w:pPr>
+        <w:pStyle w:val="Heading4"/>
+      </w:pPr>
+      <w:r>
         <w:t xml:space="preserve">Cosmos Policy.</w:t>
       </w:r>
     </w:p>
@@ -1495,33 +1818,12 @@
         <w:pStyle w:val="FirstParagraph"/>
       </w:pPr>
       <w:r>
-        <w:t xml:space="preserve">At the first policy query, donor futures increase action projection by</w:t>
-      </w:r>
-      <w:r>
-        <w:t xml:space="preserve"> </w:t>
-      </w:r>
-      <m:oMath>
-        <m:sSub>
-          <m:e>
-            <m:r>
-              <m:rPr>
-                <m:sty m:val="p"/>
-              </m:rPr>
-              <m:t>Δ</m:t>
-            </m:r>
-          </m:e>
-          <m:sub>
-            <m:r>
-              <m:t>a</m:t>
-            </m:r>
-          </m:sub>
-        </m:sSub>
-        <m:r>
-          <m:rPr>
-            <m:sty m:val="p"/>
-          </m:rPr>
-          <m:t>=</m:t>
-        </m:r>
+        <w:t xml:space="preserve">At the first query, donor-minus-self action steering is</w:t>
+      </w:r>
+      <w:r>
+        <w:t xml:space="preserve"> </w:t>
+      </w:r>
+      <m:oMath>
         <m:r>
           <m:t>0.499</m:t>
         </m:r>
@@ -1530,10 +1832,7 @@
         <w:t xml:space="preserve"> </w:t>
       </w:r>
       <w:r>
-        <w:t xml:space="preserve">(95% CI</w:t>
-      </w:r>
-      <w:r>
-        <w:t xml:space="preserve"> </w:t>
+        <w:t xml:space="preserve">(</w:t>
       </w:r>
       <m:oMath>
         <m:r>
@@ -1562,33 +1861,12 @@
         </m:r>
       </m:oMath>
       <w:r>
-        <w:t xml:space="preserve">) relative to self-future recomputation. The effect is positive in all ten tasks. Executing the recomputed action from the same state yields a corresponding endpoint effect of</w:t>
-      </w:r>
-      <w:r>
-        <w:t xml:space="preserve"> </w:t>
-      </w:r>
-      <m:oMath>
-        <m:sSub>
-          <m:e>
-            <m:r>
-              <m:rPr>
-                <m:sty m:val="p"/>
-              </m:rPr>
-              <m:t>Δ</m:t>
-            </m:r>
-          </m:e>
-          <m:sub>
-            <m:r>
-              <m:t>e</m:t>
-            </m:r>
-          </m:sub>
-        </m:sSub>
-        <m:r>
-          <m:rPr>
-            <m:sty m:val="p"/>
-          </m:rPr>
-          <m:t>=</m:t>
-        </m:r>
+        <w:t xml:space="preserve">), positive in all ten tasks. Executed-endpoint steering is</w:t>
+      </w:r>
+      <w:r>
+        <w:t xml:space="preserve"> </w:t>
+      </w:r>
+      <m:oMath>
         <m:r>
           <m:t>0.552</m:t>
         </m:r>
@@ -1626,10 +1904,7 @@
         </m:r>
       </m:oMath>
       <w:r>
-        <w:t xml:space="preserve">), also positive in all ten tasks. Relative to the Gaussian and shuffled-future controls, the action-projection differences are</w:t>
-      </w:r>
-      <w:r>
-        <w:t xml:space="preserve"> </w:t>
+        <w:t xml:space="preserve">), also positive in all ten. The action contrast remains positive against Gaussian (</w:t>
       </w:r>
       <m:oMath>
         <m:r>
@@ -1637,6 +1912,66 @@
         </m:r>
       </m:oMath>
       <w:r>
+        <w:t xml:space="preserve">), natural (</w:t>
+      </w:r>
+      <m:oMath>
+        <m:r>
+          <m:t>0.103</m:t>
+        </m:r>
+      </m:oMath>
+      <w:r>
+        <w:t xml:space="preserve">), and shuffled-future (</w:t>
+      </w:r>
+      <m:oMath>
+        <m:r>
+          <m:t>0.255</m:t>
+        </m:r>
+      </m:oMath>
+      <w:r>
+        <w:t xml:space="preserve">) controls; endpoint contrasts are</w:t>
+      </w:r>
+      <w:r>
+        <w:t xml:space="preserve"> </w:t>
+      </w:r>
+      <m:oMath>
+        <m:r>
+          <m:t>0.549</m:t>
+        </m:r>
+      </m:oMath>
+      <w:r>
+        <w:t xml:space="preserve">,</w:t>
+      </w:r>
+      <w:r>
+        <w:t xml:space="preserve"> </w:t>
+      </w:r>
+      <m:oMath>
+        <m:r>
+          <m:t>0.110</m:t>
+        </m:r>
+      </m:oMath>
+      <w:r>
+        <w:t xml:space="preserve">, and</w:t>
+      </w:r>
+      <w:r>
+        <w:t xml:space="preserve"> </w:t>
+      </w:r>
+      <m:oMath>
+        <m:r>
+          <m:t>0.277</m:t>
+        </m:r>
+      </m:oMath>
+      <w:r>
+        <w:t xml:space="preserve">. Secondary control intervals were not available. Steering is much smaller at later sampled states: after three chunks, action and endpoint effects are</w:t>
+      </w:r>
+      <w:r>
+        <w:t xml:space="preserve"> </w:t>
+      </w:r>
+      <m:oMath>
+        <m:r>
+          <m:t>0.031</m:t>
+        </m:r>
+      </m:oMath>
+      <w:r>
         <w:t xml:space="preserve"> </w:t>
       </w:r>
       <w:r>
@@ -1647,18 +1982,18 @@
       </w:r>
       <m:oMath>
         <m:r>
-          <m:t>0.255</m:t>
-        </m:r>
-      </m:oMath>
-      <w:r>
-        <w:t xml:space="preserve">, and the endpoint differences are</w:t>
-      </w:r>
-      <w:r>
-        <w:t xml:space="preserve"> </w:t>
-      </w:r>
-      <m:oMath>
-        <m:r>
-          <m:t>0.549</m:t>
+          <m:t>0.004</m:t>
+        </m:r>
+      </m:oMath>
+      <w:r>
+        <w:t xml:space="preserve">; after six, they are</w:t>
+      </w:r>
+      <w:r>
+        <w:t xml:space="preserve"> </w:t>
+      </w:r>
+      <m:oMath>
+        <m:r>
+          <m:t>0.027</m:t>
         </m:r>
       </m:oMath>
       <w:r>
@@ -1672,21 +2007,16 @@
       </w:r>
       <m:oMath>
         <m:r>
-          <m:t>0.277</m:t>
-        </m:r>
-      </m:oMath>
-      <w:r>
-        <w:t xml:space="preserve">. Confidence intervals are unavailable for these secondary control contrasts.</w:t>
-      </w:r>
-    </w:p>
-    <w:p>
-      <w:pPr>
-        <w:pStyle w:val="BodyText"/>
-      </w:pPr>
-      <w:r>
-        <w:t xml:space="preserve">Effects are much smaller at the later sampled states (Figure </w:t>
-      </w:r>
-      <w:hyperlink w:anchor="fig:directionality">
+          <m:t>0.025</m:t>
+        </m:r>
+      </m:oMath>
+      <w:r>
+        <w:t xml:space="preserve"> </w:t>
+      </w:r>
+      <w:r>
+        <w:t xml:space="preserve">(Figure </w:t>
+      </w:r>
+      <w:hyperlink w:anchor="fig:policy">
         <w:r>
           <w:rPr>
             <w:rStyle w:val="Hyperlink"/>
@@ -1695,323 +2025,10 @@
         </w:r>
       </w:hyperlink>
       <w:r>
-        <w:t xml:space="preserve">a). After three action chunks,</w:t>
-      </w:r>
-      <w:r>
-        <w:t xml:space="preserve"> </w:t>
-      </w:r>
-      <m:oMath>
-        <m:sSub>
-          <m:e>
-            <m:r>
-              <m:rPr>
-                <m:sty m:val="p"/>
-              </m:rPr>
-              <m:t>Δ</m:t>
-            </m:r>
-          </m:e>
-          <m:sub>
-            <m:r>
-              <m:t>a</m:t>
-            </m:r>
-          </m:sub>
-        </m:sSub>
-        <m:r>
-          <m:rPr>
-            <m:sty m:val="p"/>
-          </m:rPr>
-          <m:t>=</m:t>
-        </m:r>
-        <m:r>
-          <m:t>0.031</m:t>
-        </m:r>
-      </m:oMath>
-      <w:r>
-        <w:t xml:space="preserve"> </w:t>
-      </w:r>
-      <w:r>
-        <w:t xml:space="preserve">and</w:t>
-      </w:r>
-      <w:r>
-        <w:t xml:space="preserve"> </w:t>
-      </w:r>
-      <m:oMath>
-        <m:sSub>
-          <m:e>
-            <m:r>
-              <m:rPr>
-                <m:sty m:val="p"/>
-              </m:rPr>
-              <m:t>Δ</m:t>
-            </m:r>
-          </m:e>
-          <m:sub>
-            <m:r>
-              <m:t>e</m:t>
-            </m:r>
-          </m:sub>
-        </m:sSub>
-        <m:r>
-          <m:rPr>
-            <m:sty m:val="p"/>
-          </m:rPr>
-          <m:t>=</m:t>
-        </m:r>
-        <m:r>
-          <m:t>0.004</m:t>
-        </m:r>
-      </m:oMath>
-      <w:r>
-        <w:t xml:space="preserve">; after six chunks, they are</w:t>
-      </w:r>
-      <w:r>
-        <w:t xml:space="preserve"> </w:t>
-      </w:r>
-      <m:oMath>
-        <m:r>
-          <m:t>0.027</m:t>
-        </m:r>
-      </m:oMath>
-      <w:r>
-        <w:t xml:space="preserve"> </w:t>
-      </w:r>
-      <w:r>
-        <w:t xml:space="preserve">and</w:t>
-      </w:r>
-      <w:r>
-        <w:t xml:space="preserve"> </w:t>
-      </w:r>
-      <m:oMath>
-        <m:r>
-          <m:t>0.025</m:t>
-        </m:r>
-      </m:oMath>
-      <w:r>
-        <w:t xml:space="preserve">. Because each decision point uses a different saved state, these measurements do not distinguish temporal decay from state-specific variation.</w:t>
-      </w:r>
-    </w:p>
-    <w:bookmarkEnd w:id="19"/>
-    <w:bookmarkStart w:id="24" w:name="cosmos-3."/>
-    <w:p>
-      <w:pPr>
-        <w:pStyle w:val="Heading4"/>
-      </w:pPr>
-      <w:r>
-        <w:t xml:space="preserve">Cosmos 3.</w:t>
-      </w:r>
-    </w:p>
-    <w:p>
-      <w:pPr>
-        <w:pStyle w:val="FirstParagraph"/>
-      </w:pPr>
-      <w:r>
-        <w:t xml:space="preserve">The available Cosmos 3 analysis reports raw donor projection</w:t>
-      </w:r>
-      <w:r>
-        <w:t xml:space="preserve"> </w:t>
-      </w:r>
-      <m:oMath>
-        <m:r>
-          <m:t>π</m:t>
-        </m:r>
-      </m:oMath>
-      <w:r>
-        <w:t xml:space="preserve">, rather than the donor-minus-self difference</w:t>
-      </w:r>
-      <w:r>
-        <w:t xml:space="preserve"> </w:t>
-      </w:r>
-      <m:oMath>
-        <m:r>
-          <m:rPr>
-            <m:sty m:val="p"/>
-          </m:rPr>
-          <m:t>Δ</m:t>
-        </m:r>
-      </m:oMath>
-      <w:r>
-        <w:t xml:space="preserve"> </w:t>
-      </w:r>
-      <w:r>
-        <w:t xml:space="preserve">used above; the self-future control is near zero. Across the four independent states, model-predicted donor futures yield a mean action projection of</w:t>
-      </w:r>
-      <w:r>
-        <w:t xml:space="preserve"> </w:t>
-      </w:r>
-      <m:oMath>
-        <m:r>
-          <m:t>0.985</m:t>
-        </m:r>
-      </m:oMath>
-      <w:r>
-        <w:t xml:space="preserve"> </w:t>
-      </w:r>
-      <w:r>
-        <w:t xml:space="preserve">(task-bootstrap 95% CI</w:t>
-      </w:r>
-      <w:r>
-        <w:t xml:space="preserve"> </w:t>
-      </w:r>
-      <m:oMath>
-        <m:r>
-          <m:rPr>
-            <m:sty m:val="p"/>
-          </m:rPr>
-          <m:t>[</m:t>
-        </m:r>
-        <m:r>
-          <m:t>0.974</m:t>
-        </m:r>
-        <m:r>
-          <m:rPr>
-            <m:sty m:val="p"/>
-          </m:rPr>
-          <m:t>,</m:t>
-        </m:r>
-        <m:r>
-          <m:t>0.993</m:t>
-        </m:r>
-        <m:r>
-          <m:rPr>
-            <m:sty m:val="p"/>
-          </m:rPr>
-          <m:t>]</m:t>
-        </m:r>
-      </m:oMath>
-      <w:r>
-        <w:t xml:space="preserve">) and endpoint projection of</w:t>
-      </w:r>
-      <w:r>
-        <w:t xml:space="preserve"> </w:t>
-      </w:r>
-      <m:oMath>
-        <m:r>
-          <m:t>0.975</m:t>
-        </m:r>
-      </m:oMath>
-      <w:r>
-        <w:t xml:space="preserve"> </w:t>
-      </w:r>
-      <w:r>
-        <w:t xml:space="preserve">(</w:t>
-      </w:r>
-      <m:oMath>
-        <m:r>
-          <m:rPr>
-            <m:sty m:val="p"/>
-          </m:rPr>
-          <m:t>[</m:t>
-        </m:r>
-        <m:r>
-          <m:t>0.833</m:t>
-        </m:r>
-        <m:r>
-          <m:rPr>
-            <m:sty m:val="p"/>
-          </m:rPr>
-          <m:t>,</m:t>
-        </m:r>
-        <m:r>
-          <m:t>1.079</m:t>
-        </m:r>
-        <m:r>
-          <m:rPr>
-            <m:sty m:val="p"/>
-          </m:rPr>
-          <m:t>]</m:t>
-        </m:r>
-      </m:oMath>
-      <w:r>
-        <w:t xml:space="preserve">). Futures encoded from executed donor branches yield action projection</w:t>
-      </w:r>
-      <w:r>
-        <w:t xml:space="preserve"> </w:t>
-      </w:r>
-      <m:oMath>
-        <m:r>
-          <m:t>1.060</m:t>
-        </m:r>
-      </m:oMath>
-      <w:r>
-        <w:t xml:space="preserve"> </w:t>
-      </w:r>
-      <w:r>
-        <w:t xml:space="preserve">(</w:t>
-      </w:r>
-      <m:oMath>
-        <m:r>
-          <m:rPr>
-            <m:sty m:val="p"/>
-          </m:rPr>
-          <m:t>[</m:t>
-        </m:r>
-        <m:r>
-          <m:t>1.010</m:t>
-        </m:r>
-        <m:r>
-          <m:rPr>
-            <m:sty m:val="p"/>
-          </m:rPr>
-          <m:t>,</m:t>
-        </m:r>
-        <m:r>
-          <m:t>1.103</m:t>
-        </m:r>
-        <m:r>
-          <m:rPr>
-            <m:sty m:val="p"/>
-          </m:rPr>
-          <m:t>]</m:t>
-        </m:r>
-      </m:oMath>
-      <w:r>
-        <w:t xml:space="preserve">) and endpoint projection</w:t>
-      </w:r>
-      <w:r>
-        <w:t xml:space="preserve"> </w:t>
-      </w:r>
-      <m:oMath>
-        <m:r>
-          <m:t>1.027</m:t>
-        </m:r>
-      </m:oMath>
-      <w:r>
-        <w:t xml:space="preserve"> </w:t>
-      </w:r>
-      <w:r>
-        <w:t xml:space="preserve">(</w:t>
-      </w:r>
-      <m:oMath>
-        <m:r>
-          <m:rPr>
-            <m:sty m:val="p"/>
-          </m:rPr>
-          <m:t>[</m:t>
-        </m:r>
-        <m:r>
-          <m:t>0.824</m:t>
-        </m:r>
-        <m:r>
-          <m:rPr>
-            <m:sty m:val="p"/>
-          </m:rPr>
-          <m:t>,</m:t>
-        </m:r>
-        <m:r>
-          <m:t>1.204</m:t>
-        </m:r>
-        <m:r>
-          <m:rPr>
-            <m:sty m:val="p"/>
-          </m:rPr>
-          <m:t>]</m:t>
-        </m:r>
-      </m:oMath>
-      <w:r>
-        <w:t xml:space="preserve">). All 24 interventions—12 donors evaluated with two future sources—have positive donor projection. Multiple donors improve measurement within a state but do not increase the number of independent states.</w:t>
-      </w:r>
-    </w:p>
-    <w:bookmarkStart w:id="23" w:name="fig:directionality"/>
+        <w:t xml:space="preserve">). Because each time point uses a different state, this is a state/timing association rather than a causal estimate of temporal decay.</w:t>
+      </w:r>
+    </w:p>
+    <w:bookmarkStart w:id="29" w:name="fig:policy"/>
     <w:p>
       <w:pPr>
         <w:pStyle w:val="CaptionedFigure"/>
@@ -2019,20 +2036,20 @@
       <w:r>
         <w:drawing>
           <wp:inline>
-            <wp:extent cx="5334000" cy="1762064"/>
+            <wp:extent cx="5334000" cy="1617688"/>
             <wp:effectExtent b="0" l="0" r="0" t="0"/>
-            <wp:docPr descr="" title="" id="21" name="Picture"/>
+            <wp:docPr descr="" title="" id="27" name="Picture"/>
             <a:graphic>
               <a:graphicData uri="http://schemas.openxmlformats.org/drawingml/2006/picture">
                 <pic:pic>
                   <pic:nvPicPr>
-                    <pic:cNvPr descr="figures/directionality_results.png" id="22" name="Picture"/>
+                    <pic:cNvPr descr="figures/directionality_results.pdf" id="28" name="Picture"/>
                     <pic:cNvPicPr>
                       <a:picLocks noChangeArrowheads="1" noChangeAspect="1"/>
                     </pic:cNvPicPr>
                   </pic:nvPicPr>
                   <pic:blipFill>
-                    <a:blip r:embed="rId20"/>
+                    <a:blip r:embed="rId26"/>
                     <a:stretch>
                       <a:fillRect/>
                     </a:stretch>
@@ -2040,7 +2057,7 @@
                   <pic:spPr bwMode="auto">
                     <a:xfrm>
                       <a:off x="0" y="0"/>
-                      <a:ext cx="5334000" cy="1762064"/>
+                      <a:ext cx="5334000" cy="1617688"/>
                     </a:xfrm>
                     <a:prstGeom prst="rect">
                       <a:avLst/>
@@ -2064,52 +2081,41 @@
         <w:pStyle w:val="ImageCaption"/>
       </w:pPr>
       <w:r>
-        <w:t xml:space="preserve">Directional effects of future transplantation. (a) Cosmos Policy reports the donor-minus-self projection difference</w:t>
-      </w:r>
-      <w:r>
-        <w:t xml:space="preserve"> </w:t>
-      </w:r>
-      <m:oMath>
-        <m:r>
-          <m:rPr>
-            <m:sty m:val="p"/>
-          </m:rPr>
-          <m:t>Δ</m:t>
-        </m:r>
-      </m:oMath>
-      <w:r>
-        <w:t xml:space="preserve">; effects are large at first-query states and small at later sampled states. (b) Cosmos 3 reports raw donor projection</w:t>
-      </w:r>
-      <w:r>
-        <w:t xml:space="preserve"> </w:t>
-      </w:r>
-      <m:oMath>
-        <m:r>
-          <m:t>π</m:t>
-        </m:r>
-      </m:oMath>
-      <w:r>
-        <w:t xml:space="preserve">; 0 reproduces the recipient and 1 reproduces the donor. Intervals are 95% cluster-bootstrap confidence intervals where available.</w:t>
-      </w:r>
-    </w:p>
-    <w:bookmarkEnd w:id="23"/>
+        <w:t xml:space="preserve">Cosmos Policy results. (a) Donor-minus-self action and endpoint steering is large at first-query states and small at later registered states. (b) At first-query states, visual futures carry the action effect, whereas future proprioception does not. Points are state means; bars are 95% state-bootstrap intervals where reported. The dashed line is the prespecified</w:t>
+      </w:r>
+      <w:r>
+        <w:t xml:space="preserve"> </w:t>
+      </w:r>
+      <m:oMath>
+        <m:r>
+          <m:t>0.10</m:t>
+        </m:r>
+      </m:oMath>
+      <w:r>
+        <w:t xml:space="preserve"> </w:t>
+      </w:r>
+      <w:r>
+        <w:t xml:space="preserve">threshold.</w:t>
+      </w:r>
+    </w:p>
+    <w:bookmarkEnd w:id="29"/>
     <w:p>
       <w:pPr>
         <w:pStyle w:val="BodyText"/>
       </w:pPr>
       <w:r>
-        <w:t xml:space="preserve">Neither model’s selected branch pairs show stable differences in binary task success. The evidence therefore concerns donor-directed action shifts and one-chunk simulator endpoints, not closed-loop task completion.</w:t>
-      </w:r>
-    </w:p>
-    <w:bookmarkEnd w:id="24"/>
-    <w:bookmarkEnd w:id="25"/>
-    <w:bookmarkStart w:id="30" w:name="sec:content"/>
+        <w:t xml:space="preserve">No screened branch pair in either policy retained a stable success/failure label across continuation seeds. The result concerns donor-directed action and one-chunk endpoint changes, not closed-loop task completion.</w:t>
+      </w:r>
+    </w:p>
+    <w:bookmarkEnd w:id="30"/>
+    <w:bookmarkEnd w:id="31"/>
+    <w:bookmarkStart w:id="32" w:name="sec:content"/>
     <w:p>
       <w:pPr>
         <w:pStyle w:val="Heading2"/>
       </w:pPr>
       <w:r>
-        <w:t xml:space="preserve">Cosmos Policy effects track camera-visible robot motion</w:t>
+        <w:t xml:space="preserve">What future content causes steering?</w:t>
       </w:r>
     </w:p>
     <w:p>
@@ -2117,9 +2123,622 @@
         <w:pStyle w:val="FirstParagraph"/>
       </w:pPr>
       <w:r>
-        <w:t xml:space="preserve">Replacing one future component at a time reveals a large difference across modalities (Figure </w:t>
-      </w:r>
-      <w:hyperlink w:anchor="fig:content">
+        <w:rPr>
+          <w:b/>
+          <w:bCs/>
+        </w:rPr>
+        <w:t xml:space="preserve">The content pattern differs across checkpoints: Cosmos Policy favors visual robot-motion information, while Cosmos 3’s whole-future effect is not recreated by either isolated pixel factor.</w:t>
+      </w:r>
+    </w:p>
+    <w:p>
+      <w:pPr>
+        <w:pStyle w:val="BodyText"/>
+      </w:pPr>
+      <w:r>
+        <w:t xml:space="preserve">In Cosmos Policy, wrist-future action steering is</w:t>
+      </w:r>
+      <w:r>
+        <w:t xml:space="preserve"> </w:t>
+      </w:r>
+      <m:oMath>
+        <m:r>
+          <m:t>0.435</m:t>
+        </m:r>
+      </m:oMath>
+      <w:r>
+        <w:t xml:space="preserve"> </w:t>
+      </w:r>
+      <w:r>
+        <w:t xml:space="preserve">(</w:t>
+      </w:r>
+      <m:oMath>
+        <m:r>
+          <m:rPr>
+            <m:sty m:val="p"/>
+          </m:rPr>
+          <m:t>[</m:t>
+        </m:r>
+        <m:r>
+          <m:t>0.284</m:t>
+        </m:r>
+        <m:r>
+          <m:rPr>
+            <m:sty m:val="p"/>
+          </m:rPr>
+          <m:t>,</m:t>
+        </m:r>
+        <m:r>
+          <m:t>0.605</m:t>
+        </m:r>
+        <m:r>
+          <m:rPr>
+            <m:sty m:val="p"/>
+          </m:rPr>
+          <m:t>]</m:t>
+        </m:r>
+      </m:oMath>
+      <w:r>
+        <w:t xml:space="preserve">), primary-camera steering is</w:t>
+      </w:r>
+      <w:r>
+        <w:t xml:space="preserve"> </w:t>
+      </w:r>
+      <m:oMath>
+        <m:r>
+          <m:t>0.101</m:t>
+        </m:r>
+      </m:oMath>
+      <w:r>
+        <w:t xml:space="preserve"> </w:t>
+      </w:r>
+      <w:r>
+        <w:t xml:space="preserve">(</w:t>
+      </w:r>
+      <m:oMath>
+        <m:r>
+          <m:rPr>
+            <m:sty m:val="p"/>
+          </m:rPr>
+          <m:t>[</m:t>
+        </m:r>
+        <m:r>
+          <m:t>0.057</m:t>
+        </m:r>
+        <m:r>
+          <m:rPr>
+            <m:sty m:val="p"/>
+          </m:rPr>
+          <m:t>,</m:t>
+        </m:r>
+        <m:r>
+          <m:t>0.144</m:t>
+        </m:r>
+        <m:r>
+          <m:rPr>
+            <m:sty m:val="p"/>
+          </m:rPr>
+          <m:t>]</m:t>
+        </m:r>
+      </m:oMath>
+      <w:r>
+        <w:t xml:space="preserve">), and future-proprioception steering is</w:t>
+      </w:r>
+      <w:r>
+        <w:t xml:space="preserve"> </w:t>
+      </w:r>
+      <m:oMath>
+        <m:r>
+          <m:t>0.001</m:t>
+        </m:r>
+      </m:oMath>
+      <w:r>
+        <w:t xml:space="preserve"> </w:t>
+      </w:r>
+      <w:r>
+        <w:t xml:space="preserve">(</w:t>
+      </w:r>
+      <m:oMath>
+        <m:r>
+          <m:rPr>
+            <m:sty m:val="p"/>
+          </m:rPr>
+          <m:t>[</m:t>
+        </m:r>
+        <m:r>
+          <m:rPr>
+            <m:sty m:val="p"/>
+          </m:rPr>
+          <m:t>−</m:t>
+        </m:r>
+        <m:r>
+          <m:t>0.004</m:t>
+        </m:r>
+        <m:r>
+          <m:rPr>
+            <m:sty m:val="p"/>
+          </m:rPr>
+          <m:t>,</m:t>
+        </m:r>
+        <m:r>
+          <m:t>0.008</m:t>
+        </m:r>
+        <m:r>
+          <m:rPr>
+            <m:sty m:val="p"/>
+          </m:rPr>
+          <m:t>]</m:t>
+        </m:r>
+      </m:oMath>
+      <w:r>
+        <w:t xml:space="preserve">). In the 20-state</w:t>
+      </w:r>
+      <w:r>
+        <w:t xml:space="preserve"> </w:t>
+      </w:r>
+      <m:oMath>
+        <m:r>
+          <m:t>2</m:t>
+        </m:r>
+        <m:r>
+          <m:rPr>
+            <m:sty m:val="p"/>
+          </m:rPr>
+          <m:t>×</m:t>
+        </m:r>
+        <m:r>
+          <m:t>2</m:t>
+        </m:r>
+      </m:oMath>
+      <w:r>
+        <w:t xml:space="preserve"> </w:t>
+      </w:r>
+      <w:r>
+        <w:t xml:space="preserve">study, decoded futures identify the intended cell with 92.5% primary-camera and 98.75% wrist-camera accuracy, yet the object-state main effect is</w:t>
+      </w:r>
+      <w:r>
+        <w:t xml:space="preserve"> </w:t>
+      </w:r>
+      <m:oMath>
+        <m:r>
+          <m:t>0.00015</m:t>
+        </m:r>
+      </m:oMath>
+      <w:r>
+        <w:t xml:space="preserve"> </w:t>
+      </w:r>
+      <w:r>
+        <w:t xml:space="preserve">(</w:t>
+      </w:r>
+      <m:oMath>
+        <m:r>
+          <m:rPr>
+            <m:sty m:val="p"/>
+          </m:rPr>
+          <m:t>[</m:t>
+        </m:r>
+        <m:r>
+          <m:rPr>
+            <m:sty m:val="p"/>
+          </m:rPr>
+          <m:t>−</m:t>
+        </m:r>
+        <m:r>
+          <m:t>0.00012</m:t>
+        </m:r>
+        <m:r>
+          <m:rPr>
+            <m:sty m:val="p"/>
+          </m:rPr>
+          <m:t>,</m:t>
+        </m:r>
+        <m:r>
+          <m:t>0.00049</m:t>
+        </m:r>
+        <m:r>
+          <m:rPr>
+            <m:sty m:val="p"/>
+          </m:rPr>
+          <m:t>]</m:t>
+        </m:r>
+      </m:oMath>
+      <w:r>
+        <w:t xml:space="preserve">) for action and</w:t>
+      </w:r>
+      <w:r>
+        <w:t xml:space="preserve"> </w:t>
+      </w:r>
+      <m:oMath>
+        <m:r>
+          <m:t>0.00018</m:t>
+        </m:r>
+      </m:oMath>
+      <w:r>
+        <w:t xml:space="preserve"> </w:t>
+      </w:r>
+      <w:r>
+        <w:t xml:space="preserve">(</w:t>
+      </w:r>
+      <m:oMath>
+        <m:r>
+          <m:rPr>
+            <m:sty m:val="p"/>
+          </m:rPr>
+          <m:t>[</m:t>
+        </m:r>
+        <m:r>
+          <m:rPr>
+            <m:sty m:val="p"/>
+          </m:rPr>
+          <m:t>−</m:t>
+        </m:r>
+        <m:r>
+          <m:t>0.00040</m:t>
+        </m:r>
+        <m:r>
+          <m:rPr>
+            <m:sty m:val="p"/>
+          </m:rPr>
+          <m:t>,</m:t>
+        </m:r>
+        <m:r>
+          <m:t>0.00102</m:t>
+        </m:r>
+        <m:r>
+          <m:rPr>
+            <m:sty m:val="p"/>
+          </m:rPr>
+          <m:t>]</m:t>
+        </m:r>
+      </m:oMath>
+      <w:r>
+        <w:t xml:space="preserve">) for the executed goal-state endpoint. The available analysis does not report the robot-state main effect. In the four exploratory natural pairs, robot-motion futures yield action steering of</w:t>
+      </w:r>
+      <w:r>
+        <w:t xml:space="preserve"> </w:t>
+      </w:r>
+      <m:oMath>
+        <m:r>
+          <m:t>0.291</m:t>
+        </m:r>
+      </m:oMath>
+      <w:r>
+        <w:t xml:space="preserve"> </w:t>
+      </w:r>
+      <w:r>
+        <w:t xml:space="preserve">(</w:t>
+      </w:r>
+      <m:oMath>
+        <m:r>
+          <m:rPr>
+            <m:sty m:val="p"/>
+          </m:rPr>
+          <m:t>[</m:t>
+        </m:r>
+        <m:r>
+          <m:t>0.060</m:t>
+        </m:r>
+        <m:r>
+          <m:rPr>
+            <m:sty m:val="p"/>
+          </m:rPr>
+          <m:t>,</m:t>
+        </m:r>
+        <m:r>
+          <m:t>0.521</m:t>
+        </m:r>
+        <m:r>
+          <m:rPr>
+            <m:sty m:val="p"/>
+          </m:rPr>
+          <m:t>]</m:t>
+        </m:r>
+      </m:oMath>
+      <w:r>
+        <w:t xml:space="preserve">) and robot-endpoint steering of</w:t>
+      </w:r>
+      <w:r>
+        <w:t xml:space="preserve"> </w:t>
+      </w:r>
+      <m:oMath>
+        <m:r>
+          <m:t>0.315</m:t>
+        </m:r>
+      </m:oMath>
+      <w:r>
+        <w:t xml:space="preserve"> </w:t>
+      </w:r>
+      <w:r>
+        <w:t xml:space="preserve">(</w:t>
+      </w:r>
+      <m:oMath>
+        <m:r>
+          <m:rPr>
+            <m:sty m:val="p"/>
+          </m:rPr>
+          <m:t>[</m:t>
+        </m:r>
+        <m:r>
+          <m:t>0.059</m:t>
+        </m:r>
+        <m:r>
+          <m:rPr>
+            <m:sty m:val="p"/>
+          </m:rPr>
+          <m:t>,</m:t>
+        </m:r>
+        <m:r>
+          <m:t>0.571</m:t>
+        </m:r>
+        <m:r>
+          <m:rPr>
+            <m:sty m:val="p"/>
+          </m:rPr>
+          <m:t>]</m:t>
+        </m:r>
+      </m:oMath>
+      <w:r>
+        <w:t xml:space="preserve">); object-only effects are</w:t>
+      </w:r>
+      <w:r>
+        <w:t xml:space="preserve"> </w:t>
+      </w:r>
+      <m:oMath>
+        <m:r>
+          <m:t>0.021</m:t>
+        </m:r>
+      </m:oMath>
+      <w:r>
+        <w:t xml:space="preserve"> </w:t>
+      </w:r>
+      <w:r>
+        <w:t xml:space="preserve">for both action and goal endpoint, with intervals crossing zero. Together, these interventions are consistent with an inverse-dynamics-like role for camera-visible robot motion at the sampled early states, but do not show that Cosmos Policy generally ignores object consequences.</w:t>
+      </w:r>
+    </w:p>
+    <w:p>
+      <w:pPr>
+        <w:pStyle w:val="BodyText"/>
+      </w:pPr>
+      <w:r>
+        <w:t xml:space="preserve">Cosmos 3 provides a counterpoint. Across ten factor-study states and all six tasks, the isolated robot-pixel effect is</w:t>
+      </w:r>
+      <w:r>
+        <w:t xml:space="preserve"> </w:t>
+      </w:r>
+      <m:oMath>
+        <m:r>
+          <m:t>0.0022</m:t>
+        </m:r>
+      </m:oMath>
+      <w:r>
+        <w:t xml:space="preserve"> </w:t>
+      </w:r>
+      <w:r>
+        <w:t xml:space="preserve">(</w:t>
+      </w:r>
+      <m:oMath>
+        <m:r>
+          <m:rPr>
+            <m:sty m:val="p"/>
+          </m:rPr>
+          <m:t>[</m:t>
+        </m:r>
+        <m:r>
+          <m:rPr>
+            <m:sty m:val="p"/>
+          </m:rPr>
+          <m:t>−</m:t>
+        </m:r>
+        <m:r>
+          <m:t>0.0016</m:t>
+        </m:r>
+        <m:r>
+          <m:rPr>
+            <m:sty m:val="p"/>
+          </m:rPr>
+          <m:t>,</m:t>
+        </m:r>
+        <m:r>
+          <m:t>0.0060</m:t>
+        </m:r>
+        <m:r>
+          <m:rPr>
+            <m:sty m:val="p"/>
+          </m:rPr>
+          <m:t>]</m:t>
+        </m:r>
+      </m:oMath>
+      <w:r>
+        <w:t xml:space="preserve">) for action and</w:t>
+      </w:r>
+      <w:r>
+        <w:t xml:space="preserve"> </w:t>
+      </w:r>
+      <m:oMath>
+        <m:r>
+          <m:t>0.0102</m:t>
+        </m:r>
+      </m:oMath>
+      <w:r>
+        <w:t xml:space="preserve"> </w:t>
+      </w:r>
+      <w:r>
+        <w:t xml:space="preserve">(</w:t>
+      </w:r>
+      <m:oMath>
+        <m:r>
+          <m:rPr>
+            <m:sty m:val="p"/>
+          </m:rPr>
+          <m:t>[</m:t>
+        </m:r>
+        <m:r>
+          <m:rPr>
+            <m:sty m:val="p"/>
+          </m:rPr>
+          <m:t>−</m:t>
+        </m:r>
+        <m:r>
+          <m:t>0.0067</m:t>
+        </m:r>
+        <m:r>
+          <m:rPr>
+            <m:sty m:val="p"/>
+          </m:rPr>
+          <m:t>,</m:t>
+        </m:r>
+        <m:r>
+          <m:t>0.0275</m:t>
+        </m:r>
+        <m:r>
+          <m:rPr>
+            <m:sty m:val="p"/>
+          </m:rPr>
+          <m:t>]</m:t>
+        </m:r>
+      </m:oMath>
+      <w:r>
+        <w:t xml:space="preserve">) for the full executed endpoint. The isolated object-pixel effect is</w:t>
+      </w:r>
+      <w:r>
+        <w:t xml:space="preserve"> </w:t>
+      </w:r>
+      <m:oMath>
+        <m:r>
+          <m:t>0.0061</m:t>
+        </m:r>
+      </m:oMath>
+      <w:r>
+        <w:t xml:space="preserve"> </w:t>
+      </w:r>
+      <w:r>
+        <w:t xml:space="preserve">(</w:t>
+      </w:r>
+      <m:oMath>
+        <m:r>
+          <m:rPr>
+            <m:sty m:val="p"/>
+          </m:rPr>
+          <m:t>[</m:t>
+        </m:r>
+        <m:r>
+          <m:t>0.0009</m:t>
+        </m:r>
+        <m:r>
+          <m:rPr>
+            <m:sty m:val="p"/>
+          </m:rPr>
+          <m:t>,</m:t>
+        </m:r>
+        <m:r>
+          <m:t>0.0119</m:t>
+        </m:r>
+        <m:r>
+          <m:rPr>
+            <m:sty m:val="p"/>
+          </m:rPr>
+          <m:t>]</m:t>
+        </m:r>
+      </m:oMath>
+      <w:r>
+        <w:t xml:space="preserve">) for action and</w:t>
+      </w:r>
+      <w:r>
+        <w:t xml:space="preserve"> </w:t>
+      </w:r>
+      <m:oMath>
+        <m:r>
+          <m:rPr>
+            <m:sty m:val="p"/>
+          </m:rPr>
+          <m:t>−</m:t>
+        </m:r>
+        <m:r>
+          <m:t>0.0001</m:t>
+        </m:r>
+      </m:oMath>
+      <w:r>
+        <w:t xml:space="preserve"> </w:t>
+      </w:r>
+      <w:r>
+        <w:t xml:space="preserve">(</w:t>
+      </w:r>
+      <m:oMath>
+        <m:r>
+          <m:rPr>
+            <m:sty m:val="p"/>
+          </m:rPr>
+          <m:t>[</m:t>
+        </m:r>
+        <m:r>
+          <m:rPr>
+            <m:sty m:val="p"/>
+          </m:rPr>
+          <m:t>−</m:t>
+        </m:r>
+        <m:r>
+          <m:t>0.0254</m:t>
+        </m:r>
+        <m:r>
+          <m:rPr>
+            <m:sty m:val="p"/>
+          </m:rPr>
+          <m:t>,</m:t>
+        </m:r>
+        <m:r>
+          <m:t>0.0239</m:t>
+        </m:r>
+        <m:r>
+          <m:rPr>
+            <m:sty m:val="p"/>
+          </m:rPr>
+          <m:t>]</m:t>
+        </m:r>
+      </m:oMath>
+      <w:r>
+        <w:t xml:space="preserve">) for the endpoint. Every interval lies inside the prespecified</w:t>
+      </w:r>
+      <w:r>
+        <w:t xml:space="preserve"> </w:t>
+      </w:r>
+      <m:oMath>
+        <m:r>
+          <m:rPr>
+            <m:sty m:val="p"/>
+          </m:rPr>
+          <m:t>[</m:t>
+        </m:r>
+        <m:r>
+          <m:rPr>
+            <m:sty m:val="p"/>
+          </m:rPr>
+          <m:t>−</m:t>
+        </m:r>
+        <m:r>
+          <m:t>0.10</m:t>
+        </m:r>
+        <m:r>
+          <m:rPr>
+            <m:sty m:val="p"/>
+          </m:rPr>
+          <m:t>,</m:t>
+        </m:r>
+        <m:r>
+          <m:t>0.10</m:t>
+        </m:r>
+        <m:r>
+          <m:rPr>
+            <m:sty m:val="p"/>
+          </m:rPr>
+          <m:t>]</m:t>
+        </m:r>
+      </m:oMath>
+      <w:r>
+        <w:t xml:space="preserve"> </w:t>
+      </w:r>
+      <w:r>
+        <w:t xml:space="preserve">region, and task-balanced estimates agree. Thus neither isolated factor recreates a meaningful fraction of coherent steering (Figure </w:t>
+      </w:r>
+      <w:hyperlink w:anchor="fig:cosmos3">
         <w:r>
           <w:rPr>
             <w:rStyle w:val="Hyperlink"/>
@@ -2128,14 +2747,208 @@
         </w:r>
       </w:hyperlink>
       <w:r>
-        <w:t xml:space="preserve">a). Wrist-camera futures produce a mean action effect of</w:t>
-      </w:r>
-      <w:r>
-        <w:t xml:space="preserve"> </w:t>
-      </w:r>
-      <m:oMath>
-        <m:r>
-          <m:t>0.435</m:t>
+        <w:t xml:space="preserve">c). This is consistent with information distributed across the coherent future or with nonlinear interactions among content, masks, and tokenization; it does not show that the two factors are jointly necessary.</w:t>
+      </w:r>
+    </w:p>
+    <w:bookmarkEnd w:id="32"/>
+    <w:bookmarkStart w:id="37" w:name="sec:pathway"/>
+    <w:p>
+      <w:pPr>
+        <w:pStyle w:val="Heading2"/>
+      </w:pPr>
+      <w:r>
+        <w:t xml:space="preserve">Which internal pathway carries the effect?</w:t>
+      </w:r>
+    </w:p>
+    <w:p>
+      <w:pPr>
+        <w:pStyle w:val="FirstParagraph"/>
+      </w:pPr>
+      <w:r>
+        <w:rPr>
+          <w:b/>
+          <w:bCs/>
+        </w:rPr>
+        <w:t xml:space="preserve">Future-token attention provides an active route from generated futures to action, with the strongest evidence coming from population-level K/V replacement in Cosmos 3.</w:t>
+      </w:r>
+    </w:p>
+    <w:p>
+      <w:pPr>
+        <w:pStyle w:val="BodyText"/>
+      </w:pPr>
+      <w:r>
+        <w:t xml:space="preserve">In Cosmos Policy, block-27 future-key removal produces a monotonic action-disruption curve: normalized</w:t>
+      </w:r>
+      <w:r>
+        <w:t xml:space="preserve"> </w:t>
+      </w:r>
+      <m:oMath>
+        <m:sSub>
+          <m:e>
+            <m:r>
+              <m:t>L</m:t>
+            </m:r>
+          </m:e>
+          <m:sub>
+            <m:r>
+              <m:t>2</m:t>
+            </m:r>
+          </m:sub>
+        </m:sSub>
+      </m:oMath>
+      <w:r>
+        <w:t xml:space="preserve"> </w:t>
+      </w:r>
+      <w:r>
+        <w:t xml:space="preserve">change is</w:t>
+      </w:r>
+      <w:r>
+        <w:t xml:space="preserve"> </w:t>
+      </w:r>
+      <m:oMath>
+        <m:r>
+          <m:t>0.022</m:t>
+        </m:r>
+      </m:oMath>
+      <w:r>
+        <w:t xml:space="preserve">,</w:t>
+      </w:r>
+      <w:r>
+        <w:t xml:space="preserve"> </w:t>
+      </w:r>
+      <m:oMath>
+        <m:r>
+          <m:t>0.035</m:t>
+        </m:r>
+      </m:oMath>
+      <w:r>
+        <w:t xml:space="preserve">,</w:t>
+      </w:r>
+      <w:r>
+        <w:t xml:space="preserve"> </w:t>
+      </w:r>
+      <m:oMath>
+        <m:r>
+          <m:t>0.054</m:t>
+        </m:r>
+      </m:oMath>
+      <w:r>
+        <w:t xml:space="preserve">, and</w:t>
+      </w:r>
+      <w:r>
+        <w:t xml:space="preserve"> </w:t>
+      </w:r>
+      <m:oMath>
+        <m:r>
+          <m:t>0.068</m:t>
+        </m:r>
+      </m:oMath>
+      <w:r>
+        <w:t xml:space="preserve"> </w:t>
+      </w:r>
+      <w:r>
+        <w:t xml:space="preserve">at gates</w:t>
+      </w:r>
+      <w:r>
+        <w:t xml:space="preserve"> </w:t>
+      </w:r>
+      <m:oMath>
+        <m:r>
+          <m:t>0.25</m:t>
+        </m:r>
+      </m:oMath>
+      <w:r>
+        <w:t xml:space="preserve">,</w:t>
+      </w:r>
+      <w:r>
+        <w:t xml:space="preserve"> </w:t>
+      </w:r>
+      <m:oMath>
+        <m:r>
+          <m:t>0.50</m:t>
+        </m:r>
+      </m:oMath>
+      <w:r>
+        <w:t xml:space="preserve">,</w:t>
+      </w:r>
+      <w:r>
+        <w:t xml:space="preserve"> </w:t>
+      </w:r>
+      <m:oMath>
+        <m:r>
+          <m:t>0.75</m:t>
+        </m:r>
+      </m:oMath>
+      <w:r>
+        <w:t xml:space="preserve">, and</w:t>
+      </w:r>
+      <w:r>
+        <w:t xml:space="preserve"> </w:t>
+      </w:r>
+      <m:oMath>
+        <m:r>
+          <m:t>1.00</m:t>
+        </m:r>
+      </m:oMath>
+      <w:r>
+        <w:t xml:space="preserve">. All-key recomputation is bitwise exact. Full removal is</w:t>
+      </w:r>
+      <w:r>
+        <w:t xml:space="preserve"> </w:t>
+      </w:r>
+      <m:oMath>
+        <m:r>
+          <m:t>0.016</m:t>
+        </m:r>
+      </m:oMath>
+      <w:r>
+        <w:t xml:space="preserve"> </w:t>
+      </w:r>
+      <w:r>
+        <w:t xml:space="preserve">more disruptive than equal-count random-key removal and</w:t>
+      </w:r>
+      <w:r>
+        <w:t xml:space="preserve"> </w:t>
+      </w:r>
+      <m:oMath>
+        <m:r>
+          <m:t>0.048</m:t>
+        </m:r>
+      </m:oMath>
+      <w:r>
+        <w:t xml:space="preserve"> </w:t>
+      </w:r>
+      <w:r>
+        <w:t xml:space="preserve">more disruptive than block-0 future-key removal; equal-count current-key removal is</w:t>
+      </w:r>
+      <w:r>
+        <w:t xml:space="preserve"> </w:t>
+      </w:r>
+      <m:oMath>
+        <m:r>
+          <m:t>0.024</m:t>
+        </m:r>
+      </m:oMath>
+      <w:r>
+        <w:t xml:space="preserve"> </w:t>
+      </w:r>
+      <w:r>
+        <w:t xml:space="preserve">larger. Executed endpoints support the same bounded conclusion, although state counts and intervals are not available for this analysis. The late future-to-action edge is active, but it is neither the only nor the largest route through the block.</w:t>
+      </w:r>
+    </w:p>
+    <w:p>
+      <w:pPr>
+        <w:pStyle w:val="BodyText"/>
+      </w:pPr>
+      <w:r>
+        <w:t xml:space="preserve">In Cosmos 3, the interface chosen on excluded calibration tasks was frozen before population testing. Replacing donor-run future-token K/V with self-future K/V reduces predicted-future action projection by</w:t>
+      </w:r>
+      <w:r>
+        <w:t xml:space="preserve"> </w:t>
+      </w:r>
+      <m:oMath>
+        <m:r>
+          <m:t>0.877</m:t>
         </m:r>
       </m:oMath>
       <w:r>
@@ -2152,7 +2965,7 @@
           <m:t>[</m:t>
         </m:r>
         <m:r>
-          <m:t>0.284</m:t>
+          <m:t>0.842</m:t>
         </m:r>
         <m:r>
           <m:rPr>
@@ -2161,7 +2974,7 @@
           <m:t>,</m:t>
         </m:r>
         <m:r>
-          <m:t>0.605</m:t>
+          <m:t>0.910</m:t>
         </m:r>
         <m:r>
           <m:rPr>
@@ -2171,14 +2984,14 @@
         </m:r>
       </m:oMath>
       <w:r>
-        <w:t xml:space="preserve">), primary-camera futures produce</w:t>
-      </w:r>
-      <w:r>
-        <w:t xml:space="preserve"> </w:t>
-      </w:r>
-      <m:oMath>
-        <m:r>
-          <m:t>0.101</m:t>
+        <w:t xml:space="preserve">), positive in 22/22 states. For executed futures, it reduces action projection by</w:t>
+      </w:r>
+      <w:r>
+        <w:t xml:space="preserve"> </w:t>
+      </w:r>
+      <m:oMath>
+        <m:r>
+          <m:t>0.814</m:t>
         </m:r>
       </m:oMath>
       <w:r>
@@ -2195,7 +3008,7 @@
           <m:t>[</m:t>
         </m:r>
         <m:r>
-          <m:t>0.057</m:t>
+          <m:t>0.723</m:t>
         </m:r>
         <m:r>
           <m:rPr>
@@ -2204,7 +3017,7 @@
           <m:t>,</m:t>
         </m:r>
         <m:r>
-          <m:t>0.144</m:t>
+          <m:t>0.900</m:t>
         </m:r>
         <m:r>
           <m:rPr>
@@ -2214,14 +3027,14 @@
         </m:r>
       </m:oMath>
       <w:r>
-        <w:t xml:space="preserve">), and future proprioception produces</w:t>
-      </w:r>
-      <w:r>
-        <w:t xml:space="preserve"> </w:t>
-      </w:r>
-      <m:oMath>
-        <m:r>
-          <m:t>0.001</m:t>
+        <w:t xml:space="preserve">) and executed-endpoint projection by</w:t>
+      </w:r>
+      <w:r>
+        <w:t xml:space="preserve"> </w:t>
+      </w:r>
+      <m:oMath>
+        <m:r>
+          <m:t>0.851</m:t>
         </m:r>
       </m:oMath>
       <w:r>
@@ -2238,13 +3051,7 @@
           <m:t>[</m:t>
         </m:r>
         <m:r>
-          <m:rPr>
-            <m:sty m:val="p"/>
-          </m:rPr>
-          <m:t>−</m:t>
-        </m:r>
-        <m:r>
-          <m:t>0.004</m:t>
+          <m:t>0.766</m:t>
         </m:r>
         <m:r>
           <m:rPr>
@@ -2253,7 +3060,7 @@
           <m:t>,</m:t>
         </m:r>
         <m:r>
-          <m:t>0.008</m:t>
+          <m:t>0.922</m:t>
         </m:r>
         <m:r>
           <m:rPr>
@@ -2263,247 +3070,43 @@
         </m:r>
       </m:oMath>
       <w:r>
-        <w:t xml:space="preserve">). The strongest effect therefore comes from the view that most closely tracks the manipulator, while the proprioception interval includes zero.</w:t>
-      </w:r>
-    </w:p>
-    <w:p>
-      <w:pPr>
-        <w:pStyle w:val="BodyText"/>
-      </w:pPr>
-      <w:r>
-        <w:t xml:space="preserve">In the factorized</w:t>
-      </w:r>
-      <w:r>
-        <w:t xml:space="preserve"> </w:t>
-      </w:r>
-      <m:oMath>
-        <m:r>
-          <m:t>2</m:t>
-        </m:r>
-        <m:r>
-          <m:rPr>
-            <m:sty m:val="p"/>
-          </m:rPr>
-          <m:t>×</m:t>
-        </m:r>
-        <m:r>
-          <m:t>2</m:t>
-        </m:r>
-      </m:oMath>
-      <w:r>
-        <w:t xml:space="preserve"> </w:t>
-      </w:r>
-      <w:r>
-        <w:t xml:space="preserve">experiment, changing object state while averaging over robot state produces a mean action effect of</w:t>
-      </w:r>
-      <w:r>
-        <w:t xml:space="preserve"> </w:t>
-      </w:r>
-      <m:oMath>
-        <m:r>
-          <m:t>0.00015</m:t>
-        </m:r>
-      </m:oMath>
-      <w:r>
-        <w:t xml:space="preserve"> </w:t>
-      </w:r>
-      <w:r>
-        <w:t xml:space="preserve">(</w:t>
-      </w:r>
-      <m:oMath>
-        <m:r>
-          <m:rPr>
-            <m:sty m:val="p"/>
-          </m:rPr>
-          <m:t>[</m:t>
-        </m:r>
-        <m:r>
-          <m:rPr>
-            <m:sty m:val="p"/>
-          </m:rPr>
-          <m:t>−</m:t>
-        </m:r>
-        <m:r>
-          <m:t>0.00012</m:t>
-        </m:r>
-        <m:r>
-          <m:rPr>
-            <m:sty m:val="p"/>
-          </m:rPr>
-          <m:t>,</m:t>
-        </m:r>
-        <m:r>
-          <m:t>0.00049</m:t>
-        </m:r>
-        <m:r>
-          <m:rPr>
-            <m:sty m:val="p"/>
-          </m:rPr>
-          <m:t>]</m:t>
-        </m:r>
-      </m:oMath>
-      <w:r>
-        <w:t xml:space="preserve">) and endpoint effect of</w:t>
-      </w:r>
-      <w:r>
-        <w:t xml:space="preserve"> </w:t>
-      </w:r>
-      <m:oMath>
-        <m:r>
-          <m:t>0.00018</m:t>
-        </m:r>
-      </m:oMath>
-      <w:r>
-        <w:t xml:space="preserve"> </w:t>
-      </w:r>
-      <w:r>
-        <w:t xml:space="preserve">(</w:t>
-      </w:r>
-      <m:oMath>
-        <m:r>
-          <m:rPr>
-            <m:sty m:val="p"/>
-          </m:rPr>
-          <m:t>[</m:t>
-        </m:r>
-        <m:r>
-          <m:rPr>
-            <m:sty m:val="p"/>
-          </m:rPr>
-          <m:t>−</m:t>
-        </m:r>
-        <m:r>
-          <m:t>0.00040</m:t>
-        </m:r>
-        <m:r>
-          <m:rPr>
-            <m:sty m:val="p"/>
-          </m:rPr>
-          <m:t>,</m:t>
-        </m:r>
-        <m:r>
-          <m:t>0.00102</m:t>
-        </m:r>
-        <m:r>
-          <m:rPr>
-            <m:sty m:val="p"/>
-          </m:rPr>
-          <m:t>]</m:t>
-        </m:r>
-      </m:oMath>
-      <w:r>
-        <w:t xml:space="preserve">). These near-zero effects occur even though the decoder reliably identifies the rendered conditions. The result isolates the object-state main effect; because the robot-state main effect was not reported, it does not by itself establish a robot-versus-object contrast. The re-rendered videos may also lie outside the distribution of futures normally generated by the policy.</w:t>
-      </w:r>
-    </w:p>
-    <w:p>
-      <w:pPr>
-        <w:pStyle w:val="BodyText"/>
-      </w:pPr>
-      <w:r>
-        <w:t xml:space="preserve">The four exploratory natural pairs show the same qualitative pattern without re-rendering. Futures that differ primarily in robot motion produce a mean action effect of</w:t>
-      </w:r>
-      <w:r>
-        <w:t xml:space="preserve"> </w:t>
-      </w:r>
-      <m:oMath>
-        <m:r>
-          <m:t>0.291</m:t>
-        </m:r>
-      </m:oMath>
-      <w:r>
-        <w:t xml:space="preserve"> </w:t>
-      </w:r>
-      <w:r>
-        <w:t xml:space="preserve">(</w:t>
-      </w:r>
-      <m:oMath>
-        <m:r>
-          <m:rPr>
-            <m:sty m:val="p"/>
-          </m:rPr>
-          <m:t>[</m:t>
-        </m:r>
-        <m:r>
-          <m:t>0.060</m:t>
-        </m:r>
-        <m:r>
-          <m:rPr>
-            <m:sty m:val="p"/>
-          </m:rPr>
-          <m:t>,</m:t>
-        </m:r>
-        <m:r>
-          <m:t>0.521</m:t>
-        </m:r>
-        <m:r>
-          <m:rPr>
-            <m:sty m:val="p"/>
-          </m:rPr>
-          <m:t>]</m:t>
-        </m:r>
-      </m:oMath>
-      <w:r>
-        <w:t xml:space="preserve">) and robot-endpoint effect of</w:t>
-      </w:r>
-      <w:r>
-        <w:t xml:space="preserve"> </w:t>
-      </w:r>
-      <m:oMath>
-        <m:r>
-          <m:t>0.315</m:t>
-        </m:r>
-      </m:oMath>
-      <w:r>
-        <w:t xml:space="preserve"> </w:t>
-      </w:r>
-      <w:r>
-        <w:t xml:space="preserve">(</w:t>
-      </w:r>
-      <m:oMath>
-        <m:r>
-          <m:rPr>
-            <m:sty m:val="p"/>
-          </m:rPr>
-          <m:t>[</m:t>
-        </m:r>
-        <m:r>
-          <m:t>0.059</m:t>
-        </m:r>
-        <m:r>
-          <m:rPr>
-            <m:sty m:val="p"/>
-          </m:rPr>
-          <m:t>,</m:t>
-        </m:r>
-        <m:r>
-          <m:t>0.571</m:t>
-        </m:r>
-        <m:r>
-          <m:rPr>
-            <m:sty m:val="p"/>
-          </m:rPr>
-          <m:t>]</m:t>
-        </m:r>
-      </m:oMath>
-      <w:r>
-        <w:t xml:space="preserve">). Pairs that differ primarily in object state produce means of</w:t>
-      </w:r>
-      <w:r>
-        <w:t xml:space="preserve"> </w:t>
-      </w:r>
-      <m:oMath>
-        <m:r>
-          <m:t>0.021</m:t>
-        </m:r>
-      </m:oMath>
-      <w:r>
-        <w:t xml:space="preserve"> </w:t>
-      </w:r>
-      <w:r>
-        <w:t xml:space="preserve">for both action and goal-endpoint projection, with intervals that include zero. Because this analysis contains only four states and incomplete interval reporting for the object pairs, it should be treated as suggestive.</w:t>
-      </w:r>
-    </w:p>
-    <w:bookmarkStart w:id="29" w:name="fig:content"/>
+        <w:t xml:space="preserve">), again positive in every state. Task-balanced point estimates are</w:t>
+      </w:r>
+      <w:r>
+        <w:t xml:space="preserve"> </w:t>
+      </w:r>
+      <m:oMath>
+        <m:r>
+          <m:t>0.877</m:t>
+        </m:r>
+      </m:oMath>
+      <w:r>
+        <w:t xml:space="preserve">,</w:t>
+      </w:r>
+      <w:r>
+        <w:t xml:space="preserve"> </w:t>
+      </w:r>
+      <m:oMath>
+        <m:r>
+          <m:t>0.812</m:t>
+        </m:r>
+      </m:oMath>
+      <w:r>
+        <w:t xml:space="preserve">, and</w:t>
+      </w:r>
+      <w:r>
+        <w:t xml:space="preserve"> </w:t>
+      </w:r>
+      <m:oMath>
+        <m:r>
+          <m:t>0.853</m:t>
+        </m:r>
+      </m:oMath>
+      <w:r>
+        <w:t xml:space="preserve">; all prespecified primary sign tests remain significant after Holm correction. Because the replacement keeps token count fixed and does not mask attention positions, it provides stronger evidence that the future-token K/V interface carries donor-directed information. It does not establish a unique or complete circuit.</w:t>
+      </w:r>
+    </w:p>
+    <w:bookmarkStart w:id="36" w:name="fig:cosmos3"/>
     <w:p>
       <w:pPr>
         <w:pStyle w:val="CaptionedFigure"/>
@@ -2511,20 +3114,20 @@
       <w:r>
         <w:drawing>
           <wp:inline>
-            <wp:extent cx="5334000" cy="1709572"/>
+            <wp:extent cx="5334000" cy="1582028"/>
             <wp:effectExtent b="0" l="0" r="0" t="0"/>
-            <wp:docPr descr="" title="" id="27" name="Picture"/>
+            <wp:docPr descr="" title="" id="34" name="Picture"/>
             <a:graphic>
               <a:graphicData uri="http://schemas.openxmlformats.org/drawingml/2006/picture">
                 <pic:pic>
                   <pic:nvPicPr>
-                    <pic:cNvPr descr="figures/content_results.png" id="28" name="Picture"/>
+                    <pic:cNvPr descr="figures/pathway_results.pdf" id="35" name="Picture"/>
                     <pic:cNvPicPr>
                       <a:picLocks noChangeArrowheads="1" noChangeAspect="1"/>
                     </pic:cNvPicPr>
                   </pic:nvPicPr>
                   <pic:blipFill>
-                    <a:blip r:embed="rId26"/>
+                    <a:blip r:embed="rId33"/>
                     <a:stretch>
                       <a:fillRect/>
                     </a:stretch>
@@ -2532,7 +3135,7 @@
                   <pic:spPr bwMode="auto">
                     <a:xfrm>
                       <a:off x="0" y="0"/>
-                      <a:ext cx="5334000" cy="1709572"/>
+                      <a:ext cx="5334000" cy="1582028"/>
                     </a:xfrm>
                     <a:prstGeom prst="rect">
                       <a:avLst/>
@@ -2556,26 +3159,117 @@
         <w:pStyle w:val="ImageCaption"/>
       </w:pPr>
       <w:r>
-        <w:t xml:space="preserve">Cosmos Policy content interventions. (a) Action effects from replacing each future modality. (b) Estimated object-state main effect in the factorized intervention. (c) Action and robot-endpoint effects in four exploratory natural robot-motion pairs. Bars show 95% cluster-bootstrap confidence intervals.</w:t>
-      </w:r>
-    </w:p>
-    <w:bookmarkEnd w:id="29"/>
+        <w:t xml:space="preserve">Cosmos 3 population results. (a) Coherent predicted and executed futures steer actions, outperform natural controls, and move one-chunk simulator endpoints toward the donor across 22 states and six tasks. (b) Replacing donor-run future-token K/V with self-future K/V removes most donor-directed action and endpoint projection. (c) In ten factor-study states, isolated robot- and object-pixel effects lie inside the prespecified</w:t>
+      </w:r>
+      <w:r>
+        <w:t xml:space="preserve"> </w:t>
+      </w:r>
+      <m:oMath>
+        <m:r>
+          <m:rPr>
+            <m:sty m:val="p"/>
+          </m:rPr>
+          <m:t>[</m:t>
+        </m:r>
+        <m:r>
+          <m:rPr>
+            <m:sty m:val="p"/>
+          </m:rPr>
+          <m:t>−</m:t>
+        </m:r>
+        <m:r>
+          <m:t>0.10</m:t>
+        </m:r>
+        <m:r>
+          <m:rPr>
+            <m:sty m:val="p"/>
+          </m:rPr>
+          <m:t>,</m:t>
+        </m:r>
+        <m:r>
+          <m:t>0.10</m:t>
+        </m:r>
+        <m:r>
+          <m:rPr>
+            <m:sty m:val="p"/>
+          </m:rPr>
+          <m:t>]</m:t>
+        </m:r>
+      </m:oMath>
+      <w:r>
+        <w:t xml:space="preserve"> </w:t>
+      </w:r>
+      <w:r>
+        <w:t xml:space="preserve">region. Bars are 95% state-bootstrap intervals.</w:t>
+      </w:r>
+    </w:p>
+    <w:bookmarkEnd w:id="36"/>
+    <w:bookmarkEnd w:id="37"/>
+    <w:bookmarkEnd w:id="38"/>
+    <w:bookmarkStart w:id="41" w:name="sec:discussion"/>
+    <w:p>
+      <w:pPr>
+        <w:pStyle w:val="Heading1"/>
+      </w:pPr>
+      <w:r>
+        <w:t xml:space="preserve">Discussion and Limitations</w:t>
+      </w:r>
+    </w:p>
+    <w:p>
+      <w:pPr>
+        <w:pStyle w:val="FirstParagraph"/>
+      </w:pPr>
+      <w:r>
+        <w:t xml:space="preserve">Together, the experiments support future-dependent action generation across two WAM generations, but not a single shared content code. A coherent donor future directs the action toward its associated alternative, and the endpoint follows after simulator execution. This is more specific than showing that generic corruption changes behavior: the intervention predicts which alternative the model will approach.</w:t>
+      </w:r>
+    </w:p>
     <w:p>
       <w:pPr>
         <w:pStyle w:val="BodyText"/>
       </w:pPr>
       <w:r>
-        <w:t xml:space="preserve">Together, the camera interventions and natural pairs are consistent with sensitivity to camera-visible robot motion at the sampled Cosmos Policy states. They do not show that the policy generally ignores object consequences or localize a latent robot-motion representation.</w:t>
-      </w:r>
-    </w:p>
-    <w:bookmarkEnd w:id="30"/>
-    <w:bookmarkStart w:id="35" w:name="sec:pathway"/>
-    <w:p>
-      <w:pPr>
-        <w:pStyle w:val="Heading2"/>
-      </w:pPr>
-      <w:r>
-        <w:t xml:space="preserve">Future-token keys and values contribute to the Cosmos 3 action shift</w:t>
+        <w:t xml:space="preserve">The content results narrow the interpretation. Cosmos Policy’s early-state pattern resembles an inverse-dynamics interface conditioned on visible robot motion. Cosmos 3 does not admit the same isolated-pixel account: strong whole-future steering coexists with negligible robot-only and object-only effects. The difference is inconsistent with a model-independent robot-pixel explanation and suggests that usable content can depend on architecture, context, or distributed feature interactions. The pathway experiments complement this finding. Cosmos Policy identifies an active late attention edge; Cosmos 3 shows across 22 states that future-token K/V carries most of the donor-directed shift.</w:t>
+      </w:r>
+    </w:p>
+    <w:p>
+      <w:pPr>
+        <w:pStyle w:val="BodyText"/>
+      </w:pPr>
+      <w:r>
+        <w:t xml:space="preserve">The evidence remains narrower than planning. We do not test candidate generation, outcome comparison, or value-based selection, and we do not establish effects on binary task success.</w:t>
+      </w:r>
+      <w:r>
+        <w:t xml:space="preserve"> </w:t>
+      </w:r>
+      <w:r>
+        <w:t xml:space="preserve">“Future”</w:t>
+      </w:r>
+      <w:r>
+        <w:t xml:space="preserve"> </w:t>
+      </w:r>
+      <w:r>
+        <w:t xml:space="preserve">and</w:t>
+      </w:r>
+      <w:r>
+        <w:t xml:space="preserve"> </w:t>
+      </w:r>
+      <w:r>
+        <w:t xml:space="preserve">“imagined”</w:t>
+      </w:r>
+      <w:r>
+        <w:t xml:space="preserve"> </w:t>
+      </w:r>
+      <w:r>
+        <w:t xml:space="preserve">describe generated representations, not deliberation. The claim is therefore that these direct policies use coherent futures to condition action, not that WAMs generally plan over task consequences.</w:t>
+      </w:r>
+    </w:p>
+    <w:bookmarkStart w:id="39" w:name="limitations."/>
+    <w:p>
+      <w:pPr>
+        <w:pStyle w:val="Heading4"/>
+      </w:pPr>
+      <w:r>
+        <w:t xml:space="preserve">Limitations.</w:t>
       </w:r>
     </w:p>
     <w:p>
@@ -2583,410 +3277,36 @@
         <w:pStyle w:val="FirstParagraph"/>
       </w:pPr>
       <w:r>
-        <w:t xml:space="preserve">On four calibration states, donor futures produce a mean action projection of</w:t>
-      </w:r>
-      <w:r>
-        <w:t xml:space="preserve"> </w:t>
-      </w:r>
-      <m:oMath>
-        <m:r>
-          <m:t>0.981</m:t>
-        </m:r>
-      </m:oMath>
-      <w:r>
-        <w:t xml:space="preserve"> </w:t>
-      </w:r>
-      <w:r>
-        <w:t xml:space="preserve">before key–value replacement. Replacing future-token keys and values at layer 16 reduces projection by</w:t>
-      </w:r>
-      <w:r>
-        <w:t xml:space="preserve"> </w:t>
-      </w:r>
-      <m:oMath>
-        <m:r>
-          <m:t>0.346</m:t>
-        </m:r>
-      </m:oMath>
-      <w:r>
-        <w:t xml:space="preserve"> </w:t>
-      </w:r>
-      <w:r>
-        <w:t xml:space="preserve">units (</w:t>
-      </w:r>
-      <m:oMath>
-        <m:r>
-          <m:rPr>
-            <m:sty m:val="p"/>
-          </m:rPr>
-          <m:t>[</m:t>
-        </m:r>
-        <m:r>
-          <m:t>0.192</m:t>
-        </m:r>
-        <m:r>
-          <m:rPr>
-            <m:sty m:val="p"/>
-          </m:rPr>
-          <m:t>,</m:t>
-        </m:r>
-        <m:r>
-          <m:t>0.501</m:t>
-        </m:r>
-        <m:r>
-          <m:rPr>
-            <m:sty m:val="p"/>
-          </m:rPr>
-          <m:t>]</m:t>
-        </m:r>
-      </m:oMath>
-      <w:r>
-        <w:t xml:space="preserve">). Replacement at all direct future-to-action attention reads reduces projection by</w:t>
-      </w:r>
-      <w:r>
-        <w:t xml:space="preserve"> </w:t>
-      </w:r>
-      <m:oMath>
-        <m:r>
-          <m:t>0.842</m:t>
-        </m:r>
-      </m:oMath>
-      <w:r>
-        <w:t xml:space="preserve"> </w:t>
-      </w:r>
-      <w:r>
-        <w:t xml:space="preserve">(</w:t>
-      </w:r>
-      <m:oMath>
-        <m:r>
-          <m:rPr>
-            <m:sty m:val="p"/>
-          </m:rPr>
-          <m:t>[</m:t>
-        </m:r>
-        <m:r>
-          <m:t>0.766</m:t>
-        </m:r>
-        <m:r>
-          <m:rPr>
-            <m:sty m:val="p"/>
-          </m:rPr>
-          <m:t>,</m:t>
-        </m:r>
-        <m:r>
-          <m:t>0.910</m:t>
-        </m:r>
-        <m:r>
-          <m:rPr>
-            <m:sty m:val="p"/>
-          </m:rPr>
-          <m:t>]</m:t>
-        </m:r>
-      </m:oMath>
-      <w:r>
-        <w:t xml:space="preserve">), with a positive reduction in all four states. Extending the replacement to future-to-current-video reads reduces projection by</w:t>
-      </w:r>
-      <w:r>
-        <w:t xml:space="preserve"> </w:t>
-      </w:r>
-      <m:oMath>
-        <m:r>
-          <m:t>0.995</m:t>
-        </m:r>
-      </m:oMath>
-      <w:r>
-        <w:t xml:space="preserve"> </w:t>
-      </w:r>
-      <w:r>
-        <w:t xml:space="preserve">(</w:t>
-      </w:r>
-      <m:oMath>
-        <m:r>
-          <m:rPr>
-            <m:sty m:val="p"/>
-          </m:rPr>
-          <m:t>[</m:t>
-        </m:r>
-        <m:r>
-          <m:t>0.976</m:t>
-        </m:r>
-        <m:r>
-          <m:rPr>
-            <m:sty m:val="p"/>
-          </m:rPr>
-          <m:t>,</m:t>
-        </m:r>
-        <m:r>
-          <m:t>1.013</m:t>
-        </m:r>
-        <m:r>
-          <m:rPr>
-            <m:sty m:val="p"/>
-          </m:rPr>
-          <m:t>]</m:t>
-        </m:r>
-      </m:oMath>
-      <w:r>
-        <w:t xml:space="preserve">). Record, replay, and same-run replacement controls reproduce the original actions exactly.</w:t>
-      </w:r>
-    </w:p>
-    <w:p>
-      <w:pPr>
-        <w:pStyle w:val="BodyText"/>
-      </w:pPr>
-      <w:r>
-        <w:t xml:space="preserve">The frozen interventions produce the same ordering on the held-out Banana state (Figure </w:t>
-      </w:r>
-      <w:hyperlink w:anchor="fig:pathway">
-        <w:r>
-          <w:rPr>
-            <w:rStyle w:val="Hyperlink"/>
-          </w:rPr>
-          <w:t xml:space="preserve">4</w:t>
-        </w:r>
-      </w:hyperlink>
-      <w:r>
-        <w:t xml:space="preserve">b). For a model-predicted donor future, action projection falls from</w:t>
-      </w:r>
-      <w:r>
-        <w:t xml:space="preserve"> </w:t>
-      </w:r>
-      <m:oMath>
-        <m:r>
-          <m:t>0.900</m:t>
-        </m:r>
-      </m:oMath>
-      <w:r>
-        <w:t xml:space="preserve"> </w:t>
-      </w:r>
-      <w:r>
-        <w:t xml:space="preserve">to</w:t>
-      </w:r>
-      <w:r>
-        <w:t xml:space="preserve"> </w:t>
-      </w:r>
-      <m:oMath>
-        <m:r>
-          <m:t>0.749</m:t>
-        </m:r>
-      </m:oMath>
-      <w:r>
-        <w:t xml:space="preserve"> </w:t>
-      </w:r>
-      <w:r>
-        <w:t xml:space="preserve">after layer-16 replacement,</w:t>
-      </w:r>
-      <w:r>
-        <w:t xml:space="preserve"> </w:t>
-      </w:r>
-      <m:oMath>
-        <m:r>
-          <m:t>0.122</m:t>
-        </m:r>
-      </m:oMath>
-      <w:r>
-        <w:t xml:space="preserve"> </w:t>
-      </w:r>
-      <w:r>
-        <w:t xml:space="preserve">after direct replacement, and</w:t>
-      </w:r>
-      <w:r>
-        <w:t xml:space="preserve"> </w:t>
-      </w:r>
-      <m:oMath>
-        <m:r>
-          <m:rPr>
-            <m:sty m:val="p"/>
-          </m:rPr>
-          <m:t>−</m:t>
-        </m:r>
-        <m:r>
-          <m:t>0.012</m:t>
-        </m:r>
-      </m:oMath>
-      <w:r>
-        <w:t xml:space="preserve"> </w:t>
-      </w:r>
-      <w:r>
-        <w:t xml:space="preserve">after the extended replacement. For a future encoded from an executed donor branch, the corresponding values are</w:t>
-      </w:r>
-      <w:r>
-        <w:t xml:space="preserve"> </w:t>
-      </w:r>
-      <m:oMath>
-        <m:r>
-          <m:t>1.577</m:t>
-        </m:r>
-      </m:oMath>
-      <w:r>
-        <w:t xml:space="preserve">,</w:t>
-      </w:r>
-      <w:r>
-        <w:t xml:space="preserve"> </w:t>
-      </w:r>
-      <m:oMath>
-        <m:r>
-          <m:t>1.326</m:t>
-        </m:r>
-      </m:oMath>
-      <w:r>
-        <w:t xml:space="preserve">,</w:t>
-      </w:r>
-      <w:r>
-        <w:t xml:space="preserve"> </w:t>
-      </w:r>
-      <m:oMath>
-        <m:r>
-          <m:t>0.382</m:t>
-        </m:r>
-      </m:oMath>
-      <w:r>
-        <w:t xml:space="preserve">, and</w:t>
-      </w:r>
-      <w:r>
-        <w:t xml:space="preserve"> </w:t>
-      </w:r>
-      <m:oMath>
-        <m:r>
-          <m:rPr>
-            <m:sty m:val="p"/>
-          </m:rPr>
-          <m:t>−</m:t>
-        </m:r>
-        <m:r>
-          <m:t>0.012</m:t>
-        </m:r>
-      </m:oMath>
-      <w:r>
-        <w:t xml:space="preserve">.</w:t>
-      </w:r>
-    </w:p>
-    <w:bookmarkStart w:id="34" w:name="fig:pathway"/>
-    <w:p>
-      <w:pPr>
-        <w:pStyle w:val="CaptionedFigure"/>
-      </w:pPr>
-      <w:r>
-        <w:drawing>
-          <wp:inline>
-            <wp:extent cx="5334000" cy="1762753"/>
-            <wp:effectExtent b="0" l="0" r="0" t="0"/>
-            <wp:docPr descr="" title="" id="32" name="Picture"/>
-            <a:graphic>
-              <a:graphicData uri="http://schemas.openxmlformats.org/drawingml/2006/picture">
-                <pic:pic>
-                  <pic:nvPicPr>
-                    <pic:cNvPr descr="figures/pathway_results.png" id="33" name="Picture"/>
-                    <pic:cNvPicPr>
-                      <a:picLocks noChangeArrowheads="1" noChangeAspect="1"/>
-                    </pic:cNvPicPr>
-                  </pic:nvPicPr>
-                  <pic:blipFill>
-                    <a:blip r:embed="rId31"/>
-                    <a:stretch>
-                      <a:fillRect/>
-                    </a:stretch>
-                  </pic:blipFill>
-                  <pic:spPr bwMode="auto">
-                    <a:xfrm>
-                      <a:off x="0" y="0"/>
-                      <a:ext cx="5334000" cy="1762753"/>
-                    </a:xfrm>
-                    <a:prstGeom prst="rect">
-                      <a:avLst/>
-                    </a:prstGeom>
-                    <a:noFill/>
-                    <a:ln w="9525">
-                      <a:noFill/>
-                      <a:headEnd/>
-                      <a:tailEnd/>
-                    </a:ln>
-                  </pic:spPr>
-                </pic:pic>
-              </a:graphicData>
-            </a:graphic>
-          </wp:inline>
-        </w:drawing>
-      </w:r>
-    </w:p>
-    <w:p>
-      <w:pPr>
-        <w:pStyle w:val="ImageCaption"/>
-      </w:pPr>
-      <w:r>
-        <w:t xml:space="preserve">Future-token key–value replacement in Cosmos 3. (a) Reduction in donor-action projection across four calibration states. (b) Action projection on the held-out Banana state under the frozen replacement schemes.</w:t>
-      </w:r>
-    </w:p>
-    <w:bookmarkEnd w:id="34"/>
-    <w:p>
-      <w:pPr>
-        <w:pStyle w:val="BodyText"/>
-      </w:pPr>
-      <w:r>
-        <w:t xml:space="preserve">Endpoint effects are less consistent. For the predicted future, direct replacement changes endpoint projection from</w:t>
-      </w:r>
-      <w:r>
-        <w:t xml:space="preserve"> </w:t>
-      </w:r>
-      <m:oMath>
-        <m:r>
-          <m:t>0.973</m:t>
-        </m:r>
-      </m:oMath>
-      <w:r>
-        <w:t xml:space="preserve"> </w:t>
-      </w:r>
-      <w:r>
-        <w:t xml:space="preserve">to</w:t>
-      </w:r>
-      <w:r>
-        <w:t xml:space="preserve"> </w:t>
-      </w:r>
-      <m:oMath>
-        <m:r>
-          <m:t>0.242</m:t>
-        </m:r>
-      </m:oMath>
-      <w:r>
-        <w:t xml:space="preserve">; for the executed-branch future, it changes endpoint projection only from</w:t>
-      </w:r>
-      <w:r>
-        <w:t xml:space="preserve"> </w:t>
-      </w:r>
-      <m:oMath>
-        <m:r>
-          <m:t>1.019</m:t>
-        </m:r>
-      </m:oMath>
-      <w:r>
-        <w:t xml:space="preserve"> </w:t>
-      </w:r>
-      <w:r>
-        <w:t xml:space="preserve">to</w:t>
-      </w:r>
-      <w:r>
-        <w:t xml:space="preserve"> </w:t>
-      </w:r>
-      <m:oMath>
-        <m:r>
-          <m:t>0.976</m:t>
-        </m:r>
-      </m:oMath>
-      <w:r>
-        <w:t xml:space="preserve"> </w:t>
-      </w:r>
-      <w:r>
-        <w:t xml:space="preserve">despite a large action effect. The intervention therefore identifies future-token attention activations that contribute to the donor-directed action shift, but it does not establish what they encode or whether they are the only route from future tokens to action.</w:t>
-      </w:r>
-    </w:p>
-    <w:bookmarkEnd w:id="35"/>
-    <w:bookmarkEnd w:id="36"/>
-    <w:bookmarkStart w:id="39" w:name="sec:discussion"/>
+        <w:t xml:space="preserve">All interventions are in simulation and cover two checkpoints, six RoboLab tasks, and LIBERO-Long. Cosmos Policy’s strongest result uses one first-query state per task, while later estimates use different states and cannot isolate elapsed time. Its natural content analysis contains only four states, and rendered hybrids may be outside the policy’s native future distribution. Cosmos 3 completed 22 of 24 frozen population states and 10 of 12 factor states; the two population omissions resulted from short source videos and were not replaced. Pixel masks may miss distributed features or induce nonlinear changes, so negligible isolated effects do not establish joint necessity. Finally, key removal changes attention normalization, and K/V replacement can interact with unpatched routes. These interventions identify active pathways, not a full circuit.</w:t>
+      </w:r>
+    </w:p>
+    <w:bookmarkEnd w:id="39"/>
+    <w:bookmarkStart w:id="40" w:name="broader-impact."/>
+    <w:p>
+      <w:pPr>
+        <w:pStyle w:val="Heading4"/>
+      </w:pPr>
+      <w:r>
+        <w:t xml:space="preserve">Broader impact.</w:t>
+      </w:r>
+    </w:p>
+    <w:p>
+      <w:pPr>
+        <w:pStyle w:val="FirstParagraph"/>
+      </w:pPr>
+      <w:r>
+        <w:t xml:space="preserve">Mechanistic tests can help distinguish plausible-looking predictions from representations that actually control behavior. The same interfaces could also redirect robot actions or create false confidence if validated on narrow state distributions. Use beyond simulation would require broader coverage, physical safety constraints, and monitoring outside the intervention metric.</w:t>
+      </w:r>
+    </w:p>
+    <w:bookmarkEnd w:id="40"/>
+    <w:bookmarkEnd w:id="41"/>
+    <w:bookmarkStart w:id="42" w:name="conclusion"/>
     <w:p>
       <w:pPr>
         <w:pStyle w:val="Heading1"/>
       </w:pPr>
       <w:r>
-        <w:t xml:space="preserve">Discussion and Limitations</w:t>
+        <w:t xml:space="preserve">Conclusion</w:t>
       </w:r>
     </w:p>
     <w:p>
@@ -2994,89 +3314,11 @@
         <w:pStyle w:val="FirstParagraph"/>
       </w:pPr>
       <w:r>
-        <w:t xml:space="preserve">Future transplantation provides stronger evidence than corruption alone because it asks whether an action change follows the content of a specific alternative future. Positive donor projections in both checkpoints show that future representations do more than occupy behaviorally sensitive positions: selecting a different coherent future predictably changes the direction of the action.</w:t>
-      </w:r>
-    </w:p>
-    <w:p>
-      <w:pPr>
-        <w:pStyle w:val="BodyText"/>
-      </w:pPr>
-      <w:r>
-        <w:t xml:space="preserve">In Cosmos Policy, the camera and natural-pair results are consistent with an inverse-dynamics-like use of visible robot motion. The action follows a displayed robot future, whereas future proprioception and isolated object-state changes have near-zero effects. This is not evidence that predicted object consequences never matter. The synthetic intervention tests one restricted object-state contrast, and the natural analysis contains only four states.</w:t>
-      </w:r>
-    </w:p>
-    <w:p>
-      <w:pPr>
-        <w:pStyle w:val="BodyText"/>
-      </w:pPr>
-      <w:r>
-        <w:t xml:space="preserve">The content and pathway results also do not form one mechanism. Cosmos Policy identifies future changes associated with the action shift, while the Cosmos 3 intervention identifies attention activations that contribute to its shift. Because these experiments use different models, we do not show that camera-visible robot-motion information passes through the replaced Cosmos 3 keys and values. More broadly, neither experiment tests candidate generation, outcome comparison, or value-based choice. The results therefore establish future-dependent action generation, not planning.</w:t>
-      </w:r>
-    </w:p>
-    <w:bookmarkStart w:id="37" w:name="limitations."/>
-    <w:p>
-      <w:pPr>
-        <w:pStyle w:val="Heading4"/>
-      </w:pPr>
-      <w:r>
-        <w:t xml:space="preserve">Limitations.</w:t>
-      </w:r>
-    </w:p>
-    <w:p>
-      <w:pPr>
-        <w:pStyle w:val="FirstParagraph"/>
-      </w:pPr>
-      <w:r>
-        <w:t xml:space="preserve">The evidence comes from a limited number of independent states. Cosmos Policy’s largest effects occur at one first-query state from each of ten tasks; later estimates are much smaller, and decision point is confounded with saved state. Cosmos 3 transplantation uses four states, while the held-out key–value test uses one. Additional donors and process launches improve within-state measurement but do not establish generalization across states. We also do not establish effects on task success.</w:t>
-      </w:r>
-    </w:p>
-    <w:p>
-      <w:pPr>
-        <w:pStyle w:val="BodyText"/>
-      </w:pPr>
-      <w:r>
-        <w:t xml:space="preserve">The content and pathway analyses have further limits. Factorized videos may be outside the policy’s normal future distribution and provide only the object-state main effect. The natural matched-pair analysis falls below its prespecified sample size. On the held-out Cosmos 3 state, key–value replacement does not consistently reduce endpoint effects even when it reduces action projection. These qualifications limit the interpretation to the sampled checkpoints and states.</w:t>
-      </w:r>
-    </w:p>
-    <w:bookmarkEnd w:id="37"/>
-    <w:bookmarkStart w:id="38" w:name="broader-impact."/>
-    <w:p>
-      <w:pPr>
-        <w:pStyle w:val="Heading4"/>
-      </w:pPr>
-      <w:r>
-        <w:t xml:space="preserve">Broader impact.</w:t>
-      </w:r>
-    </w:p>
-    <w:p>
-      <w:pPr>
-        <w:pStyle w:val="FirstParagraph"/>
-      </w:pPr>
-      <w:r>
-        <w:t xml:space="preserve">Future transplantation may help audit whether a robot policy’s predictions affect its actions, but the same intervention could redirect behavior. Any use outside simulation would require broader state coverage, physical safety constraints, and independent action monitoring.</w:t>
-      </w:r>
-    </w:p>
-    <w:bookmarkEnd w:id="38"/>
-    <w:bookmarkEnd w:id="39"/>
-    <w:bookmarkStart w:id="40" w:name="conclusion"/>
-    <w:p>
-      <w:pPr>
-        <w:pStyle w:val="Heading1"/>
-      </w:pPr>
-      <w:r>
-        <w:t xml:space="preserve">Conclusion</w:t>
-      </w:r>
-    </w:p>
-    <w:p>
-      <w:pPr>
-        <w:pStyle w:val="FirstParagraph"/>
-      </w:pPr>
-      <w:r>
-        <w:t xml:space="preserve">Future transplantation provides donor-specific evidence that predicted futures influence actions in both WAM checkpoints. Connecting camera-visible robot motion to the future-token key–value pathway within one model, across more states and task outcomes, remains an open problem.</w:t>
-      </w:r>
-    </w:p>
-    <w:bookmarkEnd w:id="40"/>
-    <w:bookmarkStart w:id="41" w:name="app:reproducibility"/>
+        <w:t xml:space="preserve">Coherent generated futures steer actions and one-chunk simulator endpoints in two WAM checkpoints. In Cosmos 3, the result holds across 22 sampled states, is strongly attenuated by future-token K/V replacement, and is not recreated by isolated robot or object pixels. Cosmos Policy shows a related but more state-dependent pattern that favors visual robot-motion information. These results identify future-conditioned action generation while leaving general planning claims open.</w:t>
+      </w:r>
+    </w:p>
+    <w:bookmarkEnd w:id="42"/>
+    <w:bookmarkStart w:id="43" w:name="app:reproducibility"/>
     <w:p>
       <w:pPr>
         <w:pStyle w:val="Heading1"/>
@@ -3114,7 +3356,7 @@
         <w:t xml:space="preserve">cb689ec0</w:t>
       </w:r>
       <w:r>
-        <w:t xml:space="preserve">, LIBERO, PyTorch 2.7 with CUDA 12.8, and two NVIDIA H100 80GB GPUs. Endpoint vectors concatenate goal-relevant simulator coordinates with the official nine-dimensional proprioceptive endpoint. The prespecified design includes ten tasks, three decision points, eight unmodified policy runs per state, one reciprocal donor pair per state, and three future-noise draws per direction. Confidence intervals use 10,000 bootstrap resamples of simulator states.</w:t>
+        <w:t xml:space="preserve">, LIBERO, PyTorch 2.7 with CUDA 12.8, and two NVIDIA H100 80GB GPUs. The frozen design contains ten tasks, three state indices, eight native policy runs per state, one reciprocal donor pair per state, and three future-noise draws per direction. Confidence intervals use 10,000 bootstrap resamples of simulator states.</w:t>
       </w:r>
     </w:p>
     <w:p>
@@ -3122,7 +3364,43 @@
         <w:pStyle w:val="BodyText"/>
       </w:pPr>
       <w:r>
-        <w:t xml:space="preserve">The Cosmos 3 experiments use checkpoint revision</w:t>
+        <w:t xml:space="preserve">The Cosmos 3 experiments pin Cosmos commit</w:t>
+      </w:r>
+      <w:r>
+        <w:t xml:space="preserve"> </w:t>
+      </w:r>
+      <w:r>
+        <w:rPr>
+          <w:rStyle w:val="VerbatimChar"/>
+        </w:rPr>
+        <w:t xml:space="preserve">9aa98e5a</w:t>
+      </w:r>
+      <w:r>
+        <w:t xml:space="preserve">, Cosmos Framework commit</w:t>
+      </w:r>
+      <w:r>
+        <w:t xml:space="preserve"> </w:t>
+      </w:r>
+      <w:r>
+        <w:rPr>
+          <w:rStyle w:val="VerbatimChar"/>
+        </w:rPr>
+        <w:t xml:space="preserve">d4599e2e</w:t>
+      </w:r>
+      <w:r>
+        <w:t xml:space="preserve">, RoboLab commit</w:t>
+      </w:r>
+      <w:r>
+        <w:t xml:space="preserve"> </w:t>
+      </w:r>
+      <w:r>
+        <w:rPr>
+          <w:rStyle w:val="VerbatimChar"/>
+        </w:rPr>
+        <w:t xml:space="preserve">9db0aaf0</w:t>
+      </w:r>
+      <w:r>
+        <w:t xml:space="preserve">, and checkpoint revision</w:t>
       </w:r>
       <w:r>
         <w:t xml:space="preserve"> </w:t>
@@ -3134,16 +3412,123 @@
         <w:t xml:space="preserve">2b9f9517</w:t>
       </w:r>
       <w:r>
-        <w:t xml:space="preserve">. The public report and checkpoint describe a diffusion generator with 36 transformer layers, four diffusion steps, and 32-action chunks of absolute joint positions</w:t>
-      </w:r>
-      <w:r>
-        <w:t xml:space="preserve"> </w:t>
-      </w:r>
-      <w:r>
-        <w:t xml:space="preserve">(NVIDIA 2026a, 2026b)</w:t>
-      </w:r>
-      <w:r>
-        <w:t xml:space="preserve">. For each endpoint evaluation, we reconstruct the simulator, restore the saved state, and replay the same observation prefix. Separate controls check token layout, sampler wrapping, cache recording and replay, and same-run replacement. Sentinel values verify that interventions to future representations never write to the action-token slice directly. Repeating the held-out action intervention in five independently launched processes yields bitwise-identical results; these repetitions test numerical stability, not generalization.</w:t>
+        <w:t xml:space="preserve">. The frozen manifest has SHA-256</w:t>
+      </w:r>
+      <w:r>
+        <w:t xml:space="preserve"> </w:t>
+      </w:r>
+      <w:r>
+        <w:rPr>
+          <w:rStyle w:val="VerbatimChar"/>
+        </w:rPr>
+        <w:t xml:space="preserve">46b6fe3d6abb07712d0926361587b853b2e8313a10c7faeeccb0150d030e986b</w:t>
+      </w:r>
+      <w:r>
+        <w:t xml:space="preserve">. Endpoint evaluation reconstructs the environment, restores the saved state, and replays the observation prefix. Separate controls test token layout, sampler wrapping, cache record and replay, self replacement, and the action-coordinate boundary. Complete timing and aggregate compute accounting remain to be added before submission.</w:t>
+      </w:r>
+    </w:p>
+    <w:bookmarkEnd w:id="43"/>
+    <w:bookmarkStart w:id="44" w:name="app:additional"/>
+    <w:p>
+      <w:pPr>
+        <w:pStyle w:val="Heading1"/>
+      </w:pPr>
+      <w:r>
+        <w:t xml:space="preserve">Additional Results and Boundaries</w:t>
+      </w:r>
+    </w:p>
+    <w:p>
+      <w:pPr>
+        <w:pStyle w:val="FirstParagraph"/>
+      </w:pPr>
+      <w:r>
+        <w:t xml:space="preserve">Across all 30 Cosmos Policy states, mean donor-minus-self steering is</w:t>
+      </w:r>
+      <w:r>
+        <w:t xml:space="preserve"> </w:t>
+      </w:r>
+      <m:oMath>
+        <m:r>
+          <m:t>0.186</m:t>
+        </m:r>
+      </m:oMath>
+      <w:r>
+        <w:t xml:space="preserve"> </w:t>
+      </w:r>
+      <w:r>
+        <w:t xml:space="preserve">(</w:t>
+      </w:r>
+      <m:oMath>
+        <m:r>
+          <m:rPr>
+            <m:sty m:val="p"/>
+          </m:rPr>
+          <m:t>[</m:t>
+        </m:r>
+        <m:r>
+          <m:t>0.095</m:t>
+        </m:r>
+        <m:r>
+          <m:rPr>
+            <m:sty m:val="p"/>
+          </m:rPr>
+          <m:t>,</m:t>
+        </m:r>
+        <m:r>
+          <m:t>0.290</m:t>
+        </m:r>
+        <m:r>
+          <m:rPr>
+            <m:sty m:val="p"/>
+          </m:rPr>
+          <m:t>]</m:t>
+        </m:r>
+      </m:oMath>
+      <w:r>
+        <w:t xml:space="preserve">) for actions and</w:t>
+      </w:r>
+      <w:r>
+        <w:t xml:space="preserve"> </w:t>
+      </w:r>
+      <m:oMath>
+        <m:r>
+          <m:t>0.194</m:t>
+        </m:r>
+      </m:oMath>
+      <w:r>
+        <w:t xml:space="preserve"> </w:t>
+      </w:r>
+      <w:r>
+        <w:t xml:space="preserve">(</w:t>
+      </w:r>
+      <m:oMath>
+        <m:r>
+          <m:rPr>
+            <m:sty m:val="p"/>
+          </m:rPr>
+          <m:t>[</m:t>
+        </m:r>
+        <m:r>
+          <m:t>0.091</m:t>
+        </m:r>
+        <m:r>
+          <m:rPr>
+            <m:sty m:val="p"/>
+          </m:rPr>
+          <m:t>,</m:t>
+        </m:r>
+        <m:r>
+          <m:t>0.305</m:t>
+        </m:r>
+        <m:r>
+          <m:rPr>
+            <m:sty m:val="p"/>
+          </m:rPr>
+          <m:t>]</m:t>
+        </m:r>
+      </m:oMath>
+      <w:r>
+        <w:t xml:space="preserve">) for endpoints. Because the three state indices may be nested within task trajectories, the first-query analysis is the cleaner confirmatory result.</w:t>
       </w:r>
     </w:p>
     <w:p>
@@ -3151,61 +3536,7 @@
         <w:pStyle w:val="BodyText"/>
       </w:pPr>
       <w:r>
-        <w:t xml:space="preserve">The supplied artifact contains the aggregate values used for the figures, but not the full seed list, intervention logs, code, repository hashes, container digests, per-run wall-clock times, or aggregate compute. These items must be added to a complete reproduction package.</w:t>
-      </w:r>
-    </w:p>
-    <w:bookmarkEnd w:id="41"/>
-    <w:bookmarkStart w:id="42" w:name="app:additional"/>
-    <w:p>
-      <w:pPr>
-        <w:pStyle w:val="Heading1"/>
-      </w:pPr>
-      <w:r>
-        <w:t xml:space="preserve">Additional Results and Exclusions</w:t>
-      </w:r>
-    </w:p>
-    <w:p>
-      <w:pPr>
-        <w:pStyle w:val="FirstParagraph"/>
-      </w:pPr>
-      <w:r>
-        <w:t xml:space="preserve">Across all 30 Cosmos Policy states, the mean donor-minus-self effect is</w:t>
-      </w:r>
-      <w:r>
-        <w:t xml:space="preserve"> </w:t>
-      </w:r>
-      <m:oMath>
-        <m:r>
-          <m:t>0.186</m:t>
-        </m:r>
-      </m:oMath>
-      <w:r>
-        <w:t xml:space="preserve"> </w:t>
-      </w:r>
-      <w:r>
-        <w:t xml:space="preserve">for actions and</w:t>
-      </w:r>
-      <w:r>
-        <w:t xml:space="preserve"> </w:t>
-      </w:r>
-      <m:oMath>
-        <m:r>
-          <m:t>0.194</m:t>
-        </m:r>
-      </m:oMath>
-      <w:r>
-        <w:t xml:space="preserve"> </w:t>
-      </w:r>
-      <w:r>
-        <w:t xml:space="preserve">for endpoints. Because the three decision points may be nested within task trajectories, the first-query analysis is the cleaner confirmatory result. For Cosmos 3, action-space nearest-donor accuracy is 12/12 for both future sources. Endpoint nearest-donor accuracy is 10/12 for predicted futures and 11/12 for executed-branch futures.</w:t>
-      </w:r>
-    </w:p>
-    <w:p>
-      <w:pPr>
-        <w:pStyle w:val="BodyText"/>
-      </w:pPr>
-      <w:r>
-        <w:t xml:space="preserve">We separately evaluated six states in RoboCasa</w:t>
+        <w:t xml:space="preserve">The six-state RoboCasa replication is exploratory and is not pooled with LIBERO</w:t>
       </w:r>
       <w:r>
         <w:t xml:space="preserve"> </w:t>
@@ -3214,7 +3545,7 @@
         <w:t xml:space="preserve">(Nasiriany et al. 2024)</w:t>
       </w:r>
       <w:r>
-        <w:t xml:space="preserve">. This exploratory experiment is not pooled with LIBERO. The donor-minus-self endpoint effect is</w:t>
+        <w:t xml:space="preserve">. Its donor-minus-self endpoint effect is</w:t>
       </w:r>
       <w:r>
         <w:t xml:space="preserve"> </w:t>
@@ -3228,10 +3559,7 @@
         <w:t xml:space="preserve"> </w:t>
       </w:r>
       <w:r>
-        <w:t xml:space="preserve">(95% CI</w:t>
-      </w:r>
-      <w:r>
-        <w:t xml:space="preserve"> </w:t>
+        <w:t xml:space="preserve">(</w:t>
       </w:r>
       <m:oMath>
         <m:r>
@@ -3260,19 +3588,11 @@
         </m:r>
       </m:oMath>
       <w:r>
-        <w:t xml:space="preserve">) and is positive in all six states. The action effect is smaller and does not reliably exceed the Gaussian control. An unfinished 20-state Cosmos 3 study is excluded from all reported estimates.</w:t>
-      </w:r>
-    </w:p>
-    <w:p>
-      <w:pPr>
-        <w:pStyle w:val="BodyText"/>
-      </w:pPr>
-      <w:r>
-        <w:t xml:space="preserve">The original draft also reported a natural control whose construction was not documented and a Cosmos Policy attention ablation whose gating rule, independent-state count, confidence intervals, and endpoint effects were unavailable. We exclude both from the revised paper rather than treat them as interpretable evidence.</w:t>
-      </w:r>
-    </w:p>
-    <w:bookmarkEnd w:id="42"/>
-    <w:bookmarkStart w:id="93" w:name="neurips-paper-checklist"/>
+        <w:t xml:space="preserve">), positive in 6/6 states; action steering is smaller and does not reliably exceed the Gaussian control. In the Cosmos 3 population, the two missing frozen states ended after 21 and 29 actions, before producing the 33-frame source video. Neither was replaced. The prespecified minimum of 20 states across five tasks and the factor-study minimum of ten states across five tasks were both met across six tasks.</w:t>
+      </w:r>
+    </w:p>
+    <w:bookmarkEnd w:id="44"/>
+    <w:bookmarkStart w:id="97" w:name="neurips-paper-checklist"/>
     <w:p>
       <w:pPr>
         <w:pStyle w:val="Heading1"/>
@@ -3906,7 +4226,7 @@
       <w:r>
         <w:t xml:space="preserve">Please see the NeurIPS code and data submission guidelines (</w:t>
       </w:r>
-      <w:hyperlink r:id="rId43">
+      <w:hyperlink r:id="rId45">
         <w:r>
           <w:rPr>
             <w:rStyle w:val="Hyperlink"/>
@@ -3939,7 +4259,7 @@
       <w:r>
         <w:t xml:space="preserve">The instructions should contain the exact command and environment needed to run to reproduce the results. See the NeurIPS code and data submission guidelines (</w:t>
       </w:r>
-      <w:hyperlink r:id="rId43">
+      <w:hyperlink r:id="rId45">
         <w:r>
           <w:rPr>
             <w:rStyle w:val="Hyperlink"/>
@@ -4376,7 +4696,7 @@
       <w:r>
         <w:t xml:space="preserve"> </w:t>
       </w:r>
-      <w:hyperlink r:id="rId44">
+      <w:hyperlink r:id="rId46">
         <w:r>
           <w:rPr>
             <w:rStyle w:val="Hyperlink"/>
@@ -4809,7 +5129,7 @@
       <w:r>
         <w:t xml:space="preserve"> </w:t>
       </w:r>
-      <w:hyperlink r:id="rId45">
+      <w:hyperlink r:id="rId47">
         <w:r>
           <w:rPr>
             <w:rStyle w:val="Hyperlink"/>
@@ -5241,8 +5561,8 @@
         <w:t xml:space="preserve">Please refer to our LLM policy in the NeurIPS handbook for what should or should not be described.</w:t>
       </w:r>
     </w:p>
-    <w:bookmarkStart w:id="92" w:name="refs"/>
-    <w:bookmarkStart w:id="47" w:name="ref-du2023unipi"/>
+    <w:bookmarkStart w:id="96" w:name="refs"/>
+    <w:bookmarkStart w:id="49" w:name="ref-du2023unipi"/>
     <w:p>
       <w:pPr>
         <w:pStyle w:val="Bibliography"/>
@@ -5275,7 +5595,7 @@
       <w:r>
         <w:t xml:space="preserve"> </w:t>
       </w:r>
-      <w:hyperlink r:id="rId46">
+      <w:hyperlink r:id="rId48">
         <w:r>
           <w:rPr>
             <w:rStyle w:val="Hyperlink"/>
@@ -5287,8 +5607,8 @@
         <w:t xml:space="preserve">.</w:t>
       </w:r>
     </w:p>
-    <w:bookmarkEnd w:id="47"/>
-    <w:bookmarkStart w:id="49" w:name="ref-du2024videolanguage"/>
+    <w:bookmarkEnd w:id="49"/>
+    <w:bookmarkStart w:id="51" w:name="ref-du2024videolanguage"/>
     <w:p>
       <w:pPr>
         <w:pStyle w:val="Bibliography"/>
@@ -5318,7 +5638,7 @@
       <w:r>
         <w:t xml:space="preserve"> </w:t>
       </w:r>
-      <w:hyperlink r:id="rId48">
+      <w:hyperlink r:id="rId50">
         <w:r>
           <w:rPr>
             <w:rStyle w:val="Hyperlink"/>
@@ -5330,8 +5650,8 @@
         <w:t xml:space="preserve">.</w:t>
       </w:r>
     </w:p>
-    <w:bookmarkEnd w:id="49"/>
-    <w:bookmarkStart w:id="51" w:name="ref-ebert2018visualforesight"/>
+    <w:bookmarkEnd w:id="51"/>
+    <w:bookmarkStart w:id="53" w:name="ref-ebert2018visualforesight"/>
     <w:p>
       <w:pPr>
         <w:pStyle w:val="Bibliography"/>
@@ -5361,7 +5681,7 @@
       <w:r>
         <w:t xml:space="preserve"> </w:t>
       </w:r>
-      <w:hyperlink r:id="rId50">
+      <w:hyperlink r:id="rId52">
         <w:r>
           <w:rPr>
             <w:rStyle w:val="Hyperlink"/>
@@ -5373,8 +5693,8 @@
         <w:t xml:space="preserve">.</w:t>
       </w:r>
     </w:p>
-    <w:bookmarkEnd w:id="51"/>
-    <w:bookmarkStart w:id="53" w:name="ref-field2007clusterbootstrap"/>
+    <w:bookmarkEnd w:id="53"/>
+    <w:bookmarkStart w:id="55" w:name="ref-field2007clusterbootstrap"/>
     <w:p>
       <w:pPr>
         <w:pStyle w:val="Bibliography"/>
@@ -5407,7 +5727,7 @@
       <w:r>
         <w:t xml:space="preserve"> </w:t>
       </w:r>
-      <w:hyperlink r:id="rId52">
+      <w:hyperlink r:id="rId54">
         <w:r>
           <w:rPr>
             <w:rStyle w:val="Hyperlink"/>
@@ -5419,8 +5739,8 @@
         <w:t xml:space="preserve">.</w:t>
       </w:r>
     </w:p>
-    <w:bookmarkEnd w:id="53"/>
-    <w:bookmarkStart w:id="55" w:name="ref-goldowskydill2023pathpatching"/>
+    <w:bookmarkEnd w:id="55"/>
+    <w:bookmarkStart w:id="57" w:name="ref-goldowskydill2023pathpatching"/>
     <w:p>
       <w:pPr>
         <w:pStyle w:val="Bibliography"/>
@@ -5444,7 +5764,7 @@
       <w:r>
         <w:t xml:space="preserve"> </w:t>
       </w:r>
-      <w:hyperlink r:id="rId54">
+      <w:hyperlink r:id="rId56">
         <w:r>
           <w:rPr>
             <w:rStyle w:val="Hyperlink"/>
@@ -5456,8 +5776,8 @@
         <w:t xml:space="preserve">.</w:t>
       </w:r>
     </w:p>
-    <w:bookmarkEnd w:id="55"/>
-    <w:bookmarkStart w:id="57" w:name="ref-guo2024pad"/>
+    <w:bookmarkEnd w:id="57"/>
+    <w:bookmarkStart w:id="59" w:name="ref-guo2024pad"/>
     <w:p>
       <w:pPr>
         <w:pStyle w:val="Bibliography"/>
@@ -5490,7 +5810,7 @@
       <w:r>
         <w:t xml:space="preserve"> </w:t>
       </w:r>
-      <w:hyperlink r:id="rId56">
+      <w:hyperlink r:id="rId58">
         <w:r>
           <w:rPr>
             <w:rStyle w:val="Hyperlink"/>
@@ -5502,8 +5822,8 @@
         <w:t xml:space="preserve">.</w:t>
       </w:r>
     </w:p>
-    <w:bookmarkEnd w:id="57"/>
-    <w:bookmarkStart w:id="59" w:name="ref-hu2025vpp"/>
+    <w:bookmarkEnd w:id="59"/>
+    <w:bookmarkStart w:id="61" w:name="ref-hu2025vpp"/>
     <w:p>
       <w:pPr>
         <w:pStyle w:val="Bibliography"/>
@@ -5533,7 +5853,7 @@
       <w:r>
         <w:t xml:space="preserve"> </w:t>
       </w:r>
-      <w:hyperlink r:id="rId58">
+      <w:hyperlink r:id="rId60">
         <w:r>
           <w:rPr>
             <w:rStyle w:val="Hyperlink"/>
@@ -5545,8 +5865,8 @@
         <w:t xml:space="preserve">.</w:t>
       </w:r>
     </w:p>
-    <w:bookmarkEnd w:id="59"/>
-    <w:bookmarkStart w:id="61" w:name="ref-kim2026cosmospolicy"/>
+    <w:bookmarkEnd w:id="61"/>
+    <w:bookmarkStart w:id="63" w:name="ref-kim2026cosmospolicy"/>
     <w:p>
       <w:pPr>
         <w:pStyle w:val="Bibliography"/>
@@ -5582,7 +5902,7 @@
       <w:r>
         <w:t xml:space="preserve"> </w:t>
       </w:r>
-      <w:hyperlink r:id="rId60">
+      <w:hyperlink r:id="rId62">
         <w:r>
           <w:rPr>
             <w:rStyle w:val="Hyperlink"/>
@@ -5594,8 +5914,8 @@
         <w:t xml:space="preserve">.</w:t>
       </w:r>
     </w:p>
-    <w:bookmarkEnd w:id="61"/>
-    <w:bookmarkStart w:id="63" w:name="ref-lakens2017equivalence"/>
+    <w:bookmarkEnd w:id="63"/>
+    <w:bookmarkStart w:id="65" w:name="ref-lakens2017equivalence"/>
     <w:p>
       <w:pPr>
         <w:pStyle w:val="Bibliography"/>
@@ -5628,7 +5948,7 @@
       <w:r>
         <w:t xml:space="preserve"> </w:t>
       </w:r>
-      <w:hyperlink r:id="rId62">
+      <w:hyperlink r:id="rId64">
         <w:r>
           <w:rPr>
             <w:rStyle w:val="Hyperlink"/>
@@ -5640,8 +5960,8 @@
         <w:t xml:space="preserve">.</w:t>
       </w:r>
     </w:p>
-    <w:bookmarkEnd w:id="63"/>
-    <w:bookmarkStart w:id="65" w:name="ref-li2025uva"/>
+    <w:bookmarkEnd w:id="65"/>
+    <w:bookmarkStart w:id="67" w:name="ref-li2025uva"/>
     <w:p>
       <w:pPr>
         <w:pStyle w:val="Bibliography"/>
@@ -5665,7 +5985,7 @@
       <w:r>
         <w:t xml:space="preserve"> </w:t>
       </w:r>
-      <w:hyperlink r:id="rId64">
+      <w:hyperlink r:id="rId66">
         <w:r>
           <w:rPr>
             <w:rStyle w:val="Hyperlink"/>
@@ -5677,8 +5997,8 @@
         <w:t xml:space="preserve">.</w:t>
       </w:r>
     </w:p>
-    <w:bookmarkEnd w:id="65"/>
-    <w:bookmarkStart w:id="67" w:name="ref-liu2023libero"/>
+    <w:bookmarkEnd w:id="67"/>
+    <w:bookmarkStart w:id="69" w:name="ref-liu2023libero"/>
     <w:p>
       <w:pPr>
         <w:pStyle w:val="Bibliography"/>
@@ -5717,7 +6037,7 @@
       <w:r>
         <w:t xml:space="preserve"> </w:t>
       </w:r>
-      <w:hyperlink r:id="rId66">
+      <w:hyperlink r:id="rId68">
         <w:r>
           <w:rPr>
             <w:rStyle w:val="Hyperlink"/>
@@ -5729,8 +6049,8 @@
         <w:t xml:space="preserve">.</w:t>
       </w:r>
     </w:p>
-    <w:bookmarkEnd w:id="67"/>
-    <w:bookmarkStart w:id="69" w:name="ref-meng2022rome"/>
+    <w:bookmarkEnd w:id="69"/>
+    <w:bookmarkStart w:id="71" w:name="ref-meng2022rome"/>
     <w:p>
       <w:pPr>
         <w:pStyle w:val="Bibliography"/>
@@ -5772,7 +6092,7 @@
       <w:r>
         <w:t xml:space="preserve"> </w:t>
       </w:r>
-      <w:hyperlink r:id="rId68">
+      <w:hyperlink r:id="rId70">
         <w:r>
           <w:rPr>
             <w:rStyle w:val="Hyperlink"/>
@@ -5784,8 +6104,8 @@
         <w:t xml:space="preserve">.</w:t>
       </w:r>
     </w:p>
-    <w:bookmarkEnd w:id="69"/>
-    <w:bookmarkStart w:id="71" w:name="ref-nasiriany2024robocasa"/>
+    <w:bookmarkEnd w:id="71"/>
+    <w:bookmarkStart w:id="73" w:name="ref-nasiriany2024robocasa"/>
     <w:p>
       <w:pPr>
         <w:pStyle w:val="Bibliography"/>
@@ -5824,7 +6144,7 @@
       <w:r>
         <w:t xml:space="preserve"> </w:t>
       </w:r>
-      <w:hyperlink r:id="rId70">
+      <w:hyperlink r:id="rId72">
         <w:r>
           <w:rPr>
             <w:rStyle w:val="Hyperlink"/>
@@ -5836,8 +6156,8 @@
         <w:t xml:space="preserve">.</w:t>
       </w:r>
     </w:p>
-    <w:bookmarkEnd w:id="71"/>
-    <w:bookmarkStart w:id="73" w:name="ref-nvidia2026cosmos3"/>
+    <w:bookmarkEnd w:id="73"/>
+    <w:bookmarkStart w:id="75" w:name="ref-nvidia2026cosmos3"/>
     <w:p>
       <w:pPr>
         <w:pStyle w:val="Bibliography"/>
@@ -5882,7 +6202,7 @@
       <w:r>
         <w:t xml:space="preserve"> </w:t>
       </w:r>
-      <w:hyperlink r:id="rId72">
+      <w:hyperlink r:id="rId74">
         <w:r>
           <w:rPr>
             <w:rStyle w:val="Hyperlink"/>
@@ -5894,8 +6214,8 @@
         <w:t xml:space="preserve">.</w:t>
       </w:r>
     </w:p>
-    <w:bookmarkEnd w:id="73"/>
-    <w:bookmarkStart w:id="75" w:name="ref-nvidia2026cosmos3droid"/>
+    <w:bookmarkEnd w:id="75"/>
+    <w:bookmarkStart w:id="77" w:name="ref-nvidia2026cosmos3droid"/>
     <w:p>
       <w:pPr>
         <w:pStyle w:val="Bibliography"/>
@@ -5919,58 +6239,12 @@
       <w:r>
         <w:t xml:space="preserve"> </w:t>
       </w:r>
-      <w:hyperlink r:id="rId74">
+      <w:hyperlink r:id="rId76">
         <w:r>
           <w:rPr>
             <w:rStyle w:val="Hyperlink"/>
           </w:rPr>
           <w:t xml:space="preserve">https://huggingface.co/nvidia/Cosmos3-Nano-Policy-DROID</w:t>
-        </w:r>
-      </w:hyperlink>
-      <w:r>
-        <w:t xml:space="preserve">.</w:t>
-      </w:r>
-    </w:p>
-    <w:bookmarkEnd w:id="75"/>
-    <w:bookmarkStart w:id="77" w:name="ref-pearl2001direct"/>
-    <w:p>
-      <w:pPr>
-        <w:pStyle w:val="Bibliography"/>
-      </w:pPr>
-      <w:r>
-        <w:t xml:space="preserve">Pearl, Judea. 2001.</w:t>
-      </w:r>
-      <w:r>
-        <w:t xml:space="preserve"> </w:t>
-      </w:r>
-      <w:r>
-        <w:t xml:space="preserve">“Direct and Indirect Effects.”</w:t>
-      </w:r>
-      <w:r>
-        <w:t xml:space="preserve"> </w:t>
-      </w:r>
-      <w:r>
-        <w:rPr>
-          <w:i/>
-          <w:iCs/>
-        </w:rPr>
-        <w:t xml:space="preserve">Proceedings of the Seventeenth Conference on Uncertainty in Artificial Intelligence</w:t>
-      </w:r>
-      <w:r>
-        <w:t xml:space="preserve"> </w:t>
-      </w:r>
-      <w:r>
-        <w:t xml:space="preserve">(San Francisco, CA), 411–20.</w:t>
-      </w:r>
-      <w:r>
-        <w:t xml:space="preserve"> </w:t>
-      </w:r>
-      <w:hyperlink r:id="rId76">
-        <w:r>
-          <w:rPr>
-            <w:rStyle w:val="Hyperlink"/>
-          </w:rPr>
-          <w:t xml:space="preserve">https://ftp.cs.ucla.edu/pub/stat_ser/R273.pdf</w:t>
         </w:r>
       </w:hyperlink>
       <w:r>
@@ -6052,7 +6326,53 @@
       </w:r>
     </w:p>
     <w:bookmarkEnd w:id="81"/>
-    <w:bookmarkStart w:id="83" w:name="ref-yang2026robolab"/>
+    <w:bookmarkStart w:id="83" w:name="ref-vig2020causalmediation"/>
+    <w:p>
+      <w:pPr>
+        <w:pStyle w:val="Bibliography"/>
+      </w:pPr>
+      <w:r>
+        <w:t xml:space="preserve">Vig, Jesse, Sebastian Gehrmann, Yonatan Belinkov, et al. 2020.</w:t>
+      </w:r>
+      <w:r>
+        <w:t xml:space="preserve"> </w:t>
+      </w:r>
+      <w:r>
+        <w:t xml:space="preserve">“Investigating Gender Bias in Language Models Using Causal Mediation Analysis.”</w:t>
+      </w:r>
+      <w:r>
+        <w:t xml:space="preserve"> </w:t>
+      </w:r>
+      <w:r>
+        <w:rPr>
+          <w:i/>
+          <w:iCs/>
+        </w:rPr>
+        <w:t xml:space="preserve">Advances in Neural Information Processing Systems</w:t>
+      </w:r>
+      <w:r>
+        <w:t xml:space="preserve"> </w:t>
+      </w:r>
+      <w:r>
+        <w:t xml:space="preserve">33: 12388–401.</w:t>
+      </w:r>
+      <w:r>
+        <w:t xml:space="preserve"> </w:t>
+      </w:r>
+      <w:hyperlink r:id="rId82">
+        <w:r>
+          <w:rPr>
+            <w:rStyle w:val="Hyperlink"/>
+          </w:rPr>
+          <w:t xml:space="preserve">https://proceedings.neurips.cc/paper/2020/hash/92650b2e92217715fe312e6fa7b90d82-Abstract.html</w:t>
+        </w:r>
+      </w:hyperlink>
+      <w:r>
+        <w:t xml:space="preserve">.</w:t>
+      </w:r>
+    </w:p>
+    <w:bookmarkEnd w:id="83"/>
+    <w:bookmarkStart w:id="85" w:name="ref-yang2026robolab"/>
     <w:p>
       <w:pPr>
         <w:pStyle w:val="Bibliography"/>
@@ -6091,7 +6411,7 @@
       <w:r>
         <w:t xml:space="preserve"> </w:t>
       </w:r>
-      <w:hyperlink r:id="rId82">
+      <w:hyperlink r:id="rId84">
         <w:r>
           <w:rPr>
             <w:rStyle w:val="Hyperlink"/>
@@ -6103,8 +6423,45 @@
         <w:t xml:space="preserve">.</w:t>
       </w:r>
     </w:p>
-    <w:bookmarkEnd w:id="83"/>
-    <w:bookmarkStart w:id="85" w:name="ref-yuan2026fastwam"/>
+    <w:bookmarkEnd w:id="85"/>
+    <w:bookmarkStart w:id="87" w:name="ref-ye2026dreamzero"/>
+    <w:p>
+      <w:pPr>
+        <w:pStyle w:val="Bibliography"/>
+      </w:pPr>
+      <w:r>
+        <w:t xml:space="preserve">Ye, Seonghyeon, Yunhao Ge, Kaiyuan Zheng, et al. 2026.</w:t>
+      </w:r>
+      <w:r>
+        <w:t xml:space="preserve"> </w:t>
+      </w:r>
+      <w:r>
+        <w:rPr>
+          <w:i/>
+          <w:iCs/>
+        </w:rPr>
+        <w:t xml:space="preserve">World Action Models Are Zero-Shot Policies</w:t>
+      </w:r>
+      <w:r>
+        <w:t xml:space="preserve">.</w:t>
+      </w:r>
+      <w:r>
+        <w:t xml:space="preserve"> </w:t>
+      </w:r>
+      <w:hyperlink r:id="rId86">
+        <w:r>
+          <w:rPr>
+            <w:rStyle w:val="Hyperlink"/>
+          </w:rPr>
+          <w:t xml:space="preserve">https://doi.org/10.48550/arXiv.2602.15922</w:t>
+        </w:r>
+      </w:hyperlink>
+      <w:r>
+        <w:t xml:space="preserve">.</w:t>
+      </w:r>
+    </w:p>
+    <w:bookmarkEnd w:id="87"/>
+    <w:bookmarkStart w:id="89" w:name="ref-yuan2026fastwam"/>
     <w:p>
       <w:pPr>
         <w:pStyle w:val="Bibliography"/>
@@ -6132,7 +6489,7 @@
       <w:r>
         <w:t xml:space="preserve"> </w:t>
       </w:r>
-      <w:hyperlink r:id="rId84">
+      <w:hyperlink r:id="rId88">
         <w:r>
           <w:rPr>
             <w:rStyle w:val="Hyperlink"/>
@@ -6144,8 +6501,8 @@
         <w:t xml:space="preserve">.</w:t>
       </w:r>
     </w:p>
-    <w:bookmarkEnd w:id="85"/>
-    <w:bookmarkStart w:id="87" w:name="ref-zhang2026rift"/>
+    <w:bookmarkEnd w:id="89"/>
+    <w:bookmarkStart w:id="91" w:name="ref-zhang2026rift"/>
     <w:p>
       <w:pPr>
         <w:pStyle w:val="Bibliography"/>
@@ -6197,7 +6554,7 @@
       <w:r>
         <w:t xml:space="preserve"> </w:t>
       </w:r>
-      <w:hyperlink r:id="rId86">
+      <w:hyperlink r:id="rId90">
         <w:r>
           <w:rPr>
             <w:rStyle w:val="Hyperlink"/>
@@ -6209,8 +6566,8 @@
         <w:t xml:space="preserve">.</w:t>
       </w:r>
     </w:p>
-    <w:bookmarkEnd w:id="87"/>
-    <w:bookmarkStart w:id="89" w:name="ref-zhang2024activationpatching"/>
+    <w:bookmarkEnd w:id="91"/>
+    <w:bookmarkStart w:id="93" w:name="ref-zhang2024activationpatching"/>
     <w:p>
       <w:pPr>
         <w:pStyle w:val="Bibliography"/>
@@ -6240,7 +6597,7 @@
       <w:r>
         <w:t xml:space="preserve"> </w:t>
       </w:r>
-      <w:hyperlink r:id="rId88">
+      <w:hyperlink r:id="rId92">
         <w:r>
           <w:rPr>
             <w:rStyle w:val="Hyperlink"/>
@@ -6252,8 +6609,8 @@
         <w:t xml:space="preserve">.</w:t>
       </w:r>
     </w:p>
-    <w:bookmarkEnd w:id="89"/>
-    <w:bookmarkStart w:id="91" w:name="ref-zhao2026fasterwam"/>
+    <w:bookmarkEnd w:id="93"/>
+    <w:bookmarkStart w:id="95" w:name="ref-zhao2026fasterwam"/>
     <w:p>
       <w:pPr>
         <w:pStyle w:val="Bibliography"/>
@@ -6284,7 +6641,7 @@
       <w:r>
         <w:t xml:space="preserve"> </w:t>
       </w:r>
-      <w:hyperlink r:id="rId90">
+      <w:hyperlink r:id="rId94">
         <w:r>
           <w:rPr>
             <w:rStyle w:val="Hyperlink"/>
@@ -6296,9 +6653,9 @@
         <w:t xml:space="preserve">.</w:t>
       </w:r>
     </w:p>
-    <w:bookmarkEnd w:id="91"/>
-    <w:bookmarkEnd w:id="92"/>
-    <w:bookmarkEnd w:id="93"/>
+    <w:bookmarkEnd w:id="95"/>
+    <w:bookmarkEnd w:id="96"/>
+    <w:bookmarkEnd w:id="97"/>
     <w:sectPr>
       <w:footnotePr>
         <w:numRestart w:val="eachSect"/>

</xml_diff>

<commit_message>
docs: clarify core argument
</commit_message>
<xml_diff>
--- a/output/imagined_futures_neurips2026.docx
+++ b/output/imagined_futures_neurips2026.docx
@@ -37,7 +37,7 @@
         <w:pStyle w:val="Abstract"/>
       </w:pPr>
       <w:r>
-        <w:t xml:space="preserve">Do world action models actually use the futures they generate? Jointly producing future observations and robot actions does not answer this question: the action may bypass the predicted future. We test future use with reachable-donor transplantation. Two native policy runs begin from the same restored simulator state and produce different futures, actions, and endpoints. We insert one run’s future into the other while holding the current observation, instruction, sampling noise, and denoising schedule fixed. If future content matters, the recomputed action should move specifically toward the action associated with the donor future. In Cosmos 3, a frozen study across 22 states and six RoboLab tasks finds predicted-future action steering of</w:t>
+        <w:t xml:space="preserve">Do world action models actually use the futures they generate? Jointly producing future observations and robot actions does not answer this question: the action may bypass the predicted future. We test future use with reachable-donor transplantation. Two native policy runs begin from the same restored simulator state and produce different futures, actions, and endpoints. We call the run being recomputed the recipient and the run supplying the alternative future the donor. Holding the recipient’s observation, instruction, sampling noise, and denoising schedule fixed, we ask not merely whether its action changes, but whether it moves specifically toward the donor action. In Cosmos 3, a frozen study across 22 states and six RoboLab tasks finds predicted-future action steering of</w:t>
       </w:r>
       <w:r>
         <w:t xml:space="preserve"> </w:t>
@@ -65,7 +65,7 @@
         <w:t xml:space="preserve"> </w:t>
       </w:r>
       <w:r>
-        <w:t xml:space="preserve">on a normalized recipient-to-donor scale. Replacing donor-run future-token keys and values with self-future counterparts reduces predicted-action steering by</w:t>
+        <w:t xml:space="preserve">on a scale where 0 is the recipient and 1 is the donor. Replacing donor-run future-token keys and values with self-future counterparts removes</w:t>
       </w:r>
       <w:r>
         <w:t xml:space="preserve"> </w:t>
@@ -76,7 +76,10 @@
         </m:r>
       </m:oMath>
       <w:r>
-        <w:t xml:space="preserve">, with positive action and endpoint reductions in all 22 states. Isolated robot- and object-pixel interventions, however, each have effects below</w:t>
+        <w:t xml:space="preserve"> </w:t>
+      </w:r>
+      <w:r>
+        <w:t xml:space="preserve">of the predicted-action shift, with positive action and endpoint reductions in all 22 states. Isolated robot- and object-pixel interventions, however, each have effects below</w:t>
       </w:r>
       <w:r>
         <w:t xml:space="preserve"> </w:t>
@@ -138,7 +141,7 @@
         <w:t xml:space="preserve">)</w:t>
       </w:r>
       <w:r>
-        <w:t xml:space="preserve">. It is tempting to read this architecture literally: the model predicts what may happen, then acts on that prediction. Joint generation does not establish such a computation. The future could be irrelevant to the action, serve as a generic workspace, encode the robot motion already paired with the action, or represent task consequences used to choose among actions.</w:t>
+        <w:t xml:space="preserve">. It is tempting to read this architecture literally: the model predicts what may happen, then acts on that prediction. Joint generation does not establish such a computation. The action could be generated through a direct observation-to-action route while a plausible video is produced alongside it.</w:t>
       </w:r>
     </w:p>
     <w:p>
@@ -146,7 +149,7 @@
         <w:pStyle w:val="BodyText"/>
       </w:pPr>
       <w:r>
-        <w:t xml:space="preserve">These alternatives imply different functional roles. A policy that conditions action inference on predicted future observations resembles an inverse-dynamics interface</w:t>
+        <w:t xml:space="preserve">This leaves at least four hypotheses about the future’s role: an epiphenomenal output with no functional role; a generic workspace whose presence matters but whose specific content does not; a content-specific action interface; or a representation of consequences used to compare actions. The third role includes an inverse-dynamics-like computation in which a prospective robot pose specifies the action needed to produce it</w:t>
       </w:r>
       <w:r>
         <w:t xml:space="preserve"> </w:t>
@@ -180,7 +183,7 @@
         <w:t xml:space="preserve">)</w:t>
       </w:r>
       <w:r>
-        <w:t xml:space="preserve">. A system that generates alternatives and compares their predicted outcomes with a cost or learned heuristic more closely resembles explicit visual planning</w:t>
+        <w:t xml:space="preserve">. The fourth more closely resembles explicit visual planning: generate alternatives, predict their outcomes, score them with a cost or learned heuristic, and select among them</w:t>
       </w:r>
       <w:r>
         <w:t xml:space="preserve"> </w:t>
@@ -214,7 +217,7 @@
         <w:t xml:space="preserve">)</w:t>
       </w:r>
       <w:r>
-        <w:t xml:space="preserve">. We study Cosmos Policy’s direct-policy mode and the diffusion-generator component of Cosmos3-Nano-Policy-DROID. The inference procedures evaluated here do not generate and score multiple candidate actions before acting; Cosmos Policy’s separate best-of-</w:t>
+        <w:t xml:space="preserve">. We study Cosmos Policy’s direct-policy mode and the diffusion-generator component of Cosmos3-Nano-Policy-DROID. Neither evaluated inference procedure generates and scores multiple candidate actions before acting; Cosmos Policy’s separate best-of-</w:t>
       </w:r>
       <m:oMath>
         <m:r>
@@ -253,7 +256,7 @@
         <w:t xml:space="preserve">)</w:t>
       </w:r>
       <w:r>
-        <w:t xml:space="preserve">. Masking the future read or editing values stored at future positions changes closed-loop trajectories and task success across several WAMs. This establishes dependence on a structured future interface, but a destructive intervention does not say what a particular coherent alternative future tells the policy to do. A damaged representation can move an action in any direction.</w:t>
+        <w:t xml:space="preserve">. Masking the future read or editing values stored at future positions changes closed-loop trajectories and task success across several WAMs. Such destructive tests establish that the future channel is necessary or behaviorally sensitive. They do not establish that its semantic content controls a particular alternative: a damaged representation can move an action in any direction.</w:t>
       </w:r>
     </w:p>
     <w:p>
@@ -261,7 +264,7 @@
         <w:pStyle w:val="BodyText"/>
       </w:pPr>
       <w:r>
-        <w:t xml:space="preserve">Our test is directional. From the same restored state, two native policy continuations define a recipient and a donor. We insert the donor future into the recipient computation while retaining the recipient’s current inputs and random draws. The model never receives the donor action; we use it only to define the direction in which we score the recomputed action and its executed simulator endpoint (Figure </w:t>
+        <w:t xml:space="preserve">Our test is directional. From the same restored state, two native policy continuations define a recipient and a donor. Both are coherent alternatives generated by the unmodified policy, and their one-chunk endpoints are reachable from that state. We insert the donor future into the recipient computation while retaining the recipient’s current inputs and random draws. The model never receives the donor action; we use it only afterward to define the direction in which we score the recomputed action and its executed simulator endpoint (Figure </w:t>
       </w:r>
       <w:hyperlink w:anchor="fig:overview">
         <w:r>
@@ -272,7 +275,7 @@
         </w:r>
       </w:hyperlink>
       <w:r>
-        <w:t xml:space="preserve">). A generic perturbation need not move either quantity in that direction. A future whose content controls behavior should.</w:t>
+        <w:t xml:space="preserve">). A generic perturbation need not move either quantity toward that particular donor. Directional movement therefore tests content-specific control, rather than dependence on the future channel alone.</w:t>
       </w:r>
     </w:p>
     <w:p>
@@ -336,7 +339,7 @@
         <w:pStyle w:val="ImageCaption"/>
       </w:pPr>
       <w:r>
-        <w:t xml:space="preserve">Reachable-donor future transplantation. Two unmodified continuations start from the same simulator state. The recipient is recomputed with the donor future while its other inputs and random draws remain fixed. Signed projections measure movement from recipient behavior (0) toward donor behavior (1); K/V replacement then tests whether future-token activations carry that shift.</w:t>
+        <w:t xml:space="preserve">Reachable-donor future transplantation. Two unmodified continuations start from the same simulator state. The recipient is recomputed with only the donor future substituted; the donor action is withheld and used afterward for scoring. Signed projection is 0 at the recipient, 1 at the donor, and 0.5 halfway along the donor direction. K/V replacement then tests whether future-token activations carry that shift.</w:t>
       </w:r>
     </w:p>
     <w:bookmarkEnd w:id="12"/>
@@ -616,7 +619,7 @@
         <w:t xml:space="preserve">)</w:t>
       </w:r>
       <w:r>
-        <w:t xml:space="preserve">. Our contribution is complementary: we exchange two coherent, policy-generated alternatives and ask whether behavior follows the selected donor.</w:t>
+        <w:t xml:space="preserve">. Our contribution is complementary but distinct: RIFT asks whether behavior depends on the future interface, whereas reachable-donor transplantation asks whether a coherent alternative sent through that interface predicts the direction of behavior.</w:t>
       </w:r>
     </w:p>
     <w:bookmarkEnd w:id="14"/>
@@ -938,7 +941,7 @@
         <w:t xml:space="preserve"> </w:t>
       </w:r>
       <w:r>
-        <w:t xml:space="preserve">the recipient and</w:t>
+        <w:t xml:space="preserve">the recipient—the branch whose action is recomputed—and</w:t>
       </w:r>
       <w:r>
         <w:t xml:space="preserve"> </w:t>
@@ -952,7 +955,7 @@
         <w:t xml:space="preserve"> </w:t>
       </w:r>
       <w:r>
-        <w:t xml:space="preserve">the donor. To recompute</w:t>
+        <w:t xml:space="preserve">the donor—the branch supplying the alternative future. To recompute</w:t>
       </w:r>
       <w:r>
         <w:t xml:space="preserve"> </w:t>
@@ -1006,7 +1009,41 @@
         </m:sSub>
       </m:oMath>
       <w:r>
-        <w:t xml:space="preserve">. We also reverse the branch roles.</w:t>
+        <w:t xml:space="preserve">. We repeat the intervention in the reciprocal direction, transplanting</w:t>
+      </w:r>
+      <w:r>
+        <w:t xml:space="preserve"> </w:t>
+      </w:r>
+      <m:oMath>
+        <m:sSub>
+          <m:e>
+            <m:r>
+              <m:t>F</m:t>
+            </m:r>
+          </m:e>
+          <m:sub>
+            <m:r>
+              <m:t>A</m:t>
+            </m:r>
+          </m:sub>
+        </m:sSub>
+      </m:oMath>
+      <w:r>
+        <w:t xml:space="preserve"> </w:t>
+      </w:r>
+      <w:r>
+        <w:t xml:space="preserve">into</w:t>
+      </w:r>
+      <w:r>
+        <w:t xml:space="preserve"> </w:t>
+      </w:r>
+      <m:oMath>
+        <m:r>
+          <m:t>B</m:t>
+        </m:r>
+      </m:oMath>
+      <w:r>
+        <w:t xml:space="preserve">.</w:t>
       </w:r>
     </w:p>
     <w:p>
@@ -1326,7 +1363,7 @@
         <w:pStyle w:val="FirstParagraph"/>
       </w:pPr>
       <w:r>
-        <w:t xml:space="preserve">The recipient is 0 and the donor is 1; negative values move away from the donor and values above 1 overshoot it. The primary steering contrast subtracts the corresponding self-future recomputation:</w:t>
+        <w:t xml:space="preserve">The recipient is 0, the donor is 1, and 0.5 is halfway between them along the donor direction; negative values move away and values above 1 overshoot. Because the dot product retains only this signed direction, a large change perpendicular to the donor receives little projection. The primary steering contrast subtracts the corresponding self-future recomputation:</w:t>
       </w:r>
     </w:p>
     <w:p>
@@ -1555,7 +1592,7 @@
         <w:pStyle w:val="FirstParagraph"/>
       </w:pPr>
       <w:r>
-        <w:t xml:space="preserve">Pairs are selected using native action and endpoint separation, never intervention outcomes. Every endpoint arm is executed after restoring the exact simulator state.</w:t>
+        <w:t xml:space="preserve">The self condition reruns the same intervention machinery with the recipient’s own future, so subtraction removes any displacement due merely to recomputation. Pairs are selected using native action and endpoint separation, never intervention outcomes. Every endpoint arm is executed after restoring the exact simulator state.</w:t>
       </w:r>
     </w:p>
     <w:bookmarkEnd w:id="17"/>
@@ -1720,7 +1757,7 @@
         <w:pStyle w:val="BodyText"/>
       </w:pPr>
       <w:r>
-        <w:t xml:space="preserve">Controls include exact self-future recomputation, Gaussian targets matched to the donor in norm and recipient distance, a prespecified natural-future control, within-task shuffled futures, and bitwise no-op checks. For Cosmos 3, identity layout capture, sampler wrapping, cache record/replay, and self patches reproduce actions bitwise; sentinels confirm that the transplant does not directly write to action coordinates. Executed-future conditions encode video from reachable donor actions and replay the same environment prefix before intervention.</w:t>
+        <w:t xml:space="preserve">Controls include exact self-future recomputation, Gaussian targets matched to the donor in norm and recipient distance, a prespecified natural-future control, within-task shuffled futures, and bitwise no-op checks. Gaussian controls test whether an equally large unstructured displacement is sufficient; the natural and shuffled controls compare the paired donor against a prespecified non-donor continuation and mismatched futures. For Cosmos 3, identity layout capture, sampler wrapping, cache record/replay, and self patches reproduce actions bitwise; sentinels confirm that the transplant does not directly write to action coordinates. Executed-future conditions encode videos produced by physically executing reachable donor actions and replay the same environment prefix before intervention. They test whether steering survives a physically realizable continuation rather than appearing only for model-predicted imagery.</w:t>
       </w:r>
     </w:p>
     <w:bookmarkEnd w:id="19"/>
@@ -1788,7 +1825,7 @@
         <w:pStyle w:val="FirstParagraph"/>
       </w:pPr>
       <w:r>
-        <w:t xml:space="preserve">In Cosmos Policy, action queries can attend to future keys. We continuously gate future keys at prespecified block 27, with exact all-key recomputation, equal-count random-key and current-key controls, and a block-0 control. This removal changes attention normalization, so it tests whether a late future-to-action edge is active, not the information carried by a token-count-preserving route.</w:t>
+        <w:t xml:space="preserve">In attention, keys help determine what an action query reads, while values carry the information returned by that read. In Cosmos Policy, action queries can attend to future keys. We continuously gate future keys at prespecified block 27, with exact all-key recomputation, equal-count random-key and current-key controls, and a block-0 control. This removal changes attention normalization, so it tests whether a late future-to-action edge is active, not the information carried by a token-count-preserving route.</w:t>
       </w:r>
     </w:p>
     <w:p>
@@ -1827,7 +1864,7 @@
         <w:pStyle w:val="FirstParagraph"/>
       </w:pPr>
       <w:r>
-        <w:t xml:space="preserve">The independent unit is a restored simulator state. We first average reciprocal directions, donors, noise draws, and process repeats within state, then form 95% percentile intervals from 10,000 bootstrap resamples of states</w:t>
+        <w:t xml:space="preserve">The independent unit is a restored simulator state, not an individual noise draw or transplant direction. We first average reciprocal directions, donors, noise draws, and process repeats within state, then form 95% percentile intervals from 10,000 bootstrap resamples of states</w:t>
       </w:r>
       <w:r>
         <w:t xml:space="preserve"> </w:t>
@@ -1881,7 +1918,48 @@
         <w:t xml:space="preserve">)</w:t>
       </w:r>
       <w:r>
-        <w:t xml:space="preserve">. Prespecified primary sign-test</w:t>
+        <w:t xml:space="preserve">. An interval contained within</w:t>
+      </w:r>
+      <w:r>
+        <w:t xml:space="preserve"> </w:t>
+      </w:r>
+      <m:oMath>
+        <m:r>
+          <m:rPr>
+            <m:sty m:val="p"/>
+          </m:rPr>
+          <m:t>[</m:t>
+        </m:r>
+        <m:r>
+          <m:rPr>
+            <m:sty m:val="p"/>
+          </m:rPr>
+          <m:t>−</m:t>
+        </m:r>
+        <m:r>
+          <m:t>0.10</m:t>
+        </m:r>
+        <m:r>
+          <m:rPr>
+            <m:sty m:val="p"/>
+          </m:rPr>
+          <m:t>,</m:t>
+        </m:r>
+        <m:r>
+          <m:t>0.10</m:t>
+        </m:r>
+        <m:r>
+          <m:rPr>
+            <m:sty m:val="p"/>
+          </m:rPr>
+          <m:t>]</m:t>
+        </m:r>
+      </m:oMath>
+      <w:r>
+        <w:t xml:space="preserve"> </w:t>
+      </w:r>
+      <w:r>
+        <w:t xml:space="preserve">supports practical equivalence to zero at that scale. Prespecified primary sign-test</w:t>
       </w:r>
       <w:r>
         <w:t xml:space="preserve"> </w:t>
@@ -1920,7 +1998,7 @@
         <w:pStyle w:val="FirstParagraph"/>
       </w:pPr>
       <w:r>
-        <w:t xml:space="preserve">Coherent donor futures move both the recipient’s action and its one-chunk simulator endpoint toward the donor. The effect is strongest at the first queried state.</w:t>
+        <w:t xml:space="preserve">Coherent donor futures move both the recipient’s action and its one-chunk simulator endpoint toward the donor. Cosmos 3 shows this throughout its frozen population; Cosmos Policy’s effect is concentrated at the first queried states.</w:t>
       </w:r>
     </w:p>
     <w:bookmarkStart w:id="25" w:name="cosmos-3.-1"/>
@@ -1983,7 +2061,7 @@
         </m:r>
       </m:oMath>
       <w:r>
-        <w:t xml:space="preserve">), positive in 22/22 states. Relative to the natural-future control, the effect is</w:t>
+        <w:t xml:space="preserve">), positive in 22/22 states. On the signed projection scale, the mean action therefore moves almost the full recipient-to-donor distance in the donor direction. Relative to the prespecified natural-future control, the effect is</w:t>
       </w:r>
       <w:r>
         <w:t xml:space="preserve"> </w:t>
@@ -2026,7 +2104,7 @@
         </m:r>
       </m:oMath>
       <w:r>
-        <w:t xml:space="preserve">) larger. Futures encoded from executed donor branches produce nearly the same result: action steering is</w:t>
+        <w:t xml:space="preserve">) larger, showing that the paired donor carries more direction-specific information than that non-donor continuation. Futures encoded from executed donor branches produce nearly the same result: action steering is</w:t>
       </w:r>
       <w:r>
         <w:t xml:space="preserve"> </w:t>
@@ -2112,7 +2190,7 @@
         </m:r>
       </m:oMath>
       <w:r>
-        <w:t xml:space="preserve">). Both are positive in all 22 states. Executed-future action steering also exceeds the geometry-matched Gaussian control by</w:t>
+        <w:t xml:space="preserve">). Both are positive in all 22 states. The endpoint result shows that donor-directed action differences survive simulator execution; because projection ignores orthogonal error, it does not imply that the full endpoint vectors coincide. Executed-future action steering also exceeds the geometry-matched Gaussian control by</w:t>
       </w:r>
       <w:r>
         <w:t xml:space="preserve"> </w:t>
@@ -2696,7 +2774,7 @@
         <w:t xml:space="preserve"> </w:t>
       </w:r>
       <w:r>
-        <w:t xml:space="preserve">study, decoded futures identify the intended cell with 92.5% primary-camera and 98.75% wrist-camera accuracy. Despite this, the object-state main effect is</w:t>
+        <w:t xml:space="preserve">study, decoded futures identify the intended cell with 92.5% primary-camera and 98.75% wrist-camera accuracy. The intended object manipulation is therefore visible in the rendered futures, yet the object-state main effect is</w:t>
       </w:r>
       <w:r>
         <w:t xml:space="preserve"> </w:t>
@@ -3160,7 +3238,7 @@
         </w:r>
       </w:hyperlink>
       <w:r>
-        <w:t xml:space="preserve">c). The effect may depend on information distributed across the coherent future or on nonlinear interactions among content, masks, and tokenization. These experiments do not establish that the two factors are jointly necessary.</w:t>
+        <w:t xml:space="preserve">c). The useful signal may be distributed across the image, require robot–object coherence, depend on camera or temporal structure, or interact nonlinearly with masking and tokenization. Hybrid videos may also be off distribution. The experiment establishes insufficiency of each isolated pixel factor, not irrelevance of robot or object information and not joint necessity.</w:t>
       </w:r>
     </w:p>
     <w:bookmarkEnd w:id="33"/>
@@ -3499,7 +3577,7 @@
         </m:r>
       </m:oMath>
       <w:r>
-        <w:t xml:space="preserve">), again positive in every state. Task-balanced point estimates are</w:t>
+        <w:t xml:space="preserve">), again positive in every state. Relative to the unpatched means, these losses remove 88% of predicted-future action steering, 83% of executed-future action steering, and 85% of endpoint steering. Task-balanced point estimates are</w:t>
       </w:r>
       <w:r>
         <w:t xml:space="preserve"> </w:t>
@@ -3532,7 +3610,7 @@
         </m:r>
       </m:oMath>
       <w:r>
-        <w:t xml:space="preserve">; all prespecified primary sign tests remain significant after Holm correction. Because this intervention keeps token count fixed and does not mask attention positions, it shows that the future-token K/V interface carries donor-directed information. It does not establish a unique or complete circuit.</w:t>
+        <w:t xml:space="preserve">; all prespecified primary sign tests remain significant after Holm correction. Because this intervention keeps token count fixed and does not mask attention positions, it shows that donor-specific information travels through the future-token K/V interface. It does not identify every head or feature, exclude interacting unpatched routes, or establish a complete circuit.</w:t>
       </w:r>
     </w:p>
     <w:bookmarkStart w:id="39" w:name="fig:cosmos3"/>
@@ -3650,7 +3728,7 @@
         <w:pStyle w:val="FirstParagraph"/>
       </w:pPr>
       <w:r>
-        <w:t xml:space="preserve">Across both WAM generations, transplanting a coherent future predicts which alternative action the model will approach. The associated simulator endpoint moves in the same direction. This goes beyond showing sensitivity to generic corruption, but the two checkpoints do not appear to rely on the same content.</w:t>
+        <w:t xml:space="preserve">Across both WAM generations, transplanting a coherent future predicts which alternative action the model will approach. The associated simulator endpoint moves in the same direction. RIFT established that behavior depends on an organized future interface; our result adds content-specific sufficiency by showing that a policy-native alternative predicts the signed direction of the change. The two checkpoints, however, do not appear to rely on the same content.</w:t>
       </w:r>
     </w:p>
     <w:p>
@@ -3666,7 +3744,7 @@
         <w:pStyle w:val="BodyText"/>
       </w:pPr>
       <w:r>
-        <w:t xml:space="preserve">This evidence is narrower than planning. We do not test candidate generation, outcome comparison, or value-based selection, and we do not establish an effect on binary task success. Here,</w:t>
+        <w:t xml:space="preserve">This evidence is narrower than planning. A planning claim would require evidence that the policy generates alternatives, predicts their outcomes, compares them using a goal, cost, or value, and selects accordingly. We do not test that sequence, and no screened pair retained a stable success/failure label across continuation seeds. Here,</w:t>
       </w:r>
       <w:r>
         <w:t xml:space="preserve"> </w:t>
@@ -3707,7 +3785,7 @@
         <w:pStyle w:val="FirstParagraph"/>
       </w:pPr>
       <w:r>
-        <w:t xml:space="preserve">All interventions are in simulation and cover two checkpoints, six RoboLab tasks, and LIBERO-Long. Cosmos Policy’s strongest result uses one first-query state per task, while later estimates use different states and cannot isolate elapsed time. Its natural content analysis contains only four states, and rendered hybrids may be outside the policy’s native future distribution. Cosmos 3 completed 22 of 24 frozen population states and 10 of 12 factor states; the two population omissions resulted from short source videos and were not replaced. Pixel masks may miss distributed features or induce nonlinear changes, so negligible isolated effects do not establish joint necessity. Finally, key removal changes attention normalization, and K/V replacement can interact with unpatched routes. These interventions identify active pathways, not a full circuit.</w:t>
+        <w:t xml:space="preserve">All interventions are in simulation and cover two checkpoints, six RoboLab tasks, and LIBERO-Long. Cosmos Policy’s strongest result uses one first-query state per task, while later estimates use different physical states and therefore cannot isolate elapsed time. Its natural content analysis contains only four states, and rendered hybrids may be outside the policy’s native future distribution. Cosmos 3 completed 22 of 24 frozen population states and 10 of 12 factor states; the two population omissions resulted from short source videos and were not replaced. Pixel masks may miss distributed semantic features or induce nonlinear changes, so negligible isolated effects do not establish joint necessity. Key removal changes attention normalization, and K/V replacement can interact with unpatched routes. We do not demonstrate task-success mediation or recover a full circuit.</w:t>
       </w:r>
     </w:p>
     <w:bookmarkEnd w:id="43"/>
@@ -3744,7 +3822,7 @@
         <w:pStyle w:val="FirstParagraph"/>
       </w:pPr>
       <w:r>
-        <w:t xml:space="preserve">In two WAM checkpoints, coherent generated futures steer actions and one-chunk simulator endpoints toward a specific donor continuation. Cosmos 3 shows this effect across 22 sampled states; future-token K/V replacement strongly attenuates it, while isolated robot or object pixels do not recreate it. Cosmos Policy shows a related, more state-dependent effect dominated by visual robot-motion information. The models use their futures to condition action, but whether they compare predicted outcomes to plan remains an open question.</w:t>
+        <w:t xml:space="preserve">The central result is directional: we do not merely damage a model’s future and observe that behavior changes; we supply a different coherent future and find that behavior follows that particular alternative. Cosmos 3 shows this across 22 sampled states, with future-token K/V carrying most of the action and endpoint shift. Cosmos Policy shows a related, more state-dependent effect dominated by visual robot-motion information, while neither isolated robot nor object pixels reproduce Cosmos 3’s whole-future effect. These models use generated futures to condition action. Whether they compare alternative predicted outcomes in order to plan remains unanswered.</w:t>
       </w:r>
     </w:p>
     <w:bookmarkEnd w:id="46"/>

</xml_diff>

<commit_message>
docs: simplify results figure
</commit_message>
<xml_diff>
--- a/output/imagined_futures_neurips2026.docx
+++ b/output/imagined_futures_neurips2026.docx
@@ -4946,7 +4946,7 @@
       <w:r>
         <w:drawing>
           <wp:inline>
-            <wp:extent cx="5334000" cy="2515424"/>
+            <wp:extent cx="5334000" cy="1991272"/>
             <wp:effectExtent b="0" l="0" r="0" t="0"/>
             <wp:docPr descr="" title="" id="28" name="Picture"/>
             <a:graphic>
@@ -4967,7 +4967,7 @@
                   <pic:spPr bwMode="auto">
                     <a:xfrm>
                       <a:off x="0" y="0"/>
-                      <a:ext cx="5334000" cy="2515424"/>
+                      <a:ext cx="5334000" cy="1991272"/>
                     </a:xfrm>
                     <a:prstGeom prst="rect">
                       <a:avLst/>
@@ -4991,7 +4991,21 @@
         <w:pStyle w:val="ImageCaption"/>
       </w:pPr>
       <w:r>
-        <w:t xml:space="preserve">Method and controls on the same donor-directed scale, separated by model. Blue squares are self-future baselines; gray marks are Gaussian, natural, and shuffled controls; orange diamonds are paired donor futures (ours). Action and endpoint are separate x-axis groups, not marker meanings. Points show means and whiskers show 95% state-bootstrap intervals. In every group, the paired donor has the largest projection. The dotted orange line marks the paired donor behavior at 1.</w:t>
+        <w:t xml:space="preserve">Paired donor versus the strongest available control, separated by model. Each row is one future-source–outcome comparison. Gray circles show the strongest control; orange diamonds show the paired donor (ours); thin lines connect the two means. Row labels report the paired donor-minus-control advantage. Whiskers show 95% state-bootstrap intervals. All five paired-advantage intervals exclude zero; Table </w:t>
+      </w:r>
+      <w:hyperlink w:anchor="tab:directionality">
+        <w:r>
+          <w:rPr>
+            <w:rStyle w:val="Hyperlink"/>
+          </w:rPr>
+          <w:t xml:space="preserve">1</w:t>
+        </w:r>
+      </w:hyperlink>
+      <w:r>
+        <w:t xml:space="preserve"> </w:t>
+      </w:r>
+      <w:r>
+        <w:t xml:space="preserve">reports those intervals and the complete control set.</w:t>
       </w:r>
     </w:p>
     <w:bookmarkEnd w:id="30"/>
@@ -6772,7 +6786,7 @@
       </w:r>
     </w:p>
     <w:bookmarkEnd w:id="50"/>
-    <w:bookmarkStart w:id="100" w:name="app:additional"/>
+    <w:bookmarkStart w:id="51" w:name="app:additional"/>
     <w:p>
       <w:pPr>
         <w:pStyle w:val="Heading1"/>
@@ -6946,8 +6960,1978 @@
         <w:t xml:space="preserve">), positive in 6/6 states; action steering is smaller and does not reliably exceed the Gaussian control. In the Cosmos 3 population, the two missing frozen states ended after 21 and 29 actions, before producing the 33-frame source video. Neither was replaced. The prespecified minimum of 20 states across five tasks and the factor-study minimum of ten states across five tasks were both met across six tasks.</w:t>
       </w:r>
     </w:p>
-    <w:bookmarkStart w:id="99" w:name="refs"/>
-    <w:bookmarkStart w:id="52" w:name="ref-du2023unipi"/>
+    <w:bookmarkEnd w:id="51"/>
+    <w:bookmarkStart w:id="104" w:name="neurips-paper-checklist"/>
+    <w:p>
+      <w:pPr>
+        <w:pStyle w:val="Heading1"/>
+      </w:pPr>
+      <w:r>
+        <w:t xml:space="preserve">NeurIPS Paper Checklist</w:t>
+      </w:r>
+    </w:p>
+    <w:p>
+      <w:pPr>
+        <w:numPr>
+          <w:ilvl w:val="0"/>
+          <w:numId w:val="1001"/>
+        </w:numPr>
+      </w:pPr>
+      <w:r>
+        <w:rPr>
+          <w:b/>
+          <w:bCs/>
+        </w:rPr>
+        <w:t xml:space="preserve">Claims</w:t>
+      </w:r>
+    </w:p>
+    <w:p>
+      <w:pPr>
+        <w:numPr>
+          <w:ilvl w:val="0"/>
+          <w:numId w:val="1001"/>
+        </w:numPr>
+      </w:pPr>
+      <w:r>
+        <w:t xml:space="preserve">Question: Do the main claims made in the abstract and introduction accurately reflect the paper’s contributions and scope?</w:t>
+      </w:r>
+    </w:p>
+    <w:p>
+      <w:pPr>
+        <w:numPr>
+          <w:ilvl w:val="0"/>
+          <w:numId w:val="1001"/>
+        </w:numPr>
+      </w:pPr>
+      <w:r>
+        <w:t xml:space="preserve">Answer:</w:t>
+      </w:r>
+    </w:p>
+    <w:p>
+      <w:pPr>
+        <w:numPr>
+          <w:ilvl w:val="0"/>
+          <w:numId w:val="1001"/>
+        </w:numPr>
+      </w:pPr>
+      <w:r>
+        <w:t xml:space="preserve">Justification: The abstract, Introduction, Results, and Discussion state the future-transplantation result, its variation across decision points, and the limits on claims about planning and task success.</w:t>
+      </w:r>
+    </w:p>
+    <w:p>
+      <w:pPr>
+        <w:numPr>
+          <w:ilvl w:val="0"/>
+          <w:numId w:val="1001"/>
+        </w:numPr>
+      </w:pPr>
+      <w:r>
+        <w:t xml:space="preserve">Guidelines:</w:t>
+      </w:r>
+    </w:p>
+    <w:p>
+      <w:pPr>
+        <w:numPr>
+          <w:ilvl w:val="1"/>
+          <w:numId w:val="1002"/>
+        </w:numPr>
+      </w:pPr>
+      <w:r>
+        <w:t xml:space="preserve">The answer means that the abstract and introduction do not include the claims made in the paper.</w:t>
+      </w:r>
+    </w:p>
+    <w:p>
+      <w:pPr>
+        <w:numPr>
+          <w:ilvl w:val="1"/>
+          <w:numId w:val="1002"/>
+        </w:numPr>
+      </w:pPr>
+      <w:r>
+        <w:t xml:space="preserve">The abstract and/or introduction should clearly state the claims made, including the contributions made in the paper and important assumptions and limitations. A or answer to this question will not be perceived well by the reviewers.</w:t>
+      </w:r>
+    </w:p>
+    <w:p>
+      <w:pPr>
+        <w:numPr>
+          <w:ilvl w:val="1"/>
+          <w:numId w:val="1002"/>
+        </w:numPr>
+      </w:pPr>
+      <w:r>
+        <w:t xml:space="preserve">The claims made should match theoretical and experimental results, and reflect how much the results can be expected to generalize to other settings.</w:t>
+      </w:r>
+    </w:p>
+    <w:p>
+      <w:pPr>
+        <w:numPr>
+          <w:ilvl w:val="1"/>
+          <w:numId w:val="1002"/>
+        </w:numPr>
+      </w:pPr>
+      <w:r>
+        <w:t xml:space="preserve">It is fine to include aspirational goals as motivation as long as it is clear that these goals are not attained by the paper.</w:t>
+      </w:r>
+    </w:p>
+    <w:p>
+      <w:pPr>
+        <w:numPr>
+          <w:ilvl w:val="0"/>
+          <w:numId w:val="1001"/>
+        </w:numPr>
+      </w:pPr>
+      <w:r>
+        <w:rPr>
+          <w:b/>
+          <w:bCs/>
+        </w:rPr>
+        <w:t xml:space="preserve">Limitations</w:t>
+      </w:r>
+    </w:p>
+    <w:p>
+      <w:pPr>
+        <w:numPr>
+          <w:ilvl w:val="0"/>
+          <w:numId w:val="1001"/>
+        </w:numPr>
+      </w:pPr>
+      <w:r>
+        <w:t xml:space="preserve">Question: Does the paper discuss the limitations of the work performed by the authors?</w:t>
+      </w:r>
+    </w:p>
+    <w:p>
+      <w:pPr>
+        <w:numPr>
+          <w:ilvl w:val="0"/>
+          <w:numId w:val="1001"/>
+        </w:numPr>
+      </w:pPr>
+      <w:r>
+        <w:t xml:space="preserve">Answer:</w:t>
+      </w:r>
+    </w:p>
+    <w:p>
+      <w:pPr>
+        <w:numPr>
+          <w:ilvl w:val="0"/>
+          <w:numId w:val="1001"/>
+        </w:numPr>
+      </w:pPr>
+      <w:r>
+        <w:t xml:space="preserve">Justification: Result-specific qualifications appear beside the relevant findings, and the Discussion and Limitations section addresses model and state coverage, the later-state comparison, the factorized object intervention, the internal replacement experiment, and the absence of task-success results.</w:t>
+      </w:r>
+    </w:p>
+    <w:p>
+      <w:pPr>
+        <w:numPr>
+          <w:ilvl w:val="0"/>
+          <w:numId w:val="1001"/>
+        </w:numPr>
+      </w:pPr>
+      <w:r>
+        <w:t xml:space="preserve">Guidelines:</w:t>
+      </w:r>
+    </w:p>
+    <w:p>
+      <w:pPr>
+        <w:numPr>
+          <w:ilvl w:val="1"/>
+          <w:numId w:val="1003"/>
+        </w:numPr>
+      </w:pPr>
+      <w:r>
+        <w:t xml:space="preserve">The answer means that the paper has no limitation while the answer means that the paper has limitations, but those are not discussed in the paper.</w:t>
+      </w:r>
+    </w:p>
+    <w:p>
+      <w:pPr>
+        <w:numPr>
+          <w:ilvl w:val="1"/>
+          <w:numId w:val="1003"/>
+        </w:numPr>
+      </w:pPr>
+      <w:r>
+        <w:t xml:space="preserve">The authors are encouraged to create a separate</w:t>
+      </w:r>
+      <w:r>
+        <w:t xml:space="preserve"> </w:t>
+      </w:r>
+      <w:r>
+        <w:t xml:space="preserve">“Limitations”</w:t>
+      </w:r>
+      <w:r>
+        <w:t xml:space="preserve"> </w:t>
+      </w:r>
+      <w:r>
+        <w:t xml:space="preserve">section in their paper.</w:t>
+      </w:r>
+    </w:p>
+    <w:p>
+      <w:pPr>
+        <w:numPr>
+          <w:ilvl w:val="1"/>
+          <w:numId w:val="1003"/>
+        </w:numPr>
+      </w:pPr>
+      <w:r>
+        <w:t xml:space="preserve">The paper should point out any strong assumptions and how robust the results are to violations of these assumptions (e.g., independence assumptions, noiseless settings, model well-specification, asymptotic approximations only holding locally). The authors should reflect on how these assumptions might be violated in practice and what the implications would be.</w:t>
+      </w:r>
+    </w:p>
+    <w:p>
+      <w:pPr>
+        <w:numPr>
+          <w:ilvl w:val="1"/>
+          <w:numId w:val="1003"/>
+        </w:numPr>
+      </w:pPr>
+      <w:r>
+        <w:t xml:space="preserve">The authors should reflect on the scope of the claims made, e.g., if the approach was only tested on a few datasets or with a few runs. In general, empirical results often depend on implicit assumptions, which should be articulated.</w:t>
+      </w:r>
+    </w:p>
+    <w:p>
+      <w:pPr>
+        <w:numPr>
+          <w:ilvl w:val="1"/>
+          <w:numId w:val="1003"/>
+        </w:numPr>
+      </w:pPr>
+      <w:r>
+        <w:t xml:space="preserve">The authors should reflect on the factors that influence the performance of the approach. For example, a facial recognition algorithm may perform poorly when image resolution is low or images are taken in low lighting. Or a speech-to-text system might not be used reliably to provide closed captions for online lectures because it fails to handle technical jargon.</w:t>
+      </w:r>
+    </w:p>
+    <w:p>
+      <w:pPr>
+        <w:numPr>
+          <w:ilvl w:val="1"/>
+          <w:numId w:val="1003"/>
+        </w:numPr>
+      </w:pPr>
+      <w:r>
+        <w:t xml:space="preserve">The authors should discuss the computational efficiency of the proposed algorithms and how they scale with dataset size.</w:t>
+      </w:r>
+    </w:p>
+    <w:p>
+      <w:pPr>
+        <w:numPr>
+          <w:ilvl w:val="1"/>
+          <w:numId w:val="1003"/>
+        </w:numPr>
+      </w:pPr>
+      <w:r>
+        <w:t xml:space="preserve">If applicable, the authors should discuss possible limitations of their approach to address problems of privacy and fairness.</w:t>
+      </w:r>
+    </w:p>
+    <w:p>
+      <w:pPr>
+        <w:numPr>
+          <w:ilvl w:val="1"/>
+          <w:numId w:val="1003"/>
+        </w:numPr>
+      </w:pPr>
+      <w:r>
+        <w:t xml:space="preserve">While the authors might fear that complete honesty about limitations might be used by reviewers as grounds for rejection, a worse outcome might be that reviewers discover limitations that aren’t acknowledged in the paper. The authors should use their best judgment and recognize that individual actions in favor of transparency play an important role in developing norms that preserve the integrity of the community. Reviewers will be specifically instructed to not penalize honesty concerning limitations.</w:t>
+      </w:r>
+    </w:p>
+    <w:p>
+      <w:pPr>
+        <w:numPr>
+          <w:ilvl w:val="0"/>
+          <w:numId w:val="1001"/>
+        </w:numPr>
+      </w:pPr>
+      <w:r>
+        <w:rPr>
+          <w:b/>
+          <w:bCs/>
+        </w:rPr>
+        <w:t xml:space="preserve">Theory assumptions and proofs</w:t>
+      </w:r>
+    </w:p>
+    <w:p>
+      <w:pPr>
+        <w:numPr>
+          <w:ilvl w:val="0"/>
+          <w:numId w:val="1001"/>
+        </w:numPr>
+      </w:pPr>
+      <w:r>
+        <w:t xml:space="preserve">Question: For each theoretical result, does the paper provide the full set of assumptions and a complete (and correct) proof?</w:t>
+      </w:r>
+    </w:p>
+    <w:p>
+      <w:pPr>
+        <w:numPr>
+          <w:ilvl w:val="0"/>
+          <w:numId w:val="1001"/>
+        </w:numPr>
+      </w:pPr>
+      <w:r>
+        <w:t xml:space="preserve">Answer:</w:t>
+      </w:r>
+    </w:p>
+    <w:p>
+      <w:pPr>
+        <w:numPr>
+          <w:ilvl w:val="0"/>
+          <w:numId w:val="1001"/>
+        </w:numPr>
+      </w:pPr>
+      <w:r>
+        <w:t xml:space="preserve">Justification: The paper reports empirical intervention results and does not claim a theorem or formal proof.</w:t>
+      </w:r>
+    </w:p>
+    <w:p>
+      <w:pPr>
+        <w:numPr>
+          <w:ilvl w:val="0"/>
+          <w:numId w:val="1001"/>
+        </w:numPr>
+      </w:pPr>
+      <w:r>
+        <w:t xml:space="preserve">Guidelines:</w:t>
+      </w:r>
+    </w:p>
+    <w:p>
+      <w:pPr>
+        <w:numPr>
+          <w:ilvl w:val="1"/>
+          <w:numId w:val="1004"/>
+        </w:numPr>
+      </w:pPr>
+      <w:r>
+        <w:t xml:space="preserve">The answer means that the paper does not include theoretical results.</w:t>
+      </w:r>
+    </w:p>
+    <w:p>
+      <w:pPr>
+        <w:numPr>
+          <w:ilvl w:val="1"/>
+          <w:numId w:val="1004"/>
+        </w:numPr>
+      </w:pPr>
+      <w:r>
+        <w:t xml:space="preserve">All the theorems, formulas, and proofs in the paper should be numbered and cross-referenced.</w:t>
+      </w:r>
+    </w:p>
+    <w:p>
+      <w:pPr>
+        <w:numPr>
+          <w:ilvl w:val="1"/>
+          <w:numId w:val="1004"/>
+        </w:numPr>
+      </w:pPr>
+      <w:r>
+        <w:t xml:space="preserve">All assumptions should be clearly stated or referenced in the statement of any theorems.</w:t>
+      </w:r>
+    </w:p>
+    <w:p>
+      <w:pPr>
+        <w:numPr>
+          <w:ilvl w:val="1"/>
+          <w:numId w:val="1004"/>
+        </w:numPr>
+      </w:pPr>
+      <w:r>
+        <w:t xml:space="preserve">The proofs can either appear in the main paper or the supplemental material, but if they appear in the supplemental material, the authors are encouraged to provide a short proof sketch to provide intuition.</w:t>
+      </w:r>
+    </w:p>
+    <w:p>
+      <w:pPr>
+        <w:numPr>
+          <w:ilvl w:val="1"/>
+          <w:numId w:val="1004"/>
+        </w:numPr>
+      </w:pPr>
+      <w:r>
+        <w:t xml:space="preserve">Inversely, any informal proof provided in the core of the paper should be complemented by formal proofs provided in appendix or supplemental material.</w:t>
+      </w:r>
+    </w:p>
+    <w:p>
+      <w:pPr>
+        <w:numPr>
+          <w:ilvl w:val="1"/>
+          <w:numId w:val="1004"/>
+        </w:numPr>
+      </w:pPr>
+      <w:r>
+        <w:t xml:space="preserve">Theorems and Lemmas that the proof relies upon should be properly referenced.</w:t>
+      </w:r>
+    </w:p>
+    <w:p>
+      <w:pPr>
+        <w:numPr>
+          <w:ilvl w:val="0"/>
+          <w:numId w:val="1001"/>
+        </w:numPr>
+      </w:pPr>
+      <w:r>
+        <w:rPr>
+          <w:b/>
+          <w:bCs/>
+        </w:rPr>
+        <w:t xml:space="preserve">Experimental result reproducibility</w:t>
+      </w:r>
+    </w:p>
+    <w:p>
+      <w:pPr>
+        <w:numPr>
+          <w:ilvl w:val="0"/>
+          <w:numId w:val="1001"/>
+        </w:numPr>
+      </w:pPr>
+      <w:r>
+        <w:t xml:space="preserve">Question: Does the paper fully disclose all the information needed to reproduce the main experimental results of the paper to the extent that it affects the main claims and/or conclusions of the paper (regardless of whether the code and data are provided or not)?</w:t>
+      </w:r>
+    </w:p>
+    <w:p>
+      <w:pPr>
+        <w:numPr>
+          <w:ilvl w:val="0"/>
+          <w:numId w:val="1001"/>
+        </w:numPr>
+      </w:pPr>
+      <w:r>
+        <w:t xml:space="preserve">Answer:</w:t>
+      </w:r>
+    </w:p>
+    <w:p>
+      <w:pPr>
+        <w:numPr>
+          <w:ilvl w:val="0"/>
+          <w:numId w:val="1001"/>
+        </w:numPr>
+      </w:pPr>
+      <w:r>
+        <w:t xml:space="preserve">Justification: The Methods, Results, and Appendix A specify the estimands, experimental units, controls, clustering, public checkpoints, and exactness gates. The complete seed list, all repository hashes and container digests, intervention code, and run logs are not yet included.</w:t>
+      </w:r>
+    </w:p>
+    <w:p>
+      <w:pPr>
+        <w:numPr>
+          <w:ilvl w:val="0"/>
+          <w:numId w:val="1001"/>
+        </w:numPr>
+      </w:pPr>
+      <w:r>
+        <w:t xml:space="preserve">Guidelines:</w:t>
+      </w:r>
+    </w:p>
+    <w:p>
+      <w:pPr>
+        <w:numPr>
+          <w:ilvl w:val="1"/>
+          <w:numId w:val="1005"/>
+        </w:numPr>
+      </w:pPr>
+      <w:r>
+        <w:t xml:space="preserve">The answer means that the paper does not include experiments.</w:t>
+      </w:r>
+    </w:p>
+    <w:p>
+      <w:pPr>
+        <w:numPr>
+          <w:ilvl w:val="1"/>
+          <w:numId w:val="1005"/>
+        </w:numPr>
+      </w:pPr>
+      <w:r>
+        <w:t xml:space="preserve">If the paper includes experiments, a answer to this question will not be perceived well by the reviewers: Making the paper reproducible is important, regardless of whether the code and data are provided or not.</w:t>
+      </w:r>
+    </w:p>
+    <w:p>
+      <w:pPr>
+        <w:numPr>
+          <w:ilvl w:val="1"/>
+          <w:numId w:val="1005"/>
+        </w:numPr>
+      </w:pPr>
+      <w:r>
+        <w:t xml:space="preserve">If the contribution is a dataset and/or model, the authors should describe the steps taken to make their results reproducible or verifiable.</w:t>
+      </w:r>
+    </w:p>
+    <w:p>
+      <w:pPr>
+        <w:numPr>
+          <w:ilvl w:val="1"/>
+          <w:numId w:val="1005"/>
+        </w:numPr>
+      </w:pPr>
+      <w:r>
+        <w:t xml:space="preserve">Depending on the contribution, reproducibility can be accomplished in various ways. For example, if the contribution is a novel architecture, describing the architecture fully might suffice, or if the contribution is a specific model and empirical evaluation, it may be necessary to either make it possible for others to replicate the model with the same dataset, or provide access to the model. In general. releasing code and data is often one good way to accomplish this, but reproducibility can also be provided via detailed instructions for how to replicate the results, access to a hosted model (e.g., in the case of a large language model), releasing of a model checkpoint, or other means that are appropriate to the research performed.</w:t>
+      </w:r>
+    </w:p>
+    <w:p>
+      <w:pPr>
+        <w:numPr>
+          <w:ilvl w:val="1"/>
+          <w:numId w:val="1005"/>
+        </w:numPr>
+      </w:pPr>
+      <w:r>
+        <w:t xml:space="preserve">While NeurIPS does not require releasing code, the conference does require all submissions to provide some reasonable avenue for reproducibility, which may depend on the nature of the contribution. For example</w:t>
+      </w:r>
+    </w:p>
+    <w:p>
+      <w:pPr>
+        <w:numPr>
+          <w:ilvl w:val="2"/>
+          <w:numId w:val="1006"/>
+        </w:numPr>
+      </w:pPr>
+      <w:r>
+        <w:t xml:space="preserve">If the contribution is primarily a new algorithm, the paper should make it clear how to reproduce that algorithm.</w:t>
+      </w:r>
+    </w:p>
+    <w:p>
+      <w:pPr>
+        <w:numPr>
+          <w:ilvl w:val="2"/>
+          <w:numId w:val="1006"/>
+        </w:numPr>
+      </w:pPr>
+      <w:r>
+        <w:t xml:space="preserve">If the contribution is primarily a new model architecture, the paper should describe the architecture clearly and fully.</w:t>
+      </w:r>
+    </w:p>
+    <w:p>
+      <w:pPr>
+        <w:numPr>
+          <w:ilvl w:val="2"/>
+          <w:numId w:val="1006"/>
+        </w:numPr>
+      </w:pPr>
+      <w:r>
+        <w:t xml:space="preserve">If the contribution is a new model (e.g., a large language model), then there should either be a way to access this model for reproducing the results or a way to reproduce the model (e.g., with an open-source dataset or instructions for how to construct the dataset).</w:t>
+      </w:r>
+    </w:p>
+    <w:p>
+      <w:pPr>
+        <w:numPr>
+          <w:ilvl w:val="2"/>
+          <w:numId w:val="1006"/>
+        </w:numPr>
+      </w:pPr>
+      <w:r>
+        <w:t xml:space="preserve">We recognize that reproducibility may be tricky in some cases, in which case authors are welcome to describe the particular way they provide for reproducibility. In the case of closed-source models, it may be that access to the model is limited in some way (e.g., to registered users), but it should be possible for other researchers to have some path to reproducing or verifying the results.</w:t>
+      </w:r>
+    </w:p>
+    <w:p>
+      <w:pPr>
+        <w:numPr>
+          <w:ilvl w:val="0"/>
+          <w:numId w:val="1001"/>
+        </w:numPr>
+      </w:pPr>
+      <w:r>
+        <w:rPr>
+          <w:b/>
+          <w:bCs/>
+        </w:rPr>
+        <w:t xml:space="preserve">Open access to data and code</w:t>
+      </w:r>
+    </w:p>
+    <w:p>
+      <w:pPr>
+        <w:numPr>
+          <w:ilvl w:val="0"/>
+          <w:numId w:val="1001"/>
+        </w:numPr>
+      </w:pPr>
+      <w:r>
+        <w:t xml:space="preserve">Question: Does the paper provide open access to the data and code, with sufficient instructions to faithfully reproduce the main experimental results, as described in supplemental material?</w:t>
+      </w:r>
+    </w:p>
+    <w:p>
+      <w:pPr>
+        <w:numPr>
+          <w:ilvl w:val="0"/>
+          <w:numId w:val="1001"/>
+        </w:numPr>
+      </w:pPr>
+      <w:r>
+        <w:t xml:space="preserve">Answer:</w:t>
+      </w:r>
+    </w:p>
+    <w:p>
+      <w:pPr>
+        <w:numPr>
+          <w:ilvl w:val="0"/>
+          <w:numId w:val="1001"/>
+        </w:numPr>
+      </w:pPr>
+      <w:r>
+        <w:t xml:space="preserve">Justification: The source package includes machine-readable values for the paper figures, but not the intervention code, raw logs, or an anonymous public reproduction artifact.</w:t>
+      </w:r>
+    </w:p>
+    <w:p>
+      <w:pPr>
+        <w:numPr>
+          <w:ilvl w:val="0"/>
+          <w:numId w:val="1001"/>
+        </w:numPr>
+      </w:pPr>
+      <w:r>
+        <w:t xml:space="preserve">Guidelines:</w:t>
+      </w:r>
+    </w:p>
+    <w:p>
+      <w:pPr>
+        <w:numPr>
+          <w:ilvl w:val="1"/>
+          <w:numId w:val="1007"/>
+        </w:numPr>
+      </w:pPr>
+      <w:r>
+        <w:t xml:space="preserve">The answer means that paper does not include experiments requiring code.</w:t>
+      </w:r>
+    </w:p>
+    <w:p>
+      <w:pPr>
+        <w:numPr>
+          <w:ilvl w:val="1"/>
+          <w:numId w:val="1007"/>
+        </w:numPr>
+      </w:pPr>
+      <w:r>
+        <w:t xml:space="preserve">Please see the NeurIPS code and data submission guidelines (</w:t>
+      </w:r>
+      <w:hyperlink r:id="rId52">
+        <w:r>
+          <w:rPr>
+            <w:rStyle w:val="Hyperlink"/>
+          </w:rPr>
+          <w:t xml:space="preserve">https://neurips.cc/public/guides/CodeSubmissionPolicy</w:t>
+        </w:r>
+      </w:hyperlink>
+      <w:r>
+        <w:t xml:space="preserve">) for more details.</w:t>
+      </w:r>
+    </w:p>
+    <w:p>
+      <w:pPr>
+        <w:numPr>
+          <w:ilvl w:val="1"/>
+          <w:numId w:val="1007"/>
+        </w:numPr>
+      </w:pPr>
+      <w:r>
+        <w:t xml:space="preserve">While we encourage the release of code and data, we understand that this might not be possible, so is an acceptable answer. Papers cannot be rejected simply for not including code, unless this is central to the contribution (e.g., for a new open-source benchmark).</w:t>
+      </w:r>
+    </w:p>
+    <w:p>
+      <w:pPr>
+        <w:numPr>
+          <w:ilvl w:val="1"/>
+          <w:numId w:val="1007"/>
+        </w:numPr>
+      </w:pPr>
+      <w:r>
+        <w:t xml:space="preserve">The instructions should contain the exact command and environment needed to run to reproduce the results. See the NeurIPS code and data submission guidelines (</w:t>
+      </w:r>
+      <w:hyperlink r:id="rId52">
+        <w:r>
+          <w:rPr>
+            <w:rStyle w:val="Hyperlink"/>
+          </w:rPr>
+          <w:t xml:space="preserve">https://neurips.cc/public/guides/CodeSubmissionPolicy</w:t>
+        </w:r>
+      </w:hyperlink>
+      <w:r>
+        <w:t xml:space="preserve">) for more details.</w:t>
+      </w:r>
+    </w:p>
+    <w:p>
+      <w:pPr>
+        <w:numPr>
+          <w:ilvl w:val="1"/>
+          <w:numId w:val="1007"/>
+        </w:numPr>
+      </w:pPr>
+      <w:r>
+        <w:t xml:space="preserve">The authors should provide instructions on data access and preparation, including how to access the raw data, preprocessed data, intermediate data, and generated data, etc.</w:t>
+      </w:r>
+    </w:p>
+    <w:p>
+      <w:pPr>
+        <w:numPr>
+          <w:ilvl w:val="1"/>
+          <w:numId w:val="1007"/>
+        </w:numPr>
+      </w:pPr>
+      <w:r>
+        <w:t xml:space="preserve">The authors should provide scripts to reproduce all experimental results for the new proposed method and baselines. If only a subset of experiments are reproducible, they should state which ones are omitted from the script and why.</w:t>
+      </w:r>
+    </w:p>
+    <w:p>
+      <w:pPr>
+        <w:numPr>
+          <w:ilvl w:val="1"/>
+          <w:numId w:val="1007"/>
+        </w:numPr>
+      </w:pPr>
+      <w:r>
+        <w:t xml:space="preserve">At submission time, to preserve anonymity, the authors should release anonymized versions (if applicable).</w:t>
+      </w:r>
+    </w:p>
+    <w:p>
+      <w:pPr>
+        <w:numPr>
+          <w:ilvl w:val="1"/>
+          <w:numId w:val="1007"/>
+        </w:numPr>
+      </w:pPr>
+      <w:r>
+        <w:t xml:space="preserve">Providing as much information as possible in supplemental material (appended to the paper) is recommended, but including URLs to data and code is permitted.</w:t>
+      </w:r>
+    </w:p>
+    <w:p>
+      <w:pPr>
+        <w:numPr>
+          <w:ilvl w:val="0"/>
+          <w:numId w:val="1001"/>
+        </w:numPr>
+      </w:pPr>
+      <w:r>
+        <w:rPr>
+          <w:b/>
+          <w:bCs/>
+        </w:rPr>
+        <w:t xml:space="preserve">Experimental setting/details</w:t>
+      </w:r>
+    </w:p>
+    <w:p>
+      <w:pPr>
+        <w:numPr>
+          <w:ilvl w:val="0"/>
+          <w:numId w:val="1001"/>
+        </w:numPr>
+      </w:pPr>
+      <w:r>
+        <w:t xml:space="preserve">Question: Does the paper specify all the training and test details (e.g., data splits, hyperparameters, how they were chosen, type of optimizer) necessary to understand the results?</w:t>
+      </w:r>
+    </w:p>
+    <w:p>
+      <w:pPr>
+        <w:numPr>
+          <w:ilvl w:val="0"/>
+          <w:numId w:val="1001"/>
+        </w:numPr>
+      </w:pPr>
+      <w:r>
+        <w:t xml:space="preserve">Answer:</w:t>
+      </w:r>
+    </w:p>
+    <w:p>
+      <w:pPr>
+        <w:numPr>
+          <w:ilvl w:val="0"/>
+          <w:numId w:val="1001"/>
+        </w:numPr>
+      </w:pPr>
+      <w:r>
+        <w:t xml:space="preserve">Justification: The Methods and Results provide the state grid, branch construction, intervention targets, controls, action horizons, model interfaces, and statistical analysis needed to interpret the results. Appendix A states which exact environment details are available and which remain unreported.</w:t>
+      </w:r>
+    </w:p>
+    <w:p>
+      <w:pPr>
+        <w:numPr>
+          <w:ilvl w:val="0"/>
+          <w:numId w:val="1001"/>
+        </w:numPr>
+      </w:pPr>
+      <w:r>
+        <w:t xml:space="preserve">Guidelines:</w:t>
+      </w:r>
+    </w:p>
+    <w:p>
+      <w:pPr>
+        <w:numPr>
+          <w:ilvl w:val="1"/>
+          <w:numId w:val="1008"/>
+        </w:numPr>
+      </w:pPr>
+      <w:r>
+        <w:t xml:space="preserve">The answer means that the paper does not include experiments.</w:t>
+      </w:r>
+    </w:p>
+    <w:p>
+      <w:pPr>
+        <w:numPr>
+          <w:ilvl w:val="1"/>
+          <w:numId w:val="1008"/>
+        </w:numPr>
+      </w:pPr>
+      <w:r>
+        <w:t xml:space="preserve">The experimental setting should be presented in the core of the paper to a level of detail that is necessary to appreciate the results and make sense of them.</w:t>
+      </w:r>
+    </w:p>
+    <w:p>
+      <w:pPr>
+        <w:numPr>
+          <w:ilvl w:val="1"/>
+          <w:numId w:val="1008"/>
+        </w:numPr>
+      </w:pPr>
+      <w:r>
+        <w:t xml:space="preserve">The full details can be provided either with the code, in appendix, or as supplemental material.</w:t>
+      </w:r>
+    </w:p>
+    <w:p>
+      <w:pPr>
+        <w:numPr>
+          <w:ilvl w:val="0"/>
+          <w:numId w:val="1001"/>
+        </w:numPr>
+      </w:pPr>
+      <w:r>
+        <w:rPr>
+          <w:b/>
+          <w:bCs/>
+        </w:rPr>
+        <w:t xml:space="preserve">Experiment statistical significance</w:t>
+      </w:r>
+    </w:p>
+    <w:p>
+      <w:pPr>
+        <w:numPr>
+          <w:ilvl w:val="0"/>
+          <w:numId w:val="1001"/>
+        </w:numPr>
+      </w:pPr>
+      <w:r>
+        <w:t xml:space="preserve">Question: Does the paper report error bars suitably and correctly defined or other appropriate information about the statistical significance of the experiments?</w:t>
+      </w:r>
+    </w:p>
+    <w:p>
+      <w:pPr>
+        <w:numPr>
+          <w:ilvl w:val="0"/>
+          <w:numId w:val="1001"/>
+        </w:numPr>
+      </w:pPr>
+      <w:r>
+        <w:t xml:space="preserve">Answer:</w:t>
+      </w:r>
+    </w:p>
+    <w:p>
+      <w:pPr>
+        <w:numPr>
+          <w:ilvl w:val="0"/>
+          <w:numId w:val="1001"/>
+        </w:numPr>
+      </w:pPr>
+      <w:r>
+        <w:t xml:space="preserve">Justification: Principal estimates have explicitly defined 95% cluster-bootstrap intervals, the independent unit and 10,000-resample procedure are stated in the Methods, and exact sign counts are reported where relevant. The text identifies controls and secondary means for which exact intervals were not available.</w:t>
+      </w:r>
+    </w:p>
+    <w:p>
+      <w:pPr>
+        <w:numPr>
+          <w:ilvl w:val="0"/>
+          <w:numId w:val="1001"/>
+        </w:numPr>
+      </w:pPr>
+      <w:r>
+        <w:t xml:space="preserve">Guidelines:</w:t>
+      </w:r>
+    </w:p>
+    <w:p>
+      <w:pPr>
+        <w:numPr>
+          <w:ilvl w:val="1"/>
+          <w:numId w:val="1009"/>
+        </w:numPr>
+      </w:pPr>
+      <w:r>
+        <w:t xml:space="preserve">The answer means that the paper does not include experiments.</w:t>
+      </w:r>
+    </w:p>
+    <w:p>
+      <w:pPr>
+        <w:numPr>
+          <w:ilvl w:val="1"/>
+          <w:numId w:val="1009"/>
+        </w:numPr>
+      </w:pPr>
+      <w:r>
+        <w:t xml:space="preserve">The authors should answer if the results are accompanied by error bars, confidence intervals, or statistical significance tests, at least for the experiments that support the main claims of the paper.</w:t>
+      </w:r>
+    </w:p>
+    <w:p>
+      <w:pPr>
+        <w:numPr>
+          <w:ilvl w:val="1"/>
+          <w:numId w:val="1009"/>
+        </w:numPr>
+      </w:pPr>
+      <w:r>
+        <w:t xml:space="preserve">The factors of variability that the error bars are capturing should be clearly stated (for example, train/test split, initialization, random drawing of some parameter, or overall run with given experimental conditions).</w:t>
+      </w:r>
+    </w:p>
+    <w:p>
+      <w:pPr>
+        <w:numPr>
+          <w:ilvl w:val="1"/>
+          <w:numId w:val="1009"/>
+        </w:numPr>
+      </w:pPr>
+      <w:r>
+        <w:t xml:space="preserve">The method for calculating the error bars should be explained (closed form formula, call to a library function, bootstrap, etc.)</w:t>
+      </w:r>
+    </w:p>
+    <w:p>
+      <w:pPr>
+        <w:numPr>
+          <w:ilvl w:val="1"/>
+          <w:numId w:val="1009"/>
+        </w:numPr>
+      </w:pPr>
+      <w:r>
+        <w:t xml:space="preserve">The assumptions made should be given (e.g., Normally distributed errors).</w:t>
+      </w:r>
+    </w:p>
+    <w:p>
+      <w:pPr>
+        <w:numPr>
+          <w:ilvl w:val="1"/>
+          <w:numId w:val="1009"/>
+        </w:numPr>
+      </w:pPr>
+      <w:r>
+        <w:t xml:space="preserve">It should be clear whether the error bar is the standard deviation or the standard error of the mean.</w:t>
+      </w:r>
+    </w:p>
+    <w:p>
+      <w:pPr>
+        <w:numPr>
+          <w:ilvl w:val="1"/>
+          <w:numId w:val="1009"/>
+        </w:numPr>
+      </w:pPr>
+      <w:r>
+        <w:t xml:space="preserve">It is OK to report 1-sigma error bars, but one should state it. The authors should preferably report a 2-sigma error bar than state that they have a 96% CI, if the hypothesis of Normality of errors is not verified.</w:t>
+      </w:r>
+    </w:p>
+    <w:p>
+      <w:pPr>
+        <w:numPr>
+          <w:ilvl w:val="1"/>
+          <w:numId w:val="1009"/>
+        </w:numPr>
+      </w:pPr>
+      <w:r>
+        <w:t xml:space="preserve">For asymmetric distributions, the authors should be careful not to show in tables or figures symmetric error bars that would yield results that are out of range (e.g., negative error rates).</w:t>
+      </w:r>
+    </w:p>
+    <w:p>
+      <w:pPr>
+        <w:numPr>
+          <w:ilvl w:val="1"/>
+          <w:numId w:val="1009"/>
+        </w:numPr>
+      </w:pPr>
+      <w:r>
+        <w:t xml:space="preserve">If error bars are reported in tables or plots, the authors should explain in the text how they were calculated and reference the corresponding figures or tables in the text.</w:t>
+      </w:r>
+    </w:p>
+    <w:p>
+      <w:pPr>
+        <w:numPr>
+          <w:ilvl w:val="0"/>
+          <w:numId w:val="1001"/>
+        </w:numPr>
+      </w:pPr>
+      <w:r>
+        <w:rPr>
+          <w:b/>
+          <w:bCs/>
+        </w:rPr>
+        <w:t xml:space="preserve">Experiments compute resources</w:t>
+      </w:r>
+    </w:p>
+    <w:p>
+      <w:pPr>
+        <w:numPr>
+          <w:ilvl w:val="0"/>
+          <w:numId w:val="1001"/>
+        </w:numPr>
+      </w:pPr>
+      <w:r>
+        <w:t xml:space="preserve">Question: For each experiment, does the paper provide sufficient information on the computer resources (type of compute workers, memory, time of execution) needed to reproduce the experiments?</w:t>
+      </w:r>
+    </w:p>
+    <w:p>
+      <w:pPr>
+        <w:numPr>
+          <w:ilvl w:val="0"/>
+          <w:numId w:val="1001"/>
+        </w:numPr>
+      </w:pPr>
+      <w:r>
+        <w:t xml:space="preserve">Answer:</w:t>
+      </w:r>
+    </w:p>
+    <w:p>
+      <w:pPr>
+        <w:numPr>
+          <w:ilvl w:val="0"/>
+          <w:numId w:val="1001"/>
+        </w:numPr>
+      </w:pPr>
+      <w:r>
+        <w:t xml:space="preserve">Justification: Appendix A reports GPU type and software environment, but complete per-run wall-clock and aggregate compute-hour accounting is still being assembled for the submission artifact.</w:t>
+      </w:r>
+    </w:p>
+    <w:p>
+      <w:pPr>
+        <w:numPr>
+          <w:ilvl w:val="0"/>
+          <w:numId w:val="1001"/>
+        </w:numPr>
+      </w:pPr>
+      <w:r>
+        <w:t xml:space="preserve">Guidelines:</w:t>
+      </w:r>
+    </w:p>
+    <w:p>
+      <w:pPr>
+        <w:numPr>
+          <w:ilvl w:val="1"/>
+          <w:numId w:val="1010"/>
+        </w:numPr>
+      </w:pPr>
+      <w:r>
+        <w:t xml:space="preserve">The answer means that the paper does not include experiments.</w:t>
+      </w:r>
+    </w:p>
+    <w:p>
+      <w:pPr>
+        <w:numPr>
+          <w:ilvl w:val="1"/>
+          <w:numId w:val="1010"/>
+        </w:numPr>
+      </w:pPr>
+      <w:r>
+        <w:t xml:space="preserve">The paper should indicate the type of compute workers CPU or GPU, internal cluster, or cloud provider, including relevant memory and storage.</w:t>
+      </w:r>
+    </w:p>
+    <w:p>
+      <w:pPr>
+        <w:numPr>
+          <w:ilvl w:val="1"/>
+          <w:numId w:val="1010"/>
+        </w:numPr>
+      </w:pPr>
+      <w:r>
+        <w:t xml:space="preserve">The paper should provide the amount of compute required for each of the individual experimental runs as well as estimate the total compute.</w:t>
+      </w:r>
+    </w:p>
+    <w:p>
+      <w:pPr>
+        <w:numPr>
+          <w:ilvl w:val="1"/>
+          <w:numId w:val="1010"/>
+        </w:numPr>
+      </w:pPr>
+      <w:r>
+        <w:t xml:space="preserve">The paper should disclose whether the full research project required more compute than the experiments reported in the paper (e.g., preliminary or failed experiments that didn’t make it into the paper).</w:t>
+      </w:r>
+    </w:p>
+    <w:p>
+      <w:pPr>
+        <w:numPr>
+          <w:ilvl w:val="0"/>
+          <w:numId w:val="1001"/>
+        </w:numPr>
+      </w:pPr>
+      <w:r>
+        <w:rPr>
+          <w:b/>
+          <w:bCs/>
+        </w:rPr>
+        <w:t xml:space="preserve">Code of ethics</w:t>
+      </w:r>
+    </w:p>
+    <w:p>
+      <w:pPr>
+        <w:numPr>
+          <w:ilvl w:val="0"/>
+          <w:numId w:val="1001"/>
+        </w:numPr>
+      </w:pPr>
+      <w:r>
+        <w:t xml:space="preserve">Question: Does the research conducted in the paper conform, in every respect, with the NeurIPS Code of Ethics</w:t>
+      </w:r>
+      <w:r>
+        <w:t xml:space="preserve"> </w:t>
+      </w:r>
+      <w:hyperlink r:id="rId53">
+        <w:r>
+          <w:rPr>
+            <w:rStyle w:val="Hyperlink"/>
+          </w:rPr>
+          <w:t xml:space="preserve">https://neurips.cc/public/EthicsGuidelines</w:t>
+        </w:r>
+      </w:hyperlink>
+      <w:r>
+        <w:t xml:space="preserve">?</w:t>
+      </w:r>
+    </w:p>
+    <w:p>
+      <w:pPr>
+        <w:numPr>
+          <w:ilvl w:val="0"/>
+          <w:numId w:val="1001"/>
+        </w:numPr>
+      </w:pPr>
+      <w:r>
+        <w:t xml:space="preserve">Answer:</w:t>
+      </w:r>
+    </w:p>
+    <w:p>
+      <w:pPr>
+        <w:numPr>
+          <w:ilvl w:val="0"/>
+          <w:numId w:val="1001"/>
+        </w:numPr>
+      </w:pPr>
+      <w:r>
+        <w:t xml:space="preserve">Justification: The experiments use public robot-policy checkpoints and simulation benchmarks, involve no people or personal data, and report negative and failed intervention results rather than selectively discarding them.</w:t>
+      </w:r>
+    </w:p>
+    <w:p>
+      <w:pPr>
+        <w:numPr>
+          <w:ilvl w:val="0"/>
+          <w:numId w:val="1001"/>
+        </w:numPr>
+      </w:pPr>
+      <w:r>
+        <w:t xml:space="preserve">Guidelines:</w:t>
+      </w:r>
+    </w:p>
+    <w:p>
+      <w:pPr>
+        <w:numPr>
+          <w:ilvl w:val="1"/>
+          <w:numId w:val="1011"/>
+        </w:numPr>
+      </w:pPr>
+      <w:r>
+        <w:t xml:space="preserve">The answer means that the authors have not reviewed the NeurIPS Code of Ethics.</w:t>
+      </w:r>
+    </w:p>
+    <w:p>
+      <w:pPr>
+        <w:numPr>
+          <w:ilvl w:val="1"/>
+          <w:numId w:val="1011"/>
+        </w:numPr>
+      </w:pPr>
+      <w:r>
+        <w:t xml:space="preserve">If the authors answer , they should explain the special circumstances that require a deviation from the Code of Ethics.</w:t>
+      </w:r>
+    </w:p>
+    <w:p>
+      <w:pPr>
+        <w:numPr>
+          <w:ilvl w:val="1"/>
+          <w:numId w:val="1011"/>
+        </w:numPr>
+      </w:pPr>
+      <w:r>
+        <w:t xml:space="preserve">The authors should make sure to preserve anonymity (e.g., if there is a special consideration due to laws or regulations in their jurisdiction).</w:t>
+      </w:r>
+    </w:p>
+    <w:p>
+      <w:pPr>
+        <w:numPr>
+          <w:ilvl w:val="0"/>
+          <w:numId w:val="1001"/>
+        </w:numPr>
+      </w:pPr>
+      <w:r>
+        <w:rPr>
+          <w:b/>
+          <w:bCs/>
+        </w:rPr>
+        <w:t xml:space="preserve">Broader impacts</w:t>
+      </w:r>
+    </w:p>
+    <w:p>
+      <w:pPr>
+        <w:numPr>
+          <w:ilvl w:val="0"/>
+          <w:numId w:val="1001"/>
+        </w:numPr>
+      </w:pPr>
+      <w:r>
+        <w:t xml:space="preserve">Question: Does the paper discuss both potential positive societal impacts and negative societal impacts of the work performed?</w:t>
+      </w:r>
+    </w:p>
+    <w:p>
+      <w:pPr>
+        <w:numPr>
+          <w:ilvl w:val="0"/>
+          <w:numId w:val="1001"/>
+        </w:numPr>
+      </w:pPr>
+      <w:r>
+        <w:t xml:space="preserve">Answer:</w:t>
+      </w:r>
+    </w:p>
+    <w:p>
+      <w:pPr>
+        <w:numPr>
+          <w:ilvl w:val="0"/>
+          <w:numId w:val="1001"/>
+        </w:numPr>
+      </w:pPr>
+      <w:r>
+        <w:t xml:space="preserve">Justification: The Discussion and Limitations section discusses auditability benefits, action-redirection misuse, false confidence from narrow simulation, and corresponding validation and safety-monitoring needs.</w:t>
+      </w:r>
+    </w:p>
+    <w:p>
+      <w:pPr>
+        <w:numPr>
+          <w:ilvl w:val="0"/>
+          <w:numId w:val="1001"/>
+        </w:numPr>
+      </w:pPr>
+      <w:r>
+        <w:t xml:space="preserve">Guidelines:</w:t>
+      </w:r>
+    </w:p>
+    <w:p>
+      <w:pPr>
+        <w:numPr>
+          <w:ilvl w:val="1"/>
+          <w:numId w:val="1012"/>
+        </w:numPr>
+      </w:pPr>
+      <w:r>
+        <w:t xml:space="preserve">The answer means that there is no societal impact of the work performed.</w:t>
+      </w:r>
+    </w:p>
+    <w:p>
+      <w:pPr>
+        <w:numPr>
+          <w:ilvl w:val="1"/>
+          <w:numId w:val="1012"/>
+        </w:numPr>
+      </w:pPr>
+      <w:r>
+        <w:t xml:space="preserve">If the authors answer or , they should explain why their work has no societal impact or why the paper does not address societal impact.</w:t>
+      </w:r>
+    </w:p>
+    <w:p>
+      <w:pPr>
+        <w:numPr>
+          <w:ilvl w:val="1"/>
+          <w:numId w:val="1012"/>
+        </w:numPr>
+      </w:pPr>
+      <w:r>
+        <w:t xml:space="preserve">Examples of negative societal impacts include potential malicious or unintended uses (e.g., disinformation, generating fake profiles, surveillance), fairness considerations (e.g., deployment of technologies that could make decisions that unfairly impact specific groups), privacy considerations, and security considerations.</w:t>
+      </w:r>
+    </w:p>
+    <w:p>
+      <w:pPr>
+        <w:numPr>
+          <w:ilvl w:val="1"/>
+          <w:numId w:val="1012"/>
+        </w:numPr>
+      </w:pPr>
+      <w:r>
+        <w:t xml:space="preserve">The conference expects that many papers will be foundational research and not tied to particular applications, let alone deployments. However, if there is a direct path to any negative applications, the authors should point it out. For example, it is legitimate to point out that an improvement in the quality of generative models could be used to generate Deepfakes for disinformation. On the other hand, it is not needed to point out that a generic algorithm for optimizing neural networks could enable people to train models that generate Deepfakes faster.</w:t>
+      </w:r>
+    </w:p>
+    <w:p>
+      <w:pPr>
+        <w:numPr>
+          <w:ilvl w:val="1"/>
+          <w:numId w:val="1012"/>
+        </w:numPr>
+      </w:pPr>
+      <w:r>
+        <w:t xml:space="preserve">The authors should consider possible harms that could arise when the technology is being used as intended and functioning correctly, harms that could arise when the technology is being used as intended but gives incorrect results, and harms following from (intentional or unintentional) misuse of the technology.</w:t>
+      </w:r>
+    </w:p>
+    <w:p>
+      <w:pPr>
+        <w:numPr>
+          <w:ilvl w:val="1"/>
+          <w:numId w:val="1012"/>
+        </w:numPr>
+      </w:pPr>
+      <w:r>
+        <w:t xml:space="preserve">If there are negative societal impacts, the authors could also discuss possible mitigation strategies (e.g., gated release of models, providing defenses in addition to attacks, mechanisms for monitoring misuse, mechanisms to monitor how a system learns from feedback over time, improving the efficiency and accessibility of ML).</w:t>
+      </w:r>
+    </w:p>
+    <w:p>
+      <w:pPr>
+        <w:numPr>
+          <w:ilvl w:val="0"/>
+          <w:numId w:val="1001"/>
+        </w:numPr>
+      </w:pPr>
+      <w:r>
+        <w:rPr>
+          <w:b/>
+          <w:bCs/>
+        </w:rPr>
+        <w:t xml:space="preserve">Safeguards</w:t>
+      </w:r>
+    </w:p>
+    <w:p>
+      <w:pPr>
+        <w:numPr>
+          <w:ilvl w:val="0"/>
+          <w:numId w:val="1001"/>
+        </w:numPr>
+      </w:pPr>
+      <w:r>
+        <w:t xml:space="preserve">Question: Does the paper describe safeguards that have been put in place for responsible release of data or models that have a high risk for misuse (e.g., pre-trained language models, image generators, or scraped datasets)?</w:t>
+      </w:r>
+    </w:p>
+    <w:p>
+      <w:pPr>
+        <w:numPr>
+          <w:ilvl w:val="0"/>
+          <w:numId w:val="1001"/>
+        </w:numPr>
+      </w:pPr>
+      <w:r>
+        <w:t xml:space="preserve">Answer:</w:t>
+      </w:r>
+    </w:p>
+    <w:p>
+      <w:pPr>
+        <w:numPr>
+          <w:ilvl w:val="0"/>
+          <w:numId w:val="1001"/>
+        </w:numPr>
+      </w:pPr>
+      <w:r>
+        <w:t xml:space="preserve">Justification: This work does not release a new high-risk pretrained model or scraped dataset; it analyzes existing robot policies in simulation.</w:t>
+      </w:r>
+    </w:p>
+    <w:p>
+      <w:pPr>
+        <w:numPr>
+          <w:ilvl w:val="0"/>
+          <w:numId w:val="1001"/>
+        </w:numPr>
+      </w:pPr>
+      <w:r>
+        <w:t xml:space="preserve">Guidelines:</w:t>
+      </w:r>
+    </w:p>
+    <w:p>
+      <w:pPr>
+        <w:numPr>
+          <w:ilvl w:val="1"/>
+          <w:numId w:val="1013"/>
+        </w:numPr>
+      </w:pPr>
+      <w:r>
+        <w:t xml:space="preserve">The answer means that the paper poses no such risks.</w:t>
+      </w:r>
+    </w:p>
+    <w:p>
+      <w:pPr>
+        <w:numPr>
+          <w:ilvl w:val="1"/>
+          <w:numId w:val="1013"/>
+        </w:numPr>
+      </w:pPr>
+      <w:r>
+        <w:t xml:space="preserve">Released models that have a high risk for misuse or dual-use should be released with necessary safeguards to allow for controlled use of the model, for example by requiring that users adhere to usage guidelines or restrictions to access the model or implementing safety filters.</w:t>
+      </w:r>
+    </w:p>
+    <w:p>
+      <w:pPr>
+        <w:numPr>
+          <w:ilvl w:val="1"/>
+          <w:numId w:val="1013"/>
+        </w:numPr>
+      </w:pPr>
+      <w:r>
+        <w:t xml:space="preserve">Datasets that have been scraped from the Internet could pose safety risks. The authors should describe how they avoided releasing unsafe images.</w:t>
+      </w:r>
+    </w:p>
+    <w:p>
+      <w:pPr>
+        <w:numPr>
+          <w:ilvl w:val="1"/>
+          <w:numId w:val="1013"/>
+        </w:numPr>
+      </w:pPr>
+      <w:r>
+        <w:t xml:space="preserve">We recognize that providing effective safeguards is challenging, and many papers do not require this, but we encourage authors to take this into account and make a best faith effort.</w:t>
+      </w:r>
+    </w:p>
+    <w:p>
+      <w:pPr>
+        <w:numPr>
+          <w:ilvl w:val="0"/>
+          <w:numId w:val="1001"/>
+        </w:numPr>
+      </w:pPr>
+      <w:r>
+        <w:rPr>
+          <w:b/>
+          <w:bCs/>
+        </w:rPr>
+        <w:t xml:space="preserve">Licenses for existing assets</w:t>
+      </w:r>
+    </w:p>
+    <w:p>
+      <w:pPr>
+        <w:numPr>
+          <w:ilvl w:val="0"/>
+          <w:numId w:val="1001"/>
+        </w:numPr>
+      </w:pPr>
+      <w:r>
+        <w:t xml:space="preserve">Question: Are the creators or original owners of assets (e.g., code, data, models), used in the paper, properly credited and are the license and terms of use explicitly mentioned and properly respected?</w:t>
+      </w:r>
+    </w:p>
+    <w:p>
+      <w:pPr>
+        <w:numPr>
+          <w:ilvl w:val="0"/>
+          <w:numId w:val="1001"/>
+        </w:numPr>
+      </w:pPr>
+      <w:r>
+        <w:t xml:space="preserve">Answer:</w:t>
+      </w:r>
+    </w:p>
+    <w:p>
+      <w:pPr>
+        <w:numPr>
+          <w:ilvl w:val="0"/>
+          <w:numId w:val="1001"/>
+        </w:numPr>
+      </w:pPr>
+      <w:r>
+        <w:t xml:space="preserve">Justification: Existing assets are cited and exact source revisions are recorded, but an explicit license inventory for every upstream code and benchmark asset remains to be added before submission.</w:t>
+      </w:r>
+    </w:p>
+    <w:p>
+      <w:pPr>
+        <w:numPr>
+          <w:ilvl w:val="0"/>
+          <w:numId w:val="1001"/>
+        </w:numPr>
+      </w:pPr>
+      <w:r>
+        <w:t xml:space="preserve">Guidelines:</w:t>
+      </w:r>
+    </w:p>
+    <w:p>
+      <w:pPr>
+        <w:numPr>
+          <w:ilvl w:val="1"/>
+          <w:numId w:val="1014"/>
+        </w:numPr>
+      </w:pPr>
+      <w:r>
+        <w:t xml:space="preserve">The answer means that the paper does not use existing assets.</w:t>
+      </w:r>
+    </w:p>
+    <w:p>
+      <w:pPr>
+        <w:numPr>
+          <w:ilvl w:val="1"/>
+          <w:numId w:val="1014"/>
+        </w:numPr>
+      </w:pPr>
+      <w:r>
+        <w:t xml:space="preserve">The authors should cite the original paper that produced the code package or dataset.</w:t>
+      </w:r>
+    </w:p>
+    <w:p>
+      <w:pPr>
+        <w:numPr>
+          <w:ilvl w:val="1"/>
+          <w:numId w:val="1014"/>
+        </w:numPr>
+      </w:pPr>
+      <w:r>
+        <w:t xml:space="preserve">The authors should state which version of the asset is used and, if possible, include a URL.</w:t>
+      </w:r>
+    </w:p>
+    <w:p>
+      <w:pPr>
+        <w:numPr>
+          <w:ilvl w:val="1"/>
+          <w:numId w:val="1014"/>
+        </w:numPr>
+      </w:pPr>
+      <w:r>
+        <w:t xml:space="preserve">The name of the license (e.g., CC-BY 4.0) should be included for each asset.</w:t>
+      </w:r>
+    </w:p>
+    <w:p>
+      <w:pPr>
+        <w:numPr>
+          <w:ilvl w:val="1"/>
+          <w:numId w:val="1014"/>
+        </w:numPr>
+      </w:pPr>
+      <w:r>
+        <w:t xml:space="preserve">For scraped data from a particular source (e.g., website), the copyright and terms of service of that source should be provided.</w:t>
+      </w:r>
+    </w:p>
+    <w:p>
+      <w:pPr>
+        <w:numPr>
+          <w:ilvl w:val="1"/>
+          <w:numId w:val="1014"/>
+        </w:numPr>
+      </w:pPr>
+      <w:r>
+        <w:t xml:space="preserve">If assets are released, the license, copyright information, and terms of use in the package should be provided. For popular datasets,</w:t>
+      </w:r>
+      <w:r>
+        <w:t xml:space="preserve"> </w:t>
+      </w:r>
+      <w:hyperlink r:id="rId54">
+        <w:r>
+          <w:rPr>
+            <w:rStyle w:val="Hyperlink"/>
+          </w:rPr>
+          <w:t xml:space="preserve">paperswithcode.com/datasets</w:t>
+        </w:r>
+      </w:hyperlink>
+      <w:r>
+        <w:t xml:space="preserve"> </w:t>
+      </w:r>
+      <w:r>
+        <w:t xml:space="preserve">has curated licenses for some datasets. Their licensing guide can help determine the license of a dataset.</w:t>
+      </w:r>
+    </w:p>
+    <w:p>
+      <w:pPr>
+        <w:numPr>
+          <w:ilvl w:val="1"/>
+          <w:numId w:val="1014"/>
+        </w:numPr>
+      </w:pPr>
+      <w:r>
+        <w:t xml:space="preserve">For existing datasets that are re-packaged, both the original license and the license of the derived asset (if it has changed) should be provided.</w:t>
+      </w:r>
+    </w:p>
+    <w:p>
+      <w:pPr>
+        <w:numPr>
+          <w:ilvl w:val="1"/>
+          <w:numId w:val="1014"/>
+        </w:numPr>
+      </w:pPr>
+      <w:r>
+        <w:t xml:space="preserve">If this information is not available online, the authors are encouraged to reach out to the asset’s creators.</w:t>
+      </w:r>
+    </w:p>
+    <w:p>
+      <w:pPr>
+        <w:numPr>
+          <w:ilvl w:val="0"/>
+          <w:numId w:val="1001"/>
+        </w:numPr>
+      </w:pPr>
+      <w:r>
+        <w:rPr>
+          <w:b/>
+          <w:bCs/>
+        </w:rPr>
+        <w:t xml:space="preserve">New assets</w:t>
+      </w:r>
+    </w:p>
+    <w:p>
+      <w:pPr>
+        <w:numPr>
+          <w:ilvl w:val="0"/>
+          <w:numId w:val="1001"/>
+        </w:numPr>
+      </w:pPr>
+      <w:r>
+        <w:t xml:space="preserve">Question: Are new assets introduced in the paper well documented and is the documentation provided alongside the assets?</w:t>
+      </w:r>
+    </w:p>
+    <w:p>
+      <w:pPr>
+        <w:numPr>
+          <w:ilvl w:val="0"/>
+          <w:numId w:val="1001"/>
+        </w:numPr>
+      </w:pPr>
+      <w:r>
+        <w:t xml:space="preserve">Answer:</w:t>
+      </w:r>
+    </w:p>
+    <w:p>
+      <w:pPr>
+        <w:numPr>
+          <w:ilvl w:val="0"/>
+          <w:numId w:val="1001"/>
+        </w:numPr>
+      </w:pPr>
+      <w:r>
+        <w:t xml:space="preserve">Justification: New intervention code and result manifests are documented in the working artifact, but the anonymized release package and its final license are not yet attached to this draft.</w:t>
+      </w:r>
+    </w:p>
+    <w:p>
+      <w:pPr>
+        <w:numPr>
+          <w:ilvl w:val="0"/>
+          <w:numId w:val="1001"/>
+        </w:numPr>
+      </w:pPr>
+      <w:r>
+        <w:t xml:space="preserve">Guidelines:</w:t>
+      </w:r>
+    </w:p>
+    <w:p>
+      <w:pPr>
+        <w:numPr>
+          <w:ilvl w:val="1"/>
+          <w:numId w:val="1015"/>
+        </w:numPr>
+      </w:pPr>
+      <w:r>
+        <w:t xml:space="preserve">The answer means that the paper does not release new assets.</w:t>
+      </w:r>
+    </w:p>
+    <w:p>
+      <w:pPr>
+        <w:numPr>
+          <w:ilvl w:val="1"/>
+          <w:numId w:val="1015"/>
+        </w:numPr>
+      </w:pPr>
+      <w:r>
+        <w:t xml:space="preserve">Researchers should communicate the details of the dataset/code/model as part of their submissions via structured templates. This includes details about training, license, limitations, etc.</w:t>
+      </w:r>
+    </w:p>
+    <w:p>
+      <w:pPr>
+        <w:numPr>
+          <w:ilvl w:val="1"/>
+          <w:numId w:val="1015"/>
+        </w:numPr>
+      </w:pPr>
+      <w:r>
+        <w:t xml:space="preserve">The paper should discuss whether and how consent was obtained from people whose asset is used.</w:t>
+      </w:r>
+    </w:p>
+    <w:p>
+      <w:pPr>
+        <w:numPr>
+          <w:ilvl w:val="1"/>
+          <w:numId w:val="1015"/>
+        </w:numPr>
+      </w:pPr>
+      <w:r>
+        <w:t xml:space="preserve">At submission time, remember to anonymize your assets (if applicable). You can either create an anonymized URL or include an anonymized zip file.</w:t>
+      </w:r>
+    </w:p>
+    <w:p>
+      <w:pPr>
+        <w:numPr>
+          <w:ilvl w:val="0"/>
+          <w:numId w:val="1001"/>
+        </w:numPr>
+      </w:pPr>
+      <w:r>
+        <w:rPr>
+          <w:b/>
+          <w:bCs/>
+        </w:rPr>
+        <w:t xml:space="preserve">Crowdsourcing and research with human subjects</w:t>
+      </w:r>
+    </w:p>
+    <w:p>
+      <w:pPr>
+        <w:numPr>
+          <w:ilvl w:val="0"/>
+          <w:numId w:val="1001"/>
+        </w:numPr>
+      </w:pPr>
+      <w:r>
+        <w:t xml:space="preserve">Question: For crowdsourcing experiments and research with human subjects, does the paper include the full text of instructions given to participants and screenshots, if applicable, as well as details about compensation (if any)?</w:t>
+      </w:r>
+    </w:p>
+    <w:p>
+      <w:pPr>
+        <w:numPr>
+          <w:ilvl w:val="0"/>
+          <w:numId w:val="1001"/>
+        </w:numPr>
+      </w:pPr>
+      <w:r>
+        <w:t xml:space="preserve">Answer:</w:t>
+      </w:r>
+    </w:p>
+    <w:p>
+      <w:pPr>
+        <w:numPr>
+          <w:ilvl w:val="0"/>
+          <w:numId w:val="1001"/>
+        </w:numPr>
+      </w:pPr>
+      <w:r>
+        <w:t xml:space="preserve">Justification: The research contains no crowdsourcing and no human participants.</w:t>
+      </w:r>
+    </w:p>
+    <w:p>
+      <w:pPr>
+        <w:numPr>
+          <w:ilvl w:val="0"/>
+          <w:numId w:val="1001"/>
+        </w:numPr>
+      </w:pPr>
+      <w:r>
+        <w:t xml:space="preserve">Guidelines:</w:t>
+      </w:r>
+    </w:p>
+    <w:p>
+      <w:pPr>
+        <w:numPr>
+          <w:ilvl w:val="1"/>
+          <w:numId w:val="1016"/>
+        </w:numPr>
+      </w:pPr>
+      <w:r>
+        <w:t xml:space="preserve">The answer means that the paper does not involve crowdsourcing nor research with human subjects.</w:t>
+      </w:r>
+    </w:p>
+    <w:p>
+      <w:pPr>
+        <w:numPr>
+          <w:ilvl w:val="1"/>
+          <w:numId w:val="1016"/>
+        </w:numPr>
+      </w:pPr>
+      <w:r>
+        <w:t xml:space="preserve">Including this information in the supplemental material is fine, but if the main contribution of the paper involves human subjects, then as much detail as possible should be included in the main paper.</w:t>
+      </w:r>
+    </w:p>
+    <w:p>
+      <w:pPr>
+        <w:numPr>
+          <w:ilvl w:val="1"/>
+          <w:numId w:val="1016"/>
+        </w:numPr>
+      </w:pPr>
+      <w:r>
+        <w:t xml:space="preserve">According to the NeurIPS Code of Ethics, workers involved in data collection, curation, or other labor should be paid at least the minimum wage in the country of the data collector.</w:t>
+      </w:r>
+    </w:p>
+    <w:p>
+      <w:pPr>
+        <w:numPr>
+          <w:ilvl w:val="0"/>
+          <w:numId w:val="1001"/>
+        </w:numPr>
+      </w:pPr>
+      <w:r>
+        <w:rPr>
+          <w:b/>
+          <w:bCs/>
+        </w:rPr>
+        <w:t xml:space="preserve">Institutional review board (IRB) approvals or equivalent for research with human subjects</w:t>
+      </w:r>
+    </w:p>
+    <w:p>
+      <w:pPr>
+        <w:numPr>
+          <w:ilvl w:val="0"/>
+          <w:numId w:val="1001"/>
+        </w:numPr>
+      </w:pPr>
+      <w:r>
+        <w:t xml:space="preserve">Question: Does the paper describe potential risks incurred by study participants, whether such risks were disclosed to the subjects, and whether Institutional Review Board (IRB) approvals (or an equivalent approval/review based on the requirements of your country or institution) were obtained?</w:t>
+      </w:r>
+    </w:p>
+    <w:p>
+      <w:pPr>
+        <w:numPr>
+          <w:ilvl w:val="0"/>
+          <w:numId w:val="1001"/>
+        </w:numPr>
+      </w:pPr>
+      <w:r>
+        <w:t xml:space="preserve">Answer:</w:t>
+      </w:r>
+    </w:p>
+    <w:p>
+      <w:pPr>
+        <w:numPr>
+          <w:ilvl w:val="0"/>
+          <w:numId w:val="1001"/>
+        </w:numPr>
+      </w:pPr>
+      <w:r>
+        <w:t xml:space="preserve">Justification: The research contains no human-subject data collection or interaction.</w:t>
+      </w:r>
+    </w:p>
+    <w:p>
+      <w:pPr>
+        <w:numPr>
+          <w:ilvl w:val="0"/>
+          <w:numId w:val="1001"/>
+        </w:numPr>
+      </w:pPr>
+      <w:r>
+        <w:t xml:space="preserve">Guidelines:</w:t>
+      </w:r>
+    </w:p>
+    <w:p>
+      <w:pPr>
+        <w:numPr>
+          <w:ilvl w:val="1"/>
+          <w:numId w:val="1017"/>
+        </w:numPr>
+      </w:pPr>
+      <w:r>
+        <w:t xml:space="preserve">The answer means that the paper does not involve crowdsourcing nor research with human subjects.</w:t>
+      </w:r>
+    </w:p>
+    <w:p>
+      <w:pPr>
+        <w:numPr>
+          <w:ilvl w:val="1"/>
+          <w:numId w:val="1017"/>
+        </w:numPr>
+      </w:pPr>
+      <w:r>
+        <w:t xml:space="preserve">Depending on the country in which research is conducted, IRB approval (or equivalent) may be required for any human subjects research. If you obtained IRB approval, you should clearly state this in the paper.</w:t>
+      </w:r>
+    </w:p>
+    <w:p>
+      <w:pPr>
+        <w:numPr>
+          <w:ilvl w:val="1"/>
+          <w:numId w:val="1017"/>
+        </w:numPr>
+      </w:pPr>
+      <w:r>
+        <w:t xml:space="preserve">We recognize that the procedures for this may vary significantly between institutions and locations, and we expect authors to adhere to the NeurIPS Code of Ethics and the guidelines for their institution.</w:t>
+      </w:r>
+    </w:p>
+    <w:p>
+      <w:pPr>
+        <w:numPr>
+          <w:ilvl w:val="1"/>
+          <w:numId w:val="1017"/>
+        </w:numPr>
+      </w:pPr>
+      <w:r>
+        <w:t xml:space="preserve">For initial submissions, do not include any information that would break anonymity (if applicable), such as the institution conducting the review.</w:t>
+      </w:r>
+    </w:p>
+    <w:p>
+      <w:pPr>
+        <w:numPr>
+          <w:ilvl w:val="0"/>
+          <w:numId w:val="1001"/>
+        </w:numPr>
+      </w:pPr>
+      <w:r>
+        <w:rPr>
+          <w:b/>
+          <w:bCs/>
+        </w:rPr>
+        <w:t xml:space="preserve">Declaration of LLM usage</w:t>
+      </w:r>
+    </w:p>
+    <w:p>
+      <w:pPr>
+        <w:numPr>
+          <w:ilvl w:val="0"/>
+          <w:numId w:val="1001"/>
+        </w:numPr>
+      </w:pPr>
+      <w:r>
+        <w:t xml:space="preserve">Question: Does the paper describe the usage of LLMs if it is an important, original, or non-standard component of the core methods in this research? Note that if the LLM is used only for writing, editing, or formatting purposes and does</w:t>
+      </w:r>
+      <w:r>
+        <w:t xml:space="preserve"> </w:t>
+      </w:r>
+      <w:r>
+        <w:rPr>
+          <w:i/>
+          <w:iCs/>
+        </w:rPr>
+        <w:t xml:space="preserve">not</w:t>
+      </w:r>
+      <w:r>
+        <w:t xml:space="preserve"> </w:t>
+      </w:r>
+      <w:r>
+        <w:t xml:space="preserve">impact the core methodology, scientific rigor, or originality of the research, declaration is not required.</w:t>
+      </w:r>
+    </w:p>
+    <w:p>
+      <w:pPr>
+        <w:numPr>
+          <w:ilvl w:val="0"/>
+          <w:numId w:val="1001"/>
+        </w:numPr>
+      </w:pPr>
+      <w:r>
+        <w:t xml:space="preserve">Answer:</w:t>
+      </w:r>
+    </w:p>
+    <w:p>
+      <w:pPr>
+        <w:numPr>
+          <w:ilvl w:val="0"/>
+          <w:numId w:val="1001"/>
+        </w:numPr>
+      </w:pPr>
+      <w:r>
+        <w:t xml:space="preserve">Justification: Language models were used only for writing and formatting assistance, not as a component of the experimental method or scientific evaluation.</w:t>
+      </w:r>
+    </w:p>
+    <w:p>
+      <w:pPr>
+        <w:numPr>
+          <w:ilvl w:val="0"/>
+          <w:numId w:val="1001"/>
+        </w:numPr>
+      </w:pPr>
+      <w:r>
+        <w:t xml:space="preserve">Guidelines:</w:t>
+      </w:r>
+    </w:p>
+    <w:p>
+      <w:pPr>
+        <w:numPr>
+          <w:ilvl w:val="1"/>
+          <w:numId w:val="1018"/>
+        </w:numPr>
+      </w:pPr>
+      <w:r>
+        <w:t xml:space="preserve">The answer means that the core method development in this research does not involve LLMs as any important, original, or non-standard components.</w:t>
+      </w:r>
+    </w:p>
+    <w:p>
+      <w:pPr>
+        <w:numPr>
+          <w:ilvl w:val="1"/>
+          <w:numId w:val="1018"/>
+        </w:numPr>
+      </w:pPr>
+      <w:r>
+        <w:t xml:space="preserve">Please refer to our LLM policy in the NeurIPS handbook for what should or should not be described.</w:t>
+      </w:r>
+    </w:p>
+    <w:bookmarkStart w:id="103" w:name="refs"/>
+    <w:bookmarkStart w:id="56" w:name="ref-du2023unipi"/>
     <w:p>
       <w:pPr>
         <w:pStyle w:val="Bibliography"/>
@@ -6980,7 +8964,7 @@
       <w:r>
         <w:t xml:space="preserve"> </w:t>
       </w:r>
-      <w:hyperlink r:id="rId51">
+      <w:hyperlink r:id="rId55">
         <w:r>
           <w:rPr>
             <w:rStyle w:val="Hyperlink"/>
@@ -6992,8 +8976,8 @@
         <w:t xml:space="preserve">.</w:t>
       </w:r>
     </w:p>
-    <w:bookmarkEnd w:id="52"/>
-    <w:bookmarkStart w:id="54" w:name="ref-du2024videolanguage"/>
+    <w:bookmarkEnd w:id="56"/>
+    <w:bookmarkStart w:id="58" w:name="ref-du2024videolanguage"/>
     <w:p>
       <w:pPr>
         <w:pStyle w:val="Bibliography"/>
@@ -7023,7 +9007,7 @@
       <w:r>
         <w:t xml:space="preserve"> </w:t>
       </w:r>
-      <w:hyperlink r:id="rId53">
+      <w:hyperlink r:id="rId57">
         <w:r>
           <w:rPr>
             <w:rStyle w:val="Hyperlink"/>
@@ -7035,8 +9019,8 @@
         <w:t xml:space="preserve">.</w:t>
       </w:r>
     </w:p>
-    <w:bookmarkEnd w:id="54"/>
-    <w:bookmarkStart w:id="56" w:name="ref-ebert2018visualforesight"/>
+    <w:bookmarkEnd w:id="58"/>
+    <w:bookmarkStart w:id="60" w:name="ref-ebert2018visualforesight"/>
     <w:p>
       <w:pPr>
         <w:pStyle w:val="Bibliography"/>
@@ -7066,7 +9050,7 @@
       <w:r>
         <w:t xml:space="preserve"> </w:t>
       </w:r>
-      <w:hyperlink r:id="rId55">
+      <w:hyperlink r:id="rId59">
         <w:r>
           <w:rPr>
             <w:rStyle w:val="Hyperlink"/>
@@ -7078,8 +9062,8 @@
         <w:t xml:space="preserve">.</w:t>
       </w:r>
     </w:p>
-    <w:bookmarkEnd w:id="56"/>
-    <w:bookmarkStart w:id="58" w:name="ref-field2007clusterbootstrap"/>
+    <w:bookmarkEnd w:id="60"/>
+    <w:bookmarkStart w:id="62" w:name="ref-field2007clusterbootstrap"/>
     <w:p>
       <w:pPr>
         <w:pStyle w:val="Bibliography"/>
@@ -7112,7 +9096,7 @@
       <w:r>
         <w:t xml:space="preserve"> </w:t>
       </w:r>
-      <w:hyperlink r:id="rId57">
+      <w:hyperlink r:id="rId61">
         <w:r>
           <w:rPr>
             <w:rStyle w:val="Hyperlink"/>
@@ -7124,8 +9108,8 @@
         <w:t xml:space="preserve">.</w:t>
       </w:r>
     </w:p>
-    <w:bookmarkEnd w:id="58"/>
-    <w:bookmarkStart w:id="60" w:name="ref-goldowskydill2023pathpatching"/>
+    <w:bookmarkEnd w:id="62"/>
+    <w:bookmarkStart w:id="64" w:name="ref-goldowskydill2023pathpatching"/>
     <w:p>
       <w:pPr>
         <w:pStyle w:val="Bibliography"/>
@@ -7149,7 +9133,7 @@
       <w:r>
         <w:t xml:space="preserve"> </w:t>
       </w:r>
-      <w:hyperlink r:id="rId59">
+      <w:hyperlink r:id="rId63">
         <w:r>
           <w:rPr>
             <w:rStyle w:val="Hyperlink"/>
@@ -7161,8 +9145,8 @@
         <w:t xml:space="preserve">.</w:t>
       </w:r>
     </w:p>
-    <w:bookmarkEnd w:id="60"/>
-    <w:bookmarkStart w:id="62" w:name="ref-guo2024pad"/>
+    <w:bookmarkEnd w:id="64"/>
+    <w:bookmarkStart w:id="66" w:name="ref-guo2024pad"/>
     <w:p>
       <w:pPr>
         <w:pStyle w:val="Bibliography"/>
@@ -7195,7 +9179,7 @@
       <w:r>
         <w:t xml:space="preserve"> </w:t>
       </w:r>
-      <w:hyperlink r:id="rId61">
+      <w:hyperlink r:id="rId65">
         <w:r>
           <w:rPr>
             <w:rStyle w:val="Hyperlink"/>
@@ -7207,8 +9191,8 @@
         <w:t xml:space="preserve">.</w:t>
       </w:r>
     </w:p>
-    <w:bookmarkEnd w:id="62"/>
-    <w:bookmarkStart w:id="64" w:name="ref-hu2025vpp"/>
+    <w:bookmarkEnd w:id="66"/>
+    <w:bookmarkStart w:id="68" w:name="ref-hu2025vpp"/>
     <w:p>
       <w:pPr>
         <w:pStyle w:val="Bibliography"/>
@@ -7238,7 +9222,7 @@
       <w:r>
         <w:t xml:space="preserve"> </w:t>
       </w:r>
-      <w:hyperlink r:id="rId63">
+      <w:hyperlink r:id="rId67">
         <w:r>
           <w:rPr>
             <w:rStyle w:val="Hyperlink"/>
@@ -7250,8 +9234,8 @@
         <w:t xml:space="preserve">.</w:t>
       </w:r>
     </w:p>
-    <w:bookmarkEnd w:id="64"/>
-    <w:bookmarkStart w:id="66" w:name="ref-kim2026cosmospolicy"/>
+    <w:bookmarkEnd w:id="68"/>
+    <w:bookmarkStart w:id="70" w:name="ref-kim2026cosmospolicy"/>
     <w:p>
       <w:pPr>
         <w:pStyle w:val="Bibliography"/>
@@ -7287,7 +9271,7 @@
       <w:r>
         <w:t xml:space="preserve"> </w:t>
       </w:r>
-      <w:hyperlink r:id="rId65">
+      <w:hyperlink r:id="rId69">
         <w:r>
           <w:rPr>
             <w:rStyle w:val="Hyperlink"/>
@@ -7299,8 +9283,8 @@
         <w:t xml:space="preserve">.</w:t>
       </w:r>
     </w:p>
-    <w:bookmarkEnd w:id="66"/>
-    <w:bookmarkStart w:id="68" w:name="ref-lakens2017equivalence"/>
+    <w:bookmarkEnd w:id="70"/>
+    <w:bookmarkStart w:id="72" w:name="ref-lakens2017equivalence"/>
     <w:p>
       <w:pPr>
         <w:pStyle w:val="Bibliography"/>
@@ -7333,7 +9317,7 @@
       <w:r>
         <w:t xml:space="preserve"> </w:t>
       </w:r>
-      <w:hyperlink r:id="rId67">
+      <w:hyperlink r:id="rId71">
         <w:r>
           <w:rPr>
             <w:rStyle w:val="Hyperlink"/>
@@ -7345,8 +9329,8 @@
         <w:t xml:space="preserve">.</w:t>
       </w:r>
     </w:p>
-    <w:bookmarkEnd w:id="68"/>
-    <w:bookmarkStart w:id="70" w:name="ref-li2025uva"/>
+    <w:bookmarkEnd w:id="72"/>
+    <w:bookmarkStart w:id="74" w:name="ref-li2025uva"/>
     <w:p>
       <w:pPr>
         <w:pStyle w:val="Bibliography"/>
@@ -7370,7 +9354,7 @@
       <w:r>
         <w:t xml:space="preserve"> </w:t>
       </w:r>
-      <w:hyperlink r:id="rId69">
+      <w:hyperlink r:id="rId73">
         <w:r>
           <w:rPr>
             <w:rStyle w:val="Hyperlink"/>
@@ -7382,8 +9366,8 @@
         <w:t xml:space="preserve">.</w:t>
       </w:r>
     </w:p>
-    <w:bookmarkEnd w:id="70"/>
-    <w:bookmarkStart w:id="72" w:name="ref-liu2023libero"/>
+    <w:bookmarkEnd w:id="74"/>
+    <w:bookmarkStart w:id="76" w:name="ref-liu2023libero"/>
     <w:p>
       <w:pPr>
         <w:pStyle w:val="Bibliography"/>
@@ -7422,7 +9406,7 @@
       <w:r>
         <w:t xml:space="preserve"> </w:t>
       </w:r>
-      <w:hyperlink r:id="rId71">
+      <w:hyperlink r:id="rId75">
         <w:r>
           <w:rPr>
             <w:rStyle w:val="Hyperlink"/>
@@ -7434,8 +9418,8 @@
         <w:t xml:space="preserve">.</w:t>
       </w:r>
     </w:p>
-    <w:bookmarkEnd w:id="72"/>
-    <w:bookmarkStart w:id="74" w:name="ref-meng2022rome"/>
+    <w:bookmarkEnd w:id="76"/>
+    <w:bookmarkStart w:id="78" w:name="ref-meng2022rome"/>
     <w:p>
       <w:pPr>
         <w:pStyle w:val="Bibliography"/>
@@ -7477,7 +9461,7 @@
       <w:r>
         <w:t xml:space="preserve"> </w:t>
       </w:r>
-      <w:hyperlink r:id="rId73">
+      <w:hyperlink r:id="rId77">
         <w:r>
           <w:rPr>
             <w:rStyle w:val="Hyperlink"/>
@@ -7489,8 +9473,8 @@
         <w:t xml:space="preserve">.</w:t>
       </w:r>
     </w:p>
-    <w:bookmarkEnd w:id="74"/>
-    <w:bookmarkStart w:id="76" w:name="ref-nasiriany2024robocasa"/>
+    <w:bookmarkEnd w:id="78"/>
+    <w:bookmarkStart w:id="80" w:name="ref-nasiriany2024robocasa"/>
     <w:p>
       <w:pPr>
         <w:pStyle w:val="Bibliography"/>
@@ -7529,7 +9513,7 @@
       <w:r>
         <w:t xml:space="preserve"> </w:t>
       </w:r>
-      <w:hyperlink r:id="rId75">
+      <w:hyperlink r:id="rId79">
         <w:r>
           <w:rPr>
             <w:rStyle w:val="Hyperlink"/>
@@ -7541,8 +9525,8 @@
         <w:t xml:space="preserve">.</w:t>
       </w:r>
     </w:p>
-    <w:bookmarkEnd w:id="76"/>
-    <w:bookmarkStart w:id="78" w:name="ref-nvidia2026cosmos3"/>
+    <w:bookmarkEnd w:id="80"/>
+    <w:bookmarkStart w:id="82" w:name="ref-nvidia2026cosmos3"/>
     <w:p>
       <w:pPr>
         <w:pStyle w:val="Bibliography"/>
@@ -7587,7 +9571,7 @@
       <w:r>
         <w:t xml:space="preserve"> </w:t>
       </w:r>
-      <w:hyperlink r:id="rId77">
+      <w:hyperlink r:id="rId81">
         <w:r>
           <w:rPr>
             <w:rStyle w:val="Hyperlink"/>
@@ -7599,8 +9583,8 @@
         <w:t xml:space="preserve">.</w:t>
       </w:r>
     </w:p>
-    <w:bookmarkEnd w:id="78"/>
-    <w:bookmarkStart w:id="80" w:name="ref-nvidia2026cosmos3droid"/>
+    <w:bookmarkEnd w:id="82"/>
+    <w:bookmarkStart w:id="84" w:name="ref-nvidia2026cosmos3droid"/>
     <w:p>
       <w:pPr>
         <w:pStyle w:val="Bibliography"/>
@@ -7624,7 +9608,7 @@
       <w:r>
         <w:t xml:space="preserve"> </w:t>
       </w:r>
-      <w:hyperlink r:id="rId79">
+      <w:hyperlink r:id="rId83">
         <w:r>
           <w:rPr>
             <w:rStyle w:val="Hyperlink"/>
@@ -7636,8 +9620,8 @@
         <w:t xml:space="preserve">.</w:t>
       </w:r>
     </w:p>
-    <w:bookmarkEnd w:id="80"/>
-    <w:bookmarkStart w:id="82" w:name="ref-qiu2026agra"/>
+    <w:bookmarkEnd w:id="84"/>
+    <w:bookmarkStart w:id="86" w:name="ref-qiu2026agra"/>
     <w:p>
       <w:pPr>
         <w:pStyle w:val="Bibliography"/>
@@ -7661,7 +9645,7 @@
       <w:r>
         <w:t xml:space="preserve"> </w:t>
       </w:r>
-      <w:hyperlink r:id="rId81">
+      <w:hyperlink r:id="rId85">
         <w:r>
           <w:rPr>
             <w:rStyle w:val="Hyperlink"/>
@@ -7673,8 +9657,8 @@
         <w:t xml:space="preserve">.</w:t>
       </w:r>
     </w:p>
-    <w:bookmarkEnd w:id="82"/>
-    <w:bookmarkStart w:id="84" w:name="ref-vaidyanathan2026multiplemediators"/>
+    <w:bookmarkEnd w:id="86"/>
+    <w:bookmarkStart w:id="88" w:name="ref-vaidyanathan2026multiplemediators"/>
     <w:p>
       <w:pPr>
         <w:pStyle w:val="Bibliography"/>
@@ -7698,7 +9682,7 @@
       <w:r>
         <w:t xml:space="preserve"> </w:t>
       </w:r>
-      <w:hyperlink r:id="rId83">
+      <w:hyperlink r:id="rId87">
         <w:r>
           <w:rPr>
             <w:rStyle w:val="Hyperlink"/>
@@ -7710,8 +9694,8 @@
         <w:t xml:space="preserve">.</w:t>
       </w:r>
     </w:p>
-    <w:bookmarkEnd w:id="84"/>
-    <w:bookmarkStart w:id="86" w:name="ref-vig2020causalmediation"/>
+    <w:bookmarkEnd w:id="88"/>
+    <w:bookmarkStart w:id="90" w:name="ref-vig2020causalmediation"/>
     <w:p>
       <w:pPr>
         <w:pStyle w:val="Bibliography"/>
@@ -7744,7 +9728,7 @@
       <w:r>
         <w:t xml:space="preserve"> </w:t>
       </w:r>
-      <w:hyperlink r:id="rId85">
+      <w:hyperlink r:id="rId89">
         <w:r>
           <w:rPr>
             <w:rStyle w:val="Hyperlink"/>
@@ -7756,8 +9740,8 @@
         <w:t xml:space="preserve">.</w:t>
       </w:r>
     </w:p>
-    <w:bookmarkEnd w:id="86"/>
-    <w:bookmarkStart w:id="88" w:name="ref-yang2026robolab"/>
+    <w:bookmarkEnd w:id="90"/>
+    <w:bookmarkStart w:id="92" w:name="ref-yang2026robolab"/>
     <w:p>
       <w:pPr>
         <w:pStyle w:val="Bibliography"/>
@@ -7796,7 +9780,7 @@
       <w:r>
         <w:t xml:space="preserve"> </w:t>
       </w:r>
-      <w:hyperlink r:id="rId87">
+      <w:hyperlink r:id="rId91">
         <w:r>
           <w:rPr>
             <w:rStyle w:val="Hyperlink"/>
@@ -7808,8 +9792,8 @@
         <w:t xml:space="preserve">.</w:t>
       </w:r>
     </w:p>
-    <w:bookmarkEnd w:id="88"/>
-    <w:bookmarkStart w:id="90" w:name="ref-ye2026dreamzero"/>
+    <w:bookmarkEnd w:id="92"/>
+    <w:bookmarkStart w:id="94" w:name="ref-ye2026dreamzero"/>
     <w:p>
       <w:pPr>
         <w:pStyle w:val="Bibliography"/>
@@ -7833,7 +9817,7 @@
       <w:r>
         <w:t xml:space="preserve"> </w:t>
       </w:r>
-      <w:hyperlink r:id="rId89">
+      <w:hyperlink r:id="rId93">
         <w:r>
           <w:rPr>
             <w:rStyle w:val="Hyperlink"/>
@@ -7845,8 +9829,8 @@
         <w:t xml:space="preserve">.</w:t>
       </w:r>
     </w:p>
-    <w:bookmarkEnd w:id="90"/>
-    <w:bookmarkStart w:id="92" w:name="ref-yuan2026fastwam"/>
+    <w:bookmarkEnd w:id="94"/>
+    <w:bookmarkStart w:id="96" w:name="ref-yuan2026fastwam"/>
     <w:p>
       <w:pPr>
         <w:pStyle w:val="Bibliography"/>
@@ -7874,7 +9858,7 @@
       <w:r>
         <w:t xml:space="preserve"> </w:t>
       </w:r>
-      <w:hyperlink r:id="rId91">
+      <w:hyperlink r:id="rId95">
         <w:r>
           <w:rPr>
             <w:rStyle w:val="Hyperlink"/>
@@ -7886,8 +9870,8 @@
         <w:t xml:space="preserve">.</w:t>
       </w:r>
     </w:p>
-    <w:bookmarkEnd w:id="92"/>
-    <w:bookmarkStart w:id="94" w:name="ref-zhang2026rift"/>
+    <w:bookmarkEnd w:id="96"/>
+    <w:bookmarkStart w:id="98" w:name="ref-zhang2026rift"/>
     <w:p>
       <w:pPr>
         <w:pStyle w:val="Bibliography"/>
@@ -7939,7 +9923,7 @@
       <w:r>
         <w:t xml:space="preserve"> </w:t>
       </w:r>
-      <w:hyperlink r:id="rId93">
+      <w:hyperlink r:id="rId97">
         <w:r>
           <w:rPr>
             <w:rStyle w:val="Hyperlink"/>
@@ -7951,8 +9935,8 @@
         <w:t xml:space="preserve">.</w:t>
       </w:r>
     </w:p>
-    <w:bookmarkEnd w:id="94"/>
-    <w:bookmarkStart w:id="96" w:name="ref-zhang2024activationpatching"/>
+    <w:bookmarkEnd w:id="98"/>
+    <w:bookmarkStart w:id="100" w:name="ref-zhang2024activationpatching"/>
     <w:p>
       <w:pPr>
         <w:pStyle w:val="Bibliography"/>
@@ -7982,7 +9966,7 @@
       <w:r>
         <w:t xml:space="preserve"> </w:t>
       </w:r>
-      <w:hyperlink r:id="rId95">
+      <w:hyperlink r:id="rId99">
         <w:r>
           <w:rPr>
             <w:rStyle w:val="Hyperlink"/>
@@ -7994,8 +9978,8 @@
         <w:t xml:space="preserve">.</w:t>
       </w:r>
     </w:p>
-    <w:bookmarkEnd w:id="96"/>
-    <w:bookmarkStart w:id="98" w:name="ref-zhao2026fasterwam"/>
+    <w:bookmarkEnd w:id="100"/>
+    <w:bookmarkStart w:id="102" w:name="ref-zhao2026fasterwam"/>
     <w:p>
       <w:pPr>
         <w:pStyle w:val="Bibliography"/>
@@ -8026,7 +10010,7 @@
       <w:r>
         <w:t xml:space="preserve"> </w:t>
       </w:r>
-      <w:hyperlink r:id="rId97">
+      <w:hyperlink r:id="rId101">
         <w:r>
           <w:rPr>
             <w:rStyle w:val="Hyperlink"/>
@@ -8038,9 +10022,9 @@
         <w:t xml:space="preserve">.</w:t>
       </w:r>
     </w:p>
-    <w:bookmarkEnd w:id="98"/>
-    <w:bookmarkEnd w:id="99"/>
-    <w:bookmarkEnd w:id="100"/>
+    <w:bookmarkEnd w:id="102"/>
+    <w:bookmarkEnd w:id="103"/>
+    <w:bookmarkEnd w:id="104"/>
     <w:sectPr>
       <w:footnotePr>
         <w:numRestart w:val="eachSect"/>
@@ -8151,8 +10135,304 @@
       </w:pPr>
     </w:lvl>
   </w:abstractNum>
+  <w:abstractNum w:abstractNumId="99201">
+    <w:nsid w:val="00A99201"/>
+    <w:multiLevelType w:val="multilevel"/>
+    <w:lvl w:ilvl="0">
+      <w:start w:val="1"/>
+      <w:numFmt w:val="decimal"/>
+      <w:lvlText w:val="%1."/>
+      <w:lvlJc w:val="left"/>
+      <w:pPr>
+        <w:ind w:left="720" w:hanging="360"/>
+      </w:pPr>
+    </w:lvl>
+    <w:lvl w:ilvl="1">
+      <w:start w:val="1"/>
+      <w:numFmt w:val="lowerLetter"/>
+      <w:lvlText w:val="%2."/>
+      <w:lvlJc w:val="left"/>
+      <w:pPr>
+        <w:ind w:left="1440" w:hanging="360"/>
+      </w:pPr>
+    </w:lvl>
+    <w:lvl w:ilvl="2">
+      <w:start w:val="1"/>
+      <w:numFmt w:val="lowerRoman"/>
+      <w:lvlText w:val="%3."/>
+      <w:lvlJc w:val="left"/>
+      <w:pPr>
+        <w:ind w:left="2160" w:hanging="360"/>
+      </w:pPr>
+    </w:lvl>
+    <w:lvl w:ilvl="3">
+      <w:start w:val="1"/>
+      <w:numFmt w:val="decimal"/>
+      <w:lvlText w:val="%4."/>
+      <w:lvlJc w:val="left"/>
+      <w:pPr>
+        <w:ind w:left="2880" w:hanging="360"/>
+      </w:pPr>
+    </w:lvl>
+    <w:lvl w:ilvl="4">
+      <w:start w:val="1"/>
+      <w:numFmt w:val="lowerLetter"/>
+      <w:lvlText w:val="%5."/>
+      <w:lvlJc w:val="left"/>
+      <w:pPr>
+        <w:ind w:left="3600" w:hanging="360"/>
+      </w:pPr>
+    </w:lvl>
+    <w:lvl w:ilvl="5">
+      <w:start w:val="1"/>
+      <w:numFmt w:val="lowerRoman"/>
+      <w:lvlText w:val="%6."/>
+      <w:lvlJc w:val="left"/>
+      <w:pPr>
+        <w:ind w:left="4320" w:hanging="360"/>
+      </w:pPr>
+    </w:lvl>
+    <w:lvl w:ilvl="6">
+      <w:start w:val="1"/>
+      <w:numFmt w:val="decimal"/>
+      <w:lvlText w:val="%7."/>
+      <w:lvlJc w:val="left"/>
+      <w:pPr>
+        <w:ind w:left="5040" w:hanging="360"/>
+      </w:pPr>
+    </w:lvl>
+    <w:lvl w:ilvl="7">
+      <w:start w:val="1"/>
+      <w:numFmt w:val="lowerLetter"/>
+      <w:lvlText w:val="%8."/>
+      <w:lvlJc w:val="left"/>
+      <w:pPr>
+        <w:ind w:left="5760" w:hanging="360"/>
+      </w:pPr>
+    </w:lvl>
+    <w:lvl w:ilvl="8">
+      <w:start w:val="1"/>
+      <w:numFmt w:val="lowerRoman"/>
+      <w:lvlText w:val="%9."/>
+      <w:lvlJc w:val="left"/>
+      <w:pPr>
+        <w:ind w:left="6480" w:hanging="360"/>
+      </w:pPr>
+    </w:lvl>
+  </w:abstractNum>
+  <w:abstractNum w:abstractNumId="991">
+    <w:nsid w:val="0000A991"/>
+    <w:multiLevelType w:val="multilevel"/>
+    <w:lvl w:ilvl="0">
+      <w:numFmt w:val="bullet"/>
+      <w:lvlText w:val=""/>
+      <w:lvlJc w:val="left"/>
+      <w:pPr>
+        <w:ind w:left="720" w:hanging="360"/>
+      </w:pPr>
+      <w:rPr>
+        <w:rFonts w:ascii="Symbol" w:hAnsi="Symbol" w:cs="Symbol" w:hint="default"/>
+      </w:rPr>
+    </w:lvl>
+    <w:lvl w:ilvl="1">
+      <w:numFmt w:val="bullet"/>
+      <w:lvlText w:val="o"/>
+      <w:lvlJc w:val="left"/>
+      <w:pPr>
+        <w:ind w:left="1440" w:hanging="360"/>
+      </w:pPr>
+      <w:rPr>
+        <w:rFonts w:ascii="Courier New" w:hAnsi="Courier New" w:cs="Courier New" w:hint="default"/>
+      </w:rPr>
+    </w:lvl>
+    <w:lvl w:ilvl="2">
+      <w:numFmt w:val="bullet"/>
+      <w:lvlText w:val=""/>
+      <w:lvlJc w:val="left"/>
+      <w:pPr>
+        <w:ind w:left="2160" w:hanging="360"/>
+      </w:pPr>
+      <w:rPr>
+        <w:rFonts w:ascii="Wingdings" w:hAnsi="Wingdings" w:cs="Wingdings" w:hint="default"/>
+      </w:rPr>
+    </w:lvl>
+    <w:lvl w:ilvl="3">
+      <w:numFmt w:val="bullet"/>
+      <w:lvlText w:val=""/>
+      <w:lvlJc w:val="left"/>
+      <w:pPr>
+        <w:ind w:left="2880" w:hanging="360"/>
+      </w:pPr>
+      <w:rPr>
+        <w:rFonts w:ascii="Symbol" w:hAnsi="Symbol" w:cs="Symbol" w:hint="default"/>
+      </w:rPr>
+    </w:lvl>
+    <w:lvl w:ilvl="4">
+      <w:numFmt w:val="bullet"/>
+      <w:lvlText w:val="o"/>
+      <w:lvlJc w:val="left"/>
+      <w:pPr>
+        <w:ind w:left="3600" w:hanging="360"/>
+      </w:pPr>
+      <w:rPr>
+        <w:rFonts w:ascii="Courier New" w:hAnsi="Courier New" w:cs="Courier New" w:hint="default"/>
+      </w:rPr>
+    </w:lvl>
+    <w:lvl w:ilvl="5">
+      <w:numFmt w:val="bullet"/>
+      <w:lvlText w:val=""/>
+      <w:lvlJc w:val="left"/>
+      <w:pPr>
+        <w:ind w:left="4320" w:hanging="360"/>
+      </w:pPr>
+      <w:rPr>
+        <w:rFonts w:ascii="Wingdings" w:hAnsi="Wingdings" w:cs="Wingdings" w:hint="default"/>
+      </w:rPr>
+    </w:lvl>
+    <w:lvl w:ilvl="6">
+      <w:numFmt w:val="bullet"/>
+      <w:lvlText w:val=""/>
+      <w:lvlJc w:val="left"/>
+      <w:pPr>
+        <w:ind w:left="5040" w:hanging="360"/>
+      </w:pPr>
+      <w:rPr>
+        <w:rFonts w:ascii="Symbol" w:hAnsi="Symbol" w:cs="Symbol" w:hint="default"/>
+      </w:rPr>
+    </w:lvl>
+    <w:lvl w:ilvl="7">
+      <w:numFmt w:val="bullet"/>
+      <w:lvlText w:val="o"/>
+      <w:lvlJc w:val="left"/>
+      <w:pPr>
+        <w:ind w:left="5760" w:hanging="360"/>
+      </w:pPr>
+      <w:rPr>
+        <w:rFonts w:ascii="Courier New" w:hAnsi="Courier New" w:cs="Courier New" w:hint="default"/>
+      </w:rPr>
+    </w:lvl>
+    <w:lvl w:ilvl="8">
+      <w:numFmt w:val="bullet"/>
+      <w:lvlText w:val=""/>
+      <w:lvlJc w:val="left"/>
+      <w:pPr>
+        <w:ind w:left="6480" w:hanging="360"/>
+      </w:pPr>
+      <w:rPr>
+        <w:rFonts w:ascii="Wingdings" w:hAnsi="Wingdings" w:cs="Wingdings" w:hint="default"/>
+      </w:rPr>
+    </w:lvl>
+  </w:abstractNum>
   <w:num w:numId="1000">
     <w:abstractNumId w:val="990"/>
+  </w:num>
+  <w:num w:numId="1001">
+    <w:abstractNumId w:val="99201"/>
+    <w:lvlOverride w:ilvl="0">
+      <w:startOverride w:val="1"/>
+    </w:lvlOverride>
+    <w:lvlOverride w:ilvl="1">
+      <w:startOverride w:val="1"/>
+    </w:lvlOverride>
+    <w:lvlOverride w:ilvl="2">
+      <w:startOverride w:val="1"/>
+    </w:lvlOverride>
+    <w:lvlOverride w:ilvl="3">
+      <w:startOverride w:val="1"/>
+    </w:lvlOverride>
+    <w:lvlOverride w:ilvl="4">
+      <w:startOverride w:val="1"/>
+    </w:lvlOverride>
+    <w:lvlOverride w:ilvl="5">
+      <w:startOverride w:val="1"/>
+    </w:lvlOverride>
+    <w:lvlOverride w:ilvl="6">
+      <w:startOverride w:val="1"/>
+    </w:lvlOverride>
+    <w:lvlOverride w:ilvl="7">
+      <w:startOverride w:val="1"/>
+    </w:lvlOverride>
+    <w:lvlOverride w:ilvl="8">
+      <w:startOverride w:val="1"/>
+    </w:lvlOverride>
+  </w:num>
+  <w:num w:numId="1002">
+    <w:abstractNumId w:val="991"/>
+  </w:num>
+  <w:num w:numId="1003">
+    <w:abstractNumId w:val="991"/>
+  </w:num>
+  <w:num w:numId="1004">
+    <w:abstractNumId w:val="991"/>
+  </w:num>
+  <w:num w:numId="1005">
+    <w:abstractNumId w:val="991"/>
+  </w:num>
+  <w:num w:numId="1006">
+    <w:abstractNumId w:val="99201"/>
+    <w:lvlOverride w:ilvl="0">
+      <w:startOverride w:val="1"/>
+    </w:lvlOverride>
+    <w:lvlOverride w:ilvl="1">
+      <w:startOverride w:val="1"/>
+    </w:lvlOverride>
+    <w:lvlOverride w:ilvl="2">
+      <w:startOverride w:val="1"/>
+    </w:lvlOverride>
+    <w:lvlOverride w:ilvl="3">
+      <w:startOverride w:val="1"/>
+    </w:lvlOverride>
+    <w:lvlOverride w:ilvl="4">
+      <w:startOverride w:val="1"/>
+    </w:lvlOverride>
+    <w:lvlOverride w:ilvl="5">
+      <w:startOverride w:val="1"/>
+    </w:lvlOverride>
+    <w:lvlOverride w:ilvl="6">
+      <w:startOverride w:val="1"/>
+    </w:lvlOverride>
+    <w:lvlOverride w:ilvl="7">
+      <w:startOverride w:val="1"/>
+    </w:lvlOverride>
+    <w:lvlOverride w:ilvl="8">
+      <w:startOverride w:val="1"/>
+    </w:lvlOverride>
+  </w:num>
+  <w:num w:numId="1007">
+    <w:abstractNumId w:val="991"/>
+  </w:num>
+  <w:num w:numId="1008">
+    <w:abstractNumId w:val="991"/>
+  </w:num>
+  <w:num w:numId="1009">
+    <w:abstractNumId w:val="991"/>
+  </w:num>
+  <w:num w:numId="1010">
+    <w:abstractNumId w:val="991"/>
+  </w:num>
+  <w:num w:numId="1011">
+    <w:abstractNumId w:val="991"/>
+  </w:num>
+  <w:num w:numId="1012">
+    <w:abstractNumId w:val="991"/>
+  </w:num>
+  <w:num w:numId="1013">
+    <w:abstractNumId w:val="991"/>
+  </w:num>
+  <w:num w:numId="1014">
+    <w:abstractNumId w:val="991"/>
+  </w:num>
+  <w:num w:numId="1015">
+    <w:abstractNumId w:val="991"/>
+  </w:num>
+  <w:num w:numId="1016">
+    <w:abstractNumId w:val="991"/>
+  </w:num>
+  <w:num w:numId="1017">
+    <w:abstractNumId w:val="991"/>
+  </w:num>
+  <w:num w:numId="1018">
+    <w:abstractNumId w:val="991"/>
   </w:num>
 </w:numbering>
 </file>

</xml_diff>

<commit_message>
docs: remove advantage column
</commit_message>
<xml_diff>
--- a/output/imagined_futures_neurips2026.docx
+++ b/output/imagined_futures_neurips2026.docx
@@ -2215,7 +2215,7 @@
         <w:pageBreakBefore/>
       </w:pPr>
       <w:r>
-        <w:t xml:space="preserve">Method and controls on one scale. Each row reports donor-directed projection after inserting the named future: 0 is the self-future result and 1 is the paired donor behavior. Within each model–source–outcome block, bold marks the largest estimate, always the paired donor (ours). The rightmost column gives its paired advantage over the strongest available control; all five intervals exclude zero. Control projections are reconstructed within independent unit before bootstrapping.</w:t>
+        <w:t xml:space="preserve">Method and controls on one scale. Each row reports donor-directed projection after inserting the named future: 0 is the self-future result and 1 is the paired donor behavior. Within each model–source–outcome block, bold marks the largest estimate, always the paired donor (ours). The paired donor exceeds the strongest available control in all five comparisons. Control projections are reconstructed within independent unit before bootstrapping.</w:t>
       </w:r>
     </w:p>
     <w:tbl>
@@ -2224,15 +2224,14 @@
         <w:tblW w:type="auto" w:w="0"/>
         <w:tblLayout w:type="fixed"/>
         <w:tblLook w:firstRow="1" w:lastRow="0" w:firstColumn="0" w:lastColumn="0" w:noHBand="0" w:noVBand="0" w:val="0020"/>
-        <w:tblCaption w:val="Method and controls on one scale. Each row reports donor-directed projection after inserting the named future: 0 is the self-future result and 1 is the paired donor behavior. Within each model–source–outcome block, bold marks the largest estimate, always the paired donor (ours). The rightmost column gives its paired advantage over the strongest available control; all five intervals exclude zero. Control projections are reconstructed within independent unit before bootstrapping."/>
+        <w:tblCaption w:val="Method and controls on one scale. Each row reports donor-directed projection after inserting the named future: 0 is the self-future result and 1 is the paired donor behavior. Within each model–source–outcome block, bold marks the largest estimate, always the paired donor (ours). The paired donor exceeds the strongest available control in all five comparisons. Control projections are reconstructed within independent unit before bootstrapping."/>
       </w:tblPr>
       <w:tblGrid>
-        <w:gridCol w:w="1320"/>
-        <w:gridCol w:w="1320"/>
-        <w:gridCol w:w="1320"/>
-        <w:gridCol w:w="1320"/>
-        <w:gridCol w:w="1320"/>
-        <w:gridCol w:w="1320"/>
+        <w:gridCol w:w="1584"/>
+        <w:gridCol w:w="1584"/>
+        <w:gridCol w:w="1584"/>
+        <w:gridCol w:w="1584"/>
+        <w:gridCol w:w="1584"/>
       </w:tblGrid>
       <w:tr>
         <w:trPr>
@@ -2241,7 +2240,7 @@
         </w:trPr>
         <w:tc>
           <w:tcPr>
-            <w:tcW w:type="dxa" w:w="1368"/>
+            <w:tcW w:type="dxa" w:w="1584"/>
           </w:tcPr>
           <w:p>
             <w:pPr>
@@ -2251,9 +2250,27 @@
             </w:pPr>
             <w:r>
               <w:rPr>
-                <w:sz w:val="15"/>
+                <w:sz w:val="16"/>
               </w:rPr>
               <w:t xml:space="preserve">Model</w:t>
+            </w:r>
+          </w:p>
+        </w:tc>
+        <w:tc>
+          <w:tcPr>
+            <w:tcW w:type="dxa" w:w="1224"/>
+          </w:tcPr>
+          <w:p>
+            <w:pPr>
+              <w:pStyle w:val="Compact"/>
+              <w:spacing w:before="0" w:after="0" w:line="240" w:lineRule="auto"/>
+              <w:jc w:val="left"/>
+            </w:pPr>
+            <w:r>
+              <w:rPr>
+                <w:sz w:val="16"/>
+              </w:rPr>
+              <w:t xml:space="preserve">Source</w:t>
             </w:r>
           </w:p>
         </w:tc>
@@ -2269,25 +2286,7 @@
             </w:pPr>
             <w:r>
               <w:rPr>
-                <w:sz w:val="15"/>
-              </w:rPr>
-              <w:t xml:space="preserve">Source</w:t>
-            </w:r>
-          </w:p>
-        </w:tc>
-        <w:tc>
-          <w:tcPr>
-            <w:tcW w:type="dxa" w:w="936"/>
-          </w:tcPr>
-          <w:p>
-            <w:pPr>
-              <w:pStyle w:val="Compact"/>
-              <w:spacing w:before="0" w:after="0" w:line="240" w:lineRule="auto"/>
-              <w:jc w:val="left"/>
-            </w:pPr>
-            <w:r>
-              <w:rPr>
-                <w:sz w:val="15"/>
+                <w:sz w:val="16"/>
               </w:rPr>
               <w:t xml:space="preserve">Outcome</w:t>
             </w:r>
@@ -2295,7 +2294,7 @@
         </w:tc>
         <w:tc>
           <w:tcPr>
-            <w:tcW w:type="dxa" w:w="1584"/>
+            <w:tcW w:type="dxa" w:w="1944"/>
           </w:tcPr>
           <w:p>
             <w:pPr>
@@ -2305,7 +2304,7 @@
             </w:pPr>
             <w:r>
               <w:rPr>
-                <w:sz w:val="15"/>
+                <w:sz w:val="16"/>
               </w:rPr>
               <w:t xml:space="preserve">Future inserted</w:t>
             </w:r>
@@ -2313,7 +2312,7 @@
         </w:tc>
         <w:tc>
           <w:tcPr>
-            <w:tcW w:type="dxa" w:w="2088"/>
+            <w:tcW w:type="dxa" w:w="3528"/>
           </w:tcPr>
           <w:p>
             <w:pPr>
@@ -2323,27 +2322,9 @@
             </w:pPr>
             <w:r>
               <w:rPr>
-                <w:sz w:val="15"/>
+                <w:sz w:val="16"/>
               </w:rPr>
               <w:t xml:space="preserve">Projection [95% CI]</w:t>
-            </w:r>
-          </w:p>
-        </w:tc>
-        <w:tc>
-          <w:tcPr>
-            <w:tcW w:type="dxa" w:w="2304"/>
-          </w:tcPr>
-          <w:p>
-            <w:pPr>
-              <w:pStyle w:val="Compact"/>
-              <w:spacing w:before="0" w:after="0" w:line="240" w:lineRule="auto"/>
-              <w:jc w:val="left"/>
-            </w:pPr>
-            <w:r>
-              <w:rPr>
-                <w:sz w:val="15"/>
-              </w:rPr>
-              <w:t xml:space="preserve">Best-control advantage [95% CI]</w:t>
             </w:r>
           </w:p>
         </w:tc>
@@ -2354,7 +2335,7 @@
         </w:trPr>
         <w:tc>
           <w:tcPr>
-            <w:tcW w:type="dxa" w:w="1368"/>
+            <w:tcW w:type="dxa" w:w="1584"/>
           </w:tcPr>
           <w:p>
             <w:pPr>
@@ -2364,9 +2345,27 @@
             </w:pPr>
             <w:r>
               <w:rPr>
-                <w:sz w:val="15"/>
+                <w:sz w:val="16"/>
               </w:rPr>
               <w:t xml:space="preserve">Cosmos 3</w:t>
+            </w:r>
+          </w:p>
+        </w:tc>
+        <w:tc>
+          <w:tcPr>
+            <w:tcW w:type="dxa" w:w="1224"/>
+          </w:tcPr>
+          <w:p>
+            <w:pPr>
+              <w:pStyle w:val="Compact"/>
+              <w:spacing w:before="0" w:after="0" w:line="240" w:lineRule="auto"/>
+              <w:jc w:val="left"/>
+            </w:pPr>
+            <w:r>
+              <w:rPr>
+                <w:sz w:val="16"/>
+              </w:rPr>
+              <w:t xml:space="preserve">Predicted</w:t>
             </w:r>
           </w:p>
         </w:tc>
@@ -2382,25 +2381,7 @@
             </w:pPr>
             <w:r>
               <w:rPr>
-                <w:sz w:val="15"/>
-              </w:rPr>
-              <w:t xml:space="preserve">Predicted</w:t>
-            </w:r>
-          </w:p>
-        </w:tc>
-        <w:tc>
-          <w:tcPr>
-            <w:tcW w:type="dxa" w:w="936"/>
-          </w:tcPr>
-          <w:p>
-            <w:pPr>
-              <w:pStyle w:val="Compact"/>
-              <w:spacing w:before="0" w:after="0" w:line="240" w:lineRule="auto"/>
-              <w:jc w:val="left"/>
-            </w:pPr>
-            <w:r>
-              <w:rPr>
-                <w:sz w:val="15"/>
+                <w:sz w:val="16"/>
               </w:rPr>
               <w:t xml:space="preserve">Action</w:t>
             </w:r>
@@ -2408,7 +2389,7 @@
         </w:tc>
         <w:tc>
           <w:tcPr>
-            <w:tcW w:type="dxa" w:w="1584"/>
+            <w:tcW w:type="dxa" w:w="1944"/>
           </w:tcPr>
           <w:p>
             <w:pPr>
@@ -2418,7 +2399,7 @@
             </w:pPr>
             <w:r>
               <w:rPr>
-                <w:sz w:val="15"/>
+                <w:sz w:val="16"/>
               </w:rPr>
               <w:t xml:space="preserve">Self</w:t>
             </w:r>
@@ -2426,7 +2407,7 @@
         </w:tc>
         <w:tc>
           <w:tcPr>
-            <w:tcW w:type="dxa" w:w="2088"/>
+            <w:tcW w:type="dxa" w:w="3528"/>
           </w:tcPr>
           <w:p>
             <w:pPr>
@@ -2436,27 +2417,9 @@
             </w:pPr>
             <w:r>
               <w:rPr>
-                <w:sz w:val="15"/>
+                <w:sz w:val="16"/>
               </w:rPr>
               <w:t xml:space="preserve">0.000 (reference)</w:t>
-            </w:r>
-          </w:p>
-        </w:tc>
-        <w:tc>
-          <w:tcPr>
-            <w:tcW w:type="dxa" w:w="2304"/>
-          </w:tcPr>
-          <w:p>
-            <w:pPr>
-              <w:pStyle w:val="Compact"/>
-              <w:spacing w:before="0" w:after="0" w:line="240" w:lineRule="auto"/>
-              <w:jc w:val="left"/>
-            </w:pPr>
-            <w:r>
-              <w:rPr>
-                <w:sz w:val="15"/>
-              </w:rPr>
-              <w:t xml:space="preserve">—</w:t>
             </w:r>
           </w:p>
         </w:tc>
@@ -2467,7 +2430,7 @@
         </w:trPr>
         <w:tc>
           <w:tcPr>
-            <w:tcW w:type="dxa" w:w="1368"/>
+            <w:tcW w:type="dxa" w:w="1584"/>
           </w:tcPr>
           <w:p>
             <w:pPr>
@@ -2477,9 +2440,27 @@
             </w:pPr>
             <w:r>
               <w:rPr>
-                <w:sz w:val="15"/>
+                <w:sz w:val="16"/>
               </w:rPr>
               <w:t xml:space="preserve">Cosmos 3</w:t>
+            </w:r>
+          </w:p>
+        </w:tc>
+        <w:tc>
+          <w:tcPr>
+            <w:tcW w:type="dxa" w:w="1224"/>
+          </w:tcPr>
+          <w:p>
+            <w:pPr>
+              <w:pStyle w:val="Compact"/>
+              <w:spacing w:before="0" w:after="0" w:line="240" w:lineRule="auto"/>
+              <w:jc w:val="left"/>
+            </w:pPr>
+            <w:r>
+              <w:rPr>
+                <w:sz w:val="16"/>
+              </w:rPr>
+              <w:t xml:space="preserve">Predicted</w:t>
             </w:r>
           </w:p>
         </w:tc>
@@ -2495,25 +2476,7 @@
             </w:pPr>
             <w:r>
               <w:rPr>
-                <w:sz w:val="15"/>
-              </w:rPr>
-              <w:t xml:space="preserve">Predicted</w:t>
-            </w:r>
-          </w:p>
-        </w:tc>
-        <w:tc>
-          <w:tcPr>
-            <w:tcW w:type="dxa" w:w="936"/>
-          </w:tcPr>
-          <w:p>
-            <w:pPr>
-              <w:pStyle w:val="Compact"/>
-              <w:spacing w:before="0" w:after="0" w:line="240" w:lineRule="auto"/>
-              <w:jc w:val="left"/>
-            </w:pPr>
-            <w:r>
-              <w:rPr>
-                <w:sz w:val="15"/>
+                <w:sz w:val="16"/>
               </w:rPr>
               <w:t xml:space="preserve">Action</w:t>
             </w:r>
@@ -2521,7 +2484,7 @@
         </w:tc>
         <w:tc>
           <w:tcPr>
-            <w:tcW w:type="dxa" w:w="1584"/>
+            <w:tcW w:type="dxa" w:w="1944"/>
           </w:tcPr>
           <w:p>
             <w:pPr>
@@ -2531,7 +2494,7 @@
             </w:pPr>
             <w:r>
               <w:rPr>
-                <w:sz w:val="15"/>
+                <w:sz w:val="16"/>
               </w:rPr>
               <w:t xml:space="preserve">Natural control</w:t>
             </w:r>
@@ -2539,7 +2502,7 @@
         </w:tc>
         <w:tc>
           <w:tcPr>
-            <w:tcW w:type="dxa" w:w="2088"/>
+            <w:tcW w:type="dxa" w:w="3528"/>
           </w:tcPr>
           <w:p>
             <w:pPr>
@@ -2549,27 +2512,9 @@
             </w:pPr>
             <w:r>
               <w:rPr>
-                <w:sz w:val="15"/>
+                <w:sz w:val="16"/>
               </w:rPr>
               <w:t xml:space="preserve">0.559 [0.465, 0.651]</w:t>
-            </w:r>
-          </w:p>
-        </w:tc>
-        <w:tc>
-          <w:tcPr>
-            <w:tcW w:type="dxa" w:w="2304"/>
-          </w:tcPr>
-          <w:p>
-            <w:pPr>
-              <w:pStyle w:val="Compact"/>
-              <w:spacing w:before="0" w:after="0" w:line="240" w:lineRule="auto"/>
-              <w:jc w:val="left"/>
-            </w:pPr>
-            <w:r>
-              <w:rPr>
-                <w:sz w:val="15"/>
-              </w:rPr>
-              <w:t xml:space="preserve">—</w:t>
             </w:r>
           </w:p>
         </w:tc>
@@ -2580,7 +2525,7 @@
         </w:trPr>
         <w:tc>
           <w:tcPr>
-            <w:tcW w:type="dxa" w:w="1368"/>
+            <w:tcW w:type="dxa" w:w="1584"/>
           </w:tcPr>
           <w:p>
             <w:pPr>
@@ -2590,9 +2535,27 @@
             </w:pPr>
             <w:r>
               <w:rPr>
-                <w:sz w:val="15"/>
+                <w:sz w:val="16"/>
               </w:rPr>
               <w:t xml:space="preserve">Cosmos 3</w:t>
+            </w:r>
+          </w:p>
+        </w:tc>
+        <w:tc>
+          <w:tcPr>
+            <w:tcW w:type="dxa" w:w="1224"/>
+          </w:tcPr>
+          <w:p>
+            <w:pPr>
+              <w:pStyle w:val="Compact"/>
+              <w:spacing w:before="0" w:after="0" w:line="240" w:lineRule="auto"/>
+              <w:jc w:val="left"/>
+            </w:pPr>
+            <w:r>
+              <w:rPr>
+                <w:sz w:val="16"/>
+              </w:rPr>
+              <w:t xml:space="preserve">Predicted</w:t>
             </w:r>
           </w:p>
         </w:tc>
@@ -2608,25 +2571,7 @@
             </w:pPr>
             <w:r>
               <w:rPr>
-                <w:sz w:val="15"/>
-              </w:rPr>
-              <w:t xml:space="preserve">Predicted</w:t>
-            </w:r>
-          </w:p>
-        </w:tc>
-        <w:tc>
-          <w:tcPr>
-            <w:tcW w:type="dxa" w:w="936"/>
-          </w:tcPr>
-          <w:p>
-            <w:pPr>
-              <w:pStyle w:val="Compact"/>
-              <w:spacing w:before="0" w:after="0" w:line="240" w:lineRule="auto"/>
-              <w:jc w:val="left"/>
-            </w:pPr>
-            <w:r>
-              <w:rPr>
-                <w:sz w:val="15"/>
+                <w:sz w:val="16"/>
               </w:rPr>
               <w:t xml:space="preserve">Action</w:t>
             </w:r>
@@ -2634,7 +2579,7 @@
         </w:tc>
         <w:tc>
           <w:tcPr>
-            <w:tcW w:type="dxa" w:w="1584"/>
+            <w:tcW w:type="dxa" w:w="1944"/>
           </w:tcPr>
           <w:p>
             <w:pPr>
@@ -2646,7 +2591,7 @@
               <w:rPr>
                 <w:b/>
                 <w:bCs/>
-                <w:sz w:val="15"/>
+                <w:sz w:val="16"/>
               </w:rPr>
               <w:t xml:space="preserve">Paired donor (ours)</w:t>
             </w:r>
@@ -2654,7 +2599,7 @@
         </w:tc>
         <w:tc>
           <w:tcPr>
-            <w:tcW w:type="dxa" w:w="2088"/>
+            <w:tcW w:type="dxa" w:w="3528"/>
           </w:tcPr>
           <w:p>
             <w:pPr>
@@ -2666,29 +2611,9 @@
               <w:rPr>
                 <w:b/>
                 <w:bCs/>
-                <w:sz w:val="15"/>
+                <w:sz w:val="16"/>
               </w:rPr>
               <w:t xml:space="preserve">0.992 [0.972, 1.010]</w:t>
-            </w:r>
-          </w:p>
-        </w:tc>
-        <w:tc>
-          <w:tcPr>
-            <w:tcW w:type="dxa" w:w="2304"/>
-          </w:tcPr>
-          <w:p>
-            <w:pPr>
-              <w:pStyle w:val="Compact"/>
-              <w:spacing w:before="0" w:after="0" w:line="240" w:lineRule="auto"/>
-              <w:jc w:val="left"/>
-            </w:pPr>
-            <w:r>
-              <w:rPr>
-                <w:b/>
-                <w:bCs/>
-                <w:sz w:val="15"/>
-              </w:rPr>
-              <w:t xml:space="preserve">0.433 [0.332, 0.538]</w:t>
             </w:r>
           </w:p>
         </w:tc>
@@ -2699,7 +2624,7 @@
         </w:trPr>
         <w:tc>
           <w:tcPr>
-            <w:tcW w:type="dxa" w:w="1368"/>
+            <w:tcW w:type="dxa" w:w="1584"/>
           </w:tcPr>
           <w:p>
             <w:pPr>
@@ -2709,9 +2634,27 @@
             </w:pPr>
             <w:r>
               <w:rPr>
-                <w:sz w:val="15"/>
+                <w:sz w:val="16"/>
               </w:rPr>
               <w:t xml:space="preserve">Cosmos 3</w:t>
+            </w:r>
+          </w:p>
+        </w:tc>
+        <w:tc>
+          <w:tcPr>
+            <w:tcW w:type="dxa" w:w="1224"/>
+          </w:tcPr>
+          <w:p>
+            <w:pPr>
+              <w:pStyle w:val="Compact"/>
+              <w:spacing w:before="0" w:after="0" w:line="240" w:lineRule="auto"/>
+              <w:jc w:val="left"/>
+            </w:pPr>
+            <w:r>
+              <w:rPr>
+                <w:sz w:val="16"/>
+              </w:rPr>
+              <w:t xml:space="preserve">Executed</w:t>
             </w:r>
           </w:p>
         </w:tc>
@@ -2727,25 +2670,7 @@
             </w:pPr>
             <w:r>
               <w:rPr>
-                <w:sz w:val="15"/>
-              </w:rPr>
-              <w:t xml:space="preserve">Executed</w:t>
-            </w:r>
-          </w:p>
-        </w:tc>
-        <w:tc>
-          <w:tcPr>
-            <w:tcW w:type="dxa" w:w="936"/>
-          </w:tcPr>
-          <w:p>
-            <w:pPr>
-              <w:pStyle w:val="Compact"/>
-              <w:spacing w:before="0" w:after="0" w:line="240" w:lineRule="auto"/>
-              <w:jc w:val="left"/>
-            </w:pPr>
-            <w:r>
-              <w:rPr>
-                <w:sz w:val="15"/>
+                <w:sz w:val="16"/>
               </w:rPr>
               <w:t xml:space="preserve">Action</w:t>
             </w:r>
@@ -2753,7 +2678,7 @@
         </w:tc>
         <w:tc>
           <w:tcPr>
-            <w:tcW w:type="dxa" w:w="1584"/>
+            <w:tcW w:type="dxa" w:w="1944"/>
           </w:tcPr>
           <w:p>
             <w:pPr>
@@ -2763,7 +2688,7 @@
             </w:pPr>
             <w:r>
               <w:rPr>
-                <w:sz w:val="15"/>
+                <w:sz w:val="16"/>
               </w:rPr>
               <w:t xml:space="preserve">Self</w:t>
             </w:r>
@@ -2771,7 +2696,7 @@
         </w:tc>
         <w:tc>
           <w:tcPr>
-            <w:tcW w:type="dxa" w:w="2088"/>
+            <w:tcW w:type="dxa" w:w="3528"/>
           </w:tcPr>
           <w:p>
             <w:pPr>
@@ -2781,27 +2706,9 @@
             </w:pPr>
             <w:r>
               <w:rPr>
-                <w:sz w:val="15"/>
+                <w:sz w:val="16"/>
               </w:rPr>
               <w:t xml:space="preserve">0.000 (reference)</w:t>
-            </w:r>
-          </w:p>
-        </w:tc>
-        <w:tc>
-          <w:tcPr>
-            <w:tcW w:type="dxa" w:w="2304"/>
-          </w:tcPr>
-          <w:p>
-            <w:pPr>
-              <w:pStyle w:val="Compact"/>
-              <w:spacing w:before="0" w:after="0" w:line="240" w:lineRule="auto"/>
-              <w:jc w:val="left"/>
-            </w:pPr>
-            <w:r>
-              <w:rPr>
-                <w:sz w:val="15"/>
-              </w:rPr>
-              <w:t xml:space="preserve">—</w:t>
             </w:r>
           </w:p>
         </w:tc>
@@ -2812,7 +2719,7 @@
         </w:trPr>
         <w:tc>
           <w:tcPr>
-            <w:tcW w:type="dxa" w:w="1368"/>
+            <w:tcW w:type="dxa" w:w="1584"/>
           </w:tcPr>
           <w:p>
             <w:pPr>
@@ -2822,9 +2729,27 @@
             </w:pPr>
             <w:r>
               <w:rPr>
-                <w:sz w:val="15"/>
+                <w:sz w:val="16"/>
               </w:rPr>
               <w:t xml:space="preserve">Cosmos 3</w:t>
+            </w:r>
+          </w:p>
+        </w:tc>
+        <w:tc>
+          <w:tcPr>
+            <w:tcW w:type="dxa" w:w="1224"/>
+          </w:tcPr>
+          <w:p>
+            <w:pPr>
+              <w:pStyle w:val="Compact"/>
+              <w:spacing w:before="0" w:after="0" w:line="240" w:lineRule="auto"/>
+              <w:jc w:val="left"/>
+            </w:pPr>
+            <w:r>
+              <w:rPr>
+                <w:sz w:val="16"/>
+              </w:rPr>
+              <w:t xml:space="preserve">Executed</w:t>
             </w:r>
           </w:p>
         </w:tc>
@@ -2840,25 +2765,7 @@
             </w:pPr>
             <w:r>
               <w:rPr>
-                <w:sz w:val="15"/>
-              </w:rPr>
-              <w:t xml:space="preserve">Executed</w:t>
-            </w:r>
-          </w:p>
-        </w:tc>
-        <w:tc>
-          <w:tcPr>
-            <w:tcW w:type="dxa" w:w="936"/>
-          </w:tcPr>
-          <w:p>
-            <w:pPr>
-              <w:pStyle w:val="Compact"/>
-              <w:spacing w:before="0" w:after="0" w:line="240" w:lineRule="auto"/>
-              <w:jc w:val="left"/>
-            </w:pPr>
-            <w:r>
-              <w:rPr>
-                <w:sz w:val="15"/>
+                <w:sz w:val="16"/>
               </w:rPr>
               <w:t xml:space="preserve">Action</w:t>
             </w:r>
@@ -2866,7 +2773,7 @@
         </w:tc>
         <w:tc>
           <w:tcPr>
-            <w:tcW w:type="dxa" w:w="1584"/>
+            <w:tcW w:type="dxa" w:w="1944"/>
           </w:tcPr>
           <w:p>
             <w:pPr>
@@ -2876,7 +2783,7 @@
             </w:pPr>
             <w:r>
               <w:rPr>
-                <w:sz w:val="15"/>
+                <w:sz w:val="16"/>
               </w:rPr>
               <w:t xml:space="preserve">Matched Gaussian</w:t>
             </w:r>
@@ -2884,7 +2791,7 @@
         </w:tc>
         <w:tc>
           <w:tcPr>
-            <w:tcW w:type="dxa" w:w="2088"/>
+            <w:tcW w:type="dxa" w:w="3528"/>
           </w:tcPr>
           <w:p>
             <w:pPr>
@@ -2894,27 +2801,9 @@
             </w:pPr>
             <w:r>
               <w:rPr>
-                <w:sz w:val="15"/>
+                <w:sz w:val="16"/>
               </w:rPr>
               <w:t xml:space="preserve">0.041 [0.003, 0.076]</w:t>
-            </w:r>
-          </w:p>
-        </w:tc>
-        <w:tc>
-          <w:tcPr>
-            <w:tcW w:type="dxa" w:w="2304"/>
-          </w:tcPr>
-          <w:p>
-            <w:pPr>
-              <w:pStyle w:val="Compact"/>
-              <w:spacing w:before="0" w:after="0" w:line="240" w:lineRule="auto"/>
-              <w:jc w:val="left"/>
-            </w:pPr>
-            <w:r>
-              <w:rPr>
-                <w:sz w:val="15"/>
-              </w:rPr>
-              <w:t xml:space="preserve">—</w:t>
             </w:r>
           </w:p>
         </w:tc>
@@ -2925,7 +2814,7 @@
         </w:trPr>
         <w:tc>
           <w:tcPr>
-            <w:tcW w:type="dxa" w:w="1368"/>
+            <w:tcW w:type="dxa" w:w="1584"/>
           </w:tcPr>
           <w:p>
             <w:pPr>
@@ -2935,9 +2824,27 @@
             </w:pPr>
             <w:r>
               <w:rPr>
-                <w:sz w:val="15"/>
+                <w:sz w:val="16"/>
               </w:rPr>
               <w:t xml:space="preserve">Cosmos 3</w:t>
+            </w:r>
+          </w:p>
+        </w:tc>
+        <w:tc>
+          <w:tcPr>
+            <w:tcW w:type="dxa" w:w="1224"/>
+          </w:tcPr>
+          <w:p>
+            <w:pPr>
+              <w:pStyle w:val="Compact"/>
+              <w:spacing w:before="0" w:after="0" w:line="240" w:lineRule="auto"/>
+              <w:jc w:val="left"/>
+            </w:pPr>
+            <w:r>
+              <w:rPr>
+                <w:sz w:val="16"/>
+              </w:rPr>
+              <w:t xml:space="preserve">Executed</w:t>
             </w:r>
           </w:p>
         </w:tc>
@@ -2953,25 +2860,7 @@
             </w:pPr>
             <w:r>
               <w:rPr>
-                <w:sz w:val="15"/>
-              </w:rPr>
-              <w:t xml:space="preserve">Executed</w:t>
-            </w:r>
-          </w:p>
-        </w:tc>
-        <w:tc>
-          <w:tcPr>
-            <w:tcW w:type="dxa" w:w="936"/>
-          </w:tcPr>
-          <w:p>
-            <w:pPr>
-              <w:pStyle w:val="Compact"/>
-              <w:spacing w:before="0" w:after="0" w:line="240" w:lineRule="auto"/>
-              <w:jc w:val="left"/>
-            </w:pPr>
-            <w:r>
-              <w:rPr>
-                <w:sz w:val="15"/>
+                <w:sz w:val="16"/>
               </w:rPr>
               <w:t xml:space="preserve">Action</w:t>
             </w:r>
@@ -2979,7 +2868,7 @@
         </w:tc>
         <w:tc>
           <w:tcPr>
-            <w:tcW w:type="dxa" w:w="1584"/>
+            <w:tcW w:type="dxa" w:w="1944"/>
           </w:tcPr>
           <w:p>
             <w:pPr>
@@ -2989,7 +2878,7 @@
             </w:pPr>
             <w:r>
               <w:rPr>
-                <w:sz w:val="15"/>
+                <w:sz w:val="16"/>
               </w:rPr>
               <w:t xml:space="preserve">Natural control</w:t>
             </w:r>
@@ -2997,7 +2886,7 @@
         </w:tc>
         <w:tc>
           <w:tcPr>
-            <w:tcW w:type="dxa" w:w="2088"/>
+            <w:tcW w:type="dxa" w:w="3528"/>
           </w:tcPr>
           <w:p>
             <w:pPr>
@@ -3007,27 +2896,9 @@
             </w:pPr>
             <w:r>
               <w:rPr>
-                <w:sz w:val="15"/>
+                <w:sz w:val="16"/>
               </w:rPr>
               <w:t xml:space="preserve">0.591 [0.491, 0.687]</w:t>
-            </w:r>
-          </w:p>
-        </w:tc>
-        <w:tc>
-          <w:tcPr>
-            <w:tcW w:type="dxa" w:w="2304"/>
-          </w:tcPr>
-          <w:p>
-            <w:pPr>
-              <w:pStyle w:val="Compact"/>
-              <w:spacing w:before="0" w:after="0" w:line="240" w:lineRule="auto"/>
-              <w:jc w:val="left"/>
-            </w:pPr>
-            <w:r>
-              <w:rPr>
-                <w:sz w:val="15"/>
-              </w:rPr>
-              <w:t xml:space="preserve">—</w:t>
             </w:r>
           </w:p>
         </w:tc>
@@ -3038,7 +2909,7 @@
         </w:trPr>
         <w:tc>
           <w:tcPr>
-            <w:tcW w:type="dxa" w:w="1368"/>
+            <w:tcW w:type="dxa" w:w="1584"/>
           </w:tcPr>
           <w:p>
             <w:pPr>
@@ -3048,9 +2919,27 @@
             </w:pPr>
             <w:r>
               <w:rPr>
-                <w:sz w:val="15"/>
+                <w:sz w:val="16"/>
               </w:rPr>
               <w:t xml:space="preserve">Cosmos 3</w:t>
+            </w:r>
+          </w:p>
+        </w:tc>
+        <w:tc>
+          <w:tcPr>
+            <w:tcW w:type="dxa" w:w="1224"/>
+          </w:tcPr>
+          <w:p>
+            <w:pPr>
+              <w:pStyle w:val="Compact"/>
+              <w:spacing w:before="0" w:after="0" w:line="240" w:lineRule="auto"/>
+              <w:jc w:val="left"/>
+            </w:pPr>
+            <w:r>
+              <w:rPr>
+                <w:sz w:val="16"/>
+              </w:rPr>
+              <w:t xml:space="preserve">Executed</w:t>
             </w:r>
           </w:p>
         </w:tc>
@@ -3066,25 +2955,7 @@
             </w:pPr>
             <w:r>
               <w:rPr>
-                <w:sz w:val="15"/>
-              </w:rPr>
-              <w:t xml:space="preserve">Executed</w:t>
-            </w:r>
-          </w:p>
-        </w:tc>
-        <w:tc>
-          <w:tcPr>
-            <w:tcW w:type="dxa" w:w="936"/>
-          </w:tcPr>
-          <w:p>
-            <w:pPr>
-              <w:pStyle w:val="Compact"/>
-              <w:spacing w:before="0" w:after="0" w:line="240" w:lineRule="auto"/>
-              <w:jc w:val="left"/>
-            </w:pPr>
-            <w:r>
-              <w:rPr>
-                <w:sz w:val="15"/>
+                <w:sz w:val="16"/>
               </w:rPr>
               <w:t xml:space="preserve">Action</w:t>
             </w:r>
@@ -3092,7 +2963,7 @@
         </w:tc>
         <w:tc>
           <w:tcPr>
-            <w:tcW w:type="dxa" w:w="1584"/>
+            <w:tcW w:type="dxa" w:w="1944"/>
           </w:tcPr>
           <w:p>
             <w:pPr>
@@ -3104,7 +2975,7 @@
               <w:rPr>
                 <w:b/>
                 <w:bCs/>
-                <w:sz w:val="15"/>
+                <w:sz w:val="16"/>
               </w:rPr>
               <w:t xml:space="preserve">Paired donor (ours)</w:t>
             </w:r>
@@ -3112,7 +2983,7 @@
         </w:tc>
         <w:tc>
           <w:tcPr>
-            <w:tcW w:type="dxa" w:w="2088"/>
+            <w:tcW w:type="dxa" w:w="3528"/>
           </w:tcPr>
           <w:p>
             <w:pPr>
@@ -3124,29 +2995,9 @@
               <w:rPr>
                 <w:b/>
                 <w:bCs/>
-                <w:sz w:val="15"/>
+                <w:sz w:val="16"/>
               </w:rPr>
               <w:t xml:space="preserve">0.983 [0.890, 1.064]</w:t>
-            </w:r>
-          </w:p>
-        </w:tc>
-        <w:tc>
-          <w:tcPr>
-            <w:tcW w:type="dxa" w:w="2304"/>
-          </w:tcPr>
-          <w:p>
-            <w:pPr>
-              <w:pStyle w:val="Compact"/>
-              <w:spacing w:before="0" w:after="0" w:line="240" w:lineRule="auto"/>
-              <w:jc w:val="left"/>
-            </w:pPr>
-            <w:r>
-              <w:rPr>
-                <w:b/>
-                <w:bCs/>
-                <w:sz w:val="15"/>
-              </w:rPr>
-              <w:t xml:space="preserve">0.391 [0.246, 0.533]</w:t>
             </w:r>
           </w:p>
         </w:tc>
@@ -3157,7 +3008,7 @@
         </w:trPr>
         <w:tc>
           <w:tcPr>
-            <w:tcW w:type="dxa" w:w="1368"/>
+            <w:tcW w:type="dxa" w:w="1584"/>
           </w:tcPr>
           <w:p>
             <w:pPr>
@@ -3167,9 +3018,27 @@
             </w:pPr>
             <w:r>
               <w:rPr>
-                <w:sz w:val="15"/>
+                <w:sz w:val="16"/>
               </w:rPr>
               <w:t xml:space="preserve">Cosmos 3</w:t>
+            </w:r>
+          </w:p>
+        </w:tc>
+        <w:tc>
+          <w:tcPr>
+            <w:tcW w:type="dxa" w:w="1224"/>
+          </w:tcPr>
+          <w:p>
+            <w:pPr>
+              <w:pStyle w:val="Compact"/>
+              <w:spacing w:before="0" w:after="0" w:line="240" w:lineRule="auto"/>
+              <w:jc w:val="left"/>
+            </w:pPr>
+            <w:r>
+              <w:rPr>
+                <w:sz w:val="16"/>
+              </w:rPr>
+              <w:t xml:space="preserve">Executed</w:t>
             </w:r>
           </w:p>
         </w:tc>
@@ -3185,25 +3054,7 @@
             </w:pPr>
             <w:r>
               <w:rPr>
-                <w:sz w:val="15"/>
-              </w:rPr>
-              <w:t xml:space="preserve">Executed</w:t>
-            </w:r>
-          </w:p>
-        </w:tc>
-        <w:tc>
-          <w:tcPr>
-            <w:tcW w:type="dxa" w:w="936"/>
-          </w:tcPr>
-          <w:p>
-            <w:pPr>
-              <w:pStyle w:val="Compact"/>
-              <w:spacing w:before="0" w:after="0" w:line="240" w:lineRule="auto"/>
-              <w:jc w:val="left"/>
-            </w:pPr>
-            <w:r>
-              <w:rPr>
-                <w:sz w:val="15"/>
+                <w:sz w:val="16"/>
               </w:rPr>
               <w:t xml:space="preserve">Endpoint</w:t>
             </w:r>
@@ -3211,7 +3062,7 @@
         </w:tc>
         <w:tc>
           <w:tcPr>
-            <w:tcW w:type="dxa" w:w="1584"/>
+            <w:tcW w:type="dxa" w:w="1944"/>
           </w:tcPr>
           <w:p>
             <w:pPr>
@@ -3221,7 +3072,7 @@
             </w:pPr>
             <w:r>
               <w:rPr>
-                <w:sz w:val="15"/>
+                <w:sz w:val="16"/>
               </w:rPr>
               <w:t xml:space="preserve">Self</w:t>
             </w:r>
@@ -3229,7 +3080,7 @@
         </w:tc>
         <w:tc>
           <w:tcPr>
-            <w:tcW w:type="dxa" w:w="2088"/>
+            <w:tcW w:type="dxa" w:w="3528"/>
           </w:tcPr>
           <w:p>
             <w:pPr>
@@ -3239,27 +3090,9 @@
             </w:pPr>
             <w:r>
               <w:rPr>
-                <w:sz w:val="15"/>
+                <w:sz w:val="16"/>
               </w:rPr>
               <w:t xml:space="preserve">0.000 (reference)</w:t>
-            </w:r>
-          </w:p>
-        </w:tc>
-        <w:tc>
-          <w:tcPr>
-            <w:tcW w:type="dxa" w:w="2304"/>
-          </w:tcPr>
-          <w:p>
-            <w:pPr>
-              <w:pStyle w:val="Compact"/>
-              <w:spacing w:before="0" w:after="0" w:line="240" w:lineRule="auto"/>
-              <w:jc w:val="left"/>
-            </w:pPr>
-            <w:r>
-              <w:rPr>
-                <w:sz w:val="15"/>
-              </w:rPr>
-              <w:t xml:space="preserve">—</w:t>
             </w:r>
           </w:p>
         </w:tc>
@@ -3270,7 +3103,7 @@
         </w:trPr>
         <w:tc>
           <w:tcPr>
-            <w:tcW w:type="dxa" w:w="1368"/>
+            <w:tcW w:type="dxa" w:w="1584"/>
           </w:tcPr>
           <w:p>
             <w:pPr>
@@ -3280,9 +3113,27 @@
             </w:pPr>
             <w:r>
               <w:rPr>
-                <w:sz w:val="15"/>
+                <w:sz w:val="16"/>
               </w:rPr>
               <w:t xml:space="preserve">Cosmos 3</w:t>
+            </w:r>
+          </w:p>
+        </w:tc>
+        <w:tc>
+          <w:tcPr>
+            <w:tcW w:type="dxa" w:w="1224"/>
+          </w:tcPr>
+          <w:p>
+            <w:pPr>
+              <w:pStyle w:val="Compact"/>
+              <w:spacing w:before="0" w:after="0" w:line="240" w:lineRule="auto"/>
+              <w:jc w:val="left"/>
+            </w:pPr>
+            <w:r>
+              <w:rPr>
+                <w:sz w:val="16"/>
+              </w:rPr>
+              <w:t xml:space="preserve">Executed</w:t>
             </w:r>
           </w:p>
         </w:tc>
@@ -3298,25 +3149,7 @@
             </w:pPr>
             <w:r>
               <w:rPr>
-                <w:sz w:val="15"/>
-              </w:rPr>
-              <w:t xml:space="preserve">Executed</w:t>
-            </w:r>
-          </w:p>
-        </w:tc>
-        <w:tc>
-          <w:tcPr>
-            <w:tcW w:type="dxa" w:w="936"/>
-          </w:tcPr>
-          <w:p>
-            <w:pPr>
-              <w:pStyle w:val="Compact"/>
-              <w:spacing w:before="0" w:after="0" w:line="240" w:lineRule="auto"/>
-              <w:jc w:val="left"/>
-            </w:pPr>
-            <w:r>
-              <w:rPr>
-                <w:sz w:val="15"/>
+                <w:sz w:val="16"/>
               </w:rPr>
               <w:t xml:space="preserve">Endpoint</w:t>
             </w:r>
@@ -3324,7 +3157,7 @@
         </w:tc>
         <w:tc>
           <w:tcPr>
-            <w:tcW w:type="dxa" w:w="1584"/>
+            <w:tcW w:type="dxa" w:w="1944"/>
           </w:tcPr>
           <w:p>
             <w:pPr>
@@ -3336,7 +3169,7 @@
               <w:rPr>
                 <w:b/>
                 <w:bCs/>
-                <w:sz w:val="15"/>
+                <w:sz w:val="16"/>
               </w:rPr>
               <w:t xml:space="preserve">Paired donor (ours)</w:t>
             </w:r>
@@ -3344,7 +3177,7 @@
         </w:tc>
         <w:tc>
           <w:tcPr>
-            <w:tcW w:type="dxa" w:w="2088"/>
+            <w:tcW w:type="dxa" w:w="3528"/>
           </w:tcPr>
           <w:p>
             <w:pPr>
@@ -3356,27 +3189,7 @@
               <w:rPr>
                 <w:b/>
                 <w:bCs/>
-                <w:sz w:val="15"/>
-              </w:rPr>
-              <w:t xml:space="preserve">1.003 [0.950, 1.050]</w:t>
-            </w:r>
-          </w:p>
-        </w:tc>
-        <w:tc>
-          <w:tcPr>
-            <w:tcW w:type="dxa" w:w="2304"/>
-          </w:tcPr>
-          <w:p>
-            <w:pPr>
-              <w:pStyle w:val="Compact"/>
-              <w:spacing w:before="0" w:after="0" w:line="240" w:lineRule="auto"/>
-              <w:jc w:val="left"/>
-            </w:pPr>
-            <w:r>
-              <w:rPr>
-                <w:b/>
-                <w:bCs/>
-                <w:sz w:val="15"/>
+                <w:sz w:val="16"/>
               </w:rPr>
               <w:t xml:space="preserve">1.003 [0.950, 1.050]</w:t>
             </w:r>
@@ -3389,7 +3202,7 @@
         </w:trPr>
         <w:tc>
           <w:tcPr>
-            <w:tcW w:type="dxa" w:w="1368"/>
+            <w:tcW w:type="dxa" w:w="1584"/>
           </w:tcPr>
           <w:p>
             <w:pPr>
@@ -3399,9 +3212,27 @@
             </w:pPr>
             <w:r>
               <w:rPr>
-                <w:sz w:val="15"/>
+                <w:sz w:val="16"/>
               </w:rPr>
               <w:t xml:space="preserve">Cosmos Policy</w:t>
+            </w:r>
+          </w:p>
+        </w:tc>
+        <w:tc>
+          <w:tcPr>
+            <w:tcW w:type="dxa" w:w="1224"/>
+          </w:tcPr>
+          <w:p>
+            <w:pPr>
+              <w:pStyle w:val="Compact"/>
+              <w:spacing w:before="0" w:after="0" w:line="240" w:lineRule="auto"/>
+              <w:jc w:val="left"/>
+            </w:pPr>
+            <w:r>
+              <w:rPr>
+                <w:sz w:val="16"/>
+              </w:rPr>
+              <w:t xml:space="preserve">Predicted</w:t>
             </w:r>
           </w:p>
         </w:tc>
@@ -3417,25 +3248,7 @@
             </w:pPr>
             <w:r>
               <w:rPr>
-                <w:sz w:val="15"/>
-              </w:rPr>
-              <w:t xml:space="preserve">Predicted</w:t>
-            </w:r>
-          </w:p>
-        </w:tc>
-        <w:tc>
-          <w:tcPr>
-            <w:tcW w:type="dxa" w:w="936"/>
-          </w:tcPr>
-          <w:p>
-            <w:pPr>
-              <w:pStyle w:val="Compact"/>
-              <w:spacing w:before="0" w:after="0" w:line="240" w:lineRule="auto"/>
-              <w:jc w:val="left"/>
-            </w:pPr>
-            <w:r>
-              <w:rPr>
-                <w:sz w:val="15"/>
+                <w:sz w:val="16"/>
               </w:rPr>
               <w:t xml:space="preserve">Action</w:t>
             </w:r>
@@ -3443,7 +3256,7 @@
         </w:tc>
         <w:tc>
           <w:tcPr>
-            <w:tcW w:type="dxa" w:w="1584"/>
+            <w:tcW w:type="dxa" w:w="1944"/>
           </w:tcPr>
           <w:p>
             <w:pPr>
@@ -3453,7 +3266,7 @@
             </w:pPr>
             <w:r>
               <w:rPr>
-                <w:sz w:val="15"/>
+                <w:sz w:val="16"/>
               </w:rPr>
               <w:t xml:space="preserve">Self</w:t>
             </w:r>
@@ -3461,7 +3274,7 @@
         </w:tc>
         <w:tc>
           <w:tcPr>
-            <w:tcW w:type="dxa" w:w="2088"/>
+            <w:tcW w:type="dxa" w:w="3528"/>
           </w:tcPr>
           <w:p>
             <w:pPr>
@@ -3471,27 +3284,9 @@
             </w:pPr>
             <w:r>
               <w:rPr>
-                <w:sz w:val="15"/>
+                <w:sz w:val="16"/>
               </w:rPr>
               <w:t xml:space="preserve">0.000 (reference)</w:t>
-            </w:r>
-          </w:p>
-        </w:tc>
-        <w:tc>
-          <w:tcPr>
-            <w:tcW w:type="dxa" w:w="2304"/>
-          </w:tcPr>
-          <w:p>
-            <w:pPr>
-              <w:pStyle w:val="Compact"/>
-              <w:spacing w:before="0" w:after="0" w:line="240" w:lineRule="auto"/>
-              <w:jc w:val="left"/>
-            </w:pPr>
-            <w:r>
-              <w:rPr>
-                <w:sz w:val="15"/>
-              </w:rPr>
-              <w:t xml:space="preserve">—</w:t>
             </w:r>
           </w:p>
         </w:tc>
@@ -3502,7 +3297,7 @@
         </w:trPr>
         <w:tc>
           <w:tcPr>
-            <w:tcW w:type="dxa" w:w="1368"/>
+            <w:tcW w:type="dxa" w:w="1584"/>
           </w:tcPr>
           <w:p>
             <w:pPr>
@@ -3512,9 +3307,27 @@
             </w:pPr>
             <w:r>
               <w:rPr>
-                <w:sz w:val="15"/>
+                <w:sz w:val="16"/>
               </w:rPr>
               <w:t xml:space="preserve">Cosmos Policy</w:t>
+            </w:r>
+          </w:p>
+        </w:tc>
+        <w:tc>
+          <w:tcPr>
+            <w:tcW w:type="dxa" w:w="1224"/>
+          </w:tcPr>
+          <w:p>
+            <w:pPr>
+              <w:pStyle w:val="Compact"/>
+              <w:spacing w:before="0" w:after="0" w:line="240" w:lineRule="auto"/>
+              <w:jc w:val="left"/>
+            </w:pPr>
+            <w:r>
+              <w:rPr>
+                <w:sz w:val="16"/>
+              </w:rPr>
+              <w:t xml:space="preserve">Predicted</w:t>
             </w:r>
           </w:p>
         </w:tc>
@@ -3530,25 +3343,7 @@
             </w:pPr>
             <w:r>
               <w:rPr>
-                <w:sz w:val="15"/>
-              </w:rPr>
-              <w:t xml:space="preserve">Predicted</w:t>
-            </w:r>
-          </w:p>
-        </w:tc>
-        <w:tc>
-          <w:tcPr>
-            <w:tcW w:type="dxa" w:w="936"/>
-          </w:tcPr>
-          <w:p>
-            <w:pPr>
-              <w:pStyle w:val="Compact"/>
-              <w:spacing w:before="0" w:after="0" w:line="240" w:lineRule="auto"/>
-              <w:jc w:val="left"/>
-            </w:pPr>
-            <w:r>
-              <w:rPr>
-                <w:sz w:val="15"/>
+                <w:sz w:val="16"/>
               </w:rPr>
               <w:t xml:space="preserve">Action</w:t>
             </w:r>
@@ -3556,7 +3351,7 @@
         </w:tc>
         <w:tc>
           <w:tcPr>
-            <w:tcW w:type="dxa" w:w="1584"/>
+            <w:tcW w:type="dxa" w:w="1944"/>
           </w:tcPr>
           <w:p>
             <w:pPr>
@@ -3566,7 +3361,7 @@
             </w:pPr>
             <w:r>
               <w:rPr>
-                <w:sz w:val="15"/>
+                <w:sz w:val="16"/>
               </w:rPr>
               <w:t xml:space="preserve">Matched Gaussian</w:t>
             </w:r>
@@ -3574,7 +3369,7 @@
         </w:tc>
         <w:tc>
           <w:tcPr>
-            <w:tcW w:type="dxa" w:w="2088"/>
+            <w:tcW w:type="dxa" w:w="3528"/>
           </w:tcPr>
           <w:p>
             <w:pPr>
@@ -3584,7 +3379,7 @@
             </w:pPr>
             <w:r>
               <w:rPr>
-                <w:sz w:val="15"/>
+                <w:sz w:val="16"/>
               </w:rPr>
               <w:t xml:space="preserve">0.001 [</w:t>
             </w:r>
@@ -3601,27 +3396,9 @@
             </m:oMath>
             <w:r>
               <w:rPr>
-                <w:sz w:val="15"/>
+                <w:sz w:val="16"/>
               </w:rPr>
               <w:t xml:space="preserve">, 0.006]</w:t>
-            </w:r>
-          </w:p>
-        </w:tc>
-        <w:tc>
-          <w:tcPr>
-            <w:tcW w:type="dxa" w:w="2304"/>
-          </w:tcPr>
-          <w:p>
-            <w:pPr>
-              <w:pStyle w:val="Compact"/>
-              <w:spacing w:before="0" w:after="0" w:line="240" w:lineRule="auto"/>
-              <w:jc w:val="left"/>
-            </w:pPr>
-            <w:r>
-              <w:rPr>
-                <w:sz w:val="15"/>
-              </w:rPr>
-              <w:t xml:space="preserve">—</w:t>
             </w:r>
           </w:p>
         </w:tc>
@@ -3632,7 +3409,7 @@
         </w:trPr>
         <w:tc>
           <w:tcPr>
-            <w:tcW w:type="dxa" w:w="1368"/>
+            <w:tcW w:type="dxa" w:w="1584"/>
           </w:tcPr>
           <w:p>
             <w:pPr>
@@ -3642,9 +3419,27 @@
             </w:pPr>
             <w:r>
               <w:rPr>
-                <w:sz w:val="15"/>
+                <w:sz w:val="16"/>
               </w:rPr>
               <w:t xml:space="preserve">Cosmos Policy</w:t>
+            </w:r>
+          </w:p>
+        </w:tc>
+        <w:tc>
+          <w:tcPr>
+            <w:tcW w:type="dxa" w:w="1224"/>
+          </w:tcPr>
+          <w:p>
+            <w:pPr>
+              <w:pStyle w:val="Compact"/>
+              <w:spacing w:before="0" w:after="0" w:line="240" w:lineRule="auto"/>
+              <w:jc w:val="left"/>
+            </w:pPr>
+            <w:r>
+              <w:rPr>
+                <w:sz w:val="16"/>
+              </w:rPr>
+              <w:t xml:space="preserve">Predicted</w:t>
             </w:r>
           </w:p>
         </w:tc>
@@ -3660,25 +3455,7 @@
             </w:pPr>
             <w:r>
               <w:rPr>
-                <w:sz w:val="15"/>
-              </w:rPr>
-              <w:t xml:space="preserve">Predicted</w:t>
-            </w:r>
-          </w:p>
-        </w:tc>
-        <w:tc>
-          <w:tcPr>
-            <w:tcW w:type="dxa" w:w="936"/>
-          </w:tcPr>
-          <w:p>
-            <w:pPr>
-              <w:pStyle w:val="Compact"/>
-              <w:spacing w:before="0" w:after="0" w:line="240" w:lineRule="auto"/>
-              <w:jc w:val="left"/>
-            </w:pPr>
-            <w:r>
-              <w:rPr>
-                <w:sz w:val="15"/>
+                <w:sz w:val="16"/>
               </w:rPr>
               <w:t xml:space="preserve">Action</w:t>
             </w:r>
@@ -3686,7 +3463,7 @@
         </w:tc>
         <w:tc>
           <w:tcPr>
-            <w:tcW w:type="dxa" w:w="1584"/>
+            <w:tcW w:type="dxa" w:w="1944"/>
           </w:tcPr>
           <w:p>
             <w:pPr>
@@ -3696,7 +3473,7 @@
             </w:pPr>
             <w:r>
               <w:rPr>
-                <w:sz w:val="15"/>
+                <w:sz w:val="16"/>
               </w:rPr>
               <w:t xml:space="preserve">Natural control</w:t>
             </w:r>
@@ -3704,7 +3481,7 @@
         </w:tc>
         <w:tc>
           <w:tcPr>
-            <w:tcW w:type="dxa" w:w="2088"/>
+            <w:tcW w:type="dxa" w:w="3528"/>
           </w:tcPr>
           <w:p>
             <w:pPr>
@@ -3714,27 +3491,9 @@
             </w:pPr>
             <w:r>
               <w:rPr>
-                <w:sz w:val="15"/>
+                <w:sz w:val="16"/>
               </w:rPr>
               <w:t xml:space="preserve">0.395 [0.269, 0.553]</w:t>
-            </w:r>
-          </w:p>
-        </w:tc>
-        <w:tc>
-          <w:tcPr>
-            <w:tcW w:type="dxa" w:w="2304"/>
-          </w:tcPr>
-          <w:p>
-            <w:pPr>
-              <w:pStyle w:val="Compact"/>
-              <w:spacing w:before="0" w:after="0" w:line="240" w:lineRule="auto"/>
-              <w:jc w:val="left"/>
-            </w:pPr>
-            <w:r>
-              <w:rPr>
-                <w:sz w:val="15"/>
-              </w:rPr>
-              <w:t xml:space="preserve">—</w:t>
             </w:r>
           </w:p>
         </w:tc>
@@ -3745,7 +3504,7 @@
         </w:trPr>
         <w:tc>
           <w:tcPr>
-            <w:tcW w:type="dxa" w:w="1368"/>
+            <w:tcW w:type="dxa" w:w="1584"/>
           </w:tcPr>
           <w:p>
             <w:pPr>
@@ -3755,9 +3514,27 @@
             </w:pPr>
             <w:r>
               <w:rPr>
-                <w:sz w:val="15"/>
+                <w:sz w:val="16"/>
               </w:rPr>
               <w:t xml:space="preserve">Cosmos Policy</w:t>
+            </w:r>
+          </w:p>
+        </w:tc>
+        <w:tc>
+          <w:tcPr>
+            <w:tcW w:type="dxa" w:w="1224"/>
+          </w:tcPr>
+          <w:p>
+            <w:pPr>
+              <w:pStyle w:val="Compact"/>
+              <w:spacing w:before="0" w:after="0" w:line="240" w:lineRule="auto"/>
+              <w:jc w:val="left"/>
+            </w:pPr>
+            <w:r>
+              <w:rPr>
+                <w:sz w:val="16"/>
+              </w:rPr>
+              <w:t xml:space="preserve">Predicted</w:t>
             </w:r>
           </w:p>
         </w:tc>
@@ -3773,25 +3550,7 @@
             </w:pPr>
             <w:r>
               <w:rPr>
-                <w:sz w:val="15"/>
-              </w:rPr>
-              <w:t xml:space="preserve">Predicted</w:t>
-            </w:r>
-          </w:p>
-        </w:tc>
-        <w:tc>
-          <w:tcPr>
-            <w:tcW w:type="dxa" w:w="936"/>
-          </w:tcPr>
-          <w:p>
-            <w:pPr>
-              <w:pStyle w:val="Compact"/>
-              <w:spacing w:before="0" w:after="0" w:line="240" w:lineRule="auto"/>
-              <w:jc w:val="left"/>
-            </w:pPr>
-            <w:r>
-              <w:rPr>
-                <w:sz w:val="15"/>
+                <w:sz w:val="16"/>
               </w:rPr>
               <w:t xml:space="preserve">Action</w:t>
             </w:r>
@@ -3799,7 +3558,7 @@
         </w:tc>
         <w:tc>
           <w:tcPr>
-            <w:tcW w:type="dxa" w:w="1584"/>
+            <w:tcW w:type="dxa" w:w="1944"/>
           </w:tcPr>
           <w:p>
             <w:pPr>
@@ -3809,7 +3568,7 @@
             </w:pPr>
             <w:r>
               <w:rPr>
-                <w:sz w:val="15"/>
+                <w:sz w:val="16"/>
               </w:rPr>
               <w:t xml:space="preserve">Shuffled control</w:t>
             </w:r>
@@ -3817,7 +3576,7 @@
         </w:tc>
         <w:tc>
           <w:tcPr>
-            <w:tcW w:type="dxa" w:w="2088"/>
+            <w:tcW w:type="dxa" w:w="3528"/>
           </w:tcPr>
           <w:p>
             <w:pPr>
@@ -3827,27 +3586,9 @@
             </w:pPr>
             <w:r>
               <w:rPr>
-                <w:sz w:val="15"/>
+                <w:sz w:val="16"/>
               </w:rPr>
               <w:t xml:space="preserve">0.244 [0.152, 0.347]</w:t>
-            </w:r>
-          </w:p>
-        </w:tc>
-        <w:tc>
-          <w:tcPr>
-            <w:tcW w:type="dxa" w:w="2304"/>
-          </w:tcPr>
-          <w:p>
-            <w:pPr>
-              <w:pStyle w:val="Compact"/>
-              <w:spacing w:before="0" w:after="0" w:line="240" w:lineRule="auto"/>
-              <w:jc w:val="left"/>
-            </w:pPr>
-            <w:r>
-              <w:rPr>
-                <w:sz w:val="15"/>
-              </w:rPr>
-              <w:t xml:space="preserve">—</w:t>
             </w:r>
           </w:p>
         </w:tc>
@@ -3858,7 +3599,7 @@
         </w:trPr>
         <w:tc>
           <w:tcPr>
-            <w:tcW w:type="dxa" w:w="1368"/>
+            <w:tcW w:type="dxa" w:w="1584"/>
           </w:tcPr>
           <w:p>
             <w:pPr>
@@ -3868,9 +3609,27 @@
             </w:pPr>
             <w:r>
               <w:rPr>
-                <w:sz w:val="15"/>
+                <w:sz w:val="16"/>
               </w:rPr>
               <w:t xml:space="preserve">Cosmos Policy</w:t>
+            </w:r>
+          </w:p>
+        </w:tc>
+        <w:tc>
+          <w:tcPr>
+            <w:tcW w:type="dxa" w:w="1224"/>
+          </w:tcPr>
+          <w:p>
+            <w:pPr>
+              <w:pStyle w:val="Compact"/>
+              <w:spacing w:before="0" w:after="0" w:line="240" w:lineRule="auto"/>
+              <w:jc w:val="left"/>
+            </w:pPr>
+            <w:r>
+              <w:rPr>
+                <w:sz w:val="16"/>
+              </w:rPr>
+              <w:t xml:space="preserve">Predicted</w:t>
             </w:r>
           </w:p>
         </w:tc>
@@ -3886,25 +3645,7 @@
             </w:pPr>
             <w:r>
               <w:rPr>
-                <w:sz w:val="15"/>
-              </w:rPr>
-              <w:t xml:space="preserve">Predicted</w:t>
-            </w:r>
-          </w:p>
-        </w:tc>
-        <w:tc>
-          <w:tcPr>
-            <w:tcW w:type="dxa" w:w="936"/>
-          </w:tcPr>
-          <w:p>
-            <w:pPr>
-              <w:pStyle w:val="Compact"/>
-              <w:spacing w:before="0" w:after="0" w:line="240" w:lineRule="auto"/>
-              <w:jc w:val="left"/>
-            </w:pPr>
-            <w:r>
-              <w:rPr>
-                <w:sz w:val="15"/>
+                <w:sz w:val="16"/>
               </w:rPr>
               <w:t xml:space="preserve">Action</w:t>
             </w:r>
@@ -3912,7 +3653,7 @@
         </w:tc>
         <w:tc>
           <w:tcPr>
-            <w:tcW w:type="dxa" w:w="1584"/>
+            <w:tcW w:type="dxa" w:w="1944"/>
           </w:tcPr>
           <w:p>
             <w:pPr>
@@ -3924,7 +3665,7 @@
               <w:rPr>
                 <w:b/>
                 <w:bCs/>
-                <w:sz w:val="15"/>
+                <w:sz w:val="16"/>
               </w:rPr>
               <w:t xml:space="preserve">Paired donor (ours)</w:t>
             </w:r>
@@ -3932,7 +3673,7 @@
         </w:tc>
         <w:tc>
           <w:tcPr>
-            <w:tcW w:type="dxa" w:w="2088"/>
+            <w:tcW w:type="dxa" w:w="3528"/>
           </w:tcPr>
           <w:p>
             <w:pPr>
@@ -3944,29 +3685,9 @@
               <w:rPr>
                 <w:b/>
                 <w:bCs/>
-                <w:sz w:val="15"/>
+                <w:sz w:val="16"/>
               </w:rPr>
               <w:t xml:space="preserve">0.499 [0.336, 0.679]</w:t>
-            </w:r>
-          </w:p>
-        </w:tc>
-        <w:tc>
-          <w:tcPr>
-            <w:tcW w:type="dxa" w:w="2304"/>
-          </w:tcPr>
-          <w:p>
-            <w:pPr>
-              <w:pStyle w:val="Compact"/>
-              <w:spacing w:before="0" w:after="0" w:line="240" w:lineRule="auto"/>
-              <w:jc w:val="left"/>
-            </w:pPr>
-            <w:r>
-              <w:rPr>
-                <w:b/>
-                <w:bCs/>
-                <w:sz w:val="15"/>
-              </w:rPr>
-              <w:t xml:space="preserve">0.103 [0.048, 0.161]</w:t>
             </w:r>
           </w:p>
         </w:tc>
@@ -3977,7 +3698,7 @@
         </w:trPr>
         <w:tc>
           <w:tcPr>
-            <w:tcW w:type="dxa" w:w="1368"/>
+            <w:tcW w:type="dxa" w:w="1584"/>
           </w:tcPr>
           <w:p>
             <w:pPr>
@@ -3987,9 +3708,27 @@
             </w:pPr>
             <w:r>
               <w:rPr>
-                <w:sz w:val="15"/>
+                <w:sz w:val="16"/>
               </w:rPr>
               <w:t xml:space="preserve">Cosmos Policy</w:t>
+            </w:r>
+          </w:p>
+        </w:tc>
+        <w:tc>
+          <w:tcPr>
+            <w:tcW w:type="dxa" w:w="1224"/>
+          </w:tcPr>
+          <w:p>
+            <w:pPr>
+              <w:pStyle w:val="Compact"/>
+              <w:spacing w:before="0" w:after="0" w:line="240" w:lineRule="auto"/>
+              <w:jc w:val="left"/>
+            </w:pPr>
+            <w:r>
+              <w:rPr>
+                <w:sz w:val="16"/>
+              </w:rPr>
+              <w:t xml:space="preserve">Predicted</w:t>
             </w:r>
           </w:p>
         </w:tc>
@@ -4005,25 +3744,7 @@
             </w:pPr>
             <w:r>
               <w:rPr>
-                <w:sz w:val="15"/>
-              </w:rPr>
-              <w:t xml:space="preserve">Predicted</w:t>
-            </w:r>
-          </w:p>
-        </w:tc>
-        <w:tc>
-          <w:tcPr>
-            <w:tcW w:type="dxa" w:w="936"/>
-          </w:tcPr>
-          <w:p>
-            <w:pPr>
-              <w:pStyle w:val="Compact"/>
-              <w:spacing w:before="0" w:after="0" w:line="240" w:lineRule="auto"/>
-              <w:jc w:val="left"/>
-            </w:pPr>
-            <w:r>
-              <w:rPr>
-                <w:sz w:val="15"/>
+                <w:sz w:val="16"/>
               </w:rPr>
               <w:t xml:space="preserve">Endpoint</w:t>
             </w:r>
@@ -4031,7 +3752,7 @@
         </w:tc>
         <w:tc>
           <w:tcPr>
-            <w:tcW w:type="dxa" w:w="1584"/>
+            <w:tcW w:type="dxa" w:w="1944"/>
           </w:tcPr>
           <w:p>
             <w:pPr>
@@ -4041,7 +3762,7 @@
             </w:pPr>
             <w:r>
               <w:rPr>
-                <w:sz w:val="15"/>
+                <w:sz w:val="16"/>
               </w:rPr>
               <w:t xml:space="preserve">Self</w:t>
             </w:r>
@@ -4049,7 +3770,7 @@
         </w:tc>
         <w:tc>
           <w:tcPr>
-            <w:tcW w:type="dxa" w:w="2088"/>
+            <w:tcW w:type="dxa" w:w="3528"/>
           </w:tcPr>
           <w:p>
             <w:pPr>
@@ -4059,27 +3780,9 @@
             </w:pPr>
             <w:r>
               <w:rPr>
-                <w:sz w:val="15"/>
+                <w:sz w:val="16"/>
               </w:rPr>
               <w:t xml:space="preserve">0.000 (reference)</w:t>
-            </w:r>
-          </w:p>
-        </w:tc>
-        <w:tc>
-          <w:tcPr>
-            <w:tcW w:type="dxa" w:w="2304"/>
-          </w:tcPr>
-          <w:p>
-            <w:pPr>
-              <w:pStyle w:val="Compact"/>
-              <w:spacing w:before="0" w:after="0" w:line="240" w:lineRule="auto"/>
-              <w:jc w:val="left"/>
-            </w:pPr>
-            <w:r>
-              <w:rPr>
-                <w:sz w:val="15"/>
-              </w:rPr>
-              <w:t xml:space="preserve">—</w:t>
             </w:r>
           </w:p>
         </w:tc>
@@ -4090,7 +3793,7 @@
         </w:trPr>
         <w:tc>
           <w:tcPr>
-            <w:tcW w:type="dxa" w:w="1368"/>
+            <w:tcW w:type="dxa" w:w="1584"/>
           </w:tcPr>
           <w:p>
             <w:pPr>
@@ -4100,9 +3803,27 @@
             </w:pPr>
             <w:r>
               <w:rPr>
-                <w:sz w:val="15"/>
+                <w:sz w:val="16"/>
               </w:rPr>
               <w:t xml:space="preserve">Cosmos Policy</w:t>
+            </w:r>
+          </w:p>
+        </w:tc>
+        <w:tc>
+          <w:tcPr>
+            <w:tcW w:type="dxa" w:w="1224"/>
+          </w:tcPr>
+          <w:p>
+            <w:pPr>
+              <w:pStyle w:val="Compact"/>
+              <w:spacing w:before="0" w:after="0" w:line="240" w:lineRule="auto"/>
+              <w:jc w:val="left"/>
+            </w:pPr>
+            <w:r>
+              <w:rPr>
+                <w:sz w:val="16"/>
+              </w:rPr>
+              <w:t xml:space="preserve">Predicted</w:t>
             </w:r>
           </w:p>
         </w:tc>
@@ -4118,25 +3839,7 @@
             </w:pPr>
             <w:r>
               <w:rPr>
-                <w:sz w:val="15"/>
-              </w:rPr>
-              <w:t xml:space="preserve">Predicted</w:t>
-            </w:r>
-          </w:p>
-        </w:tc>
-        <w:tc>
-          <w:tcPr>
-            <w:tcW w:type="dxa" w:w="936"/>
-          </w:tcPr>
-          <w:p>
-            <w:pPr>
-              <w:pStyle w:val="Compact"/>
-              <w:spacing w:before="0" w:after="0" w:line="240" w:lineRule="auto"/>
-              <w:jc w:val="left"/>
-            </w:pPr>
-            <w:r>
-              <w:rPr>
-                <w:sz w:val="15"/>
+                <w:sz w:val="16"/>
               </w:rPr>
               <w:t xml:space="preserve">Endpoint</w:t>
             </w:r>
@@ -4144,7 +3847,7 @@
         </w:tc>
         <w:tc>
           <w:tcPr>
-            <w:tcW w:type="dxa" w:w="1584"/>
+            <w:tcW w:type="dxa" w:w="1944"/>
           </w:tcPr>
           <w:p>
             <w:pPr>
@@ -4154,7 +3857,7 @@
             </w:pPr>
             <w:r>
               <w:rPr>
-                <w:sz w:val="15"/>
+                <w:sz w:val="16"/>
               </w:rPr>
               <w:t xml:space="preserve">Matched Gaussian</w:t>
             </w:r>
@@ -4162,7 +3865,7 @@
         </w:tc>
         <w:tc>
           <w:tcPr>
-            <w:tcW w:type="dxa" w:w="2088"/>
+            <w:tcW w:type="dxa" w:w="3528"/>
           </w:tcPr>
           <w:p>
             <w:pPr>
@@ -4172,7 +3875,7 @@
             </w:pPr>
             <w:r>
               <w:rPr>
-                <w:sz w:val="15"/>
+                <w:sz w:val="16"/>
               </w:rPr>
               <w:t xml:space="preserve">0.003 [</w:t>
             </w:r>
@@ -4189,27 +3892,9 @@
             </m:oMath>
             <w:r>
               <w:rPr>
-                <w:sz w:val="15"/>
+                <w:sz w:val="16"/>
               </w:rPr>
               <w:t xml:space="preserve">, 0.008]</w:t>
-            </w:r>
-          </w:p>
-        </w:tc>
-        <w:tc>
-          <w:tcPr>
-            <w:tcW w:type="dxa" w:w="2304"/>
-          </w:tcPr>
-          <w:p>
-            <w:pPr>
-              <w:pStyle w:val="Compact"/>
-              <w:spacing w:before="0" w:after="0" w:line="240" w:lineRule="auto"/>
-              <w:jc w:val="left"/>
-            </w:pPr>
-            <w:r>
-              <w:rPr>
-                <w:sz w:val="15"/>
-              </w:rPr>
-              <w:t xml:space="preserve">—</w:t>
             </w:r>
           </w:p>
         </w:tc>
@@ -4220,7 +3905,7 @@
         </w:trPr>
         <w:tc>
           <w:tcPr>
-            <w:tcW w:type="dxa" w:w="1368"/>
+            <w:tcW w:type="dxa" w:w="1584"/>
           </w:tcPr>
           <w:p>
             <w:pPr>
@@ -4230,9 +3915,27 @@
             </w:pPr>
             <w:r>
               <w:rPr>
-                <w:sz w:val="15"/>
+                <w:sz w:val="16"/>
               </w:rPr>
               <w:t xml:space="preserve">Cosmos Policy</w:t>
+            </w:r>
+          </w:p>
+        </w:tc>
+        <w:tc>
+          <w:tcPr>
+            <w:tcW w:type="dxa" w:w="1224"/>
+          </w:tcPr>
+          <w:p>
+            <w:pPr>
+              <w:pStyle w:val="Compact"/>
+              <w:spacing w:before="0" w:after="0" w:line="240" w:lineRule="auto"/>
+              <w:jc w:val="left"/>
+            </w:pPr>
+            <w:r>
+              <w:rPr>
+                <w:sz w:val="16"/>
+              </w:rPr>
+              <w:t xml:space="preserve">Predicted</w:t>
             </w:r>
           </w:p>
         </w:tc>
@@ -4248,25 +3951,7 @@
             </w:pPr>
             <w:r>
               <w:rPr>
-                <w:sz w:val="15"/>
-              </w:rPr>
-              <w:t xml:space="preserve">Predicted</w:t>
-            </w:r>
-          </w:p>
-        </w:tc>
-        <w:tc>
-          <w:tcPr>
-            <w:tcW w:type="dxa" w:w="936"/>
-          </w:tcPr>
-          <w:p>
-            <w:pPr>
-              <w:pStyle w:val="Compact"/>
-              <w:spacing w:before="0" w:after="0" w:line="240" w:lineRule="auto"/>
-              <w:jc w:val="left"/>
-            </w:pPr>
-            <w:r>
-              <w:rPr>
-                <w:sz w:val="15"/>
+                <w:sz w:val="16"/>
               </w:rPr>
               <w:t xml:space="preserve">Endpoint</w:t>
             </w:r>
@@ -4274,7 +3959,7 @@
         </w:tc>
         <w:tc>
           <w:tcPr>
-            <w:tcW w:type="dxa" w:w="1584"/>
+            <w:tcW w:type="dxa" w:w="1944"/>
           </w:tcPr>
           <w:p>
             <w:pPr>
@@ -4284,7 +3969,7 @@
             </w:pPr>
             <w:r>
               <w:rPr>
-                <w:sz w:val="15"/>
+                <w:sz w:val="16"/>
               </w:rPr>
               <w:t xml:space="preserve">Natural control</w:t>
             </w:r>
@@ -4292,7 +3977,7 @@
         </w:tc>
         <w:tc>
           <w:tcPr>
-            <w:tcW w:type="dxa" w:w="2088"/>
+            <w:tcW w:type="dxa" w:w="3528"/>
           </w:tcPr>
           <w:p>
             <w:pPr>
@@ -4302,27 +3987,9 @@
             </w:pPr>
             <w:r>
               <w:rPr>
-                <w:sz w:val="15"/>
+                <w:sz w:val="16"/>
               </w:rPr>
               <w:t xml:space="preserve">0.442 [0.311, 0.598]</w:t>
-            </w:r>
-          </w:p>
-        </w:tc>
-        <w:tc>
-          <w:tcPr>
-            <w:tcW w:type="dxa" w:w="2304"/>
-          </w:tcPr>
-          <w:p>
-            <w:pPr>
-              <w:pStyle w:val="Compact"/>
-              <w:spacing w:before="0" w:after="0" w:line="240" w:lineRule="auto"/>
-              <w:jc w:val="left"/>
-            </w:pPr>
-            <w:r>
-              <w:rPr>
-                <w:sz w:val="15"/>
-              </w:rPr>
-              <w:t xml:space="preserve">—</w:t>
             </w:r>
           </w:p>
         </w:tc>
@@ -4333,7 +4000,7 @@
         </w:trPr>
         <w:tc>
           <w:tcPr>
-            <w:tcW w:type="dxa" w:w="1368"/>
+            <w:tcW w:type="dxa" w:w="1584"/>
           </w:tcPr>
           <w:p>
             <w:pPr>
@@ -4343,9 +4010,27 @@
             </w:pPr>
             <w:r>
               <w:rPr>
-                <w:sz w:val="15"/>
+                <w:sz w:val="16"/>
               </w:rPr>
               <w:t xml:space="preserve">Cosmos Policy</w:t>
+            </w:r>
+          </w:p>
+        </w:tc>
+        <w:tc>
+          <w:tcPr>
+            <w:tcW w:type="dxa" w:w="1224"/>
+          </w:tcPr>
+          <w:p>
+            <w:pPr>
+              <w:pStyle w:val="Compact"/>
+              <w:spacing w:before="0" w:after="0" w:line="240" w:lineRule="auto"/>
+              <w:jc w:val="left"/>
+            </w:pPr>
+            <w:r>
+              <w:rPr>
+                <w:sz w:val="16"/>
+              </w:rPr>
+              <w:t xml:space="preserve">Predicted</w:t>
             </w:r>
           </w:p>
         </w:tc>
@@ -4361,25 +4046,7 @@
             </w:pPr>
             <w:r>
               <w:rPr>
-                <w:sz w:val="15"/>
-              </w:rPr>
-              <w:t xml:space="preserve">Predicted</w:t>
-            </w:r>
-          </w:p>
-        </w:tc>
-        <w:tc>
-          <w:tcPr>
-            <w:tcW w:type="dxa" w:w="936"/>
-          </w:tcPr>
-          <w:p>
-            <w:pPr>
-              <w:pStyle w:val="Compact"/>
-              <w:spacing w:before="0" w:after="0" w:line="240" w:lineRule="auto"/>
-              <w:jc w:val="left"/>
-            </w:pPr>
-            <w:r>
-              <w:rPr>
-                <w:sz w:val="15"/>
+                <w:sz w:val="16"/>
               </w:rPr>
               <w:t xml:space="preserve">Endpoint</w:t>
             </w:r>
@@ -4387,7 +4054,7 @@
         </w:tc>
         <w:tc>
           <w:tcPr>
-            <w:tcW w:type="dxa" w:w="1584"/>
+            <w:tcW w:type="dxa" w:w="1944"/>
           </w:tcPr>
           <w:p>
             <w:pPr>
@@ -4397,7 +4064,7 @@
             </w:pPr>
             <w:r>
               <w:rPr>
-                <w:sz w:val="15"/>
+                <w:sz w:val="16"/>
               </w:rPr>
               <w:t xml:space="preserve">Shuffled control</w:t>
             </w:r>
@@ -4405,7 +4072,7 @@
         </w:tc>
         <w:tc>
           <w:tcPr>
-            <w:tcW w:type="dxa" w:w="2088"/>
+            <w:tcW w:type="dxa" w:w="3528"/>
           </w:tcPr>
           <w:p>
             <w:pPr>
@@ -4415,27 +4082,9 @@
             </w:pPr>
             <w:r>
               <w:rPr>
-                <w:sz w:val="15"/>
+                <w:sz w:val="16"/>
               </w:rPr>
               <w:t xml:space="preserve">0.275 [0.185, 0.375]</w:t>
-            </w:r>
-          </w:p>
-        </w:tc>
-        <w:tc>
-          <w:tcPr>
-            <w:tcW w:type="dxa" w:w="2304"/>
-          </w:tcPr>
-          <w:p>
-            <w:pPr>
-              <w:pStyle w:val="Compact"/>
-              <w:spacing w:before="0" w:after="0" w:line="240" w:lineRule="auto"/>
-              <w:jc w:val="left"/>
-            </w:pPr>
-            <w:r>
-              <w:rPr>
-                <w:sz w:val="15"/>
-              </w:rPr>
-              <w:t xml:space="preserve">—</w:t>
             </w:r>
           </w:p>
         </w:tc>
@@ -4446,7 +4095,7 @@
         </w:trPr>
         <w:tc>
           <w:tcPr>
-            <w:tcW w:type="dxa" w:w="1368"/>
+            <w:tcW w:type="dxa" w:w="1584"/>
           </w:tcPr>
           <w:p>
             <w:pPr>
@@ -4456,9 +4105,27 @@
             </w:pPr>
             <w:r>
               <w:rPr>
-                <w:sz w:val="15"/>
+                <w:sz w:val="16"/>
               </w:rPr>
               <w:t xml:space="preserve">Cosmos Policy</w:t>
+            </w:r>
+          </w:p>
+        </w:tc>
+        <w:tc>
+          <w:tcPr>
+            <w:tcW w:type="dxa" w:w="1224"/>
+          </w:tcPr>
+          <w:p>
+            <w:pPr>
+              <w:pStyle w:val="Compact"/>
+              <w:spacing w:before="0" w:after="0" w:line="240" w:lineRule="auto"/>
+              <w:jc w:val="left"/>
+            </w:pPr>
+            <w:r>
+              <w:rPr>
+                <w:sz w:val="16"/>
+              </w:rPr>
+              <w:t xml:space="preserve">Predicted</w:t>
             </w:r>
           </w:p>
         </w:tc>
@@ -4474,25 +4141,7 @@
             </w:pPr>
             <w:r>
               <w:rPr>
-                <w:sz w:val="15"/>
-              </w:rPr>
-              <w:t xml:space="preserve">Predicted</w:t>
-            </w:r>
-          </w:p>
-        </w:tc>
-        <w:tc>
-          <w:tcPr>
-            <w:tcW w:type="dxa" w:w="936"/>
-          </w:tcPr>
-          <w:p>
-            <w:pPr>
-              <w:pStyle w:val="Compact"/>
-              <w:spacing w:before="0" w:after="0" w:line="240" w:lineRule="auto"/>
-              <w:jc w:val="left"/>
-            </w:pPr>
-            <w:r>
-              <w:rPr>
-                <w:sz w:val="15"/>
+                <w:sz w:val="16"/>
               </w:rPr>
               <w:t xml:space="preserve">Endpoint</w:t>
             </w:r>
@@ -4500,7 +4149,7 @@
         </w:tc>
         <w:tc>
           <w:tcPr>
-            <w:tcW w:type="dxa" w:w="1584"/>
+            <w:tcW w:type="dxa" w:w="1944"/>
           </w:tcPr>
           <w:p>
             <w:pPr>
@@ -4512,7 +4161,7 @@
               <w:rPr>
                 <w:b/>
                 <w:bCs/>
-                <w:sz w:val="15"/>
+                <w:sz w:val="16"/>
               </w:rPr>
               <w:t xml:space="preserve">Paired donor (ours)</w:t>
             </w:r>
@@ -4520,7 +4169,7 @@
         </w:tc>
         <w:tc>
           <w:tcPr>
-            <w:tcW w:type="dxa" w:w="2088"/>
+            <w:tcW w:type="dxa" w:w="3528"/>
           </w:tcPr>
           <w:p>
             <w:pPr>
@@ -4532,29 +4181,9 @@
               <w:rPr>
                 <w:b/>
                 <w:bCs/>
-                <w:sz w:val="15"/>
+                <w:sz w:val="16"/>
               </w:rPr>
               <w:t xml:space="preserve">0.552 [0.387, 0.728]</w:t>
-            </w:r>
-          </w:p>
-        </w:tc>
-        <w:tc>
-          <w:tcPr>
-            <w:tcW w:type="dxa" w:w="2304"/>
-          </w:tcPr>
-          <w:p>
-            <w:pPr>
-              <w:pStyle w:val="Compact"/>
-              <w:spacing w:before="0" w:after="0" w:line="240" w:lineRule="auto"/>
-              <w:jc w:val="left"/>
-            </w:pPr>
-            <w:r>
-              <w:rPr>
-                <w:b/>
-                <w:bCs/>
-                <w:sz w:val="15"/>
-              </w:rPr>
-              <w:t xml:space="preserve">0.110 [0.054, 0.166]</w:t>
             </w:r>
           </w:p>
         </w:tc>
@@ -5005,7 +4634,7 @@
         <w:t xml:space="preserve"> </w:t>
       </w:r>
       <w:r>
-        <w:t xml:space="preserve">reports those intervals and the complete control set.</w:t>
+        <w:t xml:space="preserve">reports the complete control set.</w:t>
       </w:r>
     </w:p>
     <w:bookmarkEnd w:id="30"/>

</xml_diff>

<commit_message>
docs: combine mechanism tables
</commit_message>
<xml_diff>
--- a/output/imagined_futures_neurips2026.docx
+++ b/output/imagined_futures_neurips2026.docx
@@ -1986,7 +1986,7 @@
     </w:p>
     <w:bookmarkEnd w:id="23"/>
     <w:bookmarkEnd w:id="24"/>
-    <w:bookmarkStart w:id="45" w:name="sec:results"/>
+    <w:bookmarkStart w:id="44" w:name="sec:results"/>
     <w:p>
       <w:pPr>
         <w:pStyle w:val="Heading1"/>
@@ -4648,7 +4648,7 @@
     </w:p>
     <w:bookmarkEnd w:id="31"/>
     <w:bookmarkEnd w:id="32"/>
-    <w:bookmarkStart w:id="36" w:name="sec:content"/>
+    <w:bookmarkStart w:id="35" w:name="sec:content"/>
     <w:p>
       <w:pPr>
         <w:pStyle w:val="Heading2"/>
@@ -5050,7 +5050,7 @@
       </w:r>
     </w:p>
     <w:bookmarkEnd w:id="33"/>
-    <w:bookmarkStart w:id="35" w:name="cosmos-3.-2"/>
+    <w:bookmarkStart w:id="34" w:name="cosmos-3.-2"/>
     <w:p>
       <w:pPr>
         <w:pStyle w:val="Heading4"/>
@@ -5107,7 +5107,7 @@
       <w:r>
         <w:t xml:space="preserve">equivalence region (Table </w:t>
       </w:r>
-      <w:hyperlink w:anchor="tab:content">
+      <w:hyperlink w:anchor="tab:mechanisms">
         <w:r>
           <w:rPr>
             <w:rStyle w:val="Hyperlink"/>
@@ -5189,365 +5189,9 @@
         <w:t xml:space="preserve">. Neither factor alone recreates a meaningful fraction of the roughly one-unit whole-future effect. The useful signal may be distributed across the image, require robot–object coherence, depend on camera or temporal structure, or interact nonlinearly with masking and tokenization. Hybrid videos may also be off distribution. The experiment establishes insufficiency of each isolated pixel factor, not irrelevance of robot or object information and not joint necessity.</w:t>
       </w:r>
     </w:p>
-    <w:bookmarkStart w:id="34" w:name="tab:content"/>
-    <w:p>
-      <w:pPr>
-        <w:pStyle w:val="TableCaption"/>
-      </w:pPr>
-      <w:r>
-        <w:t xml:space="preserve">Cosmos 3 isolated content factors across ten states. Each row is a main effect in the disjoint</w:t>
-      </w:r>
-      <w:r>
-        <w:t xml:space="preserve"> </w:t>
-      </w:r>
-      <m:oMath>
-        <m:r>
-          <m:t>2</m:t>
-        </m:r>
-        <m:r>
-          <m:rPr>
-            <m:sty m:val="p"/>
-          </m:rPr>
-          <m:t>×</m:t>
-        </m:r>
-        <m:r>
-          <m:t>2</m:t>
-        </m:r>
-      </m:oMath>
-      <w:r>
-        <w:t xml:space="preserve"> </w:t>
-      </w:r>
-      <w:r>
-        <w:t xml:space="preserve">pixel transplant. Every 95% state-bootstrap CI is contained within the prespecified equivalence region.</w:t>
-      </w:r>
-    </w:p>
-    <w:tbl>
-      <w:tblPr>
-        <w:tblStyle w:val="Table"/>
-        <w:tblW w:type="auto" w:w="0"/>
-        <w:tblLook w:firstRow="1" w:lastRow="0" w:firstColumn="0" w:lastColumn="0" w:noHBand="0" w:noVBand="0" w:val="0020"/>
-        <w:tblCaption w:val="Cosmos 3 isolated content factors across ten states. Each row is a main effect in the disjoint 2\times2 pixel transplant. Every 95% state-bootstrap CI is contained within the prespecified equivalence region."/>
-      </w:tblPr>
-      <w:tblGrid>
-        <w:gridCol w:w="1980"/>
-        <w:gridCol w:w="1980"/>
-        <w:gridCol w:w="1980"/>
-        <w:gridCol w:w="1980"/>
-      </w:tblGrid>
-      <w:tr>
-        <w:trPr>
-          <w:tblHeader w:val="on"/>
-        </w:trPr>
-        <w:tc>
-          <w:tcPr/>
-          <w:p>
-            <w:pPr>
-              <w:pStyle w:val="Compact"/>
-              <w:jc w:val="left"/>
-            </w:pPr>
-            <w:r>
-              <w:t xml:space="preserve">Factor</w:t>
-            </w:r>
-          </w:p>
-        </w:tc>
-        <w:tc>
-          <w:tcPr/>
-          <w:p>
-            <w:pPr>
-              <w:pStyle w:val="Compact"/>
-              <w:jc w:val="left"/>
-            </w:pPr>
-            <w:r>
-              <w:t xml:space="preserve">Outcome</w:t>
-            </w:r>
-          </w:p>
-        </w:tc>
-        <w:tc>
-          <w:tcPr/>
-          <w:p>
-            <w:pPr>
-              <w:pStyle w:val="Compact"/>
-              <w:jc w:val="center"/>
-            </w:pPr>
-            <w:r>
-              <w:t xml:space="preserve">Effect [95% CI]</w:t>
-            </w:r>
-          </w:p>
-        </w:tc>
-        <w:tc>
-          <w:tcPr/>
-          <w:p>
-            <w:pPr>
-              <w:pStyle w:val="Compact"/>
-              <w:jc w:val="center"/>
-            </w:pPr>
-            <w:r>
-              <w:t xml:space="preserve">Equivalent to zero</w:t>
-            </w:r>
-          </w:p>
-        </w:tc>
-      </w:tr>
-      <w:tr>
-        <w:tc>
-          <w:tcPr/>
-          <w:p>
-            <w:pPr>
-              <w:pStyle w:val="Compact"/>
-              <w:jc w:val="left"/>
-            </w:pPr>
-            <w:r>
-              <w:t xml:space="preserve">Robot pixels</w:t>
-            </w:r>
-          </w:p>
-        </w:tc>
-        <w:tc>
-          <w:tcPr/>
-          <w:p>
-            <w:pPr>
-              <w:pStyle w:val="Compact"/>
-              <w:jc w:val="left"/>
-            </w:pPr>
-            <w:r>
-              <w:t xml:space="preserve">Action</w:t>
-            </w:r>
-          </w:p>
-        </w:tc>
-        <w:tc>
-          <w:tcPr/>
-          <w:p>
-            <w:pPr>
-              <w:pStyle w:val="Compact"/>
-              <w:jc w:val="center"/>
-            </w:pPr>
-            <w:r>
-              <w:t xml:space="preserve">0.0022 [</w:t>
-            </w:r>
-            <m:oMath>
-              <m:r>
-                <m:rPr>
-                  <m:sty m:val="p"/>
-                </m:rPr>
-                <m:t>−</m:t>
-              </m:r>
-              <m:r>
-                <m:t>0.0016</m:t>
-              </m:r>
-            </m:oMath>
-            <w:r>
-              <w:t xml:space="preserve">, 0.0060]</w:t>
-            </w:r>
-          </w:p>
-        </w:tc>
-        <w:tc>
-          <w:tcPr/>
-          <w:p>
-            <w:pPr>
-              <w:pStyle w:val="Compact"/>
-              <w:jc w:val="center"/>
-            </w:pPr>
-            <w:r>
-              <w:t xml:space="preserve">Yes</w:t>
-            </w:r>
-          </w:p>
-        </w:tc>
-      </w:tr>
-      <w:tr>
-        <w:tc>
-          <w:tcPr/>
-          <w:p>
-            <w:pPr>
-              <w:pStyle w:val="Compact"/>
-              <w:jc w:val="left"/>
-            </w:pPr>
-            <w:r>
-              <w:t xml:space="preserve">Robot pixels</w:t>
-            </w:r>
-          </w:p>
-        </w:tc>
-        <w:tc>
-          <w:tcPr/>
-          <w:p>
-            <w:pPr>
-              <w:pStyle w:val="Compact"/>
-              <w:jc w:val="left"/>
-            </w:pPr>
-            <w:r>
-              <w:t xml:space="preserve">Endpoint</w:t>
-            </w:r>
-          </w:p>
-        </w:tc>
-        <w:tc>
-          <w:tcPr/>
-          <w:p>
-            <w:pPr>
-              <w:pStyle w:val="Compact"/>
-              <w:jc w:val="center"/>
-            </w:pPr>
-            <w:r>
-              <w:t xml:space="preserve">0.0102 [</w:t>
-            </w:r>
-            <m:oMath>
-              <m:r>
-                <m:rPr>
-                  <m:sty m:val="p"/>
-                </m:rPr>
-                <m:t>−</m:t>
-              </m:r>
-              <m:r>
-                <m:t>0.0067</m:t>
-              </m:r>
-            </m:oMath>
-            <w:r>
-              <w:t xml:space="preserve">, 0.0275]</w:t>
-            </w:r>
-          </w:p>
-        </w:tc>
-        <w:tc>
-          <w:tcPr/>
-          <w:p>
-            <w:pPr>
-              <w:pStyle w:val="Compact"/>
-              <w:jc w:val="center"/>
-            </w:pPr>
-            <w:r>
-              <w:t xml:space="preserve">Yes</w:t>
-            </w:r>
-          </w:p>
-        </w:tc>
-      </w:tr>
-      <w:tr>
-        <w:tc>
-          <w:tcPr/>
-          <w:p>
-            <w:pPr>
-              <w:pStyle w:val="Compact"/>
-              <w:jc w:val="left"/>
-            </w:pPr>
-            <w:r>
-              <w:t xml:space="preserve">Object pixels</w:t>
-            </w:r>
-          </w:p>
-        </w:tc>
-        <w:tc>
-          <w:tcPr/>
-          <w:p>
-            <w:pPr>
-              <w:pStyle w:val="Compact"/>
-              <w:jc w:val="left"/>
-            </w:pPr>
-            <w:r>
-              <w:t xml:space="preserve">Action</w:t>
-            </w:r>
-          </w:p>
-        </w:tc>
-        <w:tc>
-          <w:tcPr/>
-          <w:p>
-            <w:pPr>
-              <w:pStyle w:val="Compact"/>
-              <w:jc w:val="center"/>
-            </w:pPr>
-            <w:r>
-              <w:t xml:space="preserve">0.0061 [0.0009, 0.0119]</w:t>
-            </w:r>
-          </w:p>
-        </w:tc>
-        <w:tc>
-          <w:tcPr/>
-          <w:p>
-            <w:pPr>
-              <w:pStyle w:val="Compact"/>
-              <w:jc w:val="center"/>
-            </w:pPr>
-            <w:r>
-              <w:t xml:space="preserve">Yes</w:t>
-            </w:r>
-          </w:p>
-        </w:tc>
-      </w:tr>
-      <w:tr>
-        <w:tc>
-          <w:tcPr/>
-          <w:p>
-            <w:pPr>
-              <w:pStyle w:val="Compact"/>
-              <w:jc w:val="left"/>
-            </w:pPr>
-            <w:r>
-              <w:t xml:space="preserve">Object pixels</w:t>
-            </w:r>
-          </w:p>
-        </w:tc>
-        <w:tc>
-          <w:tcPr/>
-          <w:p>
-            <w:pPr>
-              <w:pStyle w:val="Compact"/>
-              <w:jc w:val="left"/>
-            </w:pPr>
-            <w:r>
-              <w:t xml:space="preserve">Endpoint</w:t>
-            </w:r>
-          </w:p>
-        </w:tc>
-        <w:tc>
-          <w:tcPr/>
-          <w:p>
-            <w:pPr>
-              <w:pStyle w:val="Compact"/>
-              <w:jc w:val="center"/>
-            </w:pPr>
-            <m:oMath>
-              <m:r>
-                <m:rPr>
-                  <m:sty m:val="p"/>
-                </m:rPr>
-                <m:t>−</m:t>
-              </m:r>
-              <m:r>
-                <m:t>0.0001</m:t>
-              </m:r>
-            </m:oMath>
-            <w:r>
-              <w:t xml:space="preserve"> </w:t>
-            </w:r>
-            <w:r>
-              <w:t xml:space="preserve">[</w:t>
-            </w:r>
-            <m:oMath>
-              <m:r>
-                <m:rPr>
-                  <m:sty m:val="p"/>
-                </m:rPr>
-                <m:t>−</m:t>
-              </m:r>
-              <m:r>
-                <m:t>0.0254</m:t>
-              </m:r>
-            </m:oMath>
-            <w:r>
-              <w:t xml:space="preserve">, 0.0239]</w:t>
-            </w:r>
-          </w:p>
-        </w:tc>
-        <w:tc>
-          <w:tcPr/>
-          <w:p>
-            <w:pPr>
-              <w:pStyle w:val="Compact"/>
-              <w:jc w:val="center"/>
-            </w:pPr>
-            <w:r>
-              <w:t xml:space="preserve">Yes</w:t>
-            </w:r>
-          </w:p>
-        </w:tc>
-      </w:tr>
-    </w:tbl>
     <w:bookmarkEnd w:id="34"/>
     <w:bookmarkEnd w:id="35"/>
-    <w:bookmarkEnd w:id="36"/>
-    <w:bookmarkStart w:id="44" w:name="sec:pathway"/>
+    <w:bookmarkStart w:id="43" w:name="sec:pathway"/>
     <w:p>
       <w:pPr>
         <w:pStyle w:val="Heading2"/>
@@ -5564,7 +5208,7 @@
         <w:t xml:space="preserve">Future-token attention provides an active route from generated futures to action. Population-level K/V replacement in Cosmos 3 gives the stronger of the two pathway tests.</w:t>
       </w:r>
     </w:p>
-    <w:bookmarkStart w:id="37" w:name="cosmos-policy.-3"/>
+    <w:bookmarkStart w:id="36" w:name="cosmos-policy.-3"/>
     <w:p>
       <w:pPr>
         <w:pStyle w:val="Heading4"/>
@@ -5737,8 +5381,8 @@
         <w:t xml:space="preserve">larger. Executed endpoints support the same bounded conclusion, although state counts and intervals are not available for this analysis. The late future-to-action edge is active, but it is neither the only nor the largest route through the block.</w:t>
       </w:r>
     </w:p>
-    <w:bookmarkEnd w:id="37"/>
-    <w:bookmarkStart w:id="43" w:name="cosmos-3.-3"/>
+    <w:bookmarkEnd w:id="36"/>
+    <w:bookmarkStart w:id="42" w:name="cosmos-3.-3"/>
     <w:p>
       <w:pPr>
         <w:pStyle w:val="Heading4"/>
@@ -5838,12 +5482,12 @@
       <w:r>
         <w:t xml:space="preserve">endpoint shift (Table </w:t>
       </w:r>
-      <w:hyperlink w:anchor="tab:pathway">
+      <w:hyperlink w:anchor="tab:mechanisms">
         <w:r>
           <w:rPr>
             <w:rStyle w:val="Hyperlink"/>
           </w:rPr>
-          <w:t xml:space="preserve">3</w:t>
+          <w:t xml:space="preserve">2</w:t>
         </w:r>
       </w:hyperlink>
       <w:r>
@@ -5894,246 +5538,931 @@
         <w:t xml:space="preserve">; all prespecified primary sign tests remain significant after Holm correction. Because token count and attention positions remain fixed, donor-specific information travels through this future-token K/V interface. The experiment does not identify every head or feature, exclude interacting unpatched routes, or establish a complete circuit.</w:t>
       </w:r>
     </w:p>
-    <w:bookmarkStart w:id="38" w:name="tab:pathway"/>
+    <w:bookmarkStart w:id="37" w:name="tab:mechanisms"/>
     <w:p>
       <w:pPr>
         <w:pStyle w:val="TableCaption"/>
-      </w:pPr>
-      <w:r>
-        <w:t xml:space="preserve">Cosmos 3 future-token pathway across 22 states. Each unpatched donor-minus-self effect is shown beside the reduction caused by replacing donor-future K/V with self-future K/V.</w:t>
-      </w:r>
-      <w:r>
-        <w:t xml:space="preserve"> </w:t>
-      </w:r>
-      <w:r>
-        <w:t xml:space="preserve">“Removed”</w:t>
-      </w:r>
-      <w:r>
-        <w:t xml:space="preserve"> </w:t>
-      </w:r>
-      <w:r>
-        <w:t xml:space="preserve">is the ratio of point estimates, not an independently estimated mediation proportion.</w:t>
+        <w:keepNext/>
+        <w:pageBreakBefore/>
+      </w:pPr>
+      <w:r>
+        <w:t xml:space="preserve">Two complementary Cosmos 3 mechanism tests in one table. For content sufficiency (10 states), the effect is donor steering recreated by isolated pixels;</w:t>
+      </w:r>
+      <w:r>
+        <w:t xml:space="preserve"> </w:t>
+      </w:r>
+      <w:r>
+        <w:t xml:space="preserve">“No”</w:t>
+      </w:r>
+      <w:r>
+        <w:t xml:space="preserve"> </w:t>
+      </w:r>
+      <w:r>
+        <w:t xml:space="preserve">means the entire interval lies within the prespecified</w:t>
+      </w:r>
+      <w:r>
+        <w:t xml:space="preserve"> </w:t>
+      </w:r>
+      <m:oMath>
+        <m:r>
+          <m:rPr>
+            <m:sty m:val="p"/>
+          </m:rPr>
+          <m:t>[</m:t>
+        </m:r>
+        <m:r>
+          <m:rPr>
+            <m:sty m:val="p"/>
+          </m:rPr>
+          <m:t>−</m:t>
+        </m:r>
+        <m:r>
+          <m:t>0.10</m:t>
+        </m:r>
+        <m:r>
+          <m:rPr>
+            <m:sty m:val="p"/>
+          </m:rPr>
+          <m:t>,</m:t>
+        </m:r>
+        <m:r>
+          <m:t>0.10</m:t>
+        </m:r>
+        <m:r>
+          <m:rPr>
+            <m:sty m:val="p"/>
+          </m:rPr>
+          <m:t>]</m:t>
+        </m:r>
+      </m:oMath>
+      <w:r>
+        <w:t xml:space="preserve"> </w:t>
+      </w:r>
+      <w:r>
+        <w:t xml:space="preserve">equivalence region. For pathway dependence (22 states), the effect is donor steering lost after replacing donor-future K/V with self-future K/V; percentages compare point estimates with unpatched steering. Isolated robot or object pixels are insufficient, while the complete future-token K/V interface carries most of the effect.</w:t>
       </w:r>
     </w:p>
     <w:tbl>
       <w:tblPr>
         <w:tblStyle w:val="Table"/>
         <w:tblW w:type="auto" w:w="0"/>
+        <w:tblLayout w:type="fixed"/>
         <w:tblLook w:firstRow="1" w:lastRow="0" w:firstColumn="0" w:lastColumn="0" w:noHBand="0" w:noVBand="0" w:val="0020"/>
-        <w:tblCaption w:val="Cosmos 3 future-token pathway across 22 states. Each unpatched donor-minus-self effect is shown beside the reduction caused by replacing donor-future K/V with self-future K/V. “Removed” is the ratio of point estimates, not an independently estimated mediation proportion."/>
+        <w:tblCaption w:val="Two complementary Cosmos 3 mechanism tests in one table. For content sufficiency (10 states), the effect is donor steering recreated by isolated pixels; “No” means the entire interval lies within the prespecified [-0.10,0.10] equivalence region. For pathway dependence (22 states), the effect is donor steering lost after replacing donor-future K/V with self-future K/V; percentages compare point estimates with unpatched steering. Isolated robot or object pixels are insufficient, while the complete future-token K/V interface carries most of the effect."/>
       </w:tblPr>
       <w:tblGrid>
-        <w:gridCol w:w="1980"/>
-        <w:gridCol w:w="1980"/>
-        <w:gridCol w:w="1980"/>
-        <w:gridCol w:w="1980"/>
+        <w:gridCol w:w="1584"/>
+        <w:gridCol w:w="1584"/>
+        <w:gridCol w:w="1584"/>
+        <w:gridCol w:w="1584"/>
+        <w:gridCol w:w="1584"/>
       </w:tblGrid>
       <w:tr>
         <w:trPr>
           <w:tblHeader w:val="on"/>
+          <w:cantSplit/>
         </w:trPr>
         <w:tc>
-          <w:tcPr/>
-          <w:p>
-            <w:pPr>
-              <w:pStyle w:val="Compact"/>
-              <w:jc w:val="left"/>
-            </w:pPr>
-            <w:r>
+          <w:tcPr>
+            <w:tcW w:type="dxa" w:w="2160"/>
+          </w:tcPr>
+          <w:p>
+            <w:pPr>
+              <w:pStyle w:val="Compact"/>
+              <w:spacing w:before="0" w:after="0" w:line="240" w:lineRule="auto"/>
+              <w:jc w:val="left"/>
+            </w:pPr>
+            <w:r>
+              <w:rPr>
+                <w:sz w:val="16"/>
+              </w:rPr>
+              <w:t xml:space="preserve">Question</w:t>
+            </w:r>
+          </w:p>
+        </w:tc>
+        <w:tc>
+          <w:tcPr>
+            <w:tcW w:type="dxa" w:w="2160"/>
+          </w:tcPr>
+          <w:p>
+            <w:pPr>
+              <w:pStyle w:val="Compact"/>
+              <w:spacing w:before="0" w:after="0" w:line="240" w:lineRule="auto"/>
+              <w:jc w:val="left"/>
+            </w:pPr>
+            <w:r>
+              <w:rPr>
+                <w:sz w:val="16"/>
+              </w:rPr>
+              <w:t xml:space="preserve">Intervention</w:t>
+            </w:r>
+          </w:p>
+        </w:tc>
+        <w:tc>
+          <w:tcPr>
+            <w:tcW w:type="dxa" w:w="1440"/>
+          </w:tcPr>
+          <w:p>
+            <w:pPr>
+              <w:pStyle w:val="Compact"/>
+              <w:spacing w:before="0" w:after="0" w:line="240" w:lineRule="auto"/>
+              <w:jc w:val="left"/>
+            </w:pPr>
+            <w:r>
+              <w:rPr>
+                <w:sz w:val="16"/>
+              </w:rPr>
               <w:t xml:space="preserve">Outcome</w:t>
             </w:r>
           </w:p>
         </w:tc>
         <w:tc>
-          <w:tcPr/>
-          <w:p>
-            <w:pPr>
-              <w:pStyle w:val="Compact"/>
-              <w:jc w:val="center"/>
-            </w:pPr>
-            <w:r>
-              <w:t xml:space="preserve">Unpatched steering</w:t>
-            </w:r>
-          </w:p>
-        </w:tc>
-        <w:tc>
-          <w:tcPr/>
-          <w:p>
-            <w:pPr>
-              <w:pStyle w:val="Compact"/>
-              <w:jc w:val="center"/>
-            </w:pPr>
-            <w:r>
-              <w:t xml:space="preserve">K/V replacement loss</w:t>
-            </w:r>
-          </w:p>
-        </w:tc>
-        <w:tc>
-          <w:tcPr/>
-          <w:p>
-            <w:pPr>
-              <w:pStyle w:val="Compact"/>
-              <w:jc w:val="center"/>
-            </w:pPr>
-            <w:r>
-              <w:t xml:space="preserve">Point estimate removed</w:t>
+          <w:tcPr>
+            <w:tcW w:type="dxa" w:w="2376"/>
+          </w:tcPr>
+          <w:p>
+            <w:pPr>
+              <w:pStyle w:val="Compact"/>
+              <w:spacing w:before="0" w:after="0" w:line="240" w:lineRule="auto"/>
+              <w:jc w:val="left"/>
+            </w:pPr>
+            <w:r>
+              <w:rPr>
+                <w:sz w:val="16"/>
+              </w:rPr>
+              <w:t xml:space="preserve">Effect [95% CI]</w:t>
+            </w:r>
+          </w:p>
+        </w:tc>
+        <w:tc>
+          <w:tcPr>
+            <w:tcW w:type="dxa" w:w="1224"/>
+          </w:tcPr>
+          <w:p>
+            <w:pPr>
+              <w:pStyle w:val="Compact"/>
+              <w:spacing w:before="0" w:after="0" w:line="240" w:lineRule="auto"/>
+              <w:jc w:val="left"/>
+            </w:pPr>
+            <w:r>
+              <w:rPr>
+                <w:sz w:val="16"/>
+              </w:rPr>
+              <w:t xml:space="preserve">Answer</w:t>
             </w:r>
           </w:p>
         </w:tc>
       </w:tr>
       <w:tr>
-        <w:tc>
-          <w:tcPr/>
-          <w:p>
-            <w:pPr>
-              <w:pStyle w:val="Compact"/>
-              <w:jc w:val="left"/>
-            </w:pPr>
-            <w:r>
-              <w:t xml:space="preserve">Predicted action</w:t>
-            </w:r>
-          </w:p>
-        </w:tc>
-        <w:tc>
-          <w:tcPr/>
-          <w:p>
-            <w:pPr>
-              <w:pStyle w:val="Compact"/>
-              <w:jc w:val="center"/>
-            </w:pPr>
-            <w:r>
-              <w:t xml:space="preserve">0.992 [0.972, 1.010]</w:t>
-            </w:r>
-          </w:p>
-        </w:tc>
-        <w:tc>
-          <w:tcPr/>
-          <w:p>
-            <w:pPr>
-              <w:pStyle w:val="Compact"/>
-              <w:jc w:val="center"/>
-            </w:pPr>
-            <w:r>
-              <w:t xml:space="preserve">0.877 [0.842, 0.910]</w:t>
-            </w:r>
-          </w:p>
-        </w:tc>
-        <w:tc>
-          <w:tcPr/>
-          <w:p>
-            <w:pPr>
-              <w:pStyle w:val="Compact"/>
-              <w:jc w:val="center"/>
-            </w:pPr>
-            <w:r>
-              <w:t xml:space="preserve">88%</w:t>
+        <w:trPr>
+          <w:cantSplit/>
+        </w:trPr>
+        <w:tc>
+          <w:tcPr>
+            <w:tcW w:type="dxa" w:w="2160"/>
+          </w:tcPr>
+          <w:p>
+            <w:pPr>
+              <w:pStyle w:val="Compact"/>
+              <w:spacing w:before="0" w:after="0" w:line="240" w:lineRule="auto"/>
+              <w:jc w:val="left"/>
+            </w:pPr>
+            <w:r>
+              <w:rPr>
+                <w:sz w:val="16"/>
+              </w:rPr>
+              <w:t xml:space="preserve">Content sufficient?</w:t>
+            </w:r>
+          </w:p>
+        </w:tc>
+        <w:tc>
+          <w:tcPr>
+            <w:tcW w:type="dxa" w:w="2160"/>
+          </w:tcPr>
+          <w:p>
+            <w:pPr>
+              <w:pStyle w:val="Compact"/>
+              <w:spacing w:before="0" w:after="0" w:line="240" w:lineRule="auto"/>
+              <w:jc w:val="left"/>
+            </w:pPr>
+            <w:r>
+              <w:rPr>
+                <w:sz w:val="16"/>
+              </w:rPr>
+              <w:t xml:space="preserve">Robot pixels</w:t>
+            </w:r>
+          </w:p>
+        </w:tc>
+        <w:tc>
+          <w:tcPr>
+            <w:tcW w:type="dxa" w:w="1440"/>
+          </w:tcPr>
+          <w:p>
+            <w:pPr>
+              <w:pStyle w:val="Compact"/>
+              <w:spacing w:before="0" w:after="0" w:line="240" w:lineRule="auto"/>
+              <w:jc w:val="left"/>
+            </w:pPr>
+            <w:r>
+              <w:rPr>
+                <w:sz w:val="16"/>
+              </w:rPr>
+              <w:t xml:space="preserve">Action</w:t>
+            </w:r>
+          </w:p>
+        </w:tc>
+        <w:tc>
+          <w:tcPr>
+            <w:tcW w:type="dxa" w:w="2376"/>
+          </w:tcPr>
+          <w:p>
+            <w:pPr>
+              <w:pStyle w:val="Compact"/>
+              <w:spacing w:before="0" w:after="0" w:line="240" w:lineRule="auto"/>
+              <w:jc w:val="left"/>
+            </w:pPr>
+            <w:r>
+              <w:rPr>
+                <w:sz w:val="16"/>
+              </w:rPr>
+              <w:t xml:space="preserve">0.0022 [</w:t>
+            </w:r>
+            <m:oMath>
+              <m:r>
+                <m:rPr>
+                  <m:sty m:val="p"/>
+                </m:rPr>
+                <m:t>−</m:t>
+              </m:r>
+              <m:r>
+                <m:t>0.0016</m:t>
+              </m:r>
+            </m:oMath>
+            <w:r>
+              <w:rPr>
+                <w:sz w:val="16"/>
+              </w:rPr>
+              <w:t xml:space="preserve">, 0.0060]</w:t>
+            </w:r>
+          </w:p>
+        </w:tc>
+        <w:tc>
+          <w:tcPr>
+            <w:tcW w:type="dxa" w:w="1224"/>
+          </w:tcPr>
+          <w:p>
+            <w:pPr>
+              <w:pStyle w:val="Compact"/>
+              <w:spacing w:before="0" w:after="0" w:line="240" w:lineRule="auto"/>
+              <w:jc w:val="left"/>
+            </w:pPr>
+            <w:r>
+              <w:rPr>
+                <w:b/>
+                <w:bCs/>
+                <w:sz w:val="16"/>
+              </w:rPr>
+              <w:t xml:space="preserve">No</w:t>
             </w:r>
           </w:p>
         </w:tc>
       </w:tr>
       <w:tr>
-        <w:tc>
-          <w:tcPr/>
-          <w:p>
-            <w:pPr>
-              <w:pStyle w:val="Compact"/>
-              <w:jc w:val="left"/>
-            </w:pPr>
-            <w:r>
-              <w:t xml:space="preserve">Executed action</w:t>
-            </w:r>
-          </w:p>
-        </w:tc>
-        <w:tc>
-          <w:tcPr/>
-          <w:p>
-            <w:pPr>
-              <w:pStyle w:val="Compact"/>
-              <w:jc w:val="center"/>
-            </w:pPr>
-            <w:r>
-              <w:t xml:space="preserve">0.983 [0.890, 1.064]</w:t>
-            </w:r>
-          </w:p>
-        </w:tc>
-        <w:tc>
-          <w:tcPr/>
-          <w:p>
-            <w:pPr>
-              <w:pStyle w:val="Compact"/>
-              <w:jc w:val="center"/>
-            </w:pPr>
-            <w:r>
-              <w:t xml:space="preserve">0.814 [0.723, 0.900]</w:t>
-            </w:r>
-          </w:p>
-        </w:tc>
-        <w:tc>
-          <w:tcPr/>
-          <w:p>
-            <w:pPr>
-              <w:pStyle w:val="Compact"/>
-              <w:jc w:val="center"/>
-            </w:pPr>
-            <w:r>
-              <w:t xml:space="preserve">83%</w:t>
+        <w:trPr>
+          <w:cantSplit/>
+        </w:trPr>
+        <w:tc>
+          <w:tcPr>
+            <w:tcW w:type="dxa" w:w="2160"/>
+          </w:tcPr>
+          <w:p>
+            <w:pPr>
+              <w:pStyle w:val="Compact"/>
+              <w:spacing w:before="0" w:after="0" w:line="240" w:lineRule="auto"/>
+              <w:jc w:val="left"/>
+            </w:pPr>
+            <w:r>
+              <w:rPr>
+                <w:sz w:val="16"/>
+              </w:rPr>
+              <w:t xml:space="preserve">Content sufficient?</w:t>
+            </w:r>
+          </w:p>
+        </w:tc>
+        <w:tc>
+          <w:tcPr>
+            <w:tcW w:type="dxa" w:w="2160"/>
+          </w:tcPr>
+          <w:p>
+            <w:pPr>
+              <w:pStyle w:val="Compact"/>
+              <w:spacing w:before="0" w:after="0" w:line="240" w:lineRule="auto"/>
+              <w:jc w:val="left"/>
+            </w:pPr>
+            <w:r>
+              <w:rPr>
+                <w:sz w:val="16"/>
+              </w:rPr>
+              <w:t xml:space="preserve">Robot pixels</w:t>
+            </w:r>
+          </w:p>
+        </w:tc>
+        <w:tc>
+          <w:tcPr>
+            <w:tcW w:type="dxa" w:w="1440"/>
+          </w:tcPr>
+          <w:p>
+            <w:pPr>
+              <w:pStyle w:val="Compact"/>
+              <w:spacing w:before="0" w:after="0" w:line="240" w:lineRule="auto"/>
+              <w:jc w:val="left"/>
+            </w:pPr>
+            <w:r>
+              <w:rPr>
+                <w:sz w:val="16"/>
+              </w:rPr>
+              <w:t xml:space="preserve">Endpoint</w:t>
+            </w:r>
+          </w:p>
+        </w:tc>
+        <w:tc>
+          <w:tcPr>
+            <w:tcW w:type="dxa" w:w="2376"/>
+          </w:tcPr>
+          <w:p>
+            <w:pPr>
+              <w:pStyle w:val="Compact"/>
+              <w:spacing w:before="0" w:after="0" w:line="240" w:lineRule="auto"/>
+              <w:jc w:val="left"/>
+            </w:pPr>
+            <w:r>
+              <w:rPr>
+                <w:sz w:val="16"/>
+              </w:rPr>
+              <w:t xml:space="preserve">0.0102 [</w:t>
+            </w:r>
+            <m:oMath>
+              <m:r>
+                <m:rPr>
+                  <m:sty m:val="p"/>
+                </m:rPr>
+                <m:t>−</m:t>
+              </m:r>
+              <m:r>
+                <m:t>0.0067</m:t>
+              </m:r>
+            </m:oMath>
+            <w:r>
+              <w:rPr>
+                <w:sz w:val="16"/>
+              </w:rPr>
+              <w:t xml:space="preserve">, 0.0275]</w:t>
+            </w:r>
+          </w:p>
+        </w:tc>
+        <w:tc>
+          <w:tcPr>
+            <w:tcW w:type="dxa" w:w="1224"/>
+          </w:tcPr>
+          <w:p>
+            <w:pPr>
+              <w:pStyle w:val="Compact"/>
+              <w:spacing w:before="0" w:after="0" w:line="240" w:lineRule="auto"/>
+              <w:jc w:val="left"/>
+            </w:pPr>
+            <w:r>
+              <w:rPr>
+                <w:b/>
+                <w:bCs/>
+                <w:sz w:val="16"/>
+              </w:rPr>
+              <w:t xml:space="preserve">No</w:t>
             </w:r>
           </w:p>
         </w:tc>
       </w:tr>
       <w:tr>
-        <w:tc>
-          <w:tcPr/>
-          <w:p>
-            <w:pPr>
-              <w:pStyle w:val="Compact"/>
-              <w:jc w:val="left"/>
-            </w:pPr>
-            <w:r>
+        <w:trPr>
+          <w:cantSplit/>
+        </w:trPr>
+        <w:tc>
+          <w:tcPr>
+            <w:tcW w:type="dxa" w:w="2160"/>
+          </w:tcPr>
+          <w:p>
+            <w:pPr>
+              <w:pStyle w:val="Compact"/>
+              <w:spacing w:before="0" w:after="0" w:line="240" w:lineRule="auto"/>
+              <w:jc w:val="left"/>
+            </w:pPr>
+            <w:r>
+              <w:rPr>
+                <w:sz w:val="16"/>
+              </w:rPr>
+              <w:t xml:space="preserve">Content sufficient?</w:t>
+            </w:r>
+          </w:p>
+        </w:tc>
+        <w:tc>
+          <w:tcPr>
+            <w:tcW w:type="dxa" w:w="2160"/>
+          </w:tcPr>
+          <w:p>
+            <w:pPr>
+              <w:pStyle w:val="Compact"/>
+              <w:spacing w:before="0" w:after="0" w:line="240" w:lineRule="auto"/>
+              <w:jc w:val="left"/>
+            </w:pPr>
+            <w:r>
+              <w:rPr>
+                <w:sz w:val="16"/>
+              </w:rPr>
+              <w:t xml:space="preserve">Object pixels</w:t>
+            </w:r>
+          </w:p>
+        </w:tc>
+        <w:tc>
+          <w:tcPr>
+            <w:tcW w:type="dxa" w:w="1440"/>
+          </w:tcPr>
+          <w:p>
+            <w:pPr>
+              <w:pStyle w:val="Compact"/>
+              <w:spacing w:before="0" w:after="0" w:line="240" w:lineRule="auto"/>
+              <w:jc w:val="left"/>
+            </w:pPr>
+            <w:r>
+              <w:rPr>
+                <w:sz w:val="16"/>
+              </w:rPr>
+              <w:t xml:space="preserve">Action</w:t>
+            </w:r>
+          </w:p>
+        </w:tc>
+        <w:tc>
+          <w:tcPr>
+            <w:tcW w:type="dxa" w:w="2376"/>
+          </w:tcPr>
+          <w:p>
+            <w:pPr>
+              <w:pStyle w:val="Compact"/>
+              <w:spacing w:before="0" w:after="0" w:line="240" w:lineRule="auto"/>
+              <w:jc w:val="left"/>
+            </w:pPr>
+            <w:r>
+              <w:rPr>
+                <w:sz w:val="16"/>
+              </w:rPr>
+              <w:t xml:space="preserve">0.0061 [0.0009, 0.0119]</w:t>
+            </w:r>
+          </w:p>
+        </w:tc>
+        <w:tc>
+          <w:tcPr>
+            <w:tcW w:type="dxa" w:w="1224"/>
+          </w:tcPr>
+          <w:p>
+            <w:pPr>
+              <w:pStyle w:val="Compact"/>
+              <w:spacing w:before="0" w:after="0" w:line="240" w:lineRule="auto"/>
+              <w:jc w:val="left"/>
+            </w:pPr>
+            <w:r>
+              <w:rPr>
+                <w:b/>
+                <w:bCs/>
+                <w:sz w:val="16"/>
+              </w:rPr>
+              <w:t xml:space="preserve">No</w:t>
+            </w:r>
+          </w:p>
+        </w:tc>
+      </w:tr>
+      <w:tr>
+        <w:trPr>
+          <w:cantSplit/>
+        </w:trPr>
+        <w:tc>
+          <w:tcPr>
+            <w:tcW w:type="dxa" w:w="2160"/>
+          </w:tcPr>
+          <w:p>
+            <w:pPr>
+              <w:pStyle w:val="Compact"/>
+              <w:spacing w:before="0" w:after="0" w:line="240" w:lineRule="auto"/>
+              <w:jc w:val="left"/>
+            </w:pPr>
+            <w:r>
+              <w:rPr>
+                <w:sz w:val="16"/>
+              </w:rPr>
+              <w:t xml:space="preserve">Content sufficient?</w:t>
+            </w:r>
+          </w:p>
+        </w:tc>
+        <w:tc>
+          <w:tcPr>
+            <w:tcW w:type="dxa" w:w="2160"/>
+          </w:tcPr>
+          <w:p>
+            <w:pPr>
+              <w:pStyle w:val="Compact"/>
+              <w:spacing w:before="0" w:after="0" w:line="240" w:lineRule="auto"/>
+              <w:jc w:val="left"/>
+            </w:pPr>
+            <w:r>
+              <w:rPr>
+                <w:sz w:val="16"/>
+              </w:rPr>
+              <w:t xml:space="preserve">Object pixels</w:t>
+            </w:r>
+          </w:p>
+        </w:tc>
+        <w:tc>
+          <w:tcPr>
+            <w:tcW w:type="dxa" w:w="1440"/>
+          </w:tcPr>
+          <w:p>
+            <w:pPr>
+              <w:pStyle w:val="Compact"/>
+              <w:spacing w:before="0" w:after="0" w:line="240" w:lineRule="auto"/>
+              <w:jc w:val="left"/>
+            </w:pPr>
+            <w:r>
+              <w:rPr>
+                <w:sz w:val="16"/>
+              </w:rPr>
+              <w:t xml:space="preserve">Endpoint</w:t>
+            </w:r>
+          </w:p>
+        </w:tc>
+        <w:tc>
+          <w:tcPr>
+            <w:tcW w:type="dxa" w:w="2376"/>
+          </w:tcPr>
+          <w:p>
+            <w:pPr>
+              <w:pStyle w:val="Compact"/>
+              <w:spacing w:before="0" w:after="0" w:line="240" w:lineRule="auto"/>
+              <w:jc w:val="left"/>
+            </w:pPr>
+            <m:oMath>
+              <m:r>
+                <m:rPr>
+                  <m:sty m:val="p"/>
+                </m:rPr>
+                <m:t>−</m:t>
+              </m:r>
+              <m:r>
+                <m:t>0.0001</m:t>
+              </m:r>
+            </m:oMath>
+            <w:r>
+              <w:rPr>
+                <w:sz w:val="16"/>
+              </w:rPr>
+              <w:t xml:space="preserve"> </w:t>
+            </w:r>
+            <w:r>
+              <w:rPr>
+                <w:sz w:val="16"/>
+              </w:rPr>
+              <w:t xml:space="preserve">[</w:t>
+            </w:r>
+            <m:oMath>
+              <m:r>
+                <m:rPr>
+                  <m:sty m:val="p"/>
+                </m:rPr>
+                <m:t>−</m:t>
+              </m:r>
+              <m:r>
+                <m:t>0.0254</m:t>
+              </m:r>
+            </m:oMath>
+            <w:r>
+              <w:rPr>
+                <w:sz w:val="16"/>
+              </w:rPr>
+              <w:t xml:space="preserve">, 0.0239]</w:t>
+            </w:r>
+          </w:p>
+        </w:tc>
+        <w:tc>
+          <w:tcPr>
+            <w:tcW w:type="dxa" w:w="1224"/>
+          </w:tcPr>
+          <w:p>
+            <w:pPr>
+              <w:pStyle w:val="Compact"/>
+              <w:spacing w:before="0" w:after="0" w:line="240" w:lineRule="auto"/>
+              <w:jc w:val="left"/>
+            </w:pPr>
+            <w:r>
+              <w:rPr>
+                <w:b/>
+                <w:bCs/>
+                <w:sz w:val="16"/>
+              </w:rPr>
+              <w:t xml:space="preserve">No</w:t>
+            </w:r>
+          </w:p>
+        </w:tc>
+      </w:tr>
+      <w:tr>
+        <w:trPr>
+          <w:cantSplit/>
+        </w:trPr>
+        <w:tc>
+          <w:tcPr>
+            <w:tcW w:type="dxa" w:w="2160"/>
+          </w:tcPr>
+          <w:p>
+            <w:pPr>
+              <w:pStyle w:val="Compact"/>
+              <w:spacing w:before="0" w:after="0" w:line="240" w:lineRule="auto"/>
+              <w:jc w:val="left"/>
+            </w:pPr>
+            <w:r>
+              <w:rPr>
+                <w:sz w:val="16"/>
+              </w:rPr>
+              <w:t xml:space="preserve">Future K/V carries effect?</w:t>
+            </w:r>
+          </w:p>
+        </w:tc>
+        <w:tc>
+          <w:tcPr>
+            <w:tcW w:type="dxa" w:w="2160"/>
+          </w:tcPr>
+          <w:p>
+            <w:pPr>
+              <w:pStyle w:val="Compact"/>
+              <w:spacing w:before="0" w:after="0" w:line="240" w:lineRule="auto"/>
+              <w:jc w:val="left"/>
+            </w:pPr>
+            <w:r>
+              <w:rPr>
+                <w:sz w:val="16"/>
+              </w:rPr>
+              <w:t xml:space="preserve">Self K/V replacement</w:t>
+            </w:r>
+          </w:p>
+        </w:tc>
+        <w:tc>
+          <w:tcPr>
+            <w:tcW w:type="dxa" w:w="1440"/>
+          </w:tcPr>
+          <w:p>
+            <w:pPr>
+              <w:pStyle w:val="Compact"/>
+              <w:spacing w:before="0" w:after="0" w:line="240" w:lineRule="auto"/>
+              <w:jc w:val="left"/>
+            </w:pPr>
+            <w:r>
+              <w:rPr>
+                <w:sz w:val="16"/>
+              </w:rPr>
+              <w:t xml:space="preserve">Predicted action</w:t>
+            </w:r>
+          </w:p>
+        </w:tc>
+        <w:tc>
+          <w:tcPr>
+            <w:tcW w:type="dxa" w:w="2376"/>
+          </w:tcPr>
+          <w:p>
+            <w:pPr>
+              <w:pStyle w:val="Compact"/>
+              <w:spacing w:before="0" w:after="0" w:line="240" w:lineRule="auto"/>
+              <w:jc w:val="left"/>
+            </w:pPr>
+            <w:r>
+              <w:rPr>
+                <w:sz w:val="16"/>
+              </w:rPr>
+              <w:t xml:space="preserve">0.877 [0.842, 0.910]</w:t>
+            </w:r>
+          </w:p>
+        </w:tc>
+        <w:tc>
+          <w:tcPr>
+            <w:tcW w:type="dxa" w:w="1224"/>
+          </w:tcPr>
+          <w:p>
+            <w:pPr>
+              <w:pStyle w:val="Compact"/>
+              <w:spacing w:before="0" w:after="0" w:line="240" w:lineRule="auto"/>
+              <w:jc w:val="left"/>
+            </w:pPr>
+            <w:r>
+              <w:rPr>
+                <w:b/>
+                <w:bCs/>
+                <w:sz w:val="16"/>
+              </w:rPr>
+              <w:t xml:space="preserve">Yes (88%)</w:t>
+            </w:r>
+          </w:p>
+        </w:tc>
+      </w:tr>
+      <w:tr>
+        <w:trPr>
+          <w:cantSplit/>
+        </w:trPr>
+        <w:tc>
+          <w:tcPr>
+            <w:tcW w:type="dxa" w:w="2160"/>
+          </w:tcPr>
+          <w:p>
+            <w:pPr>
+              <w:pStyle w:val="Compact"/>
+              <w:spacing w:before="0" w:after="0" w:line="240" w:lineRule="auto"/>
+              <w:jc w:val="left"/>
+            </w:pPr>
+            <w:r>
+              <w:rPr>
+                <w:sz w:val="16"/>
+              </w:rPr>
+              <w:t xml:space="preserve">Future K/V carries effect?</w:t>
+            </w:r>
+          </w:p>
+        </w:tc>
+        <w:tc>
+          <w:tcPr>
+            <w:tcW w:type="dxa" w:w="2160"/>
+          </w:tcPr>
+          <w:p>
+            <w:pPr>
+              <w:pStyle w:val="Compact"/>
+              <w:spacing w:before="0" w:after="0" w:line="240" w:lineRule="auto"/>
+              <w:jc w:val="left"/>
+            </w:pPr>
+            <w:r>
+              <w:rPr>
+                <w:sz w:val="16"/>
+              </w:rPr>
+              <w:t xml:space="preserve">Self K/V replacement</w:t>
+            </w:r>
+          </w:p>
+        </w:tc>
+        <w:tc>
+          <w:tcPr>
+            <w:tcW w:type="dxa" w:w="1440"/>
+          </w:tcPr>
+          <w:p>
+            <w:pPr>
+              <w:pStyle w:val="Compact"/>
+              <w:spacing w:before="0" w:after="0" w:line="240" w:lineRule="auto"/>
+              <w:jc w:val="left"/>
+            </w:pPr>
+            <w:r>
+              <w:rPr>
+                <w:sz w:val="16"/>
+              </w:rPr>
+              <w:t xml:space="preserve">Executed action</w:t>
+            </w:r>
+          </w:p>
+        </w:tc>
+        <w:tc>
+          <w:tcPr>
+            <w:tcW w:type="dxa" w:w="2376"/>
+          </w:tcPr>
+          <w:p>
+            <w:pPr>
+              <w:pStyle w:val="Compact"/>
+              <w:spacing w:before="0" w:after="0" w:line="240" w:lineRule="auto"/>
+              <w:jc w:val="left"/>
+            </w:pPr>
+            <w:r>
+              <w:rPr>
+                <w:sz w:val="16"/>
+              </w:rPr>
+              <w:t xml:space="preserve">0.814 [0.723, 0.900]</w:t>
+            </w:r>
+          </w:p>
+        </w:tc>
+        <w:tc>
+          <w:tcPr>
+            <w:tcW w:type="dxa" w:w="1224"/>
+          </w:tcPr>
+          <w:p>
+            <w:pPr>
+              <w:pStyle w:val="Compact"/>
+              <w:spacing w:before="0" w:after="0" w:line="240" w:lineRule="auto"/>
+              <w:jc w:val="left"/>
+            </w:pPr>
+            <w:r>
+              <w:rPr>
+                <w:b/>
+                <w:bCs/>
+                <w:sz w:val="16"/>
+              </w:rPr>
+              <w:t xml:space="preserve">Yes (83%)</w:t>
+            </w:r>
+          </w:p>
+        </w:tc>
+      </w:tr>
+      <w:tr>
+        <w:trPr>
+          <w:cantSplit/>
+        </w:trPr>
+        <w:tc>
+          <w:tcPr>
+            <w:tcW w:type="dxa" w:w="2160"/>
+          </w:tcPr>
+          <w:p>
+            <w:pPr>
+              <w:pStyle w:val="Compact"/>
+              <w:spacing w:before="0" w:after="0" w:line="240" w:lineRule="auto"/>
+              <w:jc w:val="left"/>
+            </w:pPr>
+            <w:r>
+              <w:rPr>
+                <w:sz w:val="16"/>
+              </w:rPr>
+              <w:t xml:space="preserve">Future K/V carries effect?</w:t>
+            </w:r>
+          </w:p>
+        </w:tc>
+        <w:tc>
+          <w:tcPr>
+            <w:tcW w:type="dxa" w:w="2160"/>
+          </w:tcPr>
+          <w:p>
+            <w:pPr>
+              <w:pStyle w:val="Compact"/>
+              <w:spacing w:before="0" w:after="0" w:line="240" w:lineRule="auto"/>
+              <w:jc w:val="left"/>
+            </w:pPr>
+            <w:r>
+              <w:rPr>
+                <w:sz w:val="16"/>
+              </w:rPr>
+              <w:t xml:space="preserve">Self K/V replacement</w:t>
+            </w:r>
+          </w:p>
+        </w:tc>
+        <w:tc>
+          <w:tcPr>
+            <w:tcW w:type="dxa" w:w="1440"/>
+          </w:tcPr>
+          <w:p>
+            <w:pPr>
+              <w:pStyle w:val="Compact"/>
+              <w:spacing w:before="0" w:after="0" w:line="240" w:lineRule="auto"/>
+              <w:jc w:val="left"/>
+            </w:pPr>
+            <w:r>
+              <w:rPr>
+                <w:sz w:val="16"/>
+              </w:rPr>
               <w:t xml:space="preserve">Executed endpoint</w:t>
             </w:r>
           </w:p>
         </w:tc>
         <w:tc>
-          <w:tcPr/>
-          <w:p>
-            <w:pPr>
-              <w:pStyle w:val="Compact"/>
-              <w:jc w:val="center"/>
-            </w:pPr>
-            <w:r>
-              <w:t xml:space="preserve">1.003 [0.950, 1.050]</w:t>
-            </w:r>
-          </w:p>
-        </w:tc>
-        <w:tc>
-          <w:tcPr/>
-          <w:p>
-            <w:pPr>
-              <w:pStyle w:val="Compact"/>
-              <w:jc w:val="center"/>
-            </w:pPr>
-            <w:r>
+          <w:tcPr>
+            <w:tcW w:type="dxa" w:w="2376"/>
+          </w:tcPr>
+          <w:p>
+            <w:pPr>
+              <w:pStyle w:val="Compact"/>
+              <w:spacing w:before="0" w:after="0" w:line="240" w:lineRule="auto"/>
+              <w:jc w:val="left"/>
+            </w:pPr>
+            <w:r>
+              <w:rPr>
+                <w:sz w:val="16"/>
+              </w:rPr>
               <w:t xml:space="preserve">0.851 [0.766, 0.922]</w:t>
             </w:r>
           </w:p>
         </w:tc>
         <w:tc>
-          <w:tcPr/>
-          <w:p>
-            <w:pPr>
-              <w:pStyle w:val="Compact"/>
-              <w:jc w:val="center"/>
-            </w:pPr>
-            <w:r>
-              <w:t xml:space="preserve">85%</w:t>
+          <w:tcPr>
+            <w:tcW w:type="dxa" w:w="1224"/>
+          </w:tcPr>
+          <w:p>
+            <w:pPr>
+              <w:pStyle w:val="Compact"/>
+              <w:spacing w:before="0" w:after="0" w:line="240" w:lineRule="auto"/>
+              <w:jc w:val="left"/>
+            </w:pPr>
+            <w:r>
+              <w:rPr>
+                <w:b/>
+                <w:bCs/>
+                <w:sz w:val="16"/>
+              </w:rPr>
+              <w:t xml:space="preserve">Yes (85%)</w:t>
             </w:r>
           </w:p>
         </w:tc>
       </w:tr>
     </w:tbl>
-    <w:bookmarkEnd w:id="38"/>
-    <w:bookmarkStart w:id="42" w:name="fig:mechanisms"/>
+    <w:bookmarkEnd w:id="37"/>
+    <w:bookmarkStart w:id="41" w:name="fig:mechanisms"/>
     <w:p>
       <w:pPr>
         <w:pStyle w:val="CaptionedFigure"/>
@@ -6143,18 +6472,18 @@
           <wp:inline>
             <wp:extent cx="5334000" cy="1924272"/>
             <wp:effectExtent b="0" l="0" r="0" t="0"/>
-            <wp:docPr descr="" title="" id="40" name="Picture"/>
+            <wp:docPr descr="" title="" id="39" name="Picture"/>
             <a:graphic>
               <a:graphicData uri="http://schemas.openxmlformats.org/drawingml/2006/picture">
                 <pic:pic>
                   <pic:nvPicPr>
-                    <pic:cNvPr descr="figures/pathway_results.png" id="41" name="Picture"/>
+                    <pic:cNvPr descr="figures/pathway_results.png" id="40" name="Picture"/>
                     <pic:cNvPicPr>
                       <a:picLocks noChangeArrowheads="1" noChangeAspect="1"/>
                     </pic:cNvPicPr>
                   </pic:nvPicPr>
                   <pic:blipFill>
-                    <a:blip r:embed="rId39"/>
+                    <a:blip r:embed="rId38"/>
                     <a:stretch>
                       <a:fillRect/>
                     </a:stretch>
@@ -6189,17 +6518,111 @@
         <w:t xml:space="preserve">What carries the effect? Orange denotes donor-future steering, gray denotes isolated pixel-factor effects, and blue denotes the fraction removed by restoring self-future K/V. (a) In Cosmos Policy, the wrist-video future reproduces most of the whole-future action effect; future proprioception reproduces none. (b) In Cosmos 3, neither robot-only nor object-only pixels reproduce the whole-future effect; the shaded band is the prespecified equivalence region. (c) Replacing the donor-future K/V pathway with self-future K/V removes 83–88% of donor steering.</w:t>
       </w:r>
     </w:p>
+    <w:bookmarkEnd w:id="41"/>
     <w:bookmarkEnd w:id="42"/>
     <w:bookmarkEnd w:id="43"/>
     <w:bookmarkEnd w:id="44"/>
+    <w:bookmarkStart w:id="47" w:name="sec:discussion"/>
+    <w:p>
+      <w:pPr>
+        <w:pStyle w:val="Heading1"/>
+      </w:pPr>
+      <w:r>
+        <w:t xml:space="preserve">Discussion and Limitations</w:t>
+      </w:r>
+    </w:p>
+    <w:p>
+      <w:pPr>
+        <w:pStyle w:val="FirstParagraph"/>
+      </w:pPr>
+      <w:r>
+        <w:t xml:space="preserve">Across both WAM generations, transplanting a coherent future predicts which alternative action the model will approach. The associated simulator endpoint moves in the same direction. RIFT established that behavior depends on an organized future interface; our result adds content-specific sufficiency by showing that a policy-native alternative predicts the signed direction of the change. The two checkpoints, however, do not appear to rely on the same content.</w:t>
+      </w:r>
+    </w:p>
+    <w:p>
+      <w:pPr>
+        <w:pStyle w:val="BodyText"/>
+      </w:pPr>
+      <w:r>
+        <w:t xml:space="preserve">Cosmos Policy’s early-state pattern resembles an inverse-dynamics interface conditioned on visible robot motion. That account does not transfer cleanly to Cosmos 3: strong whole-future steering coexists with negligible robot-only and object-only pixel effects. Usable content may instead depend on architecture, surrounding context, or distributed feature interactions. The pathway experiments locate where some of this influence travels. Cosmos Policy identifies an active late attention edge, while Cosmos 3 shows across 22 states that future-token K/V carries most of the donor-directed shift.</w:t>
+      </w:r>
+    </w:p>
+    <w:p>
+      <w:pPr>
+        <w:pStyle w:val="BodyText"/>
+      </w:pPr>
+      <w:r>
+        <w:t xml:space="preserve">This evidence is narrower than planning. A planning claim would require evidence that the policy generates alternatives, predicts their outcomes, compares them using a goal, cost, or value, and selects accordingly. We do not test that sequence, and no screened pair retained a stable success/failure label across continuation seeds. Here,</w:t>
+      </w:r>
+      <w:r>
+        <w:t xml:space="preserve"> </w:t>
+      </w:r>
+      <w:r>
+        <w:t xml:space="preserve">“future”</w:t>
+      </w:r>
+      <w:r>
+        <w:t xml:space="preserve"> </w:t>
+      </w:r>
+      <w:r>
+        <w:t xml:space="preserve">and</w:t>
+      </w:r>
+      <w:r>
+        <w:t xml:space="preserve"> </w:t>
+      </w:r>
+      <w:r>
+        <w:t xml:space="preserve">“imagined”</w:t>
+      </w:r>
+      <w:r>
+        <w:t xml:space="preserve"> </w:t>
+      </w:r>
+      <w:r>
+        <w:t xml:space="preserve">describe generated representations, not deliberation. Our claim is that these direct policies condition action on coherent futures, not that WAMs generally plan over task consequences.</w:t>
+      </w:r>
+    </w:p>
+    <w:bookmarkStart w:id="45" w:name="limitations."/>
+    <w:p>
+      <w:pPr>
+        <w:pStyle w:val="Heading4"/>
+      </w:pPr>
+      <w:r>
+        <w:t xml:space="preserve">Limitations.</w:t>
+      </w:r>
+    </w:p>
+    <w:p>
+      <w:pPr>
+        <w:pStyle w:val="FirstParagraph"/>
+      </w:pPr>
+      <w:r>
+        <w:t xml:space="preserve">All interventions are in simulation and cover two checkpoints, six RoboLab tasks, and LIBERO-Long. Cosmos Policy’s strongest result uses one first-query state per task, while later estimates use different physical states and therefore cannot isolate elapsed time. Its natural content analysis contains only four states, and rendered hybrids may be outside the policy’s native future distribution. Cosmos 3 completed 22 of 24 frozen population states and 10 of 12 factor states; the two population omissions resulted from short source videos and were not replaced. Pixel masks may miss distributed semantic features or induce nonlinear changes, so negligible isolated effects do not establish joint necessity. Key removal changes attention normalization, and K/V replacement can interact with unpatched routes. We do not demonstrate task-success mediation or recover a full circuit.</w:t>
+      </w:r>
+    </w:p>
     <w:bookmarkEnd w:id="45"/>
-    <w:bookmarkStart w:id="48" w:name="sec:discussion"/>
+    <w:bookmarkStart w:id="46" w:name="broader-impact."/>
+    <w:p>
+      <w:pPr>
+        <w:pStyle w:val="Heading4"/>
+      </w:pPr>
+      <w:r>
+        <w:t xml:space="preserve">Broader impact.</w:t>
+      </w:r>
+    </w:p>
+    <w:p>
+      <w:pPr>
+        <w:pStyle w:val="FirstParagraph"/>
+      </w:pPr>
+      <w:r>
+        <w:t xml:space="preserve">Mechanistic tests can help distinguish plausible-looking predictions from representations that actually control behavior. The same interfaces could also redirect robot actions or create false confidence if validated on narrow state distributions. Use beyond simulation would require broader coverage, physical safety constraints, and monitoring outside the intervention metric.</w:t>
+      </w:r>
+    </w:p>
+    <w:bookmarkEnd w:id="46"/>
+    <w:bookmarkEnd w:id="47"/>
+    <w:bookmarkStart w:id="48" w:name="conclusion"/>
     <w:p>
       <w:pPr>
         <w:pStyle w:val="Heading1"/>
       </w:pPr>
       <w:r>
-        <w:t xml:space="preserve">Discussion and Limitations</w:t>
+        <w:t xml:space="preserve">Conclusion</w:t>
       </w:r>
     </w:p>
     <w:p>
@@ -6207,105 +6630,11 @@
         <w:pStyle w:val="FirstParagraph"/>
       </w:pPr>
       <w:r>
-        <w:t xml:space="preserve">Across both WAM generations, transplanting a coherent future predicts which alternative action the model will approach. The associated simulator endpoint moves in the same direction. RIFT established that behavior depends on an organized future interface; our result adds content-specific sufficiency by showing that a policy-native alternative predicts the signed direction of the change. The two checkpoints, however, do not appear to rely on the same content.</w:t>
-      </w:r>
-    </w:p>
-    <w:p>
-      <w:pPr>
-        <w:pStyle w:val="BodyText"/>
-      </w:pPr>
-      <w:r>
-        <w:t xml:space="preserve">Cosmos Policy’s early-state pattern resembles an inverse-dynamics interface conditioned on visible robot motion. That account does not transfer cleanly to Cosmos 3: strong whole-future steering coexists with negligible robot-only and object-only pixel effects. Usable content may instead depend on architecture, surrounding context, or distributed feature interactions. The pathway experiments locate where some of this influence travels. Cosmos Policy identifies an active late attention edge, while Cosmos 3 shows across 22 states that future-token K/V carries most of the donor-directed shift.</w:t>
-      </w:r>
-    </w:p>
-    <w:p>
-      <w:pPr>
-        <w:pStyle w:val="BodyText"/>
-      </w:pPr>
-      <w:r>
-        <w:t xml:space="preserve">This evidence is narrower than planning. A planning claim would require evidence that the policy generates alternatives, predicts their outcomes, compares them using a goal, cost, or value, and selects accordingly. We do not test that sequence, and no screened pair retained a stable success/failure label across continuation seeds. Here,</w:t>
-      </w:r>
-      <w:r>
-        <w:t xml:space="preserve"> </w:t>
-      </w:r>
-      <w:r>
-        <w:t xml:space="preserve">“future”</w:t>
-      </w:r>
-      <w:r>
-        <w:t xml:space="preserve"> </w:t>
-      </w:r>
-      <w:r>
-        <w:t xml:space="preserve">and</w:t>
-      </w:r>
-      <w:r>
-        <w:t xml:space="preserve"> </w:t>
-      </w:r>
-      <w:r>
-        <w:t xml:space="preserve">“imagined”</w:t>
-      </w:r>
-      <w:r>
-        <w:t xml:space="preserve"> </w:t>
-      </w:r>
-      <w:r>
-        <w:t xml:space="preserve">describe generated representations, not deliberation. Our claim is that these direct policies condition action on coherent futures, not that WAMs generally plan over task consequences.</w:t>
-      </w:r>
-    </w:p>
-    <w:bookmarkStart w:id="46" w:name="limitations."/>
-    <w:p>
-      <w:pPr>
-        <w:pStyle w:val="Heading4"/>
-      </w:pPr>
-      <w:r>
-        <w:t xml:space="preserve">Limitations.</w:t>
-      </w:r>
-    </w:p>
-    <w:p>
-      <w:pPr>
-        <w:pStyle w:val="FirstParagraph"/>
-      </w:pPr>
-      <w:r>
-        <w:t xml:space="preserve">All interventions are in simulation and cover two checkpoints, six RoboLab tasks, and LIBERO-Long. Cosmos Policy’s strongest result uses one first-query state per task, while later estimates use different physical states and therefore cannot isolate elapsed time. Its natural content analysis contains only four states, and rendered hybrids may be outside the policy’s native future distribution. Cosmos 3 completed 22 of 24 frozen population states and 10 of 12 factor states; the two population omissions resulted from short source videos and were not replaced. Pixel masks may miss distributed semantic features or induce nonlinear changes, so negligible isolated effects do not establish joint necessity. Key removal changes attention normalization, and K/V replacement can interact with unpatched routes. We do not demonstrate task-success mediation or recover a full circuit.</w:t>
-      </w:r>
-    </w:p>
-    <w:bookmarkEnd w:id="46"/>
-    <w:bookmarkStart w:id="47" w:name="broader-impact."/>
-    <w:p>
-      <w:pPr>
-        <w:pStyle w:val="Heading4"/>
-      </w:pPr>
-      <w:r>
-        <w:t xml:space="preserve">Broader impact.</w:t>
-      </w:r>
-    </w:p>
-    <w:p>
-      <w:pPr>
-        <w:pStyle w:val="FirstParagraph"/>
-      </w:pPr>
-      <w:r>
-        <w:t xml:space="preserve">Mechanistic tests can help distinguish plausible-looking predictions from representations that actually control behavior. The same interfaces could also redirect robot actions or create false confidence if validated on narrow state distributions. Use beyond simulation would require broader coverage, physical safety constraints, and monitoring outside the intervention metric.</w:t>
-      </w:r>
-    </w:p>
-    <w:bookmarkEnd w:id="47"/>
+        <w:t xml:space="preserve">The central result is directional: we do not merely damage a model’s future and observe that behavior changes; we supply a different coherent future and find that behavior follows that particular alternative. Cosmos 3 shows this across 22 sampled states, with future-token K/V carrying most of the action and endpoint shift. Cosmos Policy shows a related, more state-dependent effect dominated by visual robot-motion information, while neither isolated robot nor object pixels reproduce Cosmos 3’s whole-future effect. These models use generated futures to condition action. Whether they compare alternative predicted outcomes in order to plan remains unanswered.</w:t>
+      </w:r>
+    </w:p>
     <w:bookmarkEnd w:id="48"/>
-    <w:bookmarkStart w:id="49" w:name="conclusion"/>
-    <w:p>
-      <w:pPr>
-        <w:pStyle w:val="Heading1"/>
-      </w:pPr>
-      <w:r>
-        <w:t xml:space="preserve">Conclusion</w:t>
-      </w:r>
-    </w:p>
-    <w:p>
-      <w:pPr>
-        <w:pStyle w:val="FirstParagraph"/>
-      </w:pPr>
-      <w:r>
-        <w:t xml:space="preserve">The central result is directional: we do not merely damage a model’s future and observe that behavior changes; we supply a different coherent future and find that behavior follows that particular alternative. Cosmos 3 shows this across 22 sampled states, with future-token K/V carrying most of the action and endpoint shift. Cosmos Policy shows a related, more state-dependent effect dominated by visual robot-motion information, while neither isolated robot nor object pixels reproduce Cosmos 3’s whole-future effect. These models use generated futures to condition action. Whether they compare alternative predicted outcomes in order to plan remains unanswered.</w:t>
-      </w:r>
-    </w:p>
-    <w:bookmarkEnd w:id="49"/>
-    <w:bookmarkStart w:id="50" w:name="app:reproducibility"/>
+    <w:bookmarkStart w:id="49" w:name="app:reproducibility"/>
     <w:p>
       <w:pPr>
         <w:pStyle w:val="Heading1"/>
@@ -6414,8 +6743,8 @@
         <w:t xml:space="preserve">. Endpoint evaluation reconstructs the environment, restores the saved state, and replays the observation prefix. Separate controls test token layout, sampler wrapping, cache record and replay, self replacement, and the action-coordinate boundary. Complete timing and aggregate compute accounting remain to be added before submission.</w:t>
       </w:r>
     </w:p>
-    <w:bookmarkEnd w:id="50"/>
-    <w:bookmarkStart w:id="100" w:name="app:additional"/>
+    <w:bookmarkEnd w:id="49"/>
+    <w:bookmarkStart w:id="99" w:name="app:additional"/>
     <w:p>
       <w:pPr>
         <w:pStyle w:val="Heading1"/>
@@ -6589,8 +6918,8 @@
         <w:t xml:space="preserve">), positive in 6/6 states; action steering is smaller and does not reliably exceed the Gaussian control. In the Cosmos 3 population, the two missing frozen states ended after 21 and 29 actions, before producing the 33-frame source video. Neither was replaced. The prespecified minimum of 20 states across five tasks and the factor-study minimum of ten states across five tasks were both met across six tasks.</w:t>
       </w:r>
     </w:p>
-    <w:bookmarkStart w:id="99" w:name="refs"/>
-    <w:bookmarkStart w:id="52" w:name="ref-du2023unipi"/>
+    <w:bookmarkStart w:id="98" w:name="refs"/>
+    <w:bookmarkStart w:id="51" w:name="ref-du2023unipi"/>
     <w:p>
       <w:pPr>
         <w:pStyle w:val="Bibliography"/>
@@ -6623,7 +6952,7 @@
       <w:r>
         <w:t xml:space="preserve"> </w:t>
       </w:r>
-      <w:hyperlink r:id="rId51">
+      <w:hyperlink r:id="rId50">
         <w:r>
           <w:rPr>
             <w:rStyle w:val="Hyperlink"/>
@@ -6635,8 +6964,8 @@
         <w:t xml:space="preserve">.</w:t>
       </w:r>
     </w:p>
-    <w:bookmarkEnd w:id="52"/>
-    <w:bookmarkStart w:id="54" w:name="ref-du2024videolanguage"/>
+    <w:bookmarkEnd w:id="51"/>
+    <w:bookmarkStart w:id="53" w:name="ref-du2024videolanguage"/>
     <w:p>
       <w:pPr>
         <w:pStyle w:val="Bibliography"/>
@@ -6666,7 +6995,7 @@
       <w:r>
         <w:t xml:space="preserve"> </w:t>
       </w:r>
-      <w:hyperlink r:id="rId53">
+      <w:hyperlink r:id="rId52">
         <w:r>
           <w:rPr>
             <w:rStyle w:val="Hyperlink"/>
@@ -6678,8 +7007,8 @@
         <w:t xml:space="preserve">.</w:t>
       </w:r>
     </w:p>
-    <w:bookmarkEnd w:id="54"/>
-    <w:bookmarkStart w:id="56" w:name="ref-ebert2018visualforesight"/>
+    <w:bookmarkEnd w:id="53"/>
+    <w:bookmarkStart w:id="55" w:name="ref-ebert2018visualforesight"/>
     <w:p>
       <w:pPr>
         <w:pStyle w:val="Bibliography"/>
@@ -6709,7 +7038,7 @@
       <w:r>
         <w:t xml:space="preserve"> </w:t>
       </w:r>
-      <w:hyperlink r:id="rId55">
+      <w:hyperlink r:id="rId54">
         <w:r>
           <w:rPr>
             <w:rStyle w:val="Hyperlink"/>
@@ -6721,8 +7050,8 @@
         <w:t xml:space="preserve">.</w:t>
       </w:r>
     </w:p>
-    <w:bookmarkEnd w:id="56"/>
-    <w:bookmarkStart w:id="58" w:name="ref-field2007clusterbootstrap"/>
+    <w:bookmarkEnd w:id="55"/>
+    <w:bookmarkStart w:id="57" w:name="ref-field2007clusterbootstrap"/>
     <w:p>
       <w:pPr>
         <w:pStyle w:val="Bibliography"/>
@@ -6755,7 +7084,7 @@
       <w:r>
         <w:t xml:space="preserve"> </w:t>
       </w:r>
-      <w:hyperlink r:id="rId57">
+      <w:hyperlink r:id="rId56">
         <w:r>
           <w:rPr>
             <w:rStyle w:val="Hyperlink"/>
@@ -6767,8 +7096,8 @@
         <w:t xml:space="preserve">.</w:t>
       </w:r>
     </w:p>
-    <w:bookmarkEnd w:id="58"/>
-    <w:bookmarkStart w:id="60" w:name="ref-goldowskydill2023pathpatching"/>
+    <w:bookmarkEnd w:id="57"/>
+    <w:bookmarkStart w:id="59" w:name="ref-goldowskydill2023pathpatching"/>
     <w:p>
       <w:pPr>
         <w:pStyle w:val="Bibliography"/>
@@ -6792,7 +7121,7 @@
       <w:r>
         <w:t xml:space="preserve"> </w:t>
       </w:r>
-      <w:hyperlink r:id="rId59">
+      <w:hyperlink r:id="rId58">
         <w:r>
           <w:rPr>
             <w:rStyle w:val="Hyperlink"/>
@@ -6804,8 +7133,8 @@
         <w:t xml:space="preserve">.</w:t>
       </w:r>
     </w:p>
-    <w:bookmarkEnd w:id="60"/>
-    <w:bookmarkStart w:id="62" w:name="ref-guo2024pad"/>
+    <w:bookmarkEnd w:id="59"/>
+    <w:bookmarkStart w:id="61" w:name="ref-guo2024pad"/>
     <w:p>
       <w:pPr>
         <w:pStyle w:val="Bibliography"/>
@@ -6838,7 +7167,7 @@
       <w:r>
         <w:t xml:space="preserve"> </w:t>
       </w:r>
-      <w:hyperlink r:id="rId61">
+      <w:hyperlink r:id="rId60">
         <w:r>
           <w:rPr>
             <w:rStyle w:val="Hyperlink"/>
@@ -6850,8 +7179,8 @@
         <w:t xml:space="preserve">.</w:t>
       </w:r>
     </w:p>
-    <w:bookmarkEnd w:id="62"/>
-    <w:bookmarkStart w:id="64" w:name="ref-hu2025vpp"/>
+    <w:bookmarkEnd w:id="61"/>
+    <w:bookmarkStart w:id="63" w:name="ref-hu2025vpp"/>
     <w:p>
       <w:pPr>
         <w:pStyle w:val="Bibliography"/>
@@ -6881,7 +7210,7 @@
       <w:r>
         <w:t xml:space="preserve"> </w:t>
       </w:r>
-      <w:hyperlink r:id="rId63">
+      <w:hyperlink r:id="rId62">
         <w:r>
           <w:rPr>
             <w:rStyle w:val="Hyperlink"/>
@@ -6893,8 +7222,8 @@
         <w:t xml:space="preserve">.</w:t>
       </w:r>
     </w:p>
-    <w:bookmarkEnd w:id="64"/>
-    <w:bookmarkStart w:id="66" w:name="ref-kim2026cosmospolicy"/>
+    <w:bookmarkEnd w:id="63"/>
+    <w:bookmarkStart w:id="65" w:name="ref-kim2026cosmospolicy"/>
     <w:p>
       <w:pPr>
         <w:pStyle w:val="Bibliography"/>
@@ -6930,7 +7259,7 @@
       <w:r>
         <w:t xml:space="preserve"> </w:t>
       </w:r>
-      <w:hyperlink r:id="rId65">
+      <w:hyperlink r:id="rId64">
         <w:r>
           <w:rPr>
             <w:rStyle w:val="Hyperlink"/>
@@ -6942,8 +7271,8 @@
         <w:t xml:space="preserve">.</w:t>
       </w:r>
     </w:p>
-    <w:bookmarkEnd w:id="66"/>
-    <w:bookmarkStart w:id="68" w:name="ref-lakens2017equivalence"/>
+    <w:bookmarkEnd w:id="65"/>
+    <w:bookmarkStart w:id="67" w:name="ref-lakens2017equivalence"/>
     <w:p>
       <w:pPr>
         <w:pStyle w:val="Bibliography"/>
@@ -6976,7 +7305,7 @@
       <w:r>
         <w:t xml:space="preserve"> </w:t>
       </w:r>
-      <w:hyperlink r:id="rId67">
+      <w:hyperlink r:id="rId66">
         <w:r>
           <w:rPr>
             <w:rStyle w:val="Hyperlink"/>
@@ -6988,8 +7317,8 @@
         <w:t xml:space="preserve">.</w:t>
       </w:r>
     </w:p>
-    <w:bookmarkEnd w:id="68"/>
-    <w:bookmarkStart w:id="70" w:name="ref-li2025uva"/>
+    <w:bookmarkEnd w:id="67"/>
+    <w:bookmarkStart w:id="69" w:name="ref-li2025uva"/>
     <w:p>
       <w:pPr>
         <w:pStyle w:val="Bibliography"/>
@@ -7013,7 +7342,7 @@
       <w:r>
         <w:t xml:space="preserve"> </w:t>
       </w:r>
-      <w:hyperlink r:id="rId69">
+      <w:hyperlink r:id="rId68">
         <w:r>
           <w:rPr>
             <w:rStyle w:val="Hyperlink"/>
@@ -7025,8 +7354,8 @@
         <w:t xml:space="preserve">.</w:t>
       </w:r>
     </w:p>
-    <w:bookmarkEnd w:id="70"/>
-    <w:bookmarkStart w:id="72" w:name="ref-liu2023libero"/>
+    <w:bookmarkEnd w:id="69"/>
+    <w:bookmarkStart w:id="71" w:name="ref-liu2023libero"/>
     <w:p>
       <w:pPr>
         <w:pStyle w:val="Bibliography"/>
@@ -7065,7 +7394,7 @@
       <w:r>
         <w:t xml:space="preserve"> </w:t>
       </w:r>
-      <w:hyperlink r:id="rId71">
+      <w:hyperlink r:id="rId70">
         <w:r>
           <w:rPr>
             <w:rStyle w:val="Hyperlink"/>
@@ -7077,8 +7406,8 @@
         <w:t xml:space="preserve">.</w:t>
       </w:r>
     </w:p>
-    <w:bookmarkEnd w:id="72"/>
-    <w:bookmarkStart w:id="74" w:name="ref-meng2022rome"/>
+    <w:bookmarkEnd w:id="71"/>
+    <w:bookmarkStart w:id="73" w:name="ref-meng2022rome"/>
     <w:p>
       <w:pPr>
         <w:pStyle w:val="Bibliography"/>
@@ -7120,7 +7449,7 @@
       <w:r>
         <w:t xml:space="preserve"> </w:t>
       </w:r>
-      <w:hyperlink r:id="rId73">
+      <w:hyperlink r:id="rId72">
         <w:r>
           <w:rPr>
             <w:rStyle w:val="Hyperlink"/>
@@ -7132,8 +7461,8 @@
         <w:t xml:space="preserve">.</w:t>
       </w:r>
     </w:p>
-    <w:bookmarkEnd w:id="74"/>
-    <w:bookmarkStart w:id="76" w:name="ref-nasiriany2024robocasa"/>
+    <w:bookmarkEnd w:id="73"/>
+    <w:bookmarkStart w:id="75" w:name="ref-nasiriany2024robocasa"/>
     <w:p>
       <w:pPr>
         <w:pStyle w:val="Bibliography"/>
@@ -7172,7 +7501,7 @@
       <w:r>
         <w:t xml:space="preserve"> </w:t>
       </w:r>
-      <w:hyperlink r:id="rId75">
+      <w:hyperlink r:id="rId74">
         <w:r>
           <w:rPr>
             <w:rStyle w:val="Hyperlink"/>
@@ -7184,8 +7513,8 @@
         <w:t xml:space="preserve">.</w:t>
       </w:r>
     </w:p>
-    <w:bookmarkEnd w:id="76"/>
-    <w:bookmarkStart w:id="78" w:name="ref-nvidia2026cosmos3"/>
+    <w:bookmarkEnd w:id="75"/>
+    <w:bookmarkStart w:id="77" w:name="ref-nvidia2026cosmos3"/>
     <w:p>
       <w:pPr>
         <w:pStyle w:val="Bibliography"/>
@@ -7230,7 +7559,7 @@
       <w:r>
         <w:t xml:space="preserve"> </w:t>
       </w:r>
-      <w:hyperlink r:id="rId77">
+      <w:hyperlink r:id="rId76">
         <w:r>
           <w:rPr>
             <w:rStyle w:val="Hyperlink"/>
@@ -7242,8 +7571,8 @@
         <w:t xml:space="preserve">.</w:t>
       </w:r>
     </w:p>
-    <w:bookmarkEnd w:id="78"/>
-    <w:bookmarkStart w:id="80" w:name="ref-nvidia2026cosmos3droid"/>
+    <w:bookmarkEnd w:id="77"/>
+    <w:bookmarkStart w:id="79" w:name="ref-nvidia2026cosmos3droid"/>
     <w:p>
       <w:pPr>
         <w:pStyle w:val="Bibliography"/>
@@ -7267,7 +7596,7 @@
       <w:r>
         <w:t xml:space="preserve"> </w:t>
       </w:r>
-      <w:hyperlink r:id="rId79">
+      <w:hyperlink r:id="rId78">
         <w:r>
           <w:rPr>
             <w:rStyle w:val="Hyperlink"/>
@@ -7279,8 +7608,8 @@
         <w:t xml:space="preserve">.</w:t>
       </w:r>
     </w:p>
-    <w:bookmarkEnd w:id="80"/>
-    <w:bookmarkStart w:id="82" w:name="ref-qiu2026agra"/>
+    <w:bookmarkEnd w:id="79"/>
+    <w:bookmarkStart w:id="81" w:name="ref-qiu2026agra"/>
     <w:p>
       <w:pPr>
         <w:pStyle w:val="Bibliography"/>
@@ -7304,7 +7633,7 @@
       <w:r>
         <w:t xml:space="preserve"> </w:t>
       </w:r>
-      <w:hyperlink r:id="rId81">
+      <w:hyperlink r:id="rId80">
         <w:r>
           <w:rPr>
             <w:rStyle w:val="Hyperlink"/>
@@ -7316,8 +7645,8 @@
         <w:t xml:space="preserve">.</w:t>
       </w:r>
     </w:p>
-    <w:bookmarkEnd w:id="82"/>
-    <w:bookmarkStart w:id="84" w:name="ref-vaidyanathan2026multiplemediators"/>
+    <w:bookmarkEnd w:id="81"/>
+    <w:bookmarkStart w:id="83" w:name="ref-vaidyanathan2026multiplemediators"/>
     <w:p>
       <w:pPr>
         <w:pStyle w:val="Bibliography"/>
@@ -7341,7 +7670,7 @@
       <w:r>
         <w:t xml:space="preserve"> </w:t>
       </w:r>
-      <w:hyperlink r:id="rId83">
+      <w:hyperlink r:id="rId82">
         <w:r>
           <w:rPr>
             <w:rStyle w:val="Hyperlink"/>
@@ -7353,8 +7682,8 @@
         <w:t xml:space="preserve">.</w:t>
       </w:r>
     </w:p>
-    <w:bookmarkEnd w:id="84"/>
-    <w:bookmarkStart w:id="86" w:name="ref-vig2020causalmediation"/>
+    <w:bookmarkEnd w:id="83"/>
+    <w:bookmarkStart w:id="85" w:name="ref-vig2020causalmediation"/>
     <w:p>
       <w:pPr>
         <w:pStyle w:val="Bibliography"/>
@@ -7387,7 +7716,7 @@
       <w:r>
         <w:t xml:space="preserve"> </w:t>
       </w:r>
-      <w:hyperlink r:id="rId85">
+      <w:hyperlink r:id="rId84">
         <w:r>
           <w:rPr>
             <w:rStyle w:val="Hyperlink"/>
@@ -7399,8 +7728,8 @@
         <w:t xml:space="preserve">.</w:t>
       </w:r>
     </w:p>
-    <w:bookmarkEnd w:id="86"/>
-    <w:bookmarkStart w:id="88" w:name="ref-yang2026robolab"/>
+    <w:bookmarkEnd w:id="85"/>
+    <w:bookmarkStart w:id="87" w:name="ref-yang2026robolab"/>
     <w:p>
       <w:pPr>
         <w:pStyle w:val="Bibliography"/>
@@ -7439,7 +7768,7 @@
       <w:r>
         <w:t xml:space="preserve"> </w:t>
       </w:r>
-      <w:hyperlink r:id="rId87">
+      <w:hyperlink r:id="rId86">
         <w:r>
           <w:rPr>
             <w:rStyle w:val="Hyperlink"/>
@@ -7451,8 +7780,8 @@
         <w:t xml:space="preserve">.</w:t>
       </w:r>
     </w:p>
-    <w:bookmarkEnd w:id="88"/>
-    <w:bookmarkStart w:id="90" w:name="ref-ye2026dreamzero"/>
+    <w:bookmarkEnd w:id="87"/>
+    <w:bookmarkStart w:id="89" w:name="ref-ye2026dreamzero"/>
     <w:p>
       <w:pPr>
         <w:pStyle w:val="Bibliography"/>
@@ -7476,7 +7805,7 @@
       <w:r>
         <w:t xml:space="preserve"> </w:t>
       </w:r>
-      <w:hyperlink r:id="rId89">
+      <w:hyperlink r:id="rId88">
         <w:r>
           <w:rPr>
             <w:rStyle w:val="Hyperlink"/>
@@ -7488,8 +7817,8 @@
         <w:t xml:space="preserve">.</w:t>
       </w:r>
     </w:p>
-    <w:bookmarkEnd w:id="90"/>
-    <w:bookmarkStart w:id="92" w:name="ref-yuan2026fastwam"/>
+    <w:bookmarkEnd w:id="89"/>
+    <w:bookmarkStart w:id="91" w:name="ref-yuan2026fastwam"/>
     <w:p>
       <w:pPr>
         <w:pStyle w:val="Bibliography"/>
@@ -7517,7 +7846,7 @@
       <w:r>
         <w:t xml:space="preserve"> </w:t>
       </w:r>
-      <w:hyperlink r:id="rId91">
+      <w:hyperlink r:id="rId90">
         <w:r>
           <w:rPr>
             <w:rStyle w:val="Hyperlink"/>
@@ -7529,8 +7858,8 @@
         <w:t xml:space="preserve">.</w:t>
       </w:r>
     </w:p>
-    <w:bookmarkEnd w:id="92"/>
-    <w:bookmarkStart w:id="94" w:name="ref-zhang2026rift"/>
+    <w:bookmarkEnd w:id="91"/>
+    <w:bookmarkStart w:id="93" w:name="ref-zhang2026rift"/>
     <w:p>
       <w:pPr>
         <w:pStyle w:val="Bibliography"/>
@@ -7582,7 +7911,7 @@
       <w:r>
         <w:t xml:space="preserve"> </w:t>
       </w:r>
-      <w:hyperlink r:id="rId93">
+      <w:hyperlink r:id="rId92">
         <w:r>
           <w:rPr>
             <w:rStyle w:val="Hyperlink"/>
@@ -7594,8 +7923,8 @@
         <w:t xml:space="preserve">.</w:t>
       </w:r>
     </w:p>
-    <w:bookmarkEnd w:id="94"/>
-    <w:bookmarkStart w:id="96" w:name="ref-zhang2024activationpatching"/>
+    <w:bookmarkEnd w:id="93"/>
+    <w:bookmarkStart w:id="95" w:name="ref-zhang2024activationpatching"/>
     <w:p>
       <w:pPr>
         <w:pStyle w:val="Bibliography"/>
@@ -7625,7 +7954,7 @@
       <w:r>
         <w:t xml:space="preserve"> </w:t>
       </w:r>
-      <w:hyperlink r:id="rId95">
+      <w:hyperlink r:id="rId94">
         <w:r>
           <w:rPr>
             <w:rStyle w:val="Hyperlink"/>
@@ -7637,8 +7966,8 @@
         <w:t xml:space="preserve">.</w:t>
       </w:r>
     </w:p>
-    <w:bookmarkEnd w:id="96"/>
-    <w:bookmarkStart w:id="98" w:name="ref-zhao2026fasterwam"/>
+    <w:bookmarkEnd w:id="95"/>
+    <w:bookmarkStart w:id="97" w:name="ref-zhao2026fasterwam"/>
     <w:p>
       <w:pPr>
         <w:pStyle w:val="Bibliography"/>
@@ -7669,7 +7998,7 @@
       <w:r>
         <w:t xml:space="preserve"> </w:t>
       </w:r>
-      <w:hyperlink r:id="rId97">
+      <w:hyperlink r:id="rId96">
         <w:r>
           <w:rPr>
             <w:rStyle w:val="Hyperlink"/>
@@ -7681,9 +8010,9 @@
         <w:t xml:space="preserve">.</w:t>
       </w:r>
     </w:p>
+    <w:bookmarkEnd w:id="97"/>
     <w:bookmarkEnd w:id="98"/>
     <w:bookmarkEnd w:id="99"/>
-    <w:bookmarkEnd w:id="100"/>
     <w:sectPr>
       <w:footnotePr>
         <w:numRestart w:val="eachSect"/>

</xml_diff>

<commit_message>
docs: remove ours labels
</commit_message>
<xml_diff>
--- a/output/imagined_futures_neurips2026.docx
+++ b/output/imagined_futures_neurips2026.docx
@@ -2215,7 +2215,7 @@
         <w:pageBreakBefore/>
       </w:pPr>
       <w:r>
-        <w:t xml:space="preserve">Method and controls on one scale. Each row reports donor-directed projection after inserting the named future: 0 is the self-future result and 1 is the paired donor behavior. Within each model–source–outcome block, bold marks the largest estimate, always the paired donor (ours). The paired donor exceeds the strongest available control in all five comparisons. Control projections are reconstructed within independent unit before bootstrapping.</w:t>
+        <w:t xml:space="preserve">Method and controls on one scale. Each row reports donor-directed projection after inserting the named future: 0 is the self-future result and 1 is the paired donor behavior. Within each model–source–outcome block, bold marks the largest estimate, always the paired donor. The paired donor exceeds the strongest available control in all five comparisons. Control projections are reconstructed within independent unit before bootstrapping.</w:t>
       </w:r>
     </w:p>
     <w:tbl>
@@ -2224,7 +2224,7 @@
         <w:tblW w:type="auto" w:w="0"/>
         <w:tblLayout w:type="fixed"/>
         <w:tblLook w:firstRow="1" w:lastRow="0" w:firstColumn="0" w:lastColumn="0" w:noHBand="0" w:noVBand="0" w:val="0020"/>
-        <w:tblCaption w:val="Method and controls on one scale. Each row reports donor-directed projection after inserting the named future: 0 is the self-future result and 1 is the paired donor behavior. Within each model–source–outcome block, bold marks the largest estimate, always the paired donor (ours). The paired donor exceeds the strongest available control in all five comparisons. Control projections are reconstructed within independent unit before bootstrapping."/>
+        <w:tblCaption w:val="Method and controls on one scale. Each row reports donor-directed projection after inserting the named future: 0 is the self-future result and 1 is the paired donor behavior. Within each model–source–outcome block, bold marks the largest estimate, always the paired donor. The paired donor exceeds the strongest available control in all five comparisons. Control projections are reconstructed within independent unit before bootstrapping."/>
       </w:tblPr>
       <w:tblGrid>
         <w:gridCol w:w="1584"/>
@@ -2593,7 +2593,7 @@
                 <w:bCs/>
                 <w:sz w:val="16"/>
               </w:rPr>
-              <w:t xml:space="preserve">Paired donor (ours)</w:t>
+              <w:t xml:space="preserve">Paired donor</w:t>
             </w:r>
           </w:p>
         </w:tc>
@@ -2977,7 +2977,7 @@
                 <w:bCs/>
                 <w:sz w:val="16"/>
               </w:rPr>
-              <w:t xml:space="preserve">Paired donor (ours)</w:t>
+              <w:t xml:space="preserve">Paired donor</w:t>
             </w:r>
           </w:p>
         </w:tc>
@@ -3171,7 +3171,7 @@
                 <w:bCs/>
                 <w:sz w:val="16"/>
               </w:rPr>
-              <w:t xml:space="preserve">Paired donor (ours)</w:t>
+              <w:t xml:space="preserve">Paired donor</w:t>
             </w:r>
           </w:p>
         </w:tc>
@@ -3667,7 +3667,7 @@
                 <w:bCs/>
                 <w:sz w:val="16"/>
               </w:rPr>
-              <w:t xml:space="preserve">Paired donor (ours)</w:t>
+              <w:t xml:space="preserve">Paired donor</w:t>
             </w:r>
           </w:p>
         </w:tc>
@@ -4163,7 +4163,7 @@
                 <w:bCs/>
                 <w:sz w:val="16"/>
               </w:rPr>
-              <w:t xml:space="preserve">Paired donor (ours)</w:t>
+              <w:t xml:space="preserve">Paired donor</w:t>
             </w:r>
           </w:p>
         </w:tc>
@@ -4620,7 +4620,7 @@
         <w:pStyle w:val="ImageCaption"/>
       </w:pPr>
       <w:r>
-        <w:t xml:space="preserve">Paired donor versus the strongest available control, separated by model. Each row is one future-source–outcome comparison. Gray circles show the strongest control; orange diamonds show the paired donor (ours); thin lines connect the two means. Row labels report the paired donor-minus-control advantage. Whiskers show 95% state-bootstrap intervals. All five paired-advantage intervals exclude zero; Table </w:t>
+        <w:t xml:space="preserve">Paired donor versus the strongest available control, separated by model. Each row is one future-source–outcome comparison. Gray circles show the strongest control; orange diamonds show the paired donor; thin lines connect the two means. Row labels report the paired donor-minus-control advantage. Whiskers show 95% state-bootstrap intervals. All five paired-advantage intervals exclude zero; Table </w:t>
       </w:r>
       <w:hyperlink w:anchor="tab:directionality">
         <w:r>

</xml_diff>

<commit_message>
docs: clarify causal hypotheses
</commit_message>
<xml_diff>
--- a/output/imagined_futures_neurips2026.docx
+++ b/output/imagined_futures_neurips2026.docx
@@ -141,7 +141,7 @@
         <w:t xml:space="preserve">)</w:t>
       </w:r>
       <w:r>
-        <w:t xml:space="preserve">. It is tempting to read this architecture literally: the model predicts what may happen, then acts on that prediction. Joint generation does not establish such a computation. The action could be generated through a direct observation-to-action route while a plausible video is produced alongside it.</w:t>
+        <w:t xml:space="preserve">. Joint generation, however, does not imply that the action computation uses the generated future. The policy could map the current observation and instruction directly to an action while producing a plausible future as an auxiliary output.</w:t>
       </w:r>
     </w:p>
     <w:p>
@@ -149,7 +149,46 @@
         <w:pStyle w:val="BodyText"/>
       </w:pPr>
       <w:r>
-        <w:t xml:space="preserve">This leaves at least four hypotheses about the future’s role: an epiphenomenal output with no functional role; a generic workspace whose presence matters but whose specific content does not; a content-specific action interface; or a representation of consequences used to compare actions. The third role includes an inverse-dynamics-like computation in which a prospective robot pose specifies the action needed to produce it</w:t>
+        <w:t xml:space="preserve">We distinguish four mechanistically different—and potentially coexisting—roles for future representations. First, they may be</w:t>
+      </w:r>
+      <w:r>
+        <w:t xml:space="preserve"> </w:t>
+      </w:r>
+      <w:r>
+        <w:rPr>
+          <w:i/>
+          <w:iCs/>
+        </w:rPr>
+        <w:t xml:space="preserve">epiphenomenal</w:t>
+      </w:r>
+      <w:r>
+        <w:t xml:space="preserve">: changing them has no causal effect on action. Second, they may provide a</w:t>
+      </w:r>
+      <w:r>
+        <w:t xml:space="preserve"> </w:t>
+      </w:r>
+      <w:r>
+        <w:rPr>
+          <w:i/>
+          <w:iCs/>
+        </w:rPr>
+        <w:t xml:space="preserve">nonspecific computational workspace</w:t>
+      </w:r>
+      <w:r>
+        <w:t xml:space="preserve">: activity at future-token positions is necessary, but the represented future does not determine the direction of the action change. Third, their semantic content may</w:t>
+      </w:r>
+      <w:r>
+        <w:t xml:space="preserve"> </w:t>
+      </w:r>
+      <w:r>
+        <w:rPr>
+          <w:i/>
+          <w:iCs/>
+        </w:rPr>
+        <w:t xml:space="preserve">parameterize action</w:t>
+      </w:r>
+      <w:r>
+        <w:t xml:space="preserve">, for example through an inverse-dynamics-like mapping from a prospective robot pose to the action that would realize it</w:t>
       </w:r>
       <w:r>
         <w:t xml:space="preserve"> </w:t>
@@ -183,7 +222,7 @@
         <w:t xml:space="preserve">)</w:t>
       </w:r>
       <w:r>
-        <w:t xml:space="preserve">. The fourth more closely resembles explicit visual planning: generate alternatives, predict their outcomes, score them with a cost or learned heuristic, and select among them</w:t>
+        <w:t xml:space="preserve">. Fourth, they may encode consequences that are evaluated to select among candidate actions</w:t>
       </w:r>
       <w:r>
         <w:t xml:space="preserve"> </w:t>
@@ -217,7 +256,7 @@
         <w:t xml:space="preserve">)</w:t>
       </w:r>
       <w:r>
-        <w:t xml:space="preserve">. We study Cosmos Policy’s direct-policy mode and the diffusion-generator component of Cosmos3-Nano-Policy-DROID. Neither evaluated inference procedure generates and scores multiple candidate actions before acting; Cosmos Policy’s separate best-of-</w:t>
+        <w:t xml:space="preserve">. Only the fourth role entails outcome-based planning; the third establishes content-specific future use but does not, by itself, show that the model compares predicted outcomes. We study Cosmos Policy’s direct-policy mode and the diffusion-generator component of Cosmos3-Nano-Policy-DROID. Neither evaluated inference procedure generates and scores multiple candidate actions before acting; Cosmos Policy’s separate best-of-</w:t>
       </w:r>
       <m:oMath>
         <m:r>
@@ -294,7 +333,7 @@
       <w:r>
         <w:drawing>
           <wp:inline>
-            <wp:extent cx="5139690" cy="3116580"/>
+            <wp:extent cx="5334000" cy="2222500"/>
             <wp:effectExtent b="0" l="0" r="0" t="0"/>
             <wp:docPr descr="" title="" id="10" name="Picture"/>
             <a:graphic>
@@ -315,7 +354,7 @@
                   <pic:spPr bwMode="auto">
                     <a:xfrm>
                       <a:off x="0" y="0"/>
-                      <a:ext cx="5139690" cy="3116580"/>
+                      <a:ext cx="5334000" cy="2222500"/>
                     </a:xfrm>
                     <a:prstGeom prst="rect">
                       <a:avLst/>

</xml_diff>

<commit_message>
docs: split mechanism tables
</commit_message>
<xml_diff>
--- a/output/imagined_futures_neurips2026.docx
+++ b/output/imagined_futures_neurips2026.docx
@@ -2025,7 +2025,7 @@
     </w:p>
     <w:bookmarkEnd w:id="23"/>
     <w:bookmarkEnd w:id="24"/>
-    <w:bookmarkStart w:id="44" w:name="sec:results"/>
+    <w:bookmarkStart w:id="45" w:name="sec:results"/>
     <w:p>
       <w:pPr>
         <w:pStyle w:val="Heading1"/>
@@ -4687,7 +4687,7 @@
     </w:p>
     <w:bookmarkEnd w:id="31"/>
     <w:bookmarkEnd w:id="32"/>
-    <w:bookmarkStart w:id="35" w:name="sec:content"/>
+    <w:bookmarkStart w:id="36" w:name="sec:content"/>
     <w:p>
       <w:pPr>
         <w:pStyle w:val="Heading2"/>
@@ -5089,7 +5089,7 @@
       </w:r>
     </w:p>
     <w:bookmarkEnd w:id="33"/>
-    <w:bookmarkStart w:id="34" w:name="cosmos-3.-2"/>
+    <w:bookmarkStart w:id="35" w:name="cosmos-3.-2"/>
     <w:p>
       <w:pPr>
         <w:pStyle w:val="Heading4"/>
@@ -5146,7 +5146,7 @@
       <w:r>
         <w:t xml:space="preserve">equivalence region (Table </w:t>
       </w:r>
-      <w:hyperlink w:anchor="tab:mechanisms">
+      <w:hyperlink w:anchor="tab:content_factors">
         <w:r>
           <w:rPr>
             <w:rStyle w:val="Hyperlink"/>
@@ -5228,9 +5228,319 @@
         <w:t xml:space="preserve">. Neither factor alone recreates a meaningful fraction of the roughly one-unit whole-future effect. The useful signal may be distributed across the image, require robot–object coherence, depend on camera or temporal structure, or interact nonlinearly with masking and tokenization. Hybrid videos may also be off distribution. The experiment establishes insufficiency of each isolated pixel factor, not irrelevance of robot or object information and not joint necessity.</w:t>
       </w:r>
     </w:p>
+    <w:bookmarkStart w:id="34" w:name="tab:content_factors"/>
+    <w:p>
+      <w:pPr>
+        <w:pStyle w:val="TableCaption"/>
+        <w:keepNext/>
+        <w:pageBreakBefore/>
+      </w:pPr>
+      <w:r>
+        <w:t xml:space="preserve">Cosmos 3 isolated-content interventions across 10 states from six tasks. Entries are mean donor-directed projections with 95% state-bootstrap intervals; 0 denotes the recipient and 1 the paired donor. Robot and object masks are disjoint. The prespecified practical-equivalence region is</w:t>
+      </w:r>
+      <w:r>
+        <w:t xml:space="preserve"> </w:t>
+      </w:r>
+      <m:oMath>
+        <m:r>
+          <m:rPr>
+            <m:sty m:val="p"/>
+          </m:rPr>
+          <m:t>[</m:t>
+        </m:r>
+        <m:r>
+          <m:rPr>
+            <m:sty m:val="p"/>
+          </m:rPr>
+          <m:t>−</m:t>
+        </m:r>
+        <m:r>
+          <m:t>0.10</m:t>
+        </m:r>
+        <m:r>
+          <m:rPr>
+            <m:sty m:val="p"/>
+          </m:rPr>
+          <m:t>,</m:t>
+        </m:r>
+        <m:r>
+          <m:t>0.10</m:t>
+        </m:r>
+        <m:r>
+          <m:rPr>
+            <m:sty m:val="p"/>
+          </m:rPr>
+          <m:t>]</m:t>
+        </m:r>
+      </m:oMath>
+      <w:r>
+        <w:t xml:space="preserve">.</w:t>
+      </w:r>
+    </w:p>
+    <w:tbl>
+      <w:tblPr>
+        <w:tblStyle w:val="Table"/>
+        <w:tblW w:type="auto" w:w="0"/>
+        <w:tblLayout w:type="fixed"/>
+        <w:tblLook w:firstRow="1" w:lastRow="0" w:firstColumn="0" w:lastColumn="0" w:noHBand="0" w:noVBand="0" w:val="0020"/>
+        <w:tblCaption w:val="Cosmos 3 isolated-content interventions across 10 states from six tasks. Entries are mean donor-directed projections with 95% state-bootstrap intervals; 0 denotes the recipient and 1 the paired donor. Robot and object masks are disjoint. The prespecified practical-equivalence region is [-0.10,0.10]."/>
+      </w:tblPr>
+      <w:tblGrid>
+        <w:gridCol w:w="2640"/>
+        <w:gridCol w:w="2640"/>
+        <w:gridCol w:w="2640"/>
+      </w:tblGrid>
+      <w:tr>
+        <w:trPr>
+          <w:tblHeader w:val="on"/>
+          <w:cantSplit/>
+        </w:trPr>
+        <w:tc>
+          <w:tcPr>
+            <w:tcW w:type="dxa" w:w="2160"/>
+          </w:tcPr>
+          <w:p>
+            <w:pPr>
+              <w:pStyle w:val="Compact"/>
+              <w:spacing w:before="0" w:after="0" w:line="240" w:lineRule="auto"/>
+              <w:jc w:val="left"/>
+            </w:pPr>
+            <w:r>
+              <w:rPr>
+                <w:sz w:val="16"/>
+              </w:rPr>
+              <w:t xml:space="preserve">Donor pixels inserted</w:t>
+            </w:r>
+          </w:p>
+        </w:tc>
+        <w:tc>
+          <w:tcPr>
+            <w:tcW w:type="dxa" w:w="3600"/>
+          </w:tcPr>
+          <w:p>
+            <w:pPr>
+              <w:pStyle w:val="Compact"/>
+              <w:spacing w:before="0" w:after="0" w:line="240" w:lineRule="auto"/>
+              <w:jc w:val="center"/>
+            </w:pPr>
+            <w:r>
+              <w:rPr>
+                <w:sz w:val="16"/>
+              </w:rPr>
+              <w:t xml:space="preserve">Action projection [95% CI]</w:t>
+            </w:r>
+          </w:p>
+        </w:tc>
+        <w:tc>
+          <w:tcPr>
+            <w:tcW w:type="dxa" w:w="3600"/>
+          </w:tcPr>
+          <w:p>
+            <w:pPr>
+              <w:pStyle w:val="Compact"/>
+              <w:spacing w:before="0" w:after="0" w:line="240" w:lineRule="auto"/>
+              <w:jc w:val="center"/>
+            </w:pPr>
+            <w:r>
+              <w:rPr>
+                <w:sz w:val="16"/>
+              </w:rPr>
+              <w:t xml:space="preserve">Endpoint projection [95% CI]</w:t>
+            </w:r>
+          </w:p>
+        </w:tc>
+      </w:tr>
+      <w:tr>
+        <w:trPr>
+          <w:cantSplit/>
+        </w:trPr>
+        <w:tc>
+          <w:tcPr>
+            <w:tcW w:type="dxa" w:w="2160"/>
+          </w:tcPr>
+          <w:p>
+            <w:pPr>
+              <w:pStyle w:val="Compact"/>
+              <w:spacing w:before="0" w:after="0" w:line="240" w:lineRule="auto"/>
+              <w:jc w:val="left"/>
+            </w:pPr>
+            <w:r>
+              <w:rPr>
+                <w:sz w:val="16"/>
+              </w:rPr>
+              <w:t xml:space="preserve">Robot only</w:t>
+            </w:r>
+          </w:p>
+        </w:tc>
+        <w:tc>
+          <w:tcPr>
+            <w:tcW w:type="dxa" w:w="3600"/>
+          </w:tcPr>
+          <w:p>
+            <w:pPr>
+              <w:pStyle w:val="Compact"/>
+              <w:spacing w:before="0" w:after="0" w:line="240" w:lineRule="auto"/>
+              <w:jc w:val="center"/>
+            </w:pPr>
+            <w:r>
+              <w:rPr>
+                <w:sz w:val="16"/>
+              </w:rPr>
+              <w:t xml:space="preserve">0.0022 [</w:t>
+            </w:r>
+            <m:oMath>
+              <m:r>
+                <m:rPr>
+                  <m:sty m:val="p"/>
+                </m:rPr>
+                <m:t>−</m:t>
+              </m:r>
+              <m:r>
+                <m:t>0.0016</m:t>
+              </m:r>
+            </m:oMath>
+            <w:r>
+              <w:rPr>
+                <w:sz w:val="16"/>
+              </w:rPr>
+              <w:t xml:space="preserve">, 0.0060]</w:t>
+            </w:r>
+          </w:p>
+        </w:tc>
+        <w:tc>
+          <w:tcPr>
+            <w:tcW w:type="dxa" w:w="3600"/>
+          </w:tcPr>
+          <w:p>
+            <w:pPr>
+              <w:pStyle w:val="Compact"/>
+              <w:spacing w:before="0" w:after="0" w:line="240" w:lineRule="auto"/>
+              <w:jc w:val="center"/>
+            </w:pPr>
+            <w:r>
+              <w:rPr>
+                <w:sz w:val="16"/>
+              </w:rPr>
+              <w:t xml:space="preserve">0.0102 [</w:t>
+            </w:r>
+            <m:oMath>
+              <m:r>
+                <m:rPr>
+                  <m:sty m:val="p"/>
+                </m:rPr>
+                <m:t>−</m:t>
+              </m:r>
+              <m:r>
+                <m:t>0.0067</m:t>
+              </m:r>
+            </m:oMath>
+            <w:r>
+              <w:rPr>
+                <w:sz w:val="16"/>
+              </w:rPr>
+              <w:t xml:space="preserve">, 0.0275]</w:t>
+            </w:r>
+          </w:p>
+        </w:tc>
+      </w:tr>
+      <w:tr>
+        <w:trPr>
+          <w:cantSplit/>
+        </w:trPr>
+        <w:tc>
+          <w:tcPr>
+            <w:tcW w:type="dxa" w:w="2160"/>
+          </w:tcPr>
+          <w:p>
+            <w:pPr>
+              <w:pStyle w:val="Compact"/>
+              <w:spacing w:before="0" w:after="0" w:line="240" w:lineRule="auto"/>
+              <w:jc w:val="left"/>
+            </w:pPr>
+            <w:r>
+              <w:rPr>
+                <w:sz w:val="16"/>
+              </w:rPr>
+              <w:t xml:space="preserve">Object only</w:t>
+            </w:r>
+          </w:p>
+        </w:tc>
+        <w:tc>
+          <w:tcPr>
+            <w:tcW w:type="dxa" w:w="3600"/>
+          </w:tcPr>
+          <w:p>
+            <w:pPr>
+              <w:pStyle w:val="Compact"/>
+              <w:spacing w:before="0" w:after="0" w:line="240" w:lineRule="auto"/>
+              <w:jc w:val="center"/>
+            </w:pPr>
+            <w:r>
+              <w:rPr>
+                <w:sz w:val="16"/>
+              </w:rPr>
+              <w:t xml:space="preserve">0.0061 [0.0009, 0.0119]</w:t>
+            </w:r>
+          </w:p>
+        </w:tc>
+        <w:tc>
+          <w:tcPr>
+            <w:tcW w:type="dxa" w:w="3600"/>
+          </w:tcPr>
+          <w:p>
+            <w:pPr>
+              <w:pStyle w:val="Compact"/>
+              <w:spacing w:before="0" w:after="0" w:line="240" w:lineRule="auto"/>
+              <w:jc w:val="center"/>
+            </w:pPr>
+            <m:oMath>
+              <m:r>
+                <m:rPr>
+                  <m:sty m:val="p"/>
+                </m:rPr>
+                <m:t>−</m:t>
+              </m:r>
+              <m:r>
+                <m:t>0.0001</m:t>
+              </m:r>
+            </m:oMath>
+            <w:r>
+              <w:rPr>
+                <w:sz w:val="16"/>
+              </w:rPr>
+              <w:t xml:space="preserve"> </w:t>
+            </w:r>
+            <w:r>
+              <w:rPr>
+                <w:sz w:val="16"/>
+              </w:rPr>
+              <w:t xml:space="preserve">[</w:t>
+            </w:r>
+            <m:oMath>
+              <m:r>
+                <m:rPr>
+                  <m:sty m:val="p"/>
+                </m:rPr>
+                <m:t>−</m:t>
+              </m:r>
+              <m:r>
+                <m:t>0.0254</m:t>
+              </m:r>
+            </m:oMath>
+            <w:r>
+              <w:rPr>
+                <w:sz w:val="16"/>
+              </w:rPr>
+              <w:t xml:space="preserve">, 0.0239]</w:t>
+            </w:r>
+          </w:p>
+        </w:tc>
+      </w:tr>
+    </w:tbl>
     <w:bookmarkEnd w:id="34"/>
     <w:bookmarkEnd w:id="35"/>
-    <w:bookmarkStart w:id="43" w:name="sec:pathway"/>
+    <w:bookmarkEnd w:id="36"/>
+    <w:bookmarkStart w:id="44" w:name="sec:pathway"/>
     <w:p>
       <w:pPr>
         <w:pStyle w:val="Heading2"/>
@@ -5247,7 +5557,7 @@
         <w:t xml:space="preserve">Future-token attention provides an active route from generated futures to action. Population-level K/V replacement in Cosmos 3 gives the stronger of the two pathway tests.</w:t>
       </w:r>
     </w:p>
-    <w:bookmarkStart w:id="36" w:name="cosmos-policy.-3"/>
+    <w:bookmarkStart w:id="37" w:name="cosmos-policy.-3"/>
     <w:p>
       <w:pPr>
         <w:pStyle w:val="Heading4"/>
@@ -5420,8 +5730,8 @@
         <w:t xml:space="preserve">larger. Executed endpoints support the same bounded conclusion, although state counts and intervals are not available for this analysis. The late future-to-action edge is active, but it is neither the only nor the largest route through the block.</w:t>
       </w:r>
     </w:p>
-    <w:bookmarkEnd w:id="36"/>
-    <w:bookmarkStart w:id="42" w:name="cosmos-3.-3"/>
+    <w:bookmarkEnd w:id="37"/>
+    <w:bookmarkStart w:id="43" w:name="cosmos-3.-3"/>
     <w:p>
       <w:pPr>
         <w:pStyle w:val="Heading4"/>
@@ -5521,12 +5831,12 @@
       <w:r>
         <w:t xml:space="preserve">endpoint shift (Table </w:t>
       </w:r>
-      <w:hyperlink w:anchor="tab:mechanisms">
+      <w:hyperlink w:anchor="tab:kv_pathway">
         <w:r>
           <w:rPr>
             <w:rStyle w:val="Hyperlink"/>
           </w:rPr>
-          <w:t xml:space="preserve">2</w:t>
+          <w:t xml:space="preserve">3</w:t>
         </w:r>
       </w:hyperlink>
       <w:r>
@@ -5577,68 +5887,14 @@
         <w:t xml:space="preserve">; all prespecified primary sign tests remain significant after Holm correction. Because token count and attention positions remain fixed, donor-specific information travels through this future-token K/V interface. The experiment does not identify every head or feature, exclude interacting unpatched routes, or establish a complete circuit.</w:t>
       </w:r>
     </w:p>
-    <w:bookmarkStart w:id="37" w:name="tab:mechanisms"/>
+    <w:bookmarkStart w:id="38" w:name="tab:kv_pathway"/>
     <w:p>
       <w:pPr>
         <w:pStyle w:val="TableCaption"/>
         <w:keepNext/>
-        <w:pageBreakBefore/>
-      </w:pPr>
-      <w:r>
-        <w:t xml:space="preserve">Two complementary Cosmos 3 mechanism tests in one table. For content sufficiency (10 states), the effect is donor steering recreated by isolated pixels;</w:t>
-      </w:r>
-      <w:r>
-        <w:t xml:space="preserve"> </w:t>
-      </w:r>
-      <w:r>
-        <w:t xml:space="preserve">“No”</w:t>
-      </w:r>
-      <w:r>
-        <w:t xml:space="preserve"> </w:t>
-      </w:r>
-      <w:r>
-        <w:t xml:space="preserve">means the entire interval lies within the prespecified</w:t>
-      </w:r>
-      <w:r>
-        <w:t xml:space="preserve"> </w:t>
-      </w:r>
-      <m:oMath>
-        <m:r>
-          <m:rPr>
-            <m:sty m:val="p"/>
-          </m:rPr>
-          <m:t>[</m:t>
-        </m:r>
-        <m:r>
-          <m:rPr>
-            <m:sty m:val="p"/>
-          </m:rPr>
-          <m:t>−</m:t>
-        </m:r>
-        <m:r>
-          <m:t>0.10</m:t>
-        </m:r>
-        <m:r>
-          <m:rPr>
-            <m:sty m:val="p"/>
-          </m:rPr>
-          <m:t>,</m:t>
-        </m:r>
-        <m:r>
-          <m:t>0.10</m:t>
-        </m:r>
-        <m:r>
-          <m:rPr>
-            <m:sty m:val="p"/>
-          </m:rPr>
-          <m:t>]</m:t>
-        </m:r>
-      </m:oMath>
-      <w:r>
-        <w:t xml:space="preserve"> </w:t>
-      </w:r>
-      <w:r>
-        <w:t xml:space="preserve">equivalence region. For pathway dependence (22 states), the effect is donor steering lost after replacing donor-future K/V with self-future K/V; percentages compare point estimates with unpatched steering. Isolated robot or object pixels are insufficient, while the complete future-token K/V interface carries most of the effect.</w:t>
+      </w:pPr>
+      <w:r>
+        <w:t xml:space="preserve">Cosmos 3 future-token pathway intervention across 22 states from six tasks. Donor steering is the unpatched donor-directed projection. Replacement loss is the reduction in that projection after replacing donor-future K/V with self-future K/V; intervals are 95% state-bootstrap intervals. Relative reduction is the replacement-loss point estimate divided by unpatched donor steering.</w:t>
       </w:r>
     </w:p>
     <w:tbl>
@@ -5647,14 +5903,13 @@
         <w:tblW w:type="auto" w:w="0"/>
         <w:tblLayout w:type="fixed"/>
         <w:tblLook w:firstRow="1" w:lastRow="0" w:firstColumn="0" w:lastColumn="0" w:noHBand="0" w:noVBand="0" w:val="0020"/>
-        <w:tblCaption w:val="Two complementary Cosmos 3 mechanism tests in one table. For content sufficiency (10 states), the effect is donor steering recreated by isolated pixels; “No” means the entire interval lies within the prespecified [-0.10,0.10] equivalence region. For pathway dependence (22 states), the effect is donor steering lost after replacing donor-future K/V with self-future K/V; percentages compare point estimates with unpatched steering. Isolated robot or object pixels are insufficient, while the complete future-token K/V interface carries most of the effect."/>
+        <w:tblCaption w:val="Cosmos 3 future-token pathway intervention across 22 states from six tasks. Donor steering is the unpatched donor-directed projection. Replacement loss is the reduction in that projection after replacing donor-future K/V with self-future K/V; intervals are 95% state-bootstrap intervals. Relative reduction is the replacement-loss point estimate divided by unpatched donor steering."/>
       </w:tblPr>
       <w:tblGrid>
-        <w:gridCol w:w="1584"/>
-        <w:gridCol w:w="1584"/>
-        <w:gridCol w:w="1584"/>
-        <w:gridCol w:w="1584"/>
-        <w:gridCol w:w="1584"/>
+        <w:gridCol w:w="1980"/>
+        <w:gridCol w:w="1980"/>
+        <w:gridCol w:w="1980"/>
+        <w:gridCol w:w="1980"/>
       </w:tblGrid>
       <w:tr>
         <w:trPr>
@@ -5663,43 +5918,7 @@
         </w:trPr>
         <w:tc>
           <w:tcPr>
-            <w:tcW w:type="dxa" w:w="2160"/>
-          </w:tcPr>
-          <w:p>
-            <w:pPr>
-              <w:pStyle w:val="Compact"/>
-              <w:spacing w:before="0" w:after="0" w:line="240" w:lineRule="auto"/>
-              <w:jc w:val="left"/>
-            </w:pPr>
-            <w:r>
-              <w:rPr>
-                <w:sz w:val="16"/>
-              </w:rPr>
-              <w:t xml:space="preserve">Question</w:t>
-            </w:r>
-          </w:p>
-        </w:tc>
-        <w:tc>
-          <w:tcPr>
-            <w:tcW w:type="dxa" w:w="2160"/>
-          </w:tcPr>
-          <w:p>
-            <w:pPr>
-              <w:pStyle w:val="Compact"/>
-              <w:spacing w:before="0" w:after="0" w:line="240" w:lineRule="auto"/>
-              <w:jc w:val="left"/>
-            </w:pPr>
-            <w:r>
-              <w:rPr>
-                <w:sz w:val="16"/>
-              </w:rPr>
-              <w:t xml:space="preserve">Intervention</w:t>
-            </w:r>
-          </w:p>
-        </w:tc>
-        <w:tc>
-          <w:tcPr>
-            <w:tcW w:type="dxa" w:w="1440"/>
+            <w:tcW w:type="dxa" w:w="1944"/>
           </w:tcPr>
           <w:p>
             <w:pPr>
@@ -5717,37 +5936,55 @@
         </w:tc>
         <w:tc>
           <w:tcPr>
-            <w:tcW w:type="dxa" w:w="2376"/>
-          </w:tcPr>
-          <w:p>
-            <w:pPr>
-              <w:pStyle w:val="Compact"/>
-              <w:spacing w:before="0" w:after="0" w:line="240" w:lineRule="auto"/>
-              <w:jc w:val="left"/>
-            </w:pPr>
-            <w:r>
-              <w:rPr>
-                <w:sz w:val="16"/>
-              </w:rPr>
-              <w:t xml:space="preserve">Effect [95% CI]</w:t>
-            </w:r>
-          </w:p>
-        </w:tc>
-        <w:tc>
-          <w:tcPr>
-            <w:tcW w:type="dxa" w:w="1224"/>
-          </w:tcPr>
-          <w:p>
-            <w:pPr>
-              <w:pStyle w:val="Compact"/>
-              <w:spacing w:before="0" w:after="0" w:line="240" w:lineRule="auto"/>
-              <w:jc w:val="left"/>
-            </w:pPr>
-            <w:r>
-              <w:rPr>
-                <w:sz w:val="16"/>
-              </w:rPr>
-              <w:t xml:space="preserve">Answer</w:t>
+            <w:tcW w:type="dxa" w:w="1728"/>
+          </w:tcPr>
+          <w:p>
+            <w:pPr>
+              <w:pStyle w:val="Compact"/>
+              <w:spacing w:before="0" w:after="0" w:line="240" w:lineRule="auto"/>
+              <w:jc w:val="center"/>
+            </w:pPr>
+            <w:r>
+              <w:rPr>
+                <w:sz w:val="16"/>
+              </w:rPr>
+              <w:t xml:space="preserve">Donor steering</w:t>
+            </w:r>
+          </w:p>
+        </w:tc>
+        <w:tc>
+          <w:tcPr>
+            <w:tcW w:type="dxa" w:w="3816"/>
+          </w:tcPr>
+          <w:p>
+            <w:pPr>
+              <w:pStyle w:val="Compact"/>
+              <w:spacing w:before="0" w:after="0" w:line="240" w:lineRule="auto"/>
+              <w:jc w:val="center"/>
+            </w:pPr>
+            <w:r>
+              <w:rPr>
+                <w:sz w:val="16"/>
+              </w:rPr>
+              <w:t xml:space="preserve">Replacement loss [95% CI]</w:t>
+            </w:r>
+          </w:p>
+        </w:tc>
+        <w:tc>
+          <w:tcPr>
+            <w:tcW w:type="dxa" w:w="1872"/>
+          </w:tcPr>
+          <w:p>
+            <w:pPr>
+              <w:pStyle w:val="Compact"/>
+              <w:spacing w:before="0" w:after="0" w:line="240" w:lineRule="auto"/>
+              <w:jc w:val="center"/>
+            </w:pPr>
+            <w:r>
+              <w:rPr>
+                <w:sz w:val="16"/>
+              </w:rPr>
+              <w:t xml:space="preserve">Relative reduction</w:t>
             </w:r>
           </w:p>
         </w:tc>
@@ -5758,110 +5995,73 @@
         </w:trPr>
         <w:tc>
           <w:tcPr>
-            <w:tcW w:type="dxa" w:w="2160"/>
-          </w:tcPr>
-          <w:p>
-            <w:pPr>
-              <w:pStyle w:val="Compact"/>
-              <w:spacing w:before="0" w:after="0" w:line="240" w:lineRule="auto"/>
-              <w:jc w:val="left"/>
-            </w:pPr>
-            <w:r>
-              <w:rPr>
-                <w:sz w:val="16"/>
-              </w:rPr>
-              <w:t xml:space="preserve">Content sufficient?</w:t>
-            </w:r>
-          </w:p>
-        </w:tc>
-        <w:tc>
-          <w:tcPr>
-            <w:tcW w:type="dxa" w:w="2160"/>
-          </w:tcPr>
-          <w:p>
-            <w:pPr>
-              <w:pStyle w:val="Compact"/>
-              <w:spacing w:before="0" w:after="0" w:line="240" w:lineRule="auto"/>
-              <w:jc w:val="left"/>
-            </w:pPr>
-            <w:r>
-              <w:rPr>
-                <w:sz w:val="16"/>
-              </w:rPr>
-              <w:t xml:space="preserve">Robot pixels</w:t>
-            </w:r>
-          </w:p>
-        </w:tc>
-        <w:tc>
-          <w:tcPr>
-            <w:tcW w:type="dxa" w:w="1440"/>
-          </w:tcPr>
-          <w:p>
-            <w:pPr>
-              <w:pStyle w:val="Compact"/>
-              <w:spacing w:before="0" w:after="0" w:line="240" w:lineRule="auto"/>
-              <w:jc w:val="left"/>
-            </w:pPr>
-            <w:r>
-              <w:rPr>
-                <w:sz w:val="16"/>
-              </w:rPr>
-              <w:t xml:space="preserve">Action</w:t>
-            </w:r>
-          </w:p>
-        </w:tc>
-        <w:tc>
-          <w:tcPr>
-            <w:tcW w:type="dxa" w:w="2376"/>
-          </w:tcPr>
-          <w:p>
-            <w:pPr>
-              <w:pStyle w:val="Compact"/>
-              <w:spacing w:before="0" w:after="0" w:line="240" w:lineRule="auto"/>
-              <w:jc w:val="left"/>
-            </w:pPr>
-            <w:r>
-              <w:rPr>
-                <w:sz w:val="16"/>
-              </w:rPr>
-              <w:t xml:space="preserve">0.0022 [</w:t>
-            </w:r>
-            <m:oMath>
-              <m:r>
-                <m:rPr>
-                  <m:sty m:val="p"/>
-                </m:rPr>
-                <m:t>−</m:t>
-              </m:r>
-              <m:r>
-                <m:t>0.0016</m:t>
-              </m:r>
-            </m:oMath>
-            <w:r>
-              <w:rPr>
-                <w:sz w:val="16"/>
-              </w:rPr>
-              <w:t xml:space="preserve">, 0.0060]</w:t>
-            </w:r>
-          </w:p>
-        </w:tc>
-        <w:tc>
-          <w:tcPr>
-            <w:tcW w:type="dxa" w:w="1224"/>
-          </w:tcPr>
-          <w:p>
-            <w:pPr>
-              <w:pStyle w:val="Compact"/>
-              <w:spacing w:before="0" w:after="0" w:line="240" w:lineRule="auto"/>
-              <w:jc w:val="left"/>
-            </w:pPr>
-            <w:r>
-              <w:rPr>
-                <w:b/>
-                <w:bCs/>
-                <w:sz w:val="16"/>
-              </w:rPr>
-              <w:t xml:space="preserve">No</w:t>
+            <w:tcW w:type="dxa" w:w="1944"/>
+          </w:tcPr>
+          <w:p>
+            <w:pPr>
+              <w:pStyle w:val="Compact"/>
+              <w:spacing w:before="0" w:after="0" w:line="240" w:lineRule="auto"/>
+              <w:jc w:val="left"/>
+            </w:pPr>
+            <w:r>
+              <w:rPr>
+                <w:sz w:val="16"/>
+              </w:rPr>
+              <w:t xml:space="preserve">Predicted action</w:t>
+            </w:r>
+          </w:p>
+        </w:tc>
+        <w:tc>
+          <w:tcPr>
+            <w:tcW w:type="dxa" w:w="1728"/>
+          </w:tcPr>
+          <w:p>
+            <w:pPr>
+              <w:pStyle w:val="Compact"/>
+              <w:spacing w:before="0" w:after="0" w:line="240" w:lineRule="auto"/>
+              <w:jc w:val="center"/>
+            </w:pPr>
+            <w:r>
+              <w:rPr>
+                <w:sz w:val="16"/>
+              </w:rPr>
+              <w:t xml:space="preserve">0.992</w:t>
+            </w:r>
+          </w:p>
+        </w:tc>
+        <w:tc>
+          <w:tcPr>
+            <w:tcW w:type="dxa" w:w="3816"/>
+          </w:tcPr>
+          <w:p>
+            <w:pPr>
+              <w:pStyle w:val="Compact"/>
+              <w:spacing w:before="0" w:after="0" w:line="240" w:lineRule="auto"/>
+              <w:jc w:val="center"/>
+            </w:pPr>
+            <w:r>
+              <w:rPr>
+                <w:sz w:val="16"/>
+              </w:rPr>
+              <w:t xml:space="preserve">0.877 [0.842, 0.910]</w:t>
+            </w:r>
+          </w:p>
+        </w:tc>
+        <w:tc>
+          <w:tcPr>
+            <w:tcW w:type="dxa" w:w="1872"/>
+          </w:tcPr>
+          <w:p>
+            <w:pPr>
+              <w:pStyle w:val="Compact"/>
+              <w:spacing w:before="0" w:after="0" w:line="240" w:lineRule="auto"/>
+              <w:jc w:val="center"/>
+            </w:pPr>
+            <w:r>
+              <w:rPr>
+                <w:sz w:val="16"/>
+              </w:rPr>
+              <w:t xml:space="preserve">88%</w:t>
             </w:r>
           </w:p>
         </w:tc>
@@ -5872,110 +6072,73 @@
         </w:trPr>
         <w:tc>
           <w:tcPr>
-            <w:tcW w:type="dxa" w:w="2160"/>
-          </w:tcPr>
-          <w:p>
-            <w:pPr>
-              <w:pStyle w:val="Compact"/>
-              <w:spacing w:before="0" w:after="0" w:line="240" w:lineRule="auto"/>
-              <w:jc w:val="left"/>
-            </w:pPr>
-            <w:r>
-              <w:rPr>
-                <w:sz w:val="16"/>
-              </w:rPr>
-              <w:t xml:space="preserve">Content sufficient?</w:t>
-            </w:r>
-          </w:p>
-        </w:tc>
-        <w:tc>
-          <w:tcPr>
-            <w:tcW w:type="dxa" w:w="2160"/>
-          </w:tcPr>
-          <w:p>
-            <w:pPr>
-              <w:pStyle w:val="Compact"/>
-              <w:spacing w:before="0" w:after="0" w:line="240" w:lineRule="auto"/>
-              <w:jc w:val="left"/>
-            </w:pPr>
-            <w:r>
-              <w:rPr>
-                <w:sz w:val="16"/>
-              </w:rPr>
-              <w:t xml:space="preserve">Robot pixels</w:t>
-            </w:r>
-          </w:p>
-        </w:tc>
-        <w:tc>
-          <w:tcPr>
-            <w:tcW w:type="dxa" w:w="1440"/>
-          </w:tcPr>
-          <w:p>
-            <w:pPr>
-              <w:pStyle w:val="Compact"/>
-              <w:spacing w:before="0" w:after="0" w:line="240" w:lineRule="auto"/>
-              <w:jc w:val="left"/>
-            </w:pPr>
-            <w:r>
-              <w:rPr>
-                <w:sz w:val="16"/>
-              </w:rPr>
-              <w:t xml:space="preserve">Endpoint</w:t>
-            </w:r>
-          </w:p>
-        </w:tc>
-        <w:tc>
-          <w:tcPr>
-            <w:tcW w:type="dxa" w:w="2376"/>
-          </w:tcPr>
-          <w:p>
-            <w:pPr>
-              <w:pStyle w:val="Compact"/>
-              <w:spacing w:before="0" w:after="0" w:line="240" w:lineRule="auto"/>
-              <w:jc w:val="left"/>
-            </w:pPr>
-            <w:r>
-              <w:rPr>
-                <w:sz w:val="16"/>
-              </w:rPr>
-              <w:t xml:space="preserve">0.0102 [</w:t>
-            </w:r>
-            <m:oMath>
-              <m:r>
-                <m:rPr>
-                  <m:sty m:val="p"/>
-                </m:rPr>
-                <m:t>−</m:t>
-              </m:r>
-              <m:r>
-                <m:t>0.0067</m:t>
-              </m:r>
-            </m:oMath>
-            <w:r>
-              <w:rPr>
-                <w:sz w:val="16"/>
-              </w:rPr>
-              <w:t xml:space="preserve">, 0.0275]</w:t>
-            </w:r>
-          </w:p>
-        </w:tc>
-        <w:tc>
-          <w:tcPr>
-            <w:tcW w:type="dxa" w:w="1224"/>
-          </w:tcPr>
-          <w:p>
-            <w:pPr>
-              <w:pStyle w:val="Compact"/>
-              <w:spacing w:before="0" w:after="0" w:line="240" w:lineRule="auto"/>
-              <w:jc w:val="left"/>
-            </w:pPr>
-            <w:r>
-              <w:rPr>
-                <w:b/>
-                <w:bCs/>
-                <w:sz w:val="16"/>
-              </w:rPr>
-              <w:t xml:space="preserve">No</w:t>
+            <w:tcW w:type="dxa" w:w="1944"/>
+          </w:tcPr>
+          <w:p>
+            <w:pPr>
+              <w:pStyle w:val="Compact"/>
+              <w:spacing w:before="0" w:after="0" w:line="240" w:lineRule="auto"/>
+              <w:jc w:val="left"/>
+            </w:pPr>
+            <w:r>
+              <w:rPr>
+                <w:sz w:val="16"/>
+              </w:rPr>
+              <w:t xml:space="preserve">Executed action</w:t>
+            </w:r>
+          </w:p>
+        </w:tc>
+        <w:tc>
+          <w:tcPr>
+            <w:tcW w:type="dxa" w:w="1728"/>
+          </w:tcPr>
+          <w:p>
+            <w:pPr>
+              <w:pStyle w:val="Compact"/>
+              <w:spacing w:before="0" w:after="0" w:line="240" w:lineRule="auto"/>
+              <w:jc w:val="center"/>
+            </w:pPr>
+            <w:r>
+              <w:rPr>
+                <w:sz w:val="16"/>
+              </w:rPr>
+              <w:t xml:space="preserve">0.983</w:t>
+            </w:r>
+          </w:p>
+        </w:tc>
+        <w:tc>
+          <w:tcPr>
+            <w:tcW w:type="dxa" w:w="3816"/>
+          </w:tcPr>
+          <w:p>
+            <w:pPr>
+              <w:pStyle w:val="Compact"/>
+              <w:spacing w:before="0" w:after="0" w:line="240" w:lineRule="auto"/>
+              <w:jc w:val="center"/>
+            </w:pPr>
+            <w:r>
+              <w:rPr>
+                <w:sz w:val="16"/>
+              </w:rPr>
+              <w:t xml:space="preserve">0.814 [0.723, 0.900]</w:t>
+            </w:r>
+          </w:p>
+        </w:tc>
+        <w:tc>
+          <w:tcPr>
+            <w:tcW w:type="dxa" w:w="1872"/>
+          </w:tcPr>
+          <w:p>
+            <w:pPr>
+              <w:pStyle w:val="Compact"/>
+              <w:spacing w:before="0" w:after="0" w:line="240" w:lineRule="auto"/>
+              <w:jc w:val="center"/>
+            </w:pPr>
+            <w:r>
+              <w:rPr>
+                <w:sz w:val="16"/>
+              </w:rPr>
+              <w:t xml:space="preserve">83%</w:t>
             </w:r>
           </w:p>
         </w:tc>
@@ -5986,465 +6149,7 @@
         </w:trPr>
         <w:tc>
           <w:tcPr>
-            <w:tcW w:type="dxa" w:w="2160"/>
-          </w:tcPr>
-          <w:p>
-            <w:pPr>
-              <w:pStyle w:val="Compact"/>
-              <w:spacing w:before="0" w:after="0" w:line="240" w:lineRule="auto"/>
-              <w:jc w:val="left"/>
-            </w:pPr>
-            <w:r>
-              <w:rPr>
-                <w:sz w:val="16"/>
-              </w:rPr>
-              <w:t xml:space="preserve">Content sufficient?</w:t>
-            </w:r>
-          </w:p>
-        </w:tc>
-        <w:tc>
-          <w:tcPr>
-            <w:tcW w:type="dxa" w:w="2160"/>
-          </w:tcPr>
-          <w:p>
-            <w:pPr>
-              <w:pStyle w:val="Compact"/>
-              <w:spacing w:before="0" w:after="0" w:line="240" w:lineRule="auto"/>
-              <w:jc w:val="left"/>
-            </w:pPr>
-            <w:r>
-              <w:rPr>
-                <w:sz w:val="16"/>
-              </w:rPr>
-              <w:t xml:space="preserve">Object pixels</w:t>
-            </w:r>
-          </w:p>
-        </w:tc>
-        <w:tc>
-          <w:tcPr>
-            <w:tcW w:type="dxa" w:w="1440"/>
-          </w:tcPr>
-          <w:p>
-            <w:pPr>
-              <w:pStyle w:val="Compact"/>
-              <w:spacing w:before="0" w:after="0" w:line="240" w:lineRule="auto"/>
-              <w:jc w:val="left"/>
-            </w:pPr>
-            <w:r>
-              <w:rPr>
-                <w:sz w:val="16"/>
-              </w:rPr>
-              <w:t xml:space="preserve">Action</w:t>
-            </w:r>
-          </w:p>
-        </w:tc>
-        <w:tc>
-          <w:tcPr>
-            <w:tcW w:type="dxa" w:w="2376"/>
-          </w:tcPr>
-          <w:p>
-            <w:pPr>
-              <w:pStyle w:val="Compact"/>
-              <w:spacing w:before="0" w:after="0" w:line="240" w:lineRule="auto"/>
-              <w:jc w:val="left"/>
-            </w:pPr>
-            <w:r>
-              <w:rPr>
-                <w:sz w:val="16"/>
-              </w:rPr>
-              <w:t xml:space="preserve">0.0061 [0.0009, 0.0119]</w:t>
-            </w:r>
-          </w:p>
-        </w:tc>
-        <w:tc>
-          <w:tcPr>
-            <w:tcW w:type="dxa" w:w="1224"/>
-          </w:tcPr>
-          <w:p>
-            <w:pPr>
-              <w:pStyle w:val="Compact"/>
-              <w:spacing w:before="0" w:after="0" w:line="240" w:lineRule="auto"/>
-              <w:jc w:val="left"/>
-            </w:pPr>
-            <w:r>
-              <w:rPr>
-                <w:b/>
-                <w:bCs/>
-                <w:sz w:val="16"/>
-              </w:rPr>
-              <w:t xml:space="preserve">No</w:t>
-            </w:r>
-          </w:p>
-        </w:tc>
-      </w:tr>
-      <w:tr>
-        <w:trPr>
-          <w:cantSplit/>
-        </w:trPr>
-        <w:tc>
-          <w:tcPr>
-            <w:tcW w:type="dxa" w:w="2160"/>
-          </w:tcPr>
-          <w:p>
-            <w:pPr>
-              <w:pStyle w:val="Compact"/>
-              <w:spacing w:before="0" w:after="0" w:line="240" w:lineRule="auto"/>
-              <w:jc w:val="left"/>
-            </w:pPr>
-            <w:r>
-              <w:rPr>
-                <w:sz w:val="16"/>
-              </w:rPr>
-              <w:t xml:space="preserve">Content sufficient?</w:t>
-            </w:r>
-          </w:p>
-        </w:tc>
-        <w:tc>
-          <w:tcPr>
-            <w:tcW w:type="dxa" w:w="2160"/>
-          </w:tcPr>
-          <w:p>
-            <w:pPr>
-              <w:pStyle w:val="Compact"/>
-              <w:spacing w:before="0" w:after="0" w:line="240" w:lineRule="auto"/>
-              <w:jc w:val="left"/>
-            </w:pPr>
-            <w:r>
-              <w:rPr>
-                <w:sz w:val="16"/>
-              </w:rPr>
-              <w:t xml:space="preserve">Object pixels</w:t>
-            </w:r>
-          </w:p>
-        </w:tc>
-        <w:tc>
-          <w:tcPr>
-            <w:tcW w:type="dxa" w:w="1440"/>
-          </w:tcPr>
-          <w:p>
-            <w:pPr>
-              <w:pStyle w:val="Compact"/>
-              <w:spacing w:before="0" w:after="0" w:line="240" w:lineRule="auto"/>
-              <w:jc w:val="left"/>
-            </w:pPr>
-            <w:r>
-              <w:rPr>
-                <w:sz w:val="16"/>
-              </w:rPr>
-              <w:t xml:space="preserve">Endpoint</w:t>
-            </w:r>
-          </w:p>
-        </w:tc>
-        <w:tc>
-          <w:tcPr>
-            <w:tcW w:type="dxa" w:w="2376"/>
-          </w:tcPr>
-          <w:p>
-            <w:pPr>
-              <w:pStyle w:val="Compact"/>
-              <w:spacing w:before="0" w:after="0" w:line="240" w:lineRule="auto"/>
-              <w:jc w:val="left"/>
-            </w:pPr>
-            <m:oMath>
-              <m:r>
-                <m:rPr>
-                  <m:sty m:val="p"/>
-                </m:rPr>
-                <m:t>−</m:t>
-              </m:r>
-              <m:r>
-                <m:t>0.0001</m:t>
-              </m:r>
-            </m:oMath>
-            <w:r>
-              <w:rPr>
-                <w:sz w:val="16"/>
-              </w:rPr>
-              <w:t xml:space="preserve"> </w:t>
-            </w:r>
-            <w:r>
-              <w:rPr>
-                <w:sz w:val="16"/>
-              </w:rPr>
-              <w:t xml:space="preserve">[</w:t>
-            </w:r>
-            <m:oMath>
-              <m:r>
-                <m:rPr>
-                  <m:sty m:val="p"/>
-                </m:rPr>
-                <m:t>−</m:t>
-              </m:r>
-              <m:r>
-                <m:t>0.0254</m:t>
-              </m:r>
-            </m:oMath>
-            <w:r>
-              <w:rPr>
-                <w:sz w:val="16"/>
-              </w:rPr>
-              <w:t xml:space="preserve">, 0.0239]</w:t>
-            </w:r>
-          </w:p>
-        </w:tc>
-        <w:tc>
-          <w:tcPr>
-            <w:tcW w:type="dxa" w:w="1224"/>
-          </w:tcPr>
-          <w:p>
-            <w:pPr>
-              <w:pStyle w:val="Compact"/>
-              <w:spacing w:before="0" w:after="0" w:line="240" w:lineRule="auto"/>
-              <w:jc w:val="left"/>
-            </w:pPr>
-            <w:r>
-              <w:rPr>
-                <w:b/>
-                <w:bCs/>
-                <w:sz w:val="16"/>
-              </w:rPr>
-              <w:t xml:space="preserve">No</w:t>
-            </w:r>
-          </w:p>
-        </w:tc>
-      </w:tr>
-      <w:tr>
-        <w:trPr>
-          <w:cantSplit/>
-        </w:trPr>
-        <w:tc>
-          <w:tcPr>
-            <w:tcW w:type="dxa" w:w="2160"/>
-          </w:tcPr>
-          <w:p>
-            <w:pPr>
-              <w:pStyle w:val="Compact"/>
-              <w:spacing w:before="0" w:after="0" w:line="240" w:lineRule="auto"/>
-              <w:jc w:val="left"/>
-            </w:pPr>
-            <w:r>
-              <w:rPr>
-                <w:sz w:val="16"/>
-              </w:rPr>
-              <w:t xml:space="preserve">Future K/V carries effect?</w:t>
-            </w:r>
-          </w:p>
-        </w:tc>
-        <w:tc>
-          <w:tcPr>
-            <w:tcW w:type="dxa" w:w="2160"/>
-          </w:tcPr>
-          <w:p>
-            <w:pPr>
-              <w:pStyle w:val="Compact"/>
-              <w:spacing w:before="0" w:after="0" w:line="240" w:lineRule="auto"/>
-              <w:jc w:val="left"/>
-            </w:pPr>
-            <w:r>
-              <w:rPr>
-                <w:sz w:val="16"/>
-              </w:rPr>
-              <w:t xml:space="preserve">Self K/V replacement</w:t>
-            </w:r>
-          </w:p>
-        </w:tc>
-        <w:tc>
-          <w:tcPr>
-            <w:tcW w:type="dxa" w:w="1440"/>
-          </w:tcPr>
-          <w:p>
-            <w:pPr>
-              <w:pStyle w:val="Compact"/>
-              <w:spacing w:before="0" w:after="0" w:line="240" w:lineRule="auto"/>
-              <w:jc w:val="left"/>
-            </w:pPr>
-            <w:r>
-              <w:rPr>
-                <w:sz w:val="16"/>
-              </w:rPr>
-              <w:t xml:space="preserve">Predicted action</w:t>
-            </w:r>
-          </w:p>
-        </w:tc>
-        <w:tc>
-          <w:tcPr>
-            <w:tcW w:type="dxa" w:w="2376"/>
-          </w:tcPr>
-          <w:p>
-            <w:pPr>
-              <w:pStyle w:val="Compact"/>
-              <w:spacing w:before="0" w:after="0" w:line="240" w:lineRule="auto"/>
-              <w:jc w:val="left"/>
-            </w:pPr>
-            <w:r>
-              <w:rPr>
-                <w:sz w:val="16"/>
-              </w:rPr>
-              <w:t xml:space="preserve">0.877 [0.842, 0.910]</w:t>
-            </w:r>
-          </w:p>
-        </w:tc>
-        <w:tc>
-          <w:tcPr>
-            <w:tcW w:type="dxa" w:w="1224"/>
-          </w:tcPr>
-          <w:p>
-            <w:pPr>
-              <w:pStyle w:val="Compact"/>
-              <w:spacing w:before="0" w:after="0" w:line="240" w:lineRule="auto"/>
-              <w:jc w:val="left"/>
-            </w:pPr>
-            <w:r>
-              <w:rPr>
-                <w:b/>
-                <w:bCs/>
-                <w:sz w:val="16"/>
-              </w:rPr>
-              <w:t xml:space="preserve">Yes (88%)</w:t>
-            </w:r>
-          </w:p>
-        </w:tc>
-      </w:tr>
-      <w:tr>
-        <w:trPr>
-          <w:cantSplit/>
-        </w:trPr>
-        <w:tc>
-          <w:tcPr>
-            <w:tcW w:type="dxa" w:w="2160"/>
-          </w:tcPr>
-          <w:p>
-            <w:pPr>
-              <w:pStyle w:val="Compact"/>
-              <w:spacing w:before="0" w:after="0" w:line="240" w:lineRule="auto"/>
-              <w:jc w:val="left"/>
-            </w:pPr>
-            <w:r>
-              <w:rPr>
-                <w:sz w:val="16"/>
-              </w:rPr>
-              <w:t xml:space="preserve">Future K/V carries effect?</w:t>
-            </w:r>
-          </w:p>
-        </w:tc>
-        <w:tc>
-          <w:tcPr>
-            <w:tcW w:type="dxa" w:w="2160"/>
-          </w:tcPr>
-          <w:p>
-            <w:pPr>
-              <w:pStyle w:val="Compact"/>
-              <w:spacing w:before="0" w:after="0" w:line="240" w:lineRule="auto"/>
-              <w:jc w:val="left"/>
-            </w:pPr>
-            <w:r>
-              <w:rPr>
-                <w:sz w:val="16"/>
-              </w:rPr>
-              <w:t xml:space="preserve">Self K/V replacement</w:t>
-            </w:r>
-          </w:p>
-        </w:tc>
-        <w:tc>
-          <w:tcPr>
-            <w:tcW w:type="dxa" w:w="1440"/>
-          </w:tcPr>
-          <w:p>
-            <w:pPr>
-              <w:pStyle w:val="Compact"/>
-              <w:spacing w:before="0" w:after="0" w:line="240" w:lineRule="auto"/>
-              <w:jc w:val="left"/>
-            </w:pPr>
-            <w:r>
-              <w:rPr>
-                <w:sz w:val="16"/>
-              </w:rPr>
-              <w:t xml:space="preserve">Executed action</w:t>
-            </w:r>
-          </w:p>
-        </w:tc>
-        <w:tc>
-          <w:tcPr>
-            <w:tcW w:type="dxa" w:w="2376"/>
-          </w:tcPr>
-          <w:p>
-            <w:pPr>
-              <w:pStyle w:val="Compact"/>
-              <w:spacing w:before="0" w:after="0" w:line="240" w:lineRule="auto"/>
-              <w:jc w:val="left"/>
-            </w:pPr>
-            <w:r>
-              <w:rPr>
-                <w:sz w:val="16"/>
-              </w:rPr>
-              <w:t xml:space="preserve">0.814 [0.723, 0.900]</w:t>
-            </w:r>
-          </w:p>
-        </w:tc>
-        <w:tc>
-          <w:tcPr>
-            <w:tcW w:type="dxa" w:w="1224"/>
-          </w:tcPr>
-          <w:p>
-            <w:pPr>
-              <w:pStyle w:val="Compact"/>
-              <w:spacing w:before="0" w:after="0" w:line="240" w:lineRule="auto"/>
-              <w:jc w:val="left"/>
-            </w:pPr>
-            <w:r>
-              <w:rPr>
-                <w:b/>
-                <w:bCs/>
-                <w:sz w:val="16"/>
-              </w:rPr>
-              <w:t xml:space="preserve">Yes (83%)</w:t>
-            </w:r>
-          </w:p>
-        </w:tc>
-      </w:tr>
-      <w:tr>
-        <w:trPr>
-          <w:cantSplit/>
-        </w:trPr>
-        <w:tc>
-          <w:tcPr>
-            <w:tcW w:type="dxa" w:w="2160"/>
-          </w:tcPr>
-          <w:p>
-            <w:pPr>
-              <w:pStyle w:val="Compact"/>
-              <w:spacing w:before="0" w:after="0" w:line="240" w:lineRule="auto"/>
-              <w:jc w:val="left"/>
-            </w:pPr>
-            <w:r>
-              <w:rPr>
-                <w:sz w:val="16"/>
-              </w:rPr>
-              <w:t xml:space="preserve">Future K/V carries effect?</w:t>
-            </w:r>
-          </w:p>
-        </w:tc>
-        <w:tc>
-          <w:tcPr>
-            <w:tcW w:type="dxa" w:w="2160"/>
-          </w:tcPr>
-          <w:p>
-            <w:pPr>
-              <w:pStyle w:val="Compact"/>
-              <w:spacing w:before="0" w:after="0" w:line="240" w:lineRule="auto"/>
-              <w:jc w:val="left"/>
-            </w:pPr>
-            <w:r>
-              <w:rPr>
-                <w:sz w:val="16"/>
-              </w:rPr>
-              <w:t xml:space="preserve">Self K/V replacement</w:t>
-            </w:r>
-          </w:p>
-        </w:tc>
-        <w:tc>
-          <w:tcPr>
-            <w:tcW w:type="dxa" w:w="1440"/>
+            <w:tcW w:type="dxa" w:w="1944"/>
           </w:tcPr>
           <w:p>
             <w:pPr>
@@ -6462,13 +6167,31 @@
         </w:tc>
         <w:tc>
           <w:tcPr>
-            <w:tcW w:type="dxa" w:w="2376"/>
-          </w:tcPr>
-          <w:p>
-            <w:pPr>
-              <w:pStyle w:val="Compact"/>
-              <w:spacing w:before="0" w:after="0" w:line="240" w:lineRule="auto"/>
-              <w:jc w:val="left"/>
+            <w:tcW w:type="dxa" w:w="1728"/>
+          </w:tcPr>
+          <w:p>
+            <w:pPr>
+              <w:pStyle w:val="Compact"/>
+              <w:spacing w:before="0" w:after="0" w:line="240" w:lineRule="auto"/>
+              <w:jc w:val="center"/>
+            </w:pPr>
+            <w:r>
+              <w:rPr>
+                <w:sz w:val="16"/>
+              </w:rPr>
+              <w:t xml:space="preserve">1.003</w:t>
+            </w:r>
+          </w:p>
+        </w:tc>
+        <w:tc>
+          <w:tcPr>
+            <w:tcW w:type="dxa" w:w="3816"/>
+          </w:tcPr>
+          <w:p>
+            <w:pPr>
+              <w:pStyle w:val="Compact"/>
+              <w:spacing w:before="0" w:after="0" w:line="240" w:lineRule="auto"/>
+              <w:jc w:val="center"/>
             </w:pPr>
             <w:r>
               <w:rPr>
@@ -6480,28 +6203,26 @@
         </w:tc>
         <w:tc>
           <w:tcPr>
-            <w:tcW w:type="dxa" w:w="1224"/>
-          </w:tcPr>
-          <w:p>
-            <w:pPr>
-              <w:pStyle w:val="Compact"/>
-              <w:spacing w:before="0" w:after="0" w:line="240" w:lineRule="auto"/>
-              <w:jc w:val="left"/>
-            </w:pPr>
-            <w:r>
-              <w:rPr>
-                <w:b/>
-                <w:bCs/>
-                <w:sz w:val="16"/>
-              </w:rPr>
-              <w:t xml:space="preserve">Yes (85%)</w:t>
+            <w:tcW w:type="dxa" w:w="1872"/>
+          </w:tcPr>
+          <w:p>
+            <w:pPr>
+              <w:pStyle w:val="Compact"/>
+              <w:spacing w:before="0" w:after="0" w:line="240" w:lineRule="auto"/>
+              <w:jc w:val="center"/>
+            </w:pPr>
+            <w:r>
+              <w:rPr>
+                <w:sz w:val="16"/>
+              </w:rPr>
+              <w:t xml:space="preserve">85%</w:t>
             </w:r>
           </w:p>
         </w:tc>
       </w:tr>
     </w:tbl>
-    <w:bookmarkEnd w:id="37"/>
-    <w:bookmarkStart w:id="41" w:name="fig:mechanisms"/>
+    <w:bookmarkEnd w:id="38"/>
+    <w:bookmarkStart w:id="42" w:name="fig:mechanisms"/>
     <w:p>
       <w:pPr>
         <w:pStyle w:val="CaptionedFigure"/>
@@ -6511,18 +6232,18 @@
           <wp:inline>
             <wp:extent cx="5334000" cy="1924272"/>
             <wp:effectExtent b="0" l="0" r="0" t="0"/>
-            <wp:docPr descr="" title="" id="39" name="Picture"/>
+            <wp:docPr descr="" title="" id="40" name="Picture"/>
             <a:graphic>
               <a:graphicData uri="http://schemas.openxmlformats.org/drawingml/2006/picture">
                 <pic:pic>
                   <pic:nvPicPr>
-                    <pic:cNvPr descr="figures/pathway_results.png" id="40" name="Picture"/>
+                    <pic:cNvPr descr="figures/pathway_results.png" id="41" name="Picture"/>
                     <pic:cNvPicPr>
                       <a:picLocks noChangeArrowheads="1" noChangeAspect="1"/>
                     </pic:cNvPicPr>
                   </pic:nvPicPr>
                   <pic:blipFill>
-                    <a:blip r:embed="rId38"/>
+                    <a:blip r:embed="rId39"/>
                     <a:stretch>
                       <a:fillRect/>
                     </a:stretch>
@@ -6557,11 +6278,11 @@
         <w:t xml:space="preserve">What carries the effect? Orange denotes donor-future steering, gray denotes isolated pixel-factor effects, and blue denotes the fraction removed by restoring self-future K/V. (a) In Cosmos Policy, the wrist-video future reproduces most of the whole-future action effect; future proprioception reproduces none. (b) In Cosmos 3, neither robot-only nor object-only pixels reproduce the whole-future effect; the shaded band is the prespecified equivalence region. (c) Replacing the donor-future K/V pathway with self-future K/V removes 83–88% of donor steering.</w:t>
       </w:r>
     </w:p>
-    <w:bookmarkEnd w:id="41"/>
     <w:bookmarkEnd w:id="42"/>
     <w:bookmarkEnd w:id="43"/>
     <w:bookmarkEnd w:id="44"/>
-    <w:bookmarkStart w:id="47" w:name="sec:discussion"/>
+    <w:bookmarkEnd w:id="45"/>
+    <w:bookmarkStart w:id="48" w:name="sec:discussion"/>
     <w:p>
       <w:pPr>
         <w:pStyle w:val="Heading1"/>
@@ -6618,7 +6339,7 @@
         <w:t xml:space="preserve">describe generated representations, not deliberation. Our claim is that these direct policies condition action on coherent futures, not that WAMs generally plan over task consequences.</w:t>
       </w:r>
     </w:p>
-    <w:bookmarkStart w:id="45" w:name="limitations."/>
+    <w:bookmarkStart w:id="46" w:name="limitations."/>
     <w:p>
       <w:pPr>
         <w:pStyle w:val="Heading4"/>
@@ -6635,8 +6356,8 @@
         <w:t xml:space="preserve">All interventions are in simulation and cover two checkpoints, six RoboLab tasks, and LIBERO-Long. Cosmos Policy’s strongest result uses one first-query state per task, while later estimates use different physical states and therefore cannot isolate elapsed time. Its natural content analysis contains only four states, and rendered hybrids may be outside the policy’s native future distribution. Cosmos 3 completed 22 of 24 frozen population states and 10 of 12 factor states; the two population omissions resulted from short source videos and were not replaced. Pixel masks may miss distributed semantic features or induce nonlinear changes, so negligible isolated effects do not establish joint necessity. Key removal changes attention normalization, and K/V replacement can interact with unpatched routes. We do not demonstrate task-success mediation or recover a full circuit.</w:t>
       </w:r>
     </w:p>
-    <w:bookmarkEnd w:id="45"/>
-    <w:bookmarkStart w:id="46" w:name="broader-impact."/>
+    <w:bookmarkEnd w:id="46"/>
+    <w:bookmarkStart w:id="47" w:name="broader-impact."/>
     <w:p>
       <w:pPr>
         <w:pStyle w:val="Heading4"/>
@@ -6653,9 +6374,9 @@
         <w:t xml:space="preserve">Mechanistic tests can help distinguish plausible-looking predictions from representations that actually control behavior. The same interfaces could also redirect robot actions or create false confidence if validated on narrow state distributions. Use beyond simulation would require broader coverage, physical safety constraints, and monitoring outside the intervention metric.</w:t>
       </w:r>
     </w:p>
-    <w:bookmarkEnd w:id="46"/>
     <w:bookmarkEnd w:id="47"/>
-    <w:bookmarkStart w:id="48" w:name="conclusion"/>
+    <w:bookmarkEnd w:id="48"/>
+    <w:bookmarkStart w:id="49" w:name="conclusion"/>
     <w:p>
       <w:pPr>
         <w:pStyle w:val="Heading1"/>
@@ -6672,8 +6393,8 @@
         <w:t xml:space="preserve">The central result is directional: we do not merely damage a model’s future and observe that behavior changes; we supply a different coherent future and find that behavior follows that particular alternative. Cosmos 3 shows this across 22 sampled states, with future-token K/V carrying most of the action and endpoint shift. Cosmos Policy shows a related, more state-dependent effect dominated by visual robot-motion information, while neither isolated robot nor object pixels reproduce Cosmos 3’s whole-future effect. These models use generated futures to condition action. Whether they compare alternative predicted outcomes in order to plan remains unanswered.</w:t>
       </w:r>
     </w:p>
-    <w:bookmarkEnd w:id="48"/>
-    <w:bookmarkStart w:id="49" w:name="app:reproducibility"/>
+    <w:bookmarkEnd w:id="49"/>
+    <w:bookmarkStart w:id="50" w:name="app:reproducibility"/>
     <w:p>
       <w:pPr>
         <w:pStyle w:val="Heading1"/>
@@ -6782,8 +6503,8 @@
         <w:t xml:space="preserve">. Endpoint evaluation reconstructs the environment, restores the saved state, and replays the observation prefix. Separate controls test token layout, sampler wrapping, cache record and replay, self replacement, and the action-coordinate boundary. Complete timing and aggregate compute accounting remain to be added before submission.</w:t>
       </w:r>
     </w:p>
-    <w:bookmarkEnd w:id="49"/>
-    <w:bookmarkStart w:id="99" w:name="app:additional"/>
+    <w:bookmarkEnd w:id="50"/>
+    <w:bookmarkStart w:id="100" w:name="app:additional"/>
     <w:p>
       <w:pPr>
         <w:pStyle w:val="Heading1"/>
@@ -6957,8 +6678,8 @@
         <w:t xml:space="preserve">), positive in 6/6 states; action steering is smaller and does not reliably exceed the Gaussian control. In the Cosmos 3 population, the two missing frozen states ended after 21 and 29 actions, before producing the 33-frame source video. Neither was replaced. The prespecified minimum of 20 states across five tasks and the factor-study minimum of ten states across five tasks were both met across six tasks.</w:t>
       </w:r>
     </w:p>
-    <w:bookmarkStart w:id="98" w:name="refs"/>
-    <w:bookmarkStart w:id="51" w:name="ref-du2023unipi"/>
+    <w:bookmarkStart w:id="99" w:name="refs"/>
+    <w:bookmarkStart w:id="52" w:name="ref-du2023unipi"/>
     <w:p>
       <w:pPr>
         <w:pStyle w:val="Bibliography"/>
@@ -6991,7 +6712,7 @@
       <w:r>
         <w:t xml:space="preserve"> </w:t>
       </w:r>
-      <w:hyperlink r:id="rId50">
+      <w:hyperlink r:id="rId51">
         <w:r>
           <w:rPr>
             <w:rStyle w:val="Hyperlink"/>
@@ -7003,8 +6724,8 @@
         <w:t xml:space="preserve">.</w:t>
       </w:r>
     </w:p>
-    <w:bookmarkEnd w:id="51"/>
-    <w:bookmarkStart w:id="53" w:name="ref-du2024videolanguage"/>
+    <w:bookmarkEnd w:id="52"/>
+    <w:bookmarkStart w:id="54" w:name="ref-du2024videolanguage"/>
     <w:p>
       <w:pPr>
         <w:pStyle w:val="Bibliography"/>
@@ -7034,7 +6755,7 @@
       <w:r>
         <w:t xml:space="preserve"> </w:t>
       </w:r>
-      <w:hyperlink r:id="rId52">
+      <w:hyperlink r:id="rId53">
         <w:r>
           <w:rPr>
             <w:rStyle w:val="Hyperlink"/>
@@ -7046,8 +6767,8 @@
         <w:t xml:space="preserve">.</w:t>
       </w:r>
     </w:p>
-    <w:bookmarkEnd w:id="53"/>
-    <w:bookmarkStart w:id="55" w:name="ref-ebert2018visualforesight"/>
+    <w:bookmarkEnd w:id="54"/>
+    <w:bookmarkStart w:id="56" w:name="ref-ebert2018visualforesight"/>
     <w:p>
       <w:pPr>
         <w:pStyle w:val="Bibliography"/>
@@ -7077,7 +6798,7 @@
       <w:r>
         <w:t xml:space="preserve"> </w:t>
       </w:r>
-      <w:hyperlink r:id="rId54">
+      <w:hyperlink r:id="rId55">
         <w:r>
           <w:rPr>
             <w:rStyle w:val="Hyperlink"/>
@@ -7089,8 +6810,8 @@
         <w:t xml:space="preserve">.</w:t>
       </w:r>
     </w:p>
-    <w:bookmarkEnd w:id="55"/>
-    <w:bookmarkStart w:id="57" w:name="ref-field2007clusterbootstrap"/>
+    <w:bookmarkEnd w:id="56"/>
+    <w:bookmarkStart w:id="58" w:name="ref-field2007clusterbootstrap"/>
     <w:p>
       <w:pPr>
         <w:pStyle w:val="Bibliography"/>
@@ -7123,7 +6844,7 @@
       <w:r>
         <w:t xml:space="preserve"> </w:t>
       </w:r>
-      <w:hyperlink r:id="rId56">
+      <w:hyperlink r:id="rId57">
         <w:r>
           <w:rPr>
             <w:rStyle w:val="Hyperlink"/>
@@ -7135,8 +6856,8 @@
         <w:t xml:space="preserve">.</w:t>
       </w:r>
     </w:p>
-    <w:bookmarkEnd w:id="57"/>
-    <w:bookmarkStart w:id="59" w:name="ref-goldowskydill2023pathpatching"/>
+    <w:bookmarkEnd w:id="58"/>
+    <w:bookmarkStart w:id="60" w:name="ref-goldowskydill2023pathpatching"/>
     <w:p>
       <w:pPr>
         <w:pStyle w:val="Bibliography"/>
@@ -7160,7 +6881,7 @@
       <w:r>
         <w:t xml:space="preserve"> </w:t>
       </w:r>
-      <w:hyperlink r:id="rId58">
+      <w:hyperlink r:id="rId59">
         <w:r>
           <w:rPr>
             <w:rStyle w:val="Hyperlink"/>
@@ -7172,8 +6893,8 @@
         <w:t xml:space="preserve">.</w:t>
       </w:r>
     </w:p>
-    <w:bookmarkEnd w:id="59"/>
-    <w:bookmarkStart w:id="61" w:name="ref-guo2024pad"/>
+    <w:bookmarkEnd w:id="60"/>
+    <w:bookmarkStart w:id="62" w:name="ref-guo2024pad"/>
     <w:p>
       <w:pPr>
         <w:pStyle w:val="Bibliography"/>
@@ -7206,7 +6927,7 @@
       <w:r>
         <w:t xml:space="preserve"> </w:t>
       </w:r>
-      <w:hyperlink r:id="rId60">
+      <w:hyperlink r:id="rId61">
         <w:r>
           <w:rPr>
             <w:rStyle w:val="Hyperlink"/>
@@ -7218,8 +6939,8 @@
         <w:t xml:space="preserve">.</w:t>
       </w:r>
     </w:p>
-    <w:bookmarkEnd w:id="61"/>
-    <w:bookmarkStart w:id="63" w:name="ref-hu2025vpp"/>
+    <w:bookmarkEnd w:id="62"/>
+    <w:bookmarkStart w:id="64" w:name="ref-hu2025vpp"/>
     <w:p>
       <w:pPr>
         <w:pStyle w:val="Bibliography"/>
@@ -7249,7 +6970,7 @@
       <w:r>
         <w:t xml:space="preserve"> </w:t>
       </w:r>
-      <w:hyperlink r:id="rId62">
+      <w:hyperlink r:id="rId63">
         <w:r>
           <w:rPr>
             <w:rStyle w:val="Hyperlink"/>
@@ -7261,8 +6982,8 @@
         <w:t xml:space="preserve">.</w:t>
       </w:r>
     </w:p>
-    <w:bookmarkEnd w:id="63"/>
-    <w:bookmarkStart w:id="65" w:name="ref-kim2026cosmospolicy"/>
+    <w:bookmarkEnd w:id="64"/>
+    <w:bookmarkStart w:id="66" w:name="ref-kim2026cosmospolicy"/>
     <w:p>
       <w:pPr>
         <w:pStyle w:val="Bibliography"/>
@@ -7298,7 +7019,7 @@
       <w:r>
         <w:t xml:space="preserve"> </w:t>
       </w:r>
-      <w:hyperlink r:id="rId64">
+      <w:hyperlink r:id="rId65">
         <w:r>
           <w:rPr>
             <w:rStyle w:val="Hyperlink"/>
@@ -7310,8 +7031,8 @@
         <w:t xml:space="preserve">.</w:t>
       </w:r>
     </w:p>
-    <w:bookmarkEnd w:id="65"/>
-    <w:bookmarkStart w:id="67" w:name="ref-lakens2017equivalence"/>
+    <w:bookmarkEnd w:id="66"/>
+    <w:bookmarkStart w:id="68" w:name="ref-lakens2017equivalence"/>
     <w:p>
       <w:pPr>
         <w:pStyle w:val="Bibliography"/>
@@ -7344,7 +7065,7 @@
       <w:r>
         <w:t xml:space="preserve"> </w:t>
       </w:r>
-      <w:hyperlink r:id="rId66">
+      <w:hyperlink r:id="rId67">
         <w:r>
           <w:rPr>
             <w:rStyle w:val="Hyperlink"/>
@@ -7356,8 +7077,8 @@
         <w:t xml:space="preserve">.</w:t>
       </w:r>
     </w:p>
-    <w:bookmarkEnd w:id="67"/>
-    <w:bookmarkStart w:id="69" w:name="ref-li2025uva"/>
+    <w:bookmarkEnd w:id="68"/>
+    <w:bookmarkStart w:id="70" w:name="ref-li2025uva"/>
     <w:p>
       <w:pPr>
         <w:pStyle w:val="Bibliography"/>
@@ -7381,7 +7102,7 @@
       <w:r>
         <w:t xml:space="preserve"> </w:t>
       </w:r>
-      <w:hyperlink r:id="rId68">
+      <w:hyperlink r:id="rId69">
         <w:r>
           <w:rPr>
             <w:rStyle w:val="Hyperlink"/>
@@ -7393,8 +7114,8 @@
         <w:t xml:space="preserve">.</w:t>
       </w:r>
     </w:p>
-    <w:bookmarkEnd w:id="69"/>
-    <w:bookmarkStart w:id="71" w:name="ref-liu2023libero"/>
+    <w:bookmarkEnd w:id="70"/>
+    <w:bookmarkStart w:id="72" w:name="ref-liu2023libero"/>
     <w:p>
       <w:pPr>
         <w:pStyle w:val="Bibliography"/>
@@ -7433,7 +7154,7 @@
       <w:r>
         <w:t xml:space="preserve"> </w:t>
       </w:r>
-      <w:hyperlink r:id="rId70">
+      <w:hyperlink r:id="rId71">
         <w:r>
           <w:rPr>
             <w:rStyle w:val="Hyperlink"/>
@@ -7445,8 +7166,8 @@
         <w:t xml:space="preserve">.</w:t>
       </w:r>
     </w:p>
-    <w:bookmarkEnd w:id="71"/>
-    <w:bookmarkStart w:id="73" w:name="ref-meng2022rome"/>
+    <w:bookmarkEnd w:id="72"/>
+    <w:bookmarkStart w:id="74" w:name="ref-meng2022rome"/>
     <w:p>
       <w:pPr>
         <w:pStyle w:val="Bibliography"/>
@@ -7488,7 +7209,7 @@
       <w:r>
         <w:t xml:space="preserve"> </w:t>
       </w:r>
-      <w:hyperlink r:id="rId72">
+      <w:hyperlink r:id="rId73">
         <w:r>
           <w:rPr>
             <w:rStyle w:val="Hyperlink"/>
@@ -7500,8 +7221,8 @@
         <w:t xml:space="preserve">.</w:t>
       </w:r>
     </w:p>
-    <w:bookmarkEnd w:id="73"/>
-    <w:bookmarkStart w:id="75" w:name="ref-nasiriany2024robocasa"/>
+    <w:bookmarkEnd w:id="74"/>
+    <w:bookmarkStart w:id="76" w:name="ref-nasiriany2024robocasa"/>
     <w:p>
       <w:pPr>
         <w:pStyle w:val="Bibliography"/>
@@ -7540,7 +7261,7 @@
       <w:r>
         <w:t xml:space="preserve"> </w:t>
       </w:r>
-      <w:hyperlink r:id="rId74">
+      <w:hyperlink r:id="rId75">
         <w:r>
           <w:rPr>
             <w:rStyle w:val="Hyperlink"/>
@@ -7552,8 +7273,8 @@
         <w:t xml:space="preserve">.</w:t>
       </w:r>
     </w:p>
-    <w:bookmarkEnd w:id="75"/>
-    <w:bookmarkStart w:id="77" w:name="ref-nvidia2026cosmos3"/>
+    <w:bookmarkEnd w:id="76"/>
+    <w:bookmarkStart w:id="78" w:name="ref-nvidia2026cosmos3"/>
     <w:p>
       <w:pPr>
         <w:pStyle w:val="Bibliography"/>
@@ -7598,7 +7319,7 @@
       <w:r>
         <w:t xml:space="preserve"> </w:t>
       </w:r>
-      <w:hyperlink r:id="rId76">
+      <w:hyperlink r:id="rId77">
         <w:r>
           <w:rPr>
             <w:rStyle w:val="Hyperlink"/>
@@ -7610,8 +7331,8 @@
         <w:t xml:space="preserve">.</w:t>
       </w:r>
     </w:p>
-    <w:bookmarkEnd w:id="77"/>
-    <w:bookmarkStart w:id="79" w:name="ref-nvidia2026cosmos3droid"/>
+    <w:bookmarkEnd w:id="78"/>
+    <w:bookmarkStart w:id="80" w:name="ref-nvidia2026cosmos3droid"/>
     <w:p>
       <w:pPr>
         <w:pStyle w:val="Bibliography"/>
@@ -7635,7 +7356,7 @@
       <w:r>
         <w:t xml:space="preserve"> </w:t>
       </w:r>
-      <w:hyperlink r:id="rId78">
+      <w:hyperlink r:id="rId79">
         <w:r>
           <w:rPr>
             <w:rStyle w:val="Hyperlink"/>
@@ -7647,8 +7368,8 @@
         <w:t xml:space="preserve">.</w:t>
       </w:r>
     </w:p>
-    <w:bookmarkEnd w:id="79"/>
-    <w:bookmarkStart w:id="81" w:name="ref-qiu2026agra"/>
+    <w:bookmarkEnd w:id="80"/>
+    <w:bookmarkStart w:id="82" w:name="ref-qiu2026agra"/>
     <w:p>
       <w:pPr>
         <w:pStyle w:val="Bibliography"/>
@@ -7672,7 +7393,7 @@
       <w:r>
         <w:t xml:space="preserve"> </w:t>
       </w:r>
-      <w:hyperlink r:id="rId80">
+      <w:hyperlink r:id="rId81">
         <w:r>
           <w:rPr>
             <w:rStyle w:val="Hyperlink"/>
@@ -7684,8 +7405,8 @@
         <w:t xml:space="preserve">.</w:t>
       </w:r>
     </w:p>
-    <w:bookmarkEnd w:id="81"/>
-    <w:bookmarkStart w:id="83" w:name="ref-vaidyanathan2026multiplemediators"/>
+    <w:bookmarkEnd w:id="82"/>
+    <w:bookmarkStart w:id="84" w:name="ref-vaidyanathan2026multiplemediators"/>
     <w:p>
       <w:pPr>
         <w:pStyle w:val="Bibliography"/>
@@ -7709,7 +7430,7 @@
       <w:r>
         <w:t xml:space="preserve"> </w:t>
       </w:r>
-      <w:hyperlink r:id="rId82">
+      <w:hyperlink r:id="rId83">
         <w:r>
           <w:rPr>
             <w:rStyle w:val="Hyperlink"/>
@@ -7721,8 +7442,8 @@
         <w:t xml:space="preserve">.</w:t>
       </w:r>
     </w:p>
-    <w:bookmarkEnd w:id="83"/>
-    <w:bookmarkStart w:id="85" w:name="ref-vig2020causalmediation"/>
+    <w:bookmarkEnd w:id="84"/>
+    <w:bookmarkStart w:id="86" w:name="ref-vig2020causalmediation"/>
     <w:p>
       <w:pPr>
         <w:pStyle w:val="Bibliography"/>
@@ -7755,7 +7476,7 @@
       <w:r>
         <w:t xml:space="preserve"> </w:t>
       </w:r>
-      <w:hyperlink r:id="rId84">
+      <w:hyperlink r:id="rId85">
         <w:r>
           <w:rPr>
             <w:rStyle w:val="Hyperlink"/>
@@ -7767,8 +7488,8 @@
         <w:t xml:space="preserve">.</w:t>
       </w:r>
     </w:p>
-    <w:bookmarkEnd w:id="85"/>
-    <w:bookmarkStart w:id="87" w:name="ref-yang2026robolab"/>
+    <w:bookmarkEnd w:id="86"/>
+    <w:bookmarkStart w:id="88" w:name="ref-yang2026robolab"/>
     <w:p>
       <w:pPr>
         <w:pStyle w:val="Bibliography"/>
@@ -7807,7 +7528,7 @@
       <w:r>
         <w:t xml:space="preserve"> </w:t>
       </w:r>
-      <w:hyperlink r:id="rId86">
+      <w:hyperlink r:id="rId87">
         <w:r>
           <w:rPr>
             <w:rStyle w:val="Hyperlink"/>
@@ -7819,8 +7540,8 @@
         <w:t xml:space="preserve">.</w:t>
       </w:r>
     </w:p>
-    <w:bookmarkEnd w:id="87"/>
-    <w:bookmarkStart w:id="89" w:name="ref-ye2026dreamzero"/>
+    <w:bookmarkEnd w:id="88"/>
+    <w:bookmarkStart w:id="90" w:name="ref-ye2026dreamzero"/>
     <w:p>
       <w:pPr>
         <w:pStyle w:val="Bibliography"/>
@@ -7844,7 +7565,7 @@
       <w:r>
         <w:t xml:space="preserve"> </w:t>
       </w:r>
-      <w:hyperlink r:id="rId88">
+      <w:hyperlink r:id="rId89">
         <w:r>
           <w:rPr>
             <w:rStyle w:val="Hyperlink"/>
@@ -7856,8 +7577,8 @@
         <w:t xml:space="preserve">.</w:t>
       </w:r>
     </w:p>
-    <w:bookmarkEnd w:id="89"/>
-    <w:bookmarkStart w:id="91" w:name="ref-yuan2026fastwam"/>
+    <w:bookmarkEnd w:id="90"/>
+    <w:bookmarkStart w:id="92" w:name="ref-yuan2026fastwam"/>
     <w:p>
       <w:pPr>
         <w:pStyle w:val="Bibliography"/>
@@ -7885,7 +7606,7 @@
       <w:r>
         <w:t xml:space="preserve"> </w:t>
       </w:r>
-      <w:hyperlink r:id="rId90">
+      <w:hyperlink r:id="rId91">
         <w:r>
           <w:rPr>
             <w:rStyle w:val="Hyperlink"/>
@@ -7897,8 +7618,8 @@
         <w:t xml:space="preserve">.</w:t>
       </w:r>
     </w:p>
-    <w:bookmarkEnd w:id="91"/>
-    <w:bookmarkStart w:id="93" w:name="ref-zhang2026rift"/>
+    <w:bookmarkEnd w:id="92"/>
+    <w:bookmarkStart w:id="94" w:name="ref-zhang2026rift"/>
     <w:p>
       <w:pPr>
         <w:pStyle w:val="Bibliography"/>
@@ -7950,7 +7671,7 @@
       <w:r>
         <w:t xml:space="preserve"> </w:t>
       </w:r>
-      <w:hyperlink r:id="rId92">
+      <w:hyperlink r:id="rId93">
         <w:r>
           <w:rPr>
             <w:rStyle w:val="Hyperlink"/>
@@ -7962,8 +7683,8 @@
         <w:t xml:space="preserve">.</w:t>
       </w:r>
     </w:p>
-    <w:bookmarkEnd w:id="93"/>
-    <w:bookmarkStart w:id="95" w:name="ref-zhang2024activationpatching"/>
+    <w:bookmarkEnd w:id="94"/>
+    <w:bookmarkStart w:id="96" w:name="ref-zhang2024activationpatching"/>
     <w:p>
       <w:pPr>
         <w:pStyle w:val="Bibliography"/>
@@ -7993,7 +7714,7 @@
       <w:r>
         <w:t xml:space="preserve"> </w:t>
       </w:r>
-      <w:hyperlink r:id="rId94">
+      <w:hyperlink r:id="rId95">
         <w:r>
           <w:rPr>
             <w:rStyle w:val="Hyperlink"/>
@@ -8005,8 +7726,8 @@
         <w:t xml:space="preserve">.</w:t>
       </w:r>
     </w:p>
-    <w:bookmarkEnd w:id="95"/>
-    <w:bookmarkStart w:id="97" w:name="ref-zhao2026fasterwam"/>
+    <w:bookmarkEnd w:id="96"/>
+    <w:bookmarkStart w:id="98" w:name="ref-zhao2026fasterwam"/>
     <w:p>
       <w:pPr>
         <w:pStyle w:val="Bibliography"/>
@@ -8037,7 +7758,7 @@
       <w:r>
         <w:t xml:space="preserve"> </w:t>
       </w:r>
-      <w:hyperlink r:id="rId96">
+      <w:hyperlink r:id="rId97">
         <w:r>
           <w:rPr>
             <w:rStyle w:val="Hyperlink"/>
@@ -8049,9 +7770,9 @@
         <w:t xml:space="preserve">.</w:t>
       </w:r>
     </w:p>
-    <w:bookmarkEnd w:id="97"/>
     <w:bookmarkEnd w:id="98"/>
     <w:bookmarkEnd w:id="99"/>
+    <w:bookmarkEnd w:id="100"/>
     <w:sectPr>
       <w:footnotePr>
         <w:numRestart w:val="eachSect"/>

</xml_diff>

<commit_message>
docs: soften future roles
</commit_message>
<xml_diff>
--- a/output/imagined_futures_neurips2026.docx
+++ b/output/imagined_futures_neurips2026.docx
@@ -149,46 +149,7 @@
         <w:pStyle w:val="BodyText"/>
       </w:pPr>
       <w:r>
-        <w:t xml:space="preserve">We distinguish four mechanistically different—and potentially coexisting—roles for future representations. First, they may be</w:t>
-      </w:r>
-      <w:r>
-        <w:t xml:space="preserve"> </w:t>
-      </w:r>
-      <w:r>
-        <w:rPr>
-          <w:i/>
-          <w:iCs/>
-        </w:rPr>
-        <w:t xml:space="preserve">epiphenomenal</w:t>
-      </w:r>
-      <w:r>
-        <w:t xml:space="preserve">: changing them has no causal effect on action. Second, they may provide a</w:t>
-      </w:r>
-      <w:r>
-        <w:t xml:space="preserve"> </w:t>
-      </w:r>
-      <w:r>
-        <w:rPr>
-          <w:i/>
-          <w:iCs/>
-        </w:rPr>
-        <w:t xml:space="preserve">nonspecific computational workspace</w:t>
-      </w:r>
-      <w:r>
-        <w:t xml:space="preserve">: activity at future-token positions is necessary, but the represented future does not determine the direction of the action change. Third, their semantic content may</w:t>
-      </w:r>
-      <w:r>
-        <w:t xml:space="preserve"> </w:t>
-      </w:r>
-      <w:r>
-        <w:rPr>
-          <w:i/>
-          <w:iCs/>
-        </w:rPr>
-        <w:t xml:space="preserve">parameterize action</w:t>
-      </w:r>
-      <w:r>
-        <w:t xml:space="preserve">, for example through an inverse-dynamics-like mapping from a prospective robot pose to the action that would realize it</w:t>
+        <w:t xml:space="preserve">Future representations could serve many roles. They may be auxiliary outputs with no causal effect on action, a general computational workspace whose disruption affects execution regardless of the represented content, a content-specific action input such as a prospective robot pose used for inverse dynamics</w:t>
       </w:r>
       <w:r>
         <w:t xml:space="preserve"> </w:t>
@@ -222,7 +183,7 @@
         <w:t xml:space="preserve">)</w:t>
       </w:r>
       <w:r>
-        <w:t xml:space="preserve">. Fourth, they may encode consequences that are evaluated to select among candidate actions</w:t>
+        <w:t xml:space="preserve">, or a representation of predicted consequences used to evaluate candidate actions</w:t>
       </w:r>
       <w:r>
         <w:t xml:space="preserve"> </w:t>
@@ -256,7 +217,7 @@
         <w:t xml:space="preserve">)</w:t>
       </w:r>
       <w:r>
-        <w:t xml:space="preserve">. Only the fourth role entails outcome-based planning; the third establishes content-specific future use but does not, by itself, show that the model compares predicted outcomes. We study Cosmos Policy’s direct-policy mode and the diffusion-generator component of Cosmos3-Nano-Policy-DROID. Neither evaluated inference procedure generates and scores multiple candidate actions before acting; Cosmos Policy’s separate best-of-</w:t>
+        <w:t xml:space="preserve">. These examples are neither exhaustive nor mutually exclusive. In particular, content-specific action conditioning would not by itself show that the model compares predicted outcomes. We study Cosmos Policy’s direct-policy mode and the diffusion-generator component of Cosmos3-Nano-Policy-DROID. Neither evaluated inference procedure generates and scores multiple candidate actions before acting; Cosmos Policy’s separate best-of-</w:t>
       </w:r>
       <m:oMath>
         <m:r>
@@ -295,7 +256,7 @@
         <w:t xml:space="preserve">)</w:t>
       </w:r>
       <w:r>
-        <w:t xml:space="preserve">. Masking the future read or editing values stored at future positions changes closed-loop trajectories and task success across several WAMs. Such destructive tests establish that the future channel is necessary or behaviorally sensitive. They do not establish that its semantic content controls a particular alternative: a damaged representation can move an action in any direction.</w:t>
+        <w:t xml:space="preserve">. Masking the future read or editing values stored at future positions changes closed-loop trajectories and task success across several WAMs. These destructive interventions establish dependence on the future channel, but do not show that the represented future determines the direction of the resulting action change: damaging the representation can alter an action arbitrarily. RIFT therefore does not distinguish content-independent computational dependence from content-specific use.</w:t>
       </w:r>
     </w:p>
     <w:p>

</xml_diff>